<commit_message>
Capítulo 4: caso determinístico de 2025 (Seção 4.1) e mapa receita fixa x preço do H2 (Seção 4.7)
Seções renumeradas; Tabela 4.1 compara determinístico e estocástico; Figuras
4.5 e 4.6 (potência ótima/lucro e arrependimento); síntese ampliada.

Co-Authored-By: Claude Opus 5.5 <noreply@anthropic.com>
Claude-Session: https://claude.ai/code/session_01YFtn9hiQUHbNLSX7rUNYuK
</commit_message>
<xml_diff>
--- a/docs/dissertacao/cap4_resultados.docx
+++ b/docs/dissertacao/cap4_resultados.docx
@@ -2,7 +2,7 @@
 <file path=word/document.xml><?xml version="1.0" encoding="utf-8"?>
 <w:document xmlns:w="http://schemas.openxmlformats.org/wordprocessingml/2006/main" xmlns:m="http://schemas.openxmlformats.org/officeDocument/2006/math" xmlns:r="http://schemas.openxmlformats.org/officeDocument/2006/relationships" xmlns:o="urn:schemas-microsoft-com:office:office" xmlns:v="urn:schemas-microsoft-com:vml" xmlns:w10="urn:schemas-microsoft-com:office:word" xmlns:a="http://schemas.openxmlformats.org/drawingml/2006/main" xmlns:pic="http://schemas.openxmlformats.org/drawingml/2006/picture" xmlns:wp="http://schemas.openxmlformats.org/drawingml/2006/wordprocessingDrawing">
   <w:body>
-    <w:bookmarkStart w:id="24" w:name="resultados-e-discussão"/>
+    <w:bookmarkStart w:id="35" w:name="resultados-e-discussão"/>
     <w:p>
       <w:pPr>
         <w:pStyle w:val="Heading1"/>
@@ -16,7 +16,7 @@
         <w:pStyle w:val="FirstParagraph"/>
       </w:pPr>
       <w:r>
-        <w:t xml:space="preserve">Este capítulo apresenta os resultados do modelo descrito no Capítulo 3, aplicado ao caso de referência: a planta da UNIFEI escalonada para 50 MWp de geração FV e 17,5 MW de eletrolisador PEM, com BESS hipotético de 60 MW e 300 MWh, conectada ao submercado SE/CO. Salvo indicação em contrário, os resultados correspondem ao lucro esperado nos cinco cenários anuais de 2021 a 2025 (Seção 3.7.2), em valores de dezembro de 2025. A Seção 4.1 apresenta a decisão de contratação e a operação no caso de referência; a Seção 4.2, o valor da solução estocástica e da informação perfeita; a Seção 4.3, a curva de oferta no leilão; a Seção 4.4, o efeito do contrato de hidrogênio e da importação de energia; a Seção 4.5, o efeito da frequência do despacho do ONS; e a Seção 4.6 sintetiza os resultados.</w:t>
+        <w:t xml:space="preserve">Este capítulo apresenta os resultados do modelo descrito no Capítulo 3, aplicado ao caso de referência: a planta da UNIFEI escalonada para 50 MWp de geração FV e 17,5 MW de eletrolisador PEM, com BESS hipotético de 60 MW e 300 MWh, conectada ao submercado SE/CO. Salvo indicação em contrário, os resultados das Seções 4.2 a 4.6 correspondem ao lucro esperado nos cinco cenários anuais de 2021 a 2025 (Seção 3.7.2), em valores de dezembro de 2025; as Seções 4.1 e 4.7 utilizam o caso determinístico de 2025 (Seção 3.5). A Seção 4.1 apresenta o caso determinístico de 2025, que serve de referência para o desempenho do método de solução; a Seção 4.2, a decisão de contratação e a operação no modelo estocástico; a Seção 4.3, o valor da solução estocástica e da informação perfeita; a Seção 4.4, a curva de oferta no leilão; a Seção 4.5, o efeito do contrato de hidrogênio e da importação de energia; a Seção 4.6, o efeito da frequência do despacho do ONS; a Seção 4.7, a sensibilidade à receita fixa e ao preço do hidrogênio; e a Seção 4.8 sintetiza os resultados.</w:t>
       </w:r>
     </w:p>
     <w:p>
@@ -27,13 +27,13 @@
         <w:t xml:space="preserve">Ressalta-se que parte dos parâmetros econômicos — em especial a receita fixa do LRCAP (R$ 600 mil/(MW·ano)), o preço do hidrogênio (R$ 35/kg), o custo de degradação do BESS (R$ 50/MWh) e a multa contratual por déficit de hidrogênio — tem caráter provisório, conforme discutido na Seção 3.5. Por isso, a ênfase deste capítulo recai sobre as relações entre as decisões e as hipóteses, e não sobre os valores absolutos de lucro.</w:t>
       </w:r>
     </w:p>
-    <w:bookmarkStart w:id="12" w:name="Xc763bdadb72b745f00fe6e6dfcbaaef391fd65a"/>
+    <w:bookmarkStart w:id="12" w:name="Xc67fa1b47bfeb8d63423723fc053b3dded1a697"/>
     <w:p>
       <w:pPr>
         <w:pStyle w:val="Heading2"/>
       </w:pPr>
       <w:r>
-        <w:t xml:space="preserve">4.1 Decisão de contratação no caso de referência</w:t>
+        <w:t xml:space="preserve">4.1 Caso determinístico de 2025 e desempenho do método</w:t>
       </w:r>
     </w:p>
     <w:p>
@@ -41,7 +41,7 @@
         <w:pStyle w:val="FirstParagraph"/>
       </w:pPr>
       <w:r>
-        <w:t xml:space="preserve">A Figura 4.1(a) apresenta o lucro anual de cada cenário, o lucro esperado e o CVaR em função da potência contratada no LRCAP. Participar do leilão é vantajoso em todos os cenários: a contratação do mínimo regulatório de 30 MW eleva o lucro esperado de R$ 45,0 milhões para R$ 60,7 milhões por ano, um acréscimo de 35%. A partir desse ponto, o lucro esperado continua a crescer, porém a taxas decrescentes, até um máximo e decresce em seguida, quando a potência contratada passa a retirar do módulo mercantil a capacidade que abastece o eletrolisador durante a noite.</w:t>
+        <w:t xml:space="preserve">O caso determinístico utiliza o PLD do submercado SE/CO de 2025, a geração FV obtida da base ERA5 e o perfil fixo de despacho do ONS descritos na Seção 3.5, com o ano dividido em 52 blocos semanais. A Figura 4.1 apresenta a convergência do algoritmo de Benders e a aproximação da função valor do primeiro estágio construída pelos cortes.</w:t>
       </w:r>
     </w:p>
     <w:p>
@@ -49,7 +49,7 @@
         <w:pStyle w:val="Legenda"/>
       </w:pPr>
       <w:r>
-        <w:t xml:space="preserve">Figura 4.1 – Lucro anual em função da potência contratada no LRCAP: (a) por cenário, lucro esperado e CVaR; (b) por cenário, para quatro decisões de contratação</w:t>
+        <w:t xml:space="preserve">Figura 4.1 – Caso determinístico de 2025: (a) limites superior e inferior ao longo das iterações de Benders; (b) aproximação da função valor pelos cortes e pontos avaliados</w:t>
       </w:r>
     </w:p>
     <w:p>
@@ -59,20 +59,535 @@
       <w:r>
         <w:drawing>
           <wp:inline>
-            <wp:extent cx="5334000" cy="1962912"/>
+            <wp:extent cx="5334000" cy="2000250"/>
             <wp:effectExtent b="0" l="0" r="0" t="0"/>
             <wp:docPr descr="" title="" id="10" name="Picture"/>
             <a:graphic>
               <a:graphicData uri="http://schemas.openxmlformats.org/drawingml/2006/picture">
                 <pic:pic>
                   <pic:nvPicPr>
-                    <pic:cNvPr descr="figuras/estocastico_unifei.png" id="11" name="Picture"/>
+                    <pic:cNvPr descr="figuras/benders_unifei_escalonada.png" id="11" name="Picture"/>
                     <pic:cNvPicPr>
                       <a:picLocks noChangeArrowheads="1" noChangeAspect="1"/>
                     </pic:cNvPicPr>
                   </pic:nvPicPr>
                   <pic:blipFill>
                     <a:blip r:embed="rId9"/>
+                    <a:stretch>
+                      <a:fillRect/>
+                    </a:stretch>
+                  </pic:blipFill>
+                  <pic:spPr bwMode="auto">
+                    <a:xfrm>
+                      <a:off x="0" y="0"/>
+                      <a:ext cx="5334000" cy="2000250"/>
+                    </a:xfrm>
+                    <a:prstGeom prst="rect">
+                      <a:avLst/>
+                    </a:prstGeom>
+                    <a:noFill/>
+                    <a:ln w="9525">
+                      <a:noFill/>
+                      <a:headEnd/>
+                      <a:tailEnd/>
+                    </a:ln>
+                  </pic:spPr>
+                </pic:pic>
+              </a:graphicData>
+            </a:graphic>
+          </wp:inline>
+        </w:drawing>
+      </w:r>
+    </w:p>
+    <w:p>
+      <w:pPr>
+        <w:pStyle w:val="Fonte"/>
+      </w:pPr>
+      <w:r>
+        <w:t xml:space="preserve">Fonte: elaborado pelo autor.</w:t>
+      </w:r>
+    </w:p>
+    <w:p>
+      <w:pPr>
+        <w:pStyle w:val="BodyText"/>
+      </w:pPr>
+      <w:r>
+        <w:t xml:space="preserve">Após a avaliação dos três pontos iniciais (0, 30 e 60 MW), o limite superior parte de R$ 72,7 milhões, e o algoritmo converge em quatro iterações, com</w:t>
+      </w:r>
+      <w:r>
+        <w:t xml:space="preserve"> </w:t>
+      </w:r>
+      <w:r>
+        <w:rPr>
+          <w:i/>
+          <w:iCs/>
+        </w:rPr>
+        <w:t xml:space="preserve">gap</w:t>
+      </w:r>
+      <w:r>
+        <w:t xml:space="preserve"> </w:t>
+      </w:r>
+      <w:r>
+        <w:t xml:space="preserve">final de 0,06%, em 67 segundos de processamento em quatro núcleos — tempo inferior ao de uma única tentativa de solução direta do MILP anual, interrompida após 15 minutos sem solução (Seção 3.6.1). A Figura 4.1(b) mostra que a função valor é crescente e aproximadamente linear até cerca de 45 MW e praticamente plana entre 50 e 60 MW, o que explica a convergência rápida: poucos cortes bastam para delimitar a região do ótimo.</w:t>
+      </w:r>
+    </w:p>
+    <w:p>
+      <w:pPr>
+        <w:pStyle w:val="BodyText"/>
+      </w:pPr>
+      <w:r>
+        <w:t xml:space="preserve">O ótimo encontrado é</w:t>
+      </w:r>
+      <w:r>
+        <w:t xml:space="preserve"> </w:t>
+      </w:r>
+      <m:oMath>
+        <m:sSup>
+          <m:e>
+            <m:r>
+              <m:t>P</m:t>
+            </m:r>
+          </m:e>
+          <m:sup>
+            <m:r>
+              <m:t>c</m:t>
+            </m:r>
+            <m:r>
+              <m:t>a</m:t>
+            </m:r>
+            <m:r>
+              <m:t>p</m:t>
+            </m:r>
+          </m:sup>
+        </m:sSup>
+        <m:r>
+          <m:rPr>
+            <m:sty m:val="p"/>
+          </m:rPr>
+          <m:t>=</m:t>
+        </m:r>
+        <m:r>
+          <m:t>54</m:t>
+        </m:r>
+        <m:r>
+          <m:rPr>
+            <m:sty m:val="p"/>
+          </m:rPr>
+          <m:t>,</m:t>
+        </m:r>
+        <m:r>
+          <m:t>4</m:t>
+        </m:r>
+      </m:oMath>
+      <w:r>
+        <w:t xml:space="preserve"> </w:t>
+      </w:r>
+      <w:r>
+        <w:t xml:space="preserve">MW, com lucro de R$ 67,5 milhões no ano. A Tabela 4.1 compara a composição desse resultado com o ótimo do modelo estocástico, apresentado na Seção 4.2.</w:t>
+      </w:r>
+    </w:p>
+    <w:p>
+      <w:pPr>
+        <w:pStyle w:val="Legenda"/>
+      </w:pPr>
+      <w:r>
+        <w:t xml:space="preserve">Tabela 4.1 – Comparação entre o caso determinístico de 2025 e o modelo estocástico</w:t>
+      </w:r>
+    </w:p>
+    <w:tbl>
+      <w:tblPr>
+        <w:tblStyle w:val="Table"/>
+        <w:tblW w:type="pct" w:w="5000"/>
+        <w:tblLayout w:type="fixed"/>
+        <w:tblLook w:firstRow="1" w:lastRow="0" w:firstColumn="0" w:lastColumn="0" w:noHBand="0" w:noVBand="0" w:val="0020"/>
+      </w:tblPr>
+      <w:tblGrid>
+        <w:gridCol w:w="3751"/>
+        <w:gridCol w:w="2084"/>
+        <w:gridCol w:w="2084"/>
+      </w:tblGrid>
+      <w:tr>
+        <w:trPr>
+          <w:tblHeader w:val="on"/>
+        </w:trPr>
+        <w:tc>
+          <w:tcPr/>
+          <w:p>
+            <w:pPr>
+              <w:pStyle w:val="Compact"/>
+            </w:pPr>
+            <w:r>
+              <w:t xml:space="preserve">Indicador</w:t>
+            </w:r>
+          </w:p>
+        </w:tc>
+        <w:tc>
+          <w:tcPr/>
+          <w:p>
+            <w:pPr>
+              <w:pStyle w:val="Compact"/>
+            </w:pPr>
+            <w:r>
+              <w:t xml:space="preserve">Determinístico (2025)</w:t>
+            </w:r>
+          </w:p>
+        </w:tc>
+        <w:tc>
+          <w:tcPr/>
+          <w:p>
+            <w:pPr>
+              <w:pStyle w:val="Compact"/>
+            </w:pPr>
+            <w:r>
+              <w:t xml:space="preserve">Estocástico (2021–2025, média)</w:t>
+            </w:r>
+          </w:p>
+        </w:tc>
+      </w:tr>
+      <w:tr>
+        <w:tc>
+          <w:tcPr/>
+          <w:p>
+            <w:pPr>
+              <w:pStyle w:val="Compact"/>
+            </w:pPr>
+            <w:r>
+              <w:t xml:space="preserve">Potência ótima no LRCAP (MW)</w:t>
+            </w:r>
+          </w:p>
+        </w:tc>
+        <w:tc>
+          <w:tcPr/>
+          <w:p>
+            <w:pPr>
+              <w:pStyle w:val="Compact"/>
+            </w:pPr>
+            <w:r>
+              <w:t xml:space="preserve">54,4</w:t>
+            </w:r>
+          </w:p>
+        </w:tc>
+        <w:tc>
+          <w:tcPr/>
+          <w:p>
+            <w:pPr>
+              <w:pStyle w:val="Compact"/>
+            </w:pPr>
+            <w:r>
+              <w:t xml:space="preserve">54,4</w:t>
+            </w:r>
+          </w:p>
+        </w:tc>
+      </w:tr>
+      <w:tr>
+        <w:tc>
+          <w:tcPr/>
+          <w:p>
+            <w:pPr>
+              <w:pStyle w:val="Compact"/>
+            </w:pPr>
+            <w:r>
+              <w:t xml:space="preserve">Lucro (R$ milhões/ano)</w:t>
+            </w:r>
+          </w:p>
+        </w:tc>
+        <w:tc>
+          <w:tcPr/>
+          <w:p>
+            <w:pPr>
+              <w:pStyle w:val="Compact"/>
+            </w:pPr>
+            <w:r>
+              <w:t xml:space="preserve">67,5</w:t>
+            </w:r>
+          </w:p>
+        </w:tc>
+        <w:tc>
+          <w:tcPr/>
+          <w:p>
+            <w:pPr>
+              <w:pStyle w:val="Compact"/>
+            </w:pPr>
+            <w:r>
+              <w:t xml:space="preserve">68,1</w:t>
+            </w:r>
+          </w:p>
+        </w:tc>
+      </w:tr>
+      <w:tr>
+        <w:tc>
+          <w:tcPr/>
+          <w:p>
+            <w:pPr>
+              <w:pStyle w:val="Compact"/>
+            </w:pPr>
+            <w:r>
+              <w:t xml:space="preserve">Receita fixa do LRCAP (R$ milhões/ano)</w:t>
+            </w:r>
+          </w:p>
+        </w:tc>
+        <w:tc>
+          <w:tcPr/>
+          <w:p>
+            <w:pPr>
+              <w:pStyle w:val="Compact"/>
+            </w:pPr>
+            <w:r>
+              <w:t xml:space="preserve">32,7</w:t>
+            </w:r>
+          </w:p>
+        </w:tc>
+        <w:tc>
+          <w:tcPr/>
+          <w:p>
+            <w:pPr>
+              <w:pStyle w:val="Compact"/>
+            </w:pPr>
+            <w:r>
+              <w:t xml:space="preserve">32,6</w:t>
+            </w:r>
+          </w:p>
+        </w:tc>
+      </w:tr>
+      <w:tr>
+        <w:tc>
+          <w:tcPr/>
+          <w:p>
+            <w:pPr>
+              <w:pStyle w:val="Compact"/>
+            </w:pPr>
+            <w:r>
+              <w:t xml:space="preserve">Receita de H₂ (R$ milhões/ano)</w:t>
+            </w:r>
+          </w:p>
+        </w:tc>
+        <w:tc>
+          <w:tcPr/>
+          <w:p>
+            <w:pPr>
+              <w:pStyle w:val="Compact"/>
+            </w:pPr>
+            <w:r>
+              <w:t xml:space="preserve">39,1</w:t>
+            </w:r>
+          </w:p>
+        </w:tc>
+        <w:tc>
+          <w:tcPr/>
+          <w:p>
+            <w:pPr>
+              <w:pStyle w:val="Compact"/>
+            </w:pPr>
+            <w:r>
+              <w:t xml:space="preserve">36,0</w:t>
+            </w:r>
+          </w:p>
+        </w:tc>
+      </w:tr>
+      <w:tr>
+        <w:tc>
+          <w:tcPr/>
+          <w:p>
+            <w:pPr>
+              <w:pStyle w:val="Compact"/>
+            </w:pPr>
+            <w:r>
+              <w:t xml:space="preserve">Receita no MCP (R$ milhões/ano)</w:t>
+            </w:r>
+          </w:p>
+        </w:tc>
+        <w:tc>
+          <w:tcPr/>
+          <w:p>
+            <w:pPr>
+              <w:pStyle w:val="Compact"/>
+            </w:pPr>
+            <w:r>
+              <w:t xml:space="preserve">1,8</w:t>
+            </w:r>
+          </w:p>
+        </w:tc>
+        <w:tc>
+          <w:tcPr/>
+          <w:p>
+            <w:pPr>
+              <w:pStyle w:val="Compact"/>
+            </w:pPr>
+            <w:r>
+              <w:t xml:space="preserve">5,1</w:t>
+            </w:r>
+          </w:p>
+        </w:tc>
+      </w:tr>
+      <w:tr>
+        <w:tc>
+          <w:tcPr/>
+          <w:p>
+            <w:pPr>
+              <w:pStyle w:val="Compact"/>
+            </w:pPr>
+            <w:r>
+              <w:t xml:space="preserve">Degradação do BESS (R$ milhões/ano)</w:t>
+            </w:r>
+          </w:p>
+        </w:tc>
+        <w:tc>
+          <w:tcPr/>
+          <w:p>
+            <w:pPr>
+              <w:pStyle w:val="Compact"/>
+            </w:pPr>
+            <w:r>
+              <w:t xml:space="preserve">4,4</w:t>
+            </w:r>
+          </w:p>
+        </w:tc>
+        <w:tc>
+          <w:tcPr/>
+          <w:p>
+            <w:pPr>
+              <w:pStyle w:val="Compact"/>
+            </w:pPr>
+            <w:r>
+              <w:t xml:space="preserve">4,4</w:t>
+            </w:r>
+          </w:p>
+        </w:tc>
+      </w:tr>
+      <w:tr>
+        <w:tc>
+          <w:tcPr/>
+          <w:p>
+            <w:pPr>
+              <w:pStyle w:val="Compact"/>
+            </w:pPr>
+            <w:r>
+              <w:t xml:space="preserve">H₂ produzido (t/ano)</w:t>
+            </w:r>
+          </w:p>
+        </w:tc>
+        <w:tc>
+          <w:tcPr/>
+          <w:p>
+            <w:pPr>
+              <w:pStyle w:val="Compact"/>
+            </w:pPr>
+            <w:r>
+              <w:t xml:space="preserve">1.117</w:t>
+            </w:r>
+          </w:p>
+        </w:tc>
+        <w:tc>
+          <w:tcPr/>
+          <w:p>
+            <w:pPr>
+              <w:pStyle w:val="Compact"/>
+            </w:pPr>
+            <w:r>
+              <w:t xml:space="preserve">1.029</w:t>
+            </w:r>
+          </w:p>
+        </w:tc>
+      </w:tr>
+      <w:tr>
+        <w:tc>
+          <w:tcPr/>
+          <w:p>
+            <w:pPr>
+              <w:pStyle w:val="Compact"/>
+            </w:pPr>
+            <w:r>
+              <w:t xml:space="preserve">Fator de capacidade do eletrolisador</w:t>
+            </w:r>
+          </w:p>
+        </w:tc>
+        <w:tc>
+          <w:tcPr/>
+          <w:p>
+            <w:pPr>
+              <w:pStyle w:val="Compact"/>
+            </w:pPr>
+            <w:r>
+              <w:t xml:space="preserve">0,40</w:t>
+            </w:r>
+          </w:p>
+        </w:tc>
+        <w:tc>
+          <w:tcPr/>
+          <w:p>
+            <w:pPr>
+              <w:pStyle w:val="Compact"/>
+            </w:pPr>
+            <w:r>
+              <w:t xml:space="preserve">0,37</w:t>
+            </w:r>
+          </w:p>
+        </w:tc>
+      </w:tr>
+    </w:tbl>
+    <w:p>
+      <w:pPr>
+        <w:pStyle w:val="Fonte"/>
+      </w:pPr>
+      <w:r>
+        <w:t xml:space="preserve">Fonte: elaborado pelo autor. Valores do modelo estocástico obtidos na grade de 55 MW, exceto potência, lucro e receita fixa.</w:t>
+      </w:r>
+    </w:p>
+    <w:p>
+      <w:pPr>
+        <w:pStyle w:val="BodyText"/>
+      </w:pPr>
+      <w:r>
+        <w:t xml:space="preserve">As duas abordagens conduzem à mesma potência ótima. As diferenças de composição decorrem principalmente do preço. Embora a série ERA5 de 2025 apresente fator de capacidade FV ligeiramente inferior ao da média dos cenários SARAH-3 (16,9% contra 17,5%), o caso determinístico produz mais hidrogênio. No modelo estocástico, os picos de PLD do cenário de 2021, que superam o valor da energia no eletrolisador, tornam a exportação ao MCP mais vantajosa em parte das horas, o que eleva a receita média no mercado de curto prazo e reduz a produção de hidrogênio. A coincidência das potências ótimas antecipa o resultado da Seção 4.3: a variação entre anos pouco altera a decisão de contratação.</w:t>
+      </w:r>
+    </w:p>
+    <w:bookmarkEnd w:id="12"/>
+    <w:bookmarkStart w:id="16" w:name="X56b8d8d6087674c35fe11f865ddd535a2471b8b"/>
+    <w:p>
+      <w:pPr>
+        <w:pStyle w:val="Heading2"/>
+      </w:pPr>
+      <w:r>
+        <w:t xml:space="preserve">4.2 Decisão de contratação no modelo estocástico</w:t>
+      </w:r>
+    </w:p>
+    <w:p>
+      <w:pPr>
+        <w:pStyle w:val="FirstParagraph"/>
+      </w:pPr>
+      <w:r>
+        <w:t xml:space="preserve">A Figura 4.2(a) apresenta o lucro anual de cada cenário, o lucro esperado e o CVaR em função da potência contratada no LRCAP. Participar do leilão é vantajoso em todos os cenários: a contratação do mínimo regulatório de 30 MW eleva o lucro esperado de R$ 45,0 milhões para R$ 60,7 milhões por ano, um acréscimo de 35%. A partir desse ponto, o lucro esperado continua a crescer, porém a taxas decrescentes, até um máximo e decresce em seguida, quando a potência contratada passa a retirar do módulo mercantil a capacidade que abastece o eletrolisador durante a noite.</w:t>
+      </w:r>
+    </w:p>
+    <w:p>
+      <w:pPr>
+        <w:pStyle w:val="Legenda"/>
+      </w:pPr>
+      <w:r>
+        <w:t xml:space="preserve">Figura 4.2 – Lucro anual em função da potência contratada no LRCAP: (a) por cenário, lucro esperado e CVaR; (b) por cenário, para quatro decisões de contratação</w:t>
+      </w:r>
+    </w:p>
+    <w:p>
+      <w:pPr>
+        <w:pStyle w:val="Figura"/>
+      </w:pPr>
+      <w:r>
+        <w:drawing>
+          <wp:inline>
+            <wp:extent cx="5334000" cy="1962912"/>
+            <wp:effectExtent b="0" l="0" r="0" t="0"/>
+            <wp:docPr descr="" title="" id="14" name="Picture"/>
+            <a:graphic>
+              <a:graphicData uri="http://schemas.openxmlformats.org/drawingml/2006/picture">
+                <pic:pic>
+                  <pic:nvPicPr>
+                    <pic:cNvPr descr="figuras/estocastico_unifei.png" id="15" name="Picture"/>
+                    <pic:cNvPicPr>
+                      <a:picLocks noChangeArrowheads="1" noChangeAspect="1"/>
+                    </pic:cNvPicPr>
+                  </pic:nvPicPr>
+                  <pic:blipFill>
+                    <a:blip r:embed="rId13"/>
                     <a:stretch>
                       <a:fillRect/>
                     </a:stretch>
@@ -112,7 +627,7 @@
         <w:pStyle w:val="BodyText"/>
       </w:pPr>
       <w:r>
-        <w:t xml:space="preserve">Com tolerância de convergência de 0,1%, o algoritmo de Benders identificou o ótimo em 53,4 MW, valor assinalado na Figura 4.1. Com a tolerância de 0,01% adotada no cálculo do VSS e do EVPI, o ótimo passou para 54,4 MW, com lucro esperado de R$ 68,12 milhões por ano — apenas R$ 20 mil acima do obtido com 53,4 MW. A diferença ilustra uma característica central do problema: a função de lucro é muito plana na vizinhança do ótimo, com variação inferior a 0,4% entre 50 e 56 MW. Do ponto de vista prático, a decisão relevante é contratar entre 50 e 55 MW; a localização exata do máximo é menos importante do que as hipóteses que o determinam, examinadas nas seções seguintes.</w:t>
+        <w:t xml:space="preserve">Com tolerância de convergência de 0,1%, o algoritmo de Benders identificou o ótimo em 53,4 MW, valor assinalado na Figura 4.2. Com a tolerância de 0,01% adotada no cálculo do VSS e do EVPI, o ótimo passou para 54,4 MW, com lucro esperado de R$ 68,12 milhões por ano — apenas R$ 20 mil acima do obtido com 53,4 MW. A diferença ilustra uma característica central do problema: a função de lucro é muito plana na vizinhança do ótimo, com variação inferior a 0,4% entre 50 e 56 MW. Do ponto de vista prático, a decisão relevante é contratar entre 50 e 55 MW; a localização exata do máximo é menos importante do que as hipóteses que o determinam, examinadas nas seções seguintes.</w:t>
       </w:r>
     </w:p>
     <w:p>
@@ -120,7 +635,7 @@
         <w:pStyle w:val="BodyText"/>
       </w:pPr>
       <w:r>
-        <w:t xml:space="preserve">O lucro por cenário na potência ótima é apresentado na Tabela 4.1. O pior cenário é 2022, ano em que o PLD permaneceu próximo do piso regulatório, e o melhor, 2021, ano da crise hídrica. A diferença entre eles, de cerca de R$ 8 milhões por ano, é pequena diante do ganho proporcionado pela participação no leilão.</w:t>
+        <w:t xml:space="preserve">O lucro por cenário na potência ótima é apresentado na Tabela 4.2. O pior cenário é 2022, ano em que o PLD permaneceu próximo do piso regulatório, e o melhor, 2021, ano da crise hídrica. A diferença entre eles, de cerca de R$ 8 milhões por ano, é pequena diante do ganho proporcionado pela participação no leilão.</w:t>
       </w:r>
     </w:p>
     <w:p>
@@ -128,7 +643,7 @@
         <w:pStyle w:val="Legenda"/>
       </w:pPr>
       <w:r>
-        <w:t xml:space="preserve">Tabela 4.1 – Lucro anual por cenário na potência ótima (54,4 MW)</w:t>
+        <w:t xml:space="preserve">Tabela 4.2 – Lucro anual por cenário na potência ótima (54,4 MW)</w:t>
       </w:r>
     </w:p>
     <w:tbl>
@@ -467,7 +982,7 @@
         <w:t xml:space="preserve"> </w:t>
       </w:r>
       <w:r>
-        <w:t xml:space="preserve">inferior a 0,07% em todos os casos. Não há, portanto, troca entre risco e retorno nesta configuração, pois a dispersão entre os cenários pouco depende da decisão de contratação, como se observa na Figura 4.1(b): as barras de cada decisão se deslocam praticamente em paralelo entre os anos.</w:t>
+        <w:t xml:space="preserve">inferior a 0,07% em todos os casos. Não há, portanto, troca entre risco e retorno nesta configuração, pois a dispersão entre os cenários pouco depende da decisão de contratação, como se observa na Figura 4.2(b): as barras de cada decisão se deslocam praticamente em paralelo entre os anos.</w:t>
       </w:r>
     </w:p>
     <w:p>
@@ -475,17 +990,17 @@
         <w:pStyle w:val="BodyText"/>
       </w:pPr>
       <w:r>
-        <w:t xml:space="preserve">A composição do lucro médio na potência de 55 MW, ponto da grade da Seção 3.8 mais próximo do ótimo, é: R$ 33,0 milhões de receita fixa do LRCAP, R$ 36,0 milhões de receita com hidrogênio e R$ 5,1 milhões no MCP, deduzidos R$ 4,4 milhões de degradação do BESS e R$ 1,6 milhão de custos variáveis de produção de hidrogênio. O eletrolisador consome 56,6 GWh por ano, cerca de três quartos da energia FV disponível, com fator de capacidade de 0,37, e produz 1.029 t de hidrogênio; os 19,4 GWh restantes são exportados ao MCP. Esse resultado antecipa a principal conclusão da Seção 4.4: com o hidrogênio vendido sem limite de volume a R$ 35/kg, cada MWh destinado ao eletrolisador vale cerca de R$ 609, e o MCP tem papel secundário na operação.</w:t>
-      </w:r>
-    </w:p>
-    <w:bookmarkEnd w:id="12"/>
-    <w:bookmarkStart w:id="13" w:name="X803239abd151ab68ada138485f7ac164ea0f3ed"/>
+        <w:t xml:space="preserve">A composição do lucro médio na potência de 55 MW, ponto da grade da Seção 3.8 mais próximo do ótimo, é: R$ 33,0 milhões de receita fixa do LRCAP, R$ 36,0 milhões de receita com hidrogênio e R$ 5,1 milhões no MCP, deduzidos R$ 4,4 milhões de degradação do BESS e R$ 1,6 milhão de custos variáveis de produção de hidrogênio. O eletrolisador consome 56,6 GWh por ano, cerca de três quartos da energia FV disponível, com fator de capacidade de 0,37, e produz 1.029 t de hidrogênio; os 19,4 GWh restantes são exportados ao MCP. Esse resultado antecipa a principal conclusão da Seção 4.5: com o hidrogênio vendido sem limite de volume a R$ 35/kg, cada MWh destinado ao eletrolisador vale cerca de R$ 609, e o MCP tem papel secundário na operação.</w:t>
+      </w:r>
+    </w:p>
+    <w:bookmarkEnd w:id="16"/>
+    <w:bookmarkStart w:id="17" w:name="X803239abd151ab68ada138485f7ac164ea0f3ed"/>
     <w:p>
       <w:pPr>
         <w:pStyle w:val="Heading2"/>
       </w:pPr>
       <w:r>
-        <w:t xml:space="preserve">4.2 Valor da solução estocástica e valor esperado da informação perfeita</w:t>
+        <w:t xml:space="preserve">4.3 Valor da solução estocástica e valor esperado da informação perfeita</w:t>
       </w:r>
     </w:p>
     <w:p>
@@ -493,7 +1008,7 @@
         <w:pStyle w:val="FirstParagraph"/>
       </w:pPr>
       <w:r>
-        <w:t xml:space="preserve">A Tabela 4.2 compara a decisão estocástica (RP) com a decisão obtida no ano médio (EV) e com a solução espera-e-vê (WS), calculadas segundo a Seção 3.7.4.</w:t>
+        <w:t xml:space="preserve">A Tabela 4.3 compara a decisão estocástica (RP) com a decisão obtida no ano médio (EV) e com a solução espera-e-vê (WS), calculadas segundo a Seção 3.7.4.</w:t>
       </w:r>
     </w:p>
     <w:p>
@@ -501,7 +1016,7 @@
         <w:pStyle w:val="Legenda"/>
       </w:pPr>
       <w:r>
-        <w:t xml:space="preserve">Tabela 4.2 – Decisões e lucro anual por cenário para o cálculo do VSS e do EVPI</w:t>
+        <w:t xml:space="preserve">Tabela 4.3 – Decisões e lucro anual por cenário para o cálculo do VSS e do EVPI</w:t>
       </w:r>
     </w:p>
     <w:tbl>
@@ -932,14 +1447,14 @@
         <w:t xml:space="preserve">Dois aspectos merecem destaque. Primeiro, embora o ano médio conduza à decisão correta, ele superestima o lucro: o valor ótimo do problema EV foi de R$ 68,89 milhões, contra R$ 68,12 milhões do EEV. A diferença, de cerca de R$ 0,8 milhão por ano, resulta da suavização dos picos e vales de preço e de irradiância pela média hora a hora, e confirma que o ano médio não deve ser usado para estimar a receita do empreendimento. Segundo, os baixos valores de VSS e de EVPI indicam que a incerteza modelada — a variação de preço e de geração entre anos — tem pouco efeito sobre a decisão de contratação. As seções seguintes mostram que outras hipóteses, não representadas nos cenários, têm efeito muito maior.</w:t>
       </w:r>
     </w:p>
-    <w:bookmarkEnd w:id="13"/>
-    <w:bookmarkStart w:id="17" w:name="curva-de-oferta-no-leilão"/>
+    <w:bookmarkEnd w:id="17"/>
+    <w:bookmarkStart w:id="21" w:name="curva-de-oferta-no-leilão"/>
     <w:p>
       <w:pPr>
         <w:pStyle w:val="Heading2"/>
       </w:pPr>
       <w:r>
-        <w:t xml:space="preserve">4.3 Curva de oferta no leilão</w:t>
+        <w:t xml:space="preserve">4.4 Curva de oferta no leilão</w:t>
       </w:r>
     </w:p>
     <w:p>
@@ -947,7 +1462,7 @@
         <w:pStyle w:val="FirstParagraph"/>
       </w:pPr>
       <w:r>
-        <w:t xml:space="preserve">A Figura 4.2 apresenta o resultado do procedimento da Seção 3.8 para os cinco casos de contrato de hidrogênio e de importação do Quadro 3.2. No caso de referência (curvas em azul), o custo de oportunidade marginal cresce de forma acentuada com a potência contratada: até 37,5 MW, cada MW adicional custa menos de R$ 100 mil/(MW·ano), enquanto os últimos 5 MW custam entre R$ 760 mil e R$ 900 mil/(MW·ano) (Figura 4.2(b)). A receita mínima de entrada é de R$ 76 mil/(MW·ano) e a receita necessária para ofertar toda a potência do BESS é de R$ 895 mil/(MW·ano).</w:t>
+        <w:t xml:space="preserve">A Figura 4.3 apresenta o resultado do procedimento da Seção 3.8 para os cinco casos de contrato de hidrogênio e de importação do Quadro 3.2. No caso de referência (curvas em azul), o custo de oportunidade marginal cresce de forma acentuada com a potência contratada: até 37,5 MW, cada MW adicional custa menos de R$ 100 mil/(MW·ano), enquanto os últimos 5 MW custam entre R$ 760 mil e R$ 900 mil/(MW·ano) (Figura 4.3(b)). A receita mínima de entrada é de R$ 76 mil/(MW·ano) e a receita necessária para ofertar toda a potência do BESS é de R$ 895 mil/(MW·ano).</w:t>
       </w:r>
     </w:p>
     <w:p>
@@ -955,7 +1470,7 @@
         <w:pStyle w:val="Legenda"/>
       </w:pPr>
       <w:r>
-        <w:t xml:space="preserve">Figura 4.2 – Curva de oferta no LRCAP para os casos de contrato de hidrogênio e de importação: (a) perda de lucro operacional esperado; (b) custo de oportunidade marginal; (c) potência ótima em função da receita fixa</w:t>
+        <w:t xml:space="preserve">Figura 4.3 – Curva de oferta no LRCAP para os casos de contrato de hidrogênio e de importação: (a) perda de lucro operacional esperado; (b) custo de oportunidade marginal; (c) potência ótima em função da receita fixa</w:t>
       </w:r>
     </w:p>
     <w:p>
@@ -967,18 +1482,18 @@
           <wp:inline>
             <wp:extent cx="5334000" cy="1635760"/>
             <wp:effectExtent b="0" l="0" r="0" t="0"/>
-            <wp:docPr descr="" title="" id="15" name="Picture"/>
+            <wp:docPr descr="" title="" id="19" name="Picture"/>
             <a:graphic>
               <a:graphicData uri="http://schemas.openxmlformats.org/drawingml/2006/picture">
                 <pic:pic>
                   <pic:nvPicPr>
-                    <pic:cNvPr descr="figuras/curva_oferta.png" id="16" name="Picture"/>
+                    <pic:cNvPr descr="figuras/curva_oferta.png" id="20" name="Picture"/>
                     <pic:cNvPicPr>
                       <a:picLocks noChangeArrowheads="1" noChangeAspect="1"/>
                     </pic:cNvPicPr>
                   </pic:nvPicPr>
                   <pic:blipFill>
-                    <a:blip r:embed="rId14"/>
+                    <a:blip r:embed="rId18"/>
                     <a:stretch>
                       <a:fillRect/>
                     </a:stretch>
@@ -1047,7 +1562,7 @@
         <w:t xml:space="preserve"> </w:t>
       </w:r>
       <w:r>
-        <w:t xml:space="preserve">tende a 60 MW, e o eletrolisador deixa de operar à noite. A Figura 4.2(c) traduz essa relação em uma curva de oferta escalonada: para receitas entre R$ 80 mil e R$ 300 mil/(MW·ano), o empreendedor ofertaria entre 35 e 42,5 MW; para R$ 600 mil, 55 MW; e somente acima de cerca de R$ 900 mil ofertaria toda a capacidade.</w:t>
+        <w:t xml:space="preserve">tende a 60 MW, e o eletrolisador deixa de operar à noite. A Figura 4.3(c) traduz essa relação em uma curva de oferta escalonada: para receitas entre R$ 80 mil e R$ 300 mil/(MW·ano), o empreendedor ofertaria entre 35 e 42,5 MW; para R$ 600 mil, 55 MW; e somente acima de cerca de R$ 900 mil ofertaria toda a capacidade.</w:t>
       </w:r>
     </w:p>
     <w:p>
@@ -1058,14 +1573,14 @@
         <w:t xml:space="preserve">Esse resultado tem duas implicações para o proponente. A decisão de participar do leilão é robusta, pois o limiar de entrada é baixo em todos os casos avaliados (R$ 76 mil a R$ 96 mil/(MW·ano)), muito inferior a qualquer receita fixa plausível para sistemas de armazenamento. Por outro lado, a quantidade a ofertar acima de cerca de 40 MW é sensível tanto ao preço quanto às hipóteses sobre o hidrogênio, como mostra a seção seguinte.</w:t>
       </w:r>
     </w:p>
-    <w:bookmarkEnd w:id="17"/>
-    <w:bookmarkStart w:id="18" w:name="Xecdbf8e9b0c8cf7cf478028b36aa5fe92ae5811"/>
+    <w:bookmarkEnd w:id="21"/>
+    <w:bookmarkStart w:id="22" w:name="Xecdbf8e9b0c8cf7cf478028b36aa5fe92ae5811"/>
     <w:p>
       <w:pPr>
         <w:pStyle w:val="Heading2"/>
       </w:pPr>
       <w:r>
-        <w:t xml:space="preserve">4.4 Contrato de hidrogênio e importação de energia</w:t>
+        <w:t xml:space="preserve">4.5 Contrato de hidrogênio e importação de energia</w:t>
       </w:r>
     </w:p>
     <w:p>
@@ -1073,7 +1588,7 @@
         <w:pStyle w:val="FirstParagraph"/>
       </w:pPr>
       <w:r>
-        <w:t xml:space="preserve">A Tabela 4.3 resume, para a receita fixa de referência, a potência ótima, o lucro e a operação média de cada caso.</w:t>
+        <w:t xml:space="preserve">A Tabela 4.4 resume, para a receita fixa de referência, a potência ótima, o lucro e a operação média de cada caso.</w:t>
       </w:r>
     </w:p>
     <w:p>
@@ -1081,7 +1596,7 @@
         <w:pStyle w:val="Legenda"/>
       </w:pPr>
       <w:r>
-        <w:t xml:space="preserve">Tabela 4.3 – Potência ótima, lucro e operação média nos casos de contrato de hidrogênio e de importação (receita fixa de R$ 600 mil/(MW·ano))</w:t>
+        <w:t xml:space="preserve">Tabela 4.4 – Potência ótima, lucro e operação média nos casos de contrato de hidrogênio e de importação (receita fixa de R$ 600 mil/(MW·ano))</w:t>
       </w:r>
     </w:p>
     <w:tbl>
@@ -2075,14 +2590,14 @@
         <w:t xml:space="preserve">Esses resultados indicam que a arbitragem entre o LRCAP e o MCP, que dá título a este trabalho, só se manifesta plenamente quando a demanda de hidrogênio é limitada. Sem limite de volume, a troca relevante é entre o LRCAP e a produção de hidrogênio, mediada pelo módulo mercantil do BESS; a regra de suprimento do eletrolisador é, entre as hipóteses avaliadas, a de maior efeito sobre o lucro.</w:t>
       </w:r>
     </w:p>
-    <w:bookmarkEnd w:id="18"/>
-    <w:bookmarkStart w:id="22" w:name="frequência-do-despacho-do-ons"/>
+    <w:bookmarkEnd w:id="22"/>
+    <w:bookmarkStart w:id="26" w:name="frequência-do-despacho-do-ons"/>
     <w:p>
       <w:pPr>
         <w:pStyle w:val="Heading2"/>
       </w:pPr>
       <w:r>
-        <w:t xml:space="preserve">4.5 Frequência do despacho do ONS</w:t>
+        <w:t xml:space="preserve">4.6 Frequência do despacho do ONS</w:t>
       </w:r>
     </w:p>
     <w:p>
@@ -2090,7 +2605,7 @@
         <w:pStyle w:val="FirstParagraph"/>
       </w:pPr>
       <w:r>
-        <w:t xml:space="preserve">A Figura 4.3 e a Tabela 4.4 apresentam a curva de oferta do caso de referência para 50, 150 e 365 despachos por ano.</w:t>
+        <w:t xml:space="preserve">A Figura 4.4 e a Tabela 4.5 apresentam a curva de oferta do caso de referência para 50, 150 e 365 despachos por ano.</w:t>
       </w:r>
     </w:p>
     <w:p>
@@ -2098,7 +2613,7 @@
         <w:pStyle w:val="Legenda"/>
       </w:pPr>
       <w:r>
-        <w:t xml:space="preserve">Figura 4.3 – Curva de oferta no LRCAP para diferentes frequências de despacho do ONS: (a) perda de lucro operacional esperado; (b) custo de oportunidade marginal; (c) potência ótima em função da receita fixa</w:t>
+        <w:t xml:space="preserve">Figura 4.4 – Curva de oferta no LRCAP para diferentes frequências de despacho do ONS: (a) perda de lucro operacional esperado; (b) custo de oportunidade marginal; (c) potência ótima em função da receita fixa</w:t>
       </w:r>
     </w:p>
     <w:p>
@@ -2110,18 +2625,18 @@
           <wp:inline>
             <wp:extent cx="5334000" cy="1635760"/>
             <wp:effectExtent b="0" l="0" r="0" t="0"/>
-            <wp:docPr descr="" title="" id="20" name="Picture"/>
+            <wp:docPr descr="" title="" id="24" name="Picture"/>
             <a:graphic>
               <a:graphicData uri="http://schemas.openxmlformats.org/drawingml/2006/picture">
                 <pic:pic>
                   <pic:nvPicPr>
-                    <pic:cNvPr descr="figuras/curva_oferta_ciclos.png" id="21" name="Picture"/>
+                    <pic:cNvPr descr="figuras/curva_oferta_ciclos.png" id="25" name="Picture"/>
                     <pic:cNvPicPr>
                       <a:picLocks noChangeArrowheads="1" noChangeAspect="1"/>
                     </pic:cNvPicPr>
                   </pic:nvPicPr>
                   <pic:blipFill>
-                    <a:blip r:embed="rId19"/>
+                    <a:blip r:embed="rId23"/>
                     <a:stretch>
                       <a:fillRect/>
                     </a:stretch>
@@ -2161,7 +2676,7 @@
         <w:pStyle w:val="Legenda"/>
       </w:pPr>
       <w:r>
-        <w:t xml:space="preserve">Tabela 4.4 – Efeito da frequência do despacho do ONS (receita fixa de R$ 600 mil/(MW·ano))</w:t>
+        <w:t xml:space="preserve">Tabela 4.5 – Efeito da frequência do despacho do ONS (receita fixa de R$ 600 mil/(MW·ano))</w:t>
       </w:r>
     </w:p>
     <w:tbl>
@@ -2423,7 +2938,7 @@
         <w:pStyle w:val="BodyText"/>
       </w:pPr>
       <w:r>
-        <w:t xml:space="preserve">As receitas no MCP e com hidrogênio são idênticas nos três casos, de modo que a frequência do despacho não altera a operação do lado mercantil. A única diferença está no custo de degradação do módulo LRCAP, e as curvas de custo de oportunidade marginal da Figura 4.3(b) são deslocadas em paralelo por exatamente</w:t>
+        <w:t xml:space="preserve">As receitas no MCP e com hidrogênio são idênticas nos três casos, de modo que a frequência do despacho não altera a operação do lado mercantil. A única diferença está no custo de degradação do módulo LRCAP, e as curvas de custo de oportunidade marginal da Figura 4.4(b) são deslocadas em paralelo por exatamente</w:t>
       </w:r>
       <w:r>
         <w:t xml:space="preserve"> </w:t>
@@ -2502,14 +3017,214 @@
         <w:t xml:space="preserve">Em consequência, a frequência do despacho, embora desconhecida, não altera a potência ótima para a receita de referência e afeta apenas o limiar de entrada e o lucro. Como seu efeito é linear e pode ser calculado diretamente, sem simulação, essa incerteza pode ser incorporada à análise como um custo por MW contratado — por exemplo, como componente do lance mínimo —, sem a necessidade de cenários adicionais no modelo de operação.</w:t>
       </w:r>
     </w:p>
-    <w:bookmarkEnd w:id="22"/>
-    <w:bookmarkStart w:id="23" w:name="síntese"/>
+    <w:bookmarkEnd w:id="26"/>
+    <w:bookmarkStart w:id="33" w:name="X5d7116e36aa75b714ebe85263b9b5917fb83cc3"/>
     <w:p>
       <w:pPr>
         <w:pStyle w:val="Heading2"/>
       </w:pPr>
       <w:r>
-        <w:t xml:space="preserve">4.6 Síntese</w:t>
+        <w:t xml:space="preserve">4.7 Sensibilidade à receita fixa e ao preço do hidrogênio</w:t>
+      </w:r>
+    </w:p>
+    <w:p>
+      <w:pPr>
+        <w:pStyle w:val="FirstParagraph"/>
+      </w:pPr>
+      <w:r>
+        <w:t xml:space="preserve">Como a receita fixa do LRCAP e o preço do hidrogênio não possuem referências consolidadas, o caso determinístico de 2025 foi resolvido para 48 combinações desses parâmetros: seis valores de receita fixa, entre R$ 330 mil e R$ 2,33 milhões/(MW·ano), e oito preços de hidrogênio, entre R$ 10 e R$ 45/kg. Os valores de receita fixa incluem referências aproximadas de leilões de capacidade para armazenamento no exterior (R$ 330 mil), de leilões de capacidade para usinas térmicas existentes (R$ 830 mil) e novas (R$ 2,33 milhões) e do custo anualizado estimado de sistemas de baterias (R$ 1,5 milhão). Cada combinação foi resolvida pelo método de Benders, com</w:t>
+      </w:r>
+      <w:r>
+        <w:t xml:space="preserve"> </w:t>
+      </w:r>
+      <w:r>
+        <w:rPr>
+          <w:i/>
+          <w:iCs/>
+        </w:rPr>
+        <w:t xml:space="preserve">gap</w:t>
+      </w:r>
+      <w:r>
+        <w:t xml:space="preserve"> </w:t>
+      </w:r>
+      <w:r>
+        <w:t xml:space="preserve">máximo de 0,11%. Os resultados são apresentados na Figura 4.5.</w:t>
+      </w:r>
+    </w:p>
+    <w:p>
+      <w:pPr>
+        <w:pStyle w:val="Legenda"/>
+      </w:pPr>
+      <w:r>
+        <w:t xml:space="preserve">Figura 4.5 – Potência ótima no LRCAP e lucro anual em função da receita fixa e do preço do hidrogênio (caso determinístico de 2025)</w:t>
+      </w:r>
+    </w:p>
+    <w:p>
+      <w:pPr>
+        <w:pStyle w:val="Figura"/>
+      </w:pPr>
+      <w:r>
+        <w:drawing>
+          <wp:inline>
+            <wp:extent cx="5334000" cy="2062480"/>
+            <wp:effectExtent b="0" l="0" r="0" t="0"/>
+            <wp:docPr descr="" title="" id="28" name="Picture"/>
+            <a:graphic>
+              <a:graphicData uri="http://schemas.openxmlformats.org/drawingml/2006/picture">
+                <pic:pic>
+                  <pic:nvPicPr>
+                    <pic:cNvPr descr="figuras/mapa_sensibilidade_potencia_lucro.png" id="29" name="Picture"/>
+                    <pic:cNvPicPr>
+                      <a:picLocks noChangeArrowheads="1" noChangeAspect="1"/>
+                    </pic:cNvPicPr>
+                  </pic:nvPicPr>
+                  <pic:blipFill>
+                    <a:blip r:embed="rId27"/>
+                    <a:stretch>
+                      <a:fillRect/>
+                    </a:stretch>
+                  </pic:blipFill>
+                  <pic:spPr bwMode="auto">
+                    <a:xfrm>
+                      <a:off x="0" y="0"/>
+                      <a:ext cx="5334000" cy="2062480"/>
+                    </a:xfrm>
+                    <a:prstGeom prst="rect">
+                      <a:avLst/>
+                    </a:prstGeom>
+                    <a:noFill/>
+                    <a:ln w="9525">
+                      <a:noFill/>
+                      <a:headEnd/>
+                      <a:tailEnd/>
+                    </a:ln>
+                  </pic:spPr>
+                </pic:pic>
+              </a:graphicData>
+            </a:graphic>
+          </wp:inline>
+        </w:drawing>
+      </w:r>
+    </w:p>
+    <w:p>
+      <w:pPr>
+        <w:pStyle w:val="Fonte"/>
+      </w:pPr>
+      <w:r>
+        <w:t xml:space="preserve">Fonte: elaborado pelo autor.</w:t>
+      </w:r>
+    </w:p>
+    <w:p>
+      <w:pPr>
+        <w:pStyle w:val="BodyText"/>
+      </w:pPr>
+      <w:r>
+        <w:t xml:space="preserve">Em nenhuma das combinações é vantajoso deixar de participar do leilão: a potência ótima varia entre 43,8 e 60 MW. Com receita fixa igual ou superior a R$ 1,5 milhão/(MW·ano), o ótimo é contratar toda a potência do BESS para qualquer preço de hidrogênio da faixa avaliada. Para preços de hidrogênio de até R$ 20/kg, o ótimo também é contratar toda a potência, independentemente da receita fixa, pois o valor da energia no eletrolisador, de até R$ 336/MWh, já não justifica reservar o BESS para abastecê-lo. A região em que o ótimo é inferior a 60 MW concentra-se nas combinações de receita fixa baixa e preço de hidrogênio alto, e sua fronteira se desloca para preços maiores à medida que a receita fixa aumenta: a potência ótima deixa de ser 60 MW a partir de R$ 25/kg com receita de R$ 330 mil, de R$ 30/kg com R$ 600 mil, de R$ 40/kg com R$ 830 mil e de R$ 45/kg com R$ 1,0 milhão/(MW·ano).</w:t>
+      </w:r>
+    </w:p>
+    <w:p>
+      <w:pPr>
+        <w:pStyle w:val="BodyText"/>
+      </w:pPr>
+      <w:r>
+        <w:t xml:space="preserve">O fator de capacidade do eletrolisador acompanha esse comportamento: com hidrogênio a R$ 10/kg, o eletrolisador opera apenas com a geração FV que não encontra uso mais valioso no MCP (fator de capacidade de 0,17); a partir de R$ 25/kg, ele absorve praticamente toda a geração FV (0,34) e, quando parte do BESS permanece no lado mercantil, também opera à noite (até 0,46).</w:t>
+      </w:r>
+    </w:p>
+    <w:p>
+      <w:pPr>
+        <w:pStyle w:val="BodyText"/>
+      </w:pPr>
+      <w:r>
+        <w:t xml:space="preserve">Para avaliar o custo de uma decisão tomada sob incerteza quanto a esses parâmetros, calculou-se o arrependimento de contratar 54,4 MW — o ótimo do caso de referência —, definido como a diferença entre o lucro ótimo de cada combinação e o lucro obtido com essa potência (Figura 4.6).</w:t>
+      </w:r>
+    </w:p>
+    <w:p>
+      <w:pPr>
+        <w:pStyle w:val="Legenda"/>
+      </w:pPr>
+      <w:r>
+        <w:t xml:space="preserve">Figura 4.6 – Arrependimento de contratar 54,4 MW em função da receita fixa e do preço do hidrogênio (caso determinístico de 2025)</w:t>
+      </w:r>
+    </w:p>
+    <w:p>
+      <w:pPr>
+        <w:pStyle w:val="Figura"/>
+      </w:pPr>
+      <w:r>
+        <w:drawing>
+          <wp:inline>
+            <wp:extent cx="5334000" cy="3867150"/>
+            <wp:effectExtent b="0" l="0" r="0" t="0"/>
+            <wp:docPr descr="" title="" id="31" name="Picture"/>
+            <a:graphic>
+              <a:graphicData uri="http://schemas.openxmlformats.org/drawingml/2006/picture">
+                <pic:pic>
+                  <pic:nvPicPr>
+                    <pic:cNvPr descr="figuras/mapa_sensibilidade_arrependimento.png" id="32" name="Picture"/>
+                    <pic:cNvPicPr>
+                      <a:picLocks noChangeArrowheads="1" noChangeAspect="1"/>
+                    </pic:cNvPicPr>
+                  </pic:nvPicPr>
+                  <pic:blipFill>
+                    <a:blip r:embed="rId30"/>
+                    <a:stretch>
+                      <a:fillRect/>
+                    </a:stretch>
+                  </pic:blipFill>
+                  <pic:spPr bwMode="auto">
+                    <a:xfrm>
+                      <a:off x="0" y="0"/>
+                      <a:ext cx="5334000" cy="3867150"/>
+                    </a:xfrm>
+                    <a:prstGeom prst="rect">
+                      <a:avLst/>
+                    </a:prstGeom>
+                    <a:noFill/>
+                    <a:ln w="9525">
+                      <a:noFill/>
+                      <a:headEnd/>
+                      <a:tailEnd/>
+                    </a:ln>
+                  </pic:spPr>
+                </pic:pic>
+              </a:graphicData>
+            </a:graphic>
+          </wp:inline>
+        </w:drawing>
+      </w:r>
+    </w:p>
+    <w:p>
+      <w:pPr>
+        <w:pStyle w:val="Fonte"/>
+      </w:pPr>
+      <w:r>
+        <w:t xml:space="preserve">Fonte: elaborado pelo autor.</w:t>
+      </w:r>
+    </w:p>
+    <w:p>
+      <w:pPr>
+        <w:pStyle w:val="BodyText"/>
+      </w:pPr>
+      <w:r>
+        <w:t xml:space="preserve">O arrependimento é nulo ou inferior a R$ 0,4 milhão por ano na vizinhança do caso de referência (receita de R$ 600 mil e hidrogênio entre R$ 30 e R$ 45/kg), mas cresce para até R$ 11,6 milhões por ano quando a receita fixa é elevada, situação em que contratar toda a potência seria ótimo. O arrependimento é assimétrico: subestimar a potência a contratar custa mais do que superestimá-la. Com receita de R$ 330 mil e hidrogênio a R$ 45/kg, por exemplo, contratar 54,4 MW em vez do ótimo de 43,8 MW custa R$ 2,5 milhões por ano, enquanto, com receita de R$ 1,5 milhão e hidrogênio a R$ 35/kg, contratar 54,4 MW em vez de 60 MW custa R$ 4,4 milhões por ano. Diante da incerteza sobre a receita fixa — que, no leilão, é o próprio lance —, essa assimetria favorece decisões de contratação mais próximas da potência máxima.</w:t>
+      </w:r>
+    </w:p>
+    <w:p>
+      <w:pPr>
+        <w:pStyle w:val="BodyText"/>
+      </w:pPr>
+      <w:r>
+        <w:t xml:space="preserve">Esses resultados são coerentes com a curva de oferta da Seção 4.4, obtida com o modelo estocástico: a potência ótima para R$ 600 mil e hidrogênio a R$ 35/kg (54,4 MW no caso determinístico) e a receita a partir da qual se oferta toda a potência (cerca de R$ 900 mil, contra a fronteira entre R$ 830 mil e R$ 1,0 milhão no mapa) são compatíveis entre as duas análises.</w:t>
+      </w:r>
+    </w:p>
+    <w:bookmarkEnd w:id="33"/>
+    <w:bookmarkStart w:id="34" w:name="síntese"/>
+    <w:p>
+      <w:pPr>
+        <w:pStyle w:val="Heading2"/>
+      </w:pPr>
+      <w:r>
+        <w:t xml:space="preserve">4.8 Síntese</w:t>
       </w:r>
     </w:p>
     <w:p>
@@ -2595,13 +3310,34 @@
           <w:b/>
           <w:bCs/>
         </w:rPr>
+        <w:t xml:space="preserve">a receita fixa e o preço do hidrogênio definem a fronteira entre contratar parte ou toda a potência:</w:t>
+      </w:r>
+      <w:r>
+        <w:t xml:space="preserve"> </w:t>
+      </w:r>
+      <w:r>
+        <w:t xml:space="preserve">com receita igual ou superior a R$ 1,5 milhão/(MW·ano) ou hidrogênio a até R$ 20/kg, o ótimo é contratar toda a potência; o arrependimento de errar a contratação é assimétrico e favorece contratar mais;</w:t>
+      </w:r>
+    </w:p>
+    <w:p>
+      <w:pPr>
+        <w:numPr>
+          <w:ilvl w:val="0"/>
+          <w:numId w:val="1001"/>
+        </w:numPr>
+      </w:pPr>
+      <w:r>
+        <w:rPr>
+          <w:b/>
+          <w:bCs/>
+        </w:rPr>
         <w:t xml:space="preserve">as incertezas de preço, de geração e de despacho têm efeito pequeno sobre a decisão:</w:t>
       </w:r>
       <w:r>
         <w:t xml:space="preserve"> </w:t>
       </w:r>
       <w:r>
-        <w:t xml:space="preserve">a variação entre anos históricos resulta em VSS nulo e EVPI de 0,2% do lucro esperado, e a frequência do despacho do ONS desloca o custo de oportunidade de um valor constante, sem alterar a potência ótima.</w:t>
+        <w:t xml:space="preserve">o modelo determinístico de 2025 e o estocástico conduzem à mesma potência ótima, a variação entre anos históricos resulta em VSS nulo e EVPI de 0,2% do lucro esperado, e a frequência do despacho do ONS desloca o custo de oportunidade de um valor constante, sem alterar a potência ótima.</w:t>
       </w:r>
     </w:p>
     <w:p>
@@ -2612,8 +3348,8 @@
         <w:t xml:space="preserve">Em conjunto, esses resultados sugerem que a decisão de contratação é determinada menos pelo comportamento do mercado de energia e mais pelas condições de comercialização do hidrogênio — volume, preço e critério de qualificação —, que são, portanto, as informações prioritárias para a definição do lance no leilão.</w:t>
       </w:r>
     </w:p>
-    <w:bookmarkEnd w:id="23"/>
-    <w:bookmarkEnd w:id="24"/>
+    <w:bookmarkEnd w:id="34"/>
+    <w:bookmarkEnd w:id="35"/>
     <w:sectPr>
       <w:pgSz w:w="11906" w:h="16838"/>
       <w:pgMar w:top="1701" w:right="1134" w:bottom="1134" w:left="1701" w:header="709" w:footer="709" w:gutter="0"/>

</xml_diff>

<commit_message>
Fontes das receitas fixas do mapa de sensibilidade
Quadro 4.1 com as referências (MACSE/Terna 2025; Leilões nº 2/2026 e
nº 3/2026-ANEEL; CAPEX de BESS da EPE/PDE 2035), referências bibliográficas
no Capítulo 4 e rótulos do mapa corrigidos (2,33 mi = média do LRCAP 2/2026,
que inclui usinas novas e existentes, não só térmica nova).

Co-Authored-By: Claude Opus 5.5 <noreply@anthropic.com>
Claude-Session: https://claude.ai/code/session_01YFtn9hiQUHbNLSX7rUNYuK
</commit_message>
<xml_diff>
--- a/docs/dissertacao/cap4_resultados.docx
+++ b/docs/dissertacao/cap4_resultados.docx
@@ -2,7 +2,7 @@
 <file path=word/document.xml><?xml version="1.0" encoding="utf-8"?>
 <w:document xmlns:w="http://schemas.openxmlformats.org/wordprocessingml/2006/main" xmlns:m="http://schemas.openxmlformats.org/officeDocument/2006/math" xmlns:r="http://schemas.openxmlformats.org/officeDocument/2006/relationships" xmlns:o="urn:schemas-microsoft-com:office:office" xmlns:v="urn:schemas-microsoft-com:vml" xmlns:w10="urn:schemas-microsoft-com:office:word" xmlns:a="http://schemas.openxmlformats.org/drawingml/2006/main" xmlns:pic="http://schemas.openxmlformats.org/drawingml/2006/picture" xmlns:wp="http://schemas.openxmlformats.org/drawingml/2006/wordprocessingDrawing">
   <w:body>
-    <w:bookmarkStart w:id="35" w:name="resultados-e-discussão"/>
+    <w:bookmarkStart w:id="36" w:name="resultados-e-discussão"/>
     <w:p>
       <w:pPr>
         <w:pStyle w:val="Heading1"/>
@@ -3032,7 +3032,222 @@
         <w:pStyle w:val="FirstParagraph"/>
       </w:pPr>
       <w:r>
-        <w:t xml:space="preserve">Como a receita fixa do LRCAP e o preço do hidrogênio não possuem referências consolidadas, o caso determinístico de 2025 foi resolvido para 48 combinações desses parâmetros: seis valores de receita fixa, entre R$ 330 mil e R$ 2,33 milhões/(MW·ano), e oito preços de hidrogênio, entre R$ 10 e R$ 45/kg. Os valores de receita fixa incluem referências aproximadas de leilões de capacidade para armazenamento no exterior (R$ 330 mil), de leilões de capacidade para usinas térmicas existentes (R$ 830 mil) e novas (R$ 2,33 milhões) e do custo anualizado estimado de sistemas de baterias (R$ 1,5 milhão). Cada combinação foi resolvida pelo método de Benders, com</w:t>
+        <w:t xml:space="preserve">Como a receita fixa do LRCAP e o preço do hidrogênio não possuem referências consolidadas, o caso determinístico de 2025 foi resolvido para 48 combinações desses parâmetros: seis valores de receita fixa, entre R$ 330 mil e R$ 2,33 milhões/(MW·ano), e oito preços de hidrogênio, entre R$ 10 e R$ 45/kg. Na ausência de leilões anteriores de armazenamento no Brasil, os valores de receita fixa foram escolhidos a partir de quatro referências, sintetizadas no Quadro 4.1.</w:t>
+      </w:r>
+    </w:p>
+    <w:p>
+      <w:pPr>
+        <w:pStyle w:val="Legenda"/>
+      </w:pPr>
+      <w:r>
+        <w:t xml:space="preserve">Quadro 4.1 – Referências para a faixa de receita fixa avaliada</w:t>
+      </w:r>
+    </w:p>
+    <w:tbl>
+      <w:tblPr>
+        <w:tblStyle w:val="Table"/>
+        <w:tblW w:type="pct" w:w="5000"/>
+        <w:tblLayout w:type="fixed"/>
+        <w:tblLook w:firstRow="1" w:lastRow="0" w:firstColumn="0" w:lastColumn="0" w:noHBand="0" w:noVBand="0" w:val="0020"/>
+      </w:tblPr>
+      <w:tblGrid>
+        <w:gridCol w:w="1584"/>
+        <w:gridCol w:w="3168"/>
+        <w:gridCol w:w="3168"/>
+      </w:tblGrid>
+      <w:tr>
+        <w:trPr>
+          <w:tblHeader w:val="on"/>
+        </w:trPr>
+        <w:tc>
+          <w:tcPr/>
+          <w:p>
+            <w:pPr>
+              <w:pStyle w:val="Compact"/>
+            </w:pPr>
+            <w:r>
+              <w:t xml:space="preserve">Receita fixa (R$/MW·ano)</w:t>
+            </w:r>
+          </w:p>
+        </w:tc>
+        <w:tc>
+          <w:tcPr/>
+          <w:p>
+            <w:pPr>
+              <w:pStyle w:val="Compact"/>
+            </w:pPr>
+            <w:r>
+              <w:t xml:space="preserve">Referência</w:t>
+            </w:r>
+          </w:p>
+        </w:tc>
+        <w:tc>
+          <w:tcPr/>
+          <w:p>
+            <w:pPr>
+              <w:pStyle w:val="Compact"/>
+            </w:pPr>
+            <w:r>
+              <w:t xml:space="preserve">Observação</w:t>
+            </w:r>
+          </w:p>
+        </w:tc>
+      </w:tr>
+      <w:tr>
+        <w:tc>
+          <w:tcPr/>
+          <w:p>
+            <w:pPr>
+              <w:pStyle w:val="Compact"/>
+            </w:pPr>
+            <w:r>
+              <w:t xml:space="preserve">330 mil</w:t>
+            </w:r>
+          </w:p>
+        </w:tc>
+        <w:tc>
+          <w:tcPr/>
+          <w:p>
+            <w:pPr>
+              <w:pStyle w:val="Compact"/>
+            </w:pPr>
+            <w:r>
+              <w:t xml:space="preserve">Primeiro leilão do MACSE, Itália, 30/09/2025: preço médio de € 12.959/(MWh·ano) para sistemas de baterias de íons de lítio, contratos de 15 anos (TERNA, 2025)</w:t>
+            </w:r>
+          </w:p>
+        </w:tc>
+        <w:tc>
+          <w:tcPr/>
+          <w:p>
+            <w:pPr>
+              <w:pStyle w:val="Compact"/>
+            </w:pPr>
+            <w:r>
+              <w:t xml:space="preserve">Convertido para um sistema de 4 h (€ 51.836/(MW·ano)) com a PTAX de 30/09/2025 (R$ 6,2396/€), o que resulta em R$ 323 mil; arredondado na grade</w:t>
+            </w:r>
+          </w:p>
+        </w:tc>
+      </w:tr>
+      <w:tr>
+        <w:tc>
+          <w:tcPr/>
+          <w:p>
+            <w:pPr>
+              <w:pStyle w:val="Compact"/>
+            </w:pPr>
+            <w:r>
+              <w:t xml:space="preserve">830 mil</w:t>
+            </w:r>
+          </w:p>
+        </w:tc>
+        <w:tc>
+          <w:tcPr/>
+          <w:p>
+            <w:pPr>
+              <w:pStyle w:val="Compact"/>
+            </w:pPr>
+            <w:r>
+              <w:t xml:space="preserve">Leilão nº 3/2026-ANEEL (LRCAP), 20/03/2026: 501,3 MW de termelétricas existentes a óleo e biodiesel, preço médio de R$ 831.251,52/(MW·ano), deságio de 50,1% (CCEE, 2026b)</w:t>
+            </w:r>
+          </w:p>
+        </w:tc>
+        <w:tc>
+          <w:tcPr/>
+          <w:p>
+            <w:pPr>
+              <w:pStyle w:val="Compact"/>
+            </w:pPr>
+            <w:r>
+              <w:t xml:space="preserve">Usinas existentes, sem investimento novo: piso de referência para o produto potência</w:t>
+            </w:r>
+          </w:p>
+        </w:tc>
+      </w:tr>
+      <w:tr>
+        <w:tc>
+          <w:tcPr/>
+          <w:p>
+            <w:pPr>
+              <w:pStyle w:val="Compact"/>
+            </w:pPr>
+            <w:r>
+              <w:t xml:space="preserve">1,0 e 1,5 mi</w:t>
+            </w:r>
+          </w:p>
+        </w:tc>
+        <w:tc>
+          <w:tcPr/>
+          <w:p>
+            <w:pPr>
+              <w:pStyle w:val="Compact"/>
+            </w:pPr>
+            <w:r>
+              <w:t xml:space="preserve">CAPEX de referência de sistemas de baterias de R$ 5.000 a 6.000/kW (BRASIL; EPE, 2025)</w:t>
+            </w:r>
+          </w:p>
+        </w:tc>
+        <w:tc>
+          <w:tcPr/>
+          <w:p>
+            <w:pPr>
+              <w:pStyle w:val="Compact"/>
+            </w:pPr>
+            <w:r>
+              <w:t xml:space="preserve">A anualização do CAPEX a 10% a.a. em 15 anos resulta em R$ 657 mil a R$ 789 mil/(MW·ano); os valores da grade acrescentam O&amp;M, encargos, tributos e reposição de módulos para manter a disponibilidade</w:t>
+            </w:r>
+          </w:p>
+        </w:tc>
+      </w:tr>
+      <w:tr>
+        <w:tc>
+          <w:tcPr/>
+          <w:p>
+            <w:pPr>
+              <w:pStyle w:val="Compact"/>
+            </w:pPr>
+            <w:r>
+              <w:t xml:space="preserve">2,33 mi</w:t>
+            </w:r>
+          </w:p>
+        </w:tc>
+        <w:tc>
+          <w:tcPr/>
+          <w:p>
+            <w:pPr>
+              <w:pStyle w:val="Compact"/>
+            </w:pPr>
+            <w:r>
+              <w:t xml:space="preserve">Leilão nº 2/2026-ANEEL (LRCAP), 18/03/2026: 18,97 GW de termelétricas a gás natural, biometano e carvão e ampliações de hidrelétricas, novas e existentes, preço médio de R$ 2,334 milhões/(MW·ano), deságio de 5,5% (CCEE, 2026a)</w:t>
+            </w:r>
+          </w:p>
+        </w:tc>
+        <w:tc>
+          <w:tcPr/>
+          <w:p>
+            <w:pPr>
+              <w:pStyle w:val="Compact"/>
+            </w:pPr>
+            <w:r>
+              <w:t xml:space="preserve">Custo de atender à mesma necessidade de potência com a expansão térmica e hidrelétrica: teto de referência</w:t>
+            </w:r>
+          </w:p>
+        </w:tc>
+      </w:tr>
+    </w:tbl>
+    <w:p>
+      <w:pPr>
+        <w:pStyle w:val="Fonte"/>
+      </w:pPr>
+      <w:r>
+        <w:t xml:space="preserve">Fonte: elaborado pelo autor.</w:t>
+      </w:r>
+    </w:p>
+    <w:p>
+      <w:pPr>
+        <w:pStyle w:val="BodyText"/>
+      </w:pPr>
+      <w:r>
+        <w:t xml:space="preserve">O valor de R$ 600 mil/(MW·ano), adotado no caso de referência, situa-se, portanto, abaixo do preço obtido por usinas existentes no LRCAP de 2026 e abaixo do custo anualizado de investimento em baterias, e deve ser interpretado como hipótese conservadora para a receita fixa. Cada combinação foi resolvida pelo método de Benders, com</w:t>
       </w:r>
       <w:r>
         <w:t xml:space="preserve"> </w:t>
@@ -3214,7 +3429,7 @@
         <w:pStyle w:val="BodyText"/>
       </w:pPr>
       <w:r>
-        <w:t xml:space="preserve">Esses resultados são coerentes com a curva de oferta da Seção 4.4, obtida com o modelo estocástico: a potência ótima para R$ 600 mil e hidrogênio a R$ 35/kg (54,4 MW no caso determinístico) e a receita a partir da qual se oferta toda a potência (cerca de R$ 900 mil, contra a fronteira entre R$ 830 mil e R$ 1,0 milhão no mapa) são compatíveis entre as duas análises.</w:t>
+        <w:t xml:space="preserve">Os resultados das Figuras 4.5 e 4.6 são coerentes com a curva de oferta da Seção 4.4, obtida com o modelo estocástico: a potência ótima para R$ 600 mil e hidrogênio a R$ 35/kg (54,4 MW no caso determinístico) e a receita a partir da qual se oferta toda a potência (cerca de R$ 900 mil, contra a fronteira entre R$ 830 mil e R$ 1,0 milhão no mapa) são compatíveis entre as duas análises.</w:t>
       </w:r>
     </w:p>
     <w:bookmarkEnd w:id="33"/>
@@ -3349,7 +3564,101 @@
       </w:r>
     </w:p>
     <w:bookmarkEnd w:id="34"/>
+    <w:bookmarkStart w:id="35" w:name="referências"/>
+    <w:p>
+      <w:pPr>
+        <w:pStyle w:val="Heading2"/>
+      </w:pPr>
+      <w:r>
+        <w:t xml:space="preserve">REFERÊNCIAS</w:t>
+      </w:r>
+    </w:p>
+    <w:p>
+      <w:pPr>
+        <w:pStyle w:val="Referencia"/>
+      </w:pPr>
+      <w:r>
+        <w:t xml:space="preserve">BRASIL. Ministério de Minas e Energia; EPE – EMPRESA DE PESQUISA ENERGÉTICA.</w:t>
+      </w:r>
+      <w:r>
+        <w:t xml:space="preserve"> </w:t>
+      </w:r>
+      <w:r>
+        <w:rPr>
+          <w:b/>
+          <w:bCs/>
+        </w:rPr>
+        <w:t xml:space="preserve">Caderno de parâmetros de custos</w:t>
+      </w:r>
+      <w:r>
+        <w:t xml:space="preserve">: geração e transmissão – PDE 2035. Brasília: MME/EPE, nov. 2025.</w:t>
+      </w:r>
+    </w:p>
+    <w:p>
+      <w:pPr>
+        <w:pStyle w:val="Referencia"/>
+      </w:pPr>
+      <w:r>
+        <w:t xml:space="preserve">CCEE – CÂMARA DE COMERCIALIZAÇÃO DE ENERGIA ELÉTRICA.</w:t>
+      </w:r>
+      <w:r>
+        <w:t xml:space="preserve"> </w:t>
+      </w:r>
+      <w:r>
+        <w:rPr>
+          <w:b/>
+          <w:bCs/>
+        </w:rPr>
+        <w:t xml:space="preserve">InfoLeilão Expresso</w:t>
+      </w:r>
+      <w:r>
+        <w:t xml:space="preserve">: 04º LRCAP 2026 – Leilão nº 2/2026-ANEEL. São Paulo: CCEE, mar. 2026a. Disponível em: https://www.ccee.org.br. Acesso em: 3 out. 2026.</w:t>
+      </w:r>
+    </w:p>
+    <w:p>
+      <w:pPr>
+        <w:pStyle w:val="Referencia"/>
+      </w:pPr>
+      <w:r>
+        <w:t xml:space="preserve">CCEE – CÂMARA DE COMERCIALIZAÇÃO DE ENERGIA ELÉTRICA.</w:t>
+      </w:r>
+      <w:r>
+        <w:t xml:space="preserve"> </w:t>
+      </w:r>
+      <w:r>
+        <w:rPr>
+          <w:b/>
+          <w:bCs/>
+        </w:rPr>
+        <w:t xml:space="preserve">InfoLeilão Expresso</w:t>
+      </w:r>
+      <w:r>
+        <w:t xml:space="preserve">: 05º LRCAP 2026 – Leilão nº 3/2026-ANEEL. São Paulo: CCEE, mar. 2026b. Disponível em: https://www.ccee.org.br. Acesso em: 3 out. 2026.</w:t>
+      </w:r>
+    </w:p>
+    <w:p>
+      <w:pPr>
+        <w:pStyle w:val="Referencia"/>
+      </w:pPr>
+      <w:r>
+        <w:t xml:space="preserve">TERNA.</w:t>
+      </w:r>
+      <w:r>
+        <w:t xml:space="preserve"> </w:t>
+      </w:r>
+      <w:r>
+        <w:rPr>
+          <w:b/>
+          <w:bCs/>
+        </w:rPr>
+        <w:t xml:space="preserve">Terna completes first MACSE auction</w:t>
+      </w:r>
+      <w:r>
+        <w:t xml:space="preserve">: 10 GWh of energy storage capacity awarded. Roma: Terna S.p.A., 1 out. 2025. Comunicado de imprensa. Disponível em: https://www.terna.it. Acesso em: 3 out. 2026.</w:t>
+      </w:r>
+    </w:p>
     <w:bookmarkEnd w:id="35"/>
+    <w:bookmarkEnd w:id="36"/>
     <w:sectPr>
       <w:pgSz w:w="11906" w:h="16838"/>
       <w:pgMar w:top="1701" w:right="1134" w:bottom="1134" w:left="1701" w:header="709" w:footer="709" w:gutter="0"/>

</xml_diff>

<commit_message>
Figura 4.2 com o ótimo refinado de 54,4 MW
estocastico.py --so-graficos usa o ótimo do cálculo do VSS/EVPI (tolerância
0,01%) quando disponível e formata decimais com vírgula; texto da Seção 4.2 e
README ajustados.

Co-Authored-By: Claude Opus 5.5 <noreply@anthropic.com>
Claude-Session: https://claude.ai/code/session_01YFtn9hiQUHbNLSX7rUNYuK
</commit_message>
<xml_diff>
--- a/docs/dissertacao/cap4_resultados.docx
+++ b/docs/dissertacao/cap4_resultados.docx
@@ -627,7 +627,54 @@
         <w:pStyle w:val="BodyText"/>
       </w:pPr>
       <w:r>
-        <w:t xml:space="preserve">Com tolerância de convergência de 0,1%, o algoritmo de Benders identificou o ótimo em 53,4 MW, valor assinalado na Figura 4.2. Com a tolerância de 0,01% adotada no cálculo do VSS e do EVPI, o ótimo passou para 54,4 MW, com lucro esperado de R$ 68,12 milhões por ano — apenas R$ 20 mil acima do obtido com 53,4 MW. A diferença ilustra uma característica central do problema: a função de lucro é muito plana na vizinhança do ótimo, com variação inferior a 0,4% entre 50 e 56 MW. Do ponto de vista prático, a decisão relevante é contratar entre 50 e 55 MW; a localização exata do máximo é menos importante do que as hipóteses que o determinam, examinadas nas seções seguintes.</w:t>
+        <w:t xml:space="preserve">O ótimo, assinalado na Figura 4.2, é</w:t>
+      </w:r>
+      <w:r>
+        <w:t xml:space="preserve"> </w:t>
+      </w:r>
+      <m:oMath>
+        <m:sSup>
+          <m:e>
+            <m:r>
+              <m:t>P</m:t>
+            </m:r>
+          </m:e>
+          <m:sup>
+            <m:r>
+              <m:t>c</m:t>
+            </m:r>
+            <m:r>
+              <m:t>a</m:t>
+            </m:r>
+            <m:r>
+              <m:t>p</m:t>
+            </m:r>
+          </m:sup>
+        </m:sSup>
+        <m:r>
+          <m:rPr>
+            <m:sty m:val="p"/>
+          </m:rPr>
+          <m:t>=</m:t>
+        </m:r>
+        <m:r>
+          <m:t>54</m:t>
+        </m:r>
+        <m:r>
+          <m:rPr>
+            <m:sty m:val="p"/>
+          </m:rPr>
+          <m:t>,</m:t>
+        </m:r>
+        <m:r>
+          <m:t>4</m:t>
+        </m:r>
+      </m:oMath>
+      <w:r>
+        <w:t xml:space="preserve"> </w:t>
+      </w:r>
+      <w:r>
+        <w:t xml:space="preserve">MW, com lucro esperado de R$ 68,12 milhões por ano, obtido com tolerância de convergência de 0,01%. Com a tolerância de 0,1% usada inicialmente, o algoritmo de Benders havia encerrado em 53,4 MW, com lucro esperado apenas R$ 20 mil inferior. A diferença ilustra uma característica central do problema: a função de lucro é muito plana na vizinhança do ótimo, com variação inferior a 0,4% entre 50 e 56 MW. Do ponto de vista prático, a decisão relevante é contratar entre 50 e 55 MW; a localização exata do máximo é menos importante do que as hipóteses que o determinam, examinadas nas seções seguintes.</w:t>
       </w:r>
     </w:p>
     <w:p>

</xml_diff>

<commit_message>
Capítulo 4 e README: dimensionamento do BESS e bateria isolada
Nova Seção 4.2.4 e Tabela 4.5 com o lance do BESS dimensionado para o
contrato (R$ 1,064 mi até 50 MW) e da bateria isolada (R$ 1,195 mi);
tabelas seguintes renumeradas e síntese atualizada.

Co-Authored-By: Claude Opus 5.5 <noreply@anthropic.com>
Claude-Session: https://claude.ai/code/session_01YFtn9hiQUHbNLSX7rUNYuK
</commit_message>
<xml_diff>
--- a/docs/dissertacao/cap4_resultados.docx
+++ b/docs/dissertacao/cap4_resultados.docx
@@ -2,7 +2,7 @@
 <file path=word/document.xml><?xml version="1.0" encoding="utf-8"?>
 <w:document xmlns:w="http://schemas.openxmlformats.org/wordprocessingml/2006/main" xmlns:m="http://schemas.openxmlformats.org/officeDocument/2006/math" xmlns:r="http://schemas.openxmlformats.org/officeDocument/2006/relationships" xmlns:o="urn:schemas-microsoft-com:office:office" xmlns:v="urn:schemas-microsoft-com:vml" xmlns:w10="urn:schemas-microsoft-com:office:word" xmlns:a="http://schemas.openxmlformats.org/drawingml/2006/main" xmlns:pic="http://schemas.openxmlformats.org/drawingml/2006/picture" xmlns:wp="http://schemas.openxmlformats.org/drawingml/2006/wordprocessingDrawing">
   <w:body>
-    <w:bookmarkStart w:id="54" w:name="resultados-e-discussão"/>
+    <w:bookmarkStart w:id="55" w:name="resultados-e-discussão"/>
     <w:p>
       <w:pPr>
         <w:pStyle w:val="Heading1"/>
@@ -594,7 +594,7 @@
       </w:r>
     </w:p>
     <w:bookmarkEnd w:id="12"/>
-    <w:bookmarkStart w:id="22" w:name="Xb33ba098ecda1c076dd3fa5147f472532b1bd56"/>
+    <w:bookmarkStart w:id="23" w:name="Xb33ba098ecda1c076dd3fa5147f472532b1bd56"/>
     <w:p>
       <w:pPr>
         <w:pStyle w:val="Heading2"/>
@@ -608,7 +608,7 @@
         <w:pStyle w:val="FirstParagraph"/>
       </w:pPr>
       <w:r>
-        <w:t xml:space="preserve">Esta seção apresenta o resultado principal do trabalho: a decisão de um proponente que precisa construir o BESS para participar do leilão, situação prevista na Portaria, que trata da contratação de novos sistemas de armazenamento (BRASIL, 2026). A Subseção 4.2.1 avalia a viabilidade do empreendimento com a receita fixa de referência; a Subseção 4.2.2, o valor do BESS e o lance mínimo; e a Subseção 4.2.3, a sensibilidade do lance mínimo às hipóteses do modelo.</w:t>
+        <w:t xml:space="preserve">Esta seção apresenta o resultado principal do trabalho: a decisão de um proponente que precisa construir o BESS para participar do leilão, situação prevista na Portaria, que trata da contratação de novos sistemas de armazenamento (BRASIL, 2026). A Subseção 4.2.1 avalia a viabilidade do empreendimento com a receita fixa de referência; a Subseção 4.2.2, o valor do BESS e o lance mínimo; a Subseção 4.2.3, a sensibilidade do lance mínimo às hipóteses do modelo; e a Subseção 4.2.4, o dimensionamento do BESS e a comparação com uma bateria isolada.</w:t>
       </w:r>
     </w:p>
     <w:bookmarkStart w:id="16" w:name="viabilidade-do-empreendimento"/>
@@ -1661,7 +1661,19 @@
         <w:t xml:space="preserve">“tudo ou nada”</w:t>
       </w:r>
       <w:r>
-        <w:t xml:space="preserve">: abaixo do lance mínimo, o proponente não constrói a bateria e não oferta potência; acima dele, oferta toda a potência do BESS, de 60 MW. A curva escalonada da Seção 4.3 descreve, portanto, a decisão de um proponente que já dispõe do BESS. O lance mínimo no caso central é de R$ 1,115 milhão/(MW·ano) e coincide com o custo anual equivalente do BESS por MW (Figura 4.3(b)): R$ 934 mil de capital, R$ 158 mil de O&amp;M com reposição de módulos e R$ 22 mil de acréscimo de uso da rede. O capital reflete a energia da bateria: com 300 MWh, ou 5 h, o investimento é de R$ 380 milhões, 15% acima do valor de referência de um sistema de 4 h. O uso da rede pesa pouco porque a bateria compartilha a conexão com a usina FV e eleva o montante de uso de injeção em apenas 10 MW. As demais parcelas são nulas: o consumo auxiliar de 1% da potência cabe na folga de recarga custeada pela CONCAP, e, com 60 MW contratados, o módulo mercantil se anula, de modo que o uso mercantil da bateria não reduz o lance. O lance mínimo supera em 34% o preço médio obtido por termelétricas existentes no LRCAP de março de 2026 (R$ 831 mil/(MW·ano)) — mesmo no cenário mais favorável, com investimento baixo e taxa de 8%, ele fica em R$ 838 mil — e é muito inferior ao das termelétricas e hidrelétricas do leilão anterior (R$ 2,33 milhões/(MW·ano)). Isso sugere que o armazenamento em baterias é competitivo frente à expansão térmica, mas não frente às usinas existentes. A receita de R$ 600 mil/(MW·ano) adotada no caso de referência é inferior ao lance mínimo em todas as combinações avaliadas: com ela, um proponente racional não construiria o BESS.</w:t>
+        <w:t xml:space="preserve">: abaixo do lance mínimo, o proponente não constrói a bateria e não oferta potência; acima dele, oferta toda a potência do BESS de referência, de 60 MW. Com a bateria dimensionada para o contrato, a oferta deixa de ser</w:t>
+      </w:r>
+      <w:r>
+        <w:t xml:space="preserve"> </w:t>
+      </w:r>
+      <w:r>
+        <w:t xml:space="preserve">“tudo ou nada”</w:t>
+      </w:r>
+      <w:r>
+        <w:t xml:space="preserve"> </w:t>
+      </w:r>
+      <w:r>
+        <w:t xml:space="preserve">(Subseção 4.2.4). A curva escalonada da Seção 4.3 descreve, portanto, a decisão de um proponente que já dispõe do BESS. O lance mínimo no caso central é de R$ 1,115 milhão/(MW·ano) e coincide com o custo anual equivalente do BESS por MW (Figura 4.3(b)): R$ 934 mil de capital, R$ 158 mil de O&amp;M com reposição de módulos e R$ 22 mil de acréscimo de uso da rede. O capital reflete a energia da bateria: com 300 MWh, ou 5 h, o investimento é de R$ 380 milhões, 15% acima do valor de referência de um sistema de 4 h. O uso da rede pesa pouco porque a bateria compartilha a conexão com a usina FV e eleva o montante de uso de injeção em apenas 10 MW. As demais parcelas são nulas: o consumo auxiliar de 1% da potência cabe na folga de recarga custeada pela CONCAP, e, com 60 MW contratados, o módulo mercantil se anula, de modo que o uso mercantil da bateria não reduz o lance. O lance mínimo supera em 34% o preço médio obtido por termelétricas existentes no LRCAP de março de 2026 (R$ 831 mil/(MW·ano)) — mesmo no cenário mais favorável, com investimento baixo e taxa de 8%, ele fica em R$ 838 mil — e é muito inferior ao das termelétricas e hidrelétricas do leilão anterior (R$ 2,33 milhões/(MW·ano)). Isso sugere que o armazenamento em baterias é competitivo frente à expansão térmica, mas não frente às usinas existentes. A receita de R$ 600 mil/(MW·ano) adotada no caso de referência é inferior ao lance mínimo em todas as combinações avaliadas: com ela, um proponente racional não construiria o BESS.</w:t>
       </w:r>
     </w:p>
     <w:bookmarkEnd w:id="20"/>
@@ -3102,8 +3114,378 @@
       </w:r>
     </w:p>
     <w:bookmarkEnd w:id="21"/>
+    <w:bookmarkStart w:id="22" w:name="Xecea054f1f21e6d64ad55e12ed02f53637149e7"/>
+    <w:p>
+      <w:pPr>
+        <w:pStyle w:val="Heading3"/>
+      </w:pPr>
+      <w:r>
+        <w:t xml:space="preserve">4.2.4 Dimensionamento do BESS e bateria isolada</w:t>
+      </w:r>
+    </w:p>
+    <w:p>
+      <w:pPr>
+        <w:pStyle w:val="FirstParagraph"/>
+      </w:pPr>
+      <w:r>
+        <w:t xml:space="preserve">Os resultados anteriores consideram o BESS de 60 MW e 300 MWh do caso de referência. Para uma bateria construída para o leilão, porém, o tamanho pode ser escolhido junto com o lance (Seção 3.8.3). A Tabela 4.5 compara o lance mínimo do BESS de referência com o de baterias dimensionadas para o contrato, com potência igual à contratada e energia de 4,8 MWh por MW, no arranjo híbrido e numa bateria isolada.</w:t>
+      </w:r>
+    </w:p>
+    <w:p>
+      <w:pPr>
+        <w:pStyle w:val="Legenda"/>
+      </w:pPr>
+      <w:r>
+        <w:t xml:space="preserve">Tabela 4.5 – Lance mínimo por arranjo e dimensionamento do BESS, em R$ mil/(MW·ano), com investimento de referência central</w:t>
+      </w:r>
+    </w:p>
+    <w:tbl>
+      <w:tblPr>
+        <w:tblStyle w:val="Table"/>
+        <w:tblW w:type="pct" w:w="5000"/>
+        <w:tblLayout w:type="fixed"/>
+        <w:tblLook w:firstRow="1" w:lastRow="0" w:firstColumn="0" w:lastColumn="0" w:noHBand="0" w:noVBand="0" w:val="0020"/>
+      </w:tblPr>
+      <w:tblGrid>
+        <w:gridCol w:w="3046"/>
+        <w:gridCol w:w="1218"/>
+        <w:gridCol w:w="1218"/>
+        <w:gridCol w:w="1218"/>
+        <w:gridCol w:w="1218"/>
+      </w:tblGrid>
+      <w:tr>
+        <w:trPr>
+          <w:tblHeader w:val="on"/>
+        </w:trPr>
+        <w:tc>
+          <w:tcPr/>
+          <w:p>
+            <w:pPr>
+              <w:pStyle w:val="Compact"/>
+            </w:pPr>
+            <w:r>
+              <w:t xml:space="preserve">Arranjo</w:t>
+            </w:r>
+          </w:p>
+        </w:tc>
+        <w:tc>
+          <w:tcPr/>
+          <w:p>
+            <w:pPr>
+              <w:pStyle w:val="Compact"/>
+            </w:pPr>
+            <w:r>
+              <w:t xml:space="preserve">Potência (MW)</w:t>
+            </w:r>
+          </w:p>
+        </w:tc>
+        <w:tc>
+          <w:tcPr/>
+          <w:p>
+            <w:pPr>
+              <w:pStyle w:val="Compact"/>
+            </w:pPr>
+            <w:r>
+              <w:t xml:space="preserve">Energia (MWh)</w:t>
+            </w:r>
+          </w:p>
+        </w:tc>
+        <w:tc>
+          <w:tcPr/>
+          <w:p>
+            <w:pPr>
+              <w:pStyle w:val="Compact"/>
+            </w:pPr>
+            <w:r>
+              <w:t xml:space="preserve">Taxa de 12,1%</w:t>
+            </w:r>
+          </w:p>
+        </w:tc>
+        <w:tc>
+          <w:tcPr/>
+          <w:p>
+            <w:pPr>
+              <w:pStyle w:val="Compact"/>
+            </w:pPr>
+            <w:r>
+              <w:t xml:space="preserve">Taxa de 8,0%</w:t>
+            </w:r>
+          </w:p>
+        </w:tc>
+      </w:tr>
+      <w:tr>
+        <w:tc>
+          <w:tcPr/>
+          <w:p>
+            <w:pPr>
+              <w:pStyle w:val="Compact"/>
+            </w:pPr>
+            <w:r>
+              <w:t xml:space="preserve">Híbrido, BESS de referência</w:t>
+            </w:r>
+          </w:p>
+        </w:tc>
+        <w:tc>
+          <w:tcPr/>
+          <w:p>
+            <w:pPr>
+              <w:pStyle w:val="Compact"/>
+            </w:pPr>
+            <w:r>
+              <w:t xml:space="preserve">60</w:t>
+            </w:r>
+          </w:p>
+        </w:tc>
+        <w:tc>
+          <w:tcPr/>
+          <w:p>
+            <w:pPr>
+              <w:pStyle w:val="Compact"/>
+            </w:pPr>
+            <w:r>
+              <w:t xml:space="preserve">300</w:t>
+            </w:r>
+          </w:p>
+        </w:tc>
+        <w:tc>
+          <w:tcPr/>
+          <w:p>
+            <w:pPr>
+              <w:pStyle w:val="Compact"/>
+            </w:pPr>
+            <w:r>
+              <w:t xml:space="preserve">1.115</w:t>
+            </w:r>
+          </w:p>
+        </w:tc>
+        <w:tc>
+          <w:tcPr/>
+          <w:p>
+            <w:pPr>
+              <w:pStyle w:val="Compact"/>
+            </w:pPr>
+            <w:r>
+              <w:t xml:space="preserve">919</w:t>
+            </w:r>
+          </w:p>
+        </w:tc>
+      </w:tr>
+      <w:tr>
+        <w:tc>
+          <w:tcPr/>
+          <w:p>
+            <w:pPr>
+              <w:pStyle w:val="Compact"/>
+            </w:pPr>
+            <w:r>
+              <w:t xml:space="preserve">Híbrido, dimensionado para o contrato</w:t>
+            </w:r>
+          </w:p>
+        </w:tc>
+        <w:tc>
+          <w:tcPr/>
+          <w:p>
+            <w:pPr>
+              <w:pStyle w:val="Compact"/>
+            </w:pPr>
+            <w:r>
+              <w:t xml:space="preserve">60</w:t>
+            </w:r>
+          </w:p>
+        </w:tc>
+        <w:tc>
+          <w:tcPr/>
+          <w:p>
+            <w:pPr>
+              <w:pStyle w:val="Compact"/>
+            </w:pPr>
+            <w:r>
+              <w:t xml:space="preserve">288</w:t>
+            </w:r>
+          </w:p>
+        </w:tc>
+        <w:tc>
+          <w:tcPr/>
+          <w:p>
+            <w:pPr>
+              <w:pStyle w:val="Compact"/>
+            </w:pPr>
+            <w:r>
+              <w:t xml:space="preserve">1.086</w:t>
+            </w:r>
+          </w:p>
+        </w:tc>
+        <w:tc>
+          <w:tcPr/>
+          <w:p>
+            <w:pPr>
+              <w:pStyle w:val="Compact"/>
+            </w:pPr>
+            <w:r>
+              <w:t xml:space="preserve">896</w:t>
+            </w:r>
+          </w:p>
+        </w:tc>
+      </w:tr>
+      <w:tr>
+        <w:tc>
+          <w:tcPr/>
+          <w:p>
+            <w:pPr>
+              <w:pStyle w:val="Compact"/>
+            </w:pPr>
+            <w:r>
+              <w:t xml:space="preserve">Híbrido, dimensionado para o contrato</w:t>
+            </w:r>
+          </w:p>
+        </w:tc>
+        <w:tc>
+          <w:tcPr/>
+          <w:p>
+            <w:pPr>
+              <w:pStyle w:val="Compact"/>
+            </w:pPr>
+            <w:r>
+              <w:t xml:space="preserve">30 a 50</w:t>
+            </w:r>
+          </w:p>
+        </w:tc>
+        <w:tc>
+          <w:tcPr/>
+          <w:p>
+            <w:pPr>
+              <w:pStyle w:val="Compact"/>
+            </w:pPr>
+            <w:r>
+              <w:t xml:space="preserve">4,8 por MW</w:t>
+            </w:r>
+          </w:p>
+        </w:tc>
+        <w:tc>
+          <w:tcPr/>
+          <w:p>
+            <w:pPr>
+              <w:pStyle w:val="Compact"/>
+            </w:pPr>
+            <w:r>
+              <w:t xml:space="preserve">1.064</w:t>
+            </w:r>
+          </w:p>
+        </w:tc>
+        <w:tc>
+          <w:tcPr/>
+          <w:p>
+            <w:pPr>
+              <w:pStyle w:val="Compact"/>
+            </w:pPr>
+            <w:r>
+              <w:t xml:space="preserve">874</w:t>
+            </w:r>
+          </w:p>
+        </w:tc>
+      </w:tr>
+      <w:tr>
+        <w:tc>
+          <w:tcPr/>
+          <w:p>
+            <w:pPr>
+              <w:pStyle w:val="Compact"/>
+            </w:pPr>
+            <w:r>
+              <w:t xml:space="preserve">Bateria isolada, dimensionada para o contrato</w:t>
+            </w:r>
+          </w:p>
+        </w:tc>
+        <w:tc>
+          <w:tcPr/>
+          <w:p>
+            <w:pPr>
+              <w:pStyle w:val="Compact"/>
+            </w:pPr>
+            <w:r>
+              <w:t xml:space="preserve">30 a 60</w:t>
+            </w:r>
+          </w:p>
+        </w:tc>
+        <w:tc>
+          <w:tcPr/>
+          <w:p>
+            <w:pPr>
+              <w:pStyle w:val="Compact"/>
+            </w:pPr>
+            <w:r>
+              <w:t xml:space="preserve">4,8 por MW</w:t>
+            </w:r>
+          </w:p>
+        </w:tc>
+        <w:tc>
+          <w:tcPr/>
+          <w:p>
+            <w:pPr>
+              <w:pStyle w:val="Compact"/>
+            </w:pPr>
+            <w:r>
+              <w:t xml:space="preserve">1.195</w:t>
+            </w:r>
+          </w:p>
+        </w:tc>
+        <w:tc>
+          <w:tcPr/>
+          <w:p>
+            <w:pPr>
+              <w:pStyle w:val="Compact"/>
+            </w:pPr>
+            <w:r>
+              <w:t xml:space="preserve">1.005</w:t>
+            </w:r>
+          </w:p>
+        </w:tc>
+      </w:tr>
+    </w:tbl>
+    <w:p>
+      <w:pPr>
+        <w:pStyle w:val="Fonte"/>
+      </w:pPr>
+      <w:r>
+        <w:t xml:space="preserve">Fonte: elaborado pelo autor.</w:t>
+      </w:r>
+    </w:p>
+    <w:p>
+      <w:pPr>
+        <w:pStyle w:val="BodyText"/>
+      </w:pPr>
+      <w:r>
+        <w:t xml:space="preserve">O cálculo da Seção 3.8.3 foi verificado com o modelo de operação: com o BESS dimensionado para o contrato de 30 e de 50 MW, o lucro operacional esperado, somada a degradação do módulo LRCAP, foi igual ao lucro sem BESS, como previsto.</w:t>
+      </w:r>
+    </w:p>
+    <w:p>
+      <w:pPr>
+        <w:pStyle w:val="BodyText"/>
+      </w:pPr>
+      <w:r>
+        <w:t xml:space="preserve">Três resultados se destacam. Primeiro, a bateria do leilão deve ser dimensionada para o contrato, pois o módulo mercantil não se paga no lance. No BESS de referência, ofertar 57,5 MW e manter 2,5 MW e 24 MWh para uso mercantil acrescenta R$ 2,1 milhões por ano ao lucro, mas essa capacidade custa R$ 4,7 milhões por ano entre capital, O&amp;M e uso da rede; já os 12 MWh além do necessário para 60 MW custam R$ 29 mil/(MW·ano) no lance. Segundo, com o BESS dimensionado para o contrato, o lance por MW não depende da potência até a potência da usina FV, porque a bateria cabe no montante de uso de injeção já contratado pela usina; acima de 50 MW, cada MW adicional acrescenta TUST, e o lance cresce até R$ 1,086 milhão/(MW·ano) com 60 MW. A oferta deixa de ser</w:t>
+      </w:r>
+      <w:r>
+        <w:t xml:space="preserve"> </w:t>
+      </w:r>
+      <w:r>
+        <w:t xml:space="preserve">“tudo ou nada”</w:t>
+      </w:r>
+      <w:r>
+        <w:t xml:space="preserve">: o proponente ofertaria qualquer quantidade entre 30 e 50 MW a partir de R$ 1,064 milhão/(MW·ano) e quantidades maiores a preços crescentes.</w:t>
+      </w:r>
+    </w:p>
+    <w:p>
+      <w:pPr>
+        <w:pStyle w:val="BodyText"/>
+      </w:pPr>
+      <w:r>
+        <w:t xml:space="preserve">Terceiro, a bateria isolada, que paga a TUST sobre toda a sua potência, tem lance de R$ 1,195 milhão/(MW·ano), R$ 131 mil acima do híbrido. Como, no lance, o uso mercantil é nulo nos dois arranjos, essa diferença decorre inteiramente do compartilhamento da conexão: no lance mínimo, o papel da usina FV com produção de hidrogênio é dividir o ponto de conexão, e não fornecer receitas à bateria. O compartilhamento da infraestrutura de conexão, que também reduziria o investimento do arranjo híbrido, não foi quantificado.</w:t>
+      </w:r>
+    </w:p>
     <w:bookmarkEnd w:id="22"/>
-    <w:bookmarkStart w:id="51" w:name="Xcde85c54f79c458b3aea976799b86356d7ba359"/>
+    <w:bookmarkEnd w:id="23"/>
+    <w:bookmarkStart w:id="52" w:name="Xcde85c54f79c458b3aea976799b86356d7ba359"/>
     <w:p>
       <w:pPr>
         <w:pStyle w:val="Heading2"/>
@@ -3120,7 +3502,7 @@
         <w:t xml:space="preserve">Esta seção supõe que o BESS está disponível — porque já existe ou porque foi construído com receita fixa acima do lance mínimo — e analisa quanto de sua potência contratar no leilão e como o sistema opera. Os resultados utilizam a receita fixa de referência de R$ 600 mil/(MW·ano), inferior ao lance mínimo da Seção 4.2, mas a curva de oferta fornece a decisão para qualquer receita; acima do lance mínimo, ela indica a oferta de 57,5 a 60 MW. A análise identifica os mecanismos que determinam o custo de oportunidade da contratação e a sensibilidade da decisão às hipóteses de operação e de mercado.</w:t>
       </w:r>
     </w:p>
-    <w:bookmarkStart w:id="26" w:name="X56b8d8d6087674c35fe11f865ddd535a2471b8b"/>
+    <w:bookmarkStart w:id="27" w:name="X56b8d8d6087674c35fe11f865ddd535a2471b8b"/>
     <w:p>
       <w:pPr>
         <w:pStyle w:val="Heading3"/>
@@ -3154,18 +3536,18 @@
           <wp:inline>
             <wp:extent cx="5334000" cy="1962912"/>
             <wp:effectExtent b="0" l="0" r="0" t="0"/>
-            <wp:docPr descr="" title="" id="24" name="Picture"/>
+            <wp:docPr descr="" title="" id="25" name="Picture"/>
             <a:graphic>
               <a:graphicData uri="http://schemas.openxmlformats.org/drawingml/2006/picture">
                 <pic:pic>
                   <pic:nvPicPr>
-                    <pic:cNvPr descr="figuras/estocastico_unifei.png" id="25" name="Picture"/>
+                    <pic:cNvPr descr="figuras/estocastico_unifei.png" id="26" name="Picture"/>
                     <pic:cNvPicPr>
                       <a:picLocks noChangeArrowheads="1" noChangeAspect="1"/>
                     </pic:cNvPicPr>
                   </pic:nvPicPr>
                   <pic:blipFill>
-                    <a:blip r:embed="rId23"/>
+                    <a:blip r:embed="rId24"/>
                     <a:stretch>
                       <a:fillRect/>
                     </a:stretch>
@@ -3260,7 +3642,7 @@
         <w:pStyle w:val="BodyText"/>
       </w:pPr>
       <w:r>
-        <w:t xml:space="preserve">O lucro por cenário na potência ótima é apresentado na Tabela 4.5. O pior cenário é 2022, ano em que o PLD permaneceu próximo do piso regulatório, e o melhor, 2021, ano da crise hídrica. A diferença entre eles, de cerca de R$ 8 milhões por ano, é pequena diante do ganho proporcionado pela participação no leilão.</w:t>
+        <w:t xml:space="preserve">O lucro por cenário na potência ótima é apresentado na Tabela 4.6. O pior cenário é 2022, ano em que o PLD permaneceu próximo do piso regulatório, e o melhor, 2021, ano da crise hídrica. A diferença entre eles, de cerca de R$ 8 milhões por ano, é pequena diante do ganho proporcionado pela participação no leilão.</w:t>
       </w:r>
     </w:p>
     <w:p>
@@ -3268,7 +3650,7 @@
         <w:pStyle w:val="Legenda"/>
       </w:pPr>
       <w:r>
-        <w:t xml:space="preserve">Tabela 4.5 – Lucro anual por cenário na potência ótima (54,4 MW)</w:t>
+        <w:t xml:space="preserve">Tabela 4.6 – Lucro anual por cenário na potência ótima (54,4 MW)</w:t>
       </w:r>
     </w:p>
     <w:tbl>
@@ -3618,8 +4000,8 @@
         <w:t xml:space="preserve">A composição do lucro médio na potência de 55 MW, ponto da grade da Seção 3.8 mais próximo do ótimo, é: R$ 33,0 milhões de receita fixa do LRCAP, R$ 36,0 milhões de receita com hidrogênio e R$ 5,1 milhões no MCP, deduzidos R$ 4,4 milhões de degradação do BESS e R$ 1,6 milhão de custos variáveis de produção de hidrogênio. O eletrolisador consome 56,6 GWh por ano, cerca de três quartos da energia FV disponível, com fator de capacidade de 0,37, e produz 1.029 t de hidrogênio; os 19,4 GWh restantes são exportados ao MCP. Esse resultado antecipa a principal conclusão da Subseção 4.3.4: com o hidrogênio vendido sem limite de volume a R$ 35/kg, cada MWh destinado ao eletrolisador vale cerca de R$ 609, e o MCP tem papel secundário na operação.</w:t>
       </w:r>
     </w:p>
-    <w:bookmarkEnd w:id="26"/>
-    <w:bookmarkStart w:id="27" w:name="X803239abd151ab68ada138485f7ac164ea0f3ed"/>
+    <w:bookmarkEnd w:id="27"/>
+    <w:bookmarkStart w:id="28" w:name="X803239abd151ab68ada138485f7ac164ea0f3ed"/>
     <w:p>
       <w:pPr>
         <w:pStyle w:val="Heading3"/>
@@ -3633,7 +4015,7 @@
         <w:pStyle w:val="FirstParagraph"/>
       </w:pPr>
       <w:r>
-        <w:t xml:space="preserve">A Tabela 4.6 compara a decisão estocástica (RP) com a decisão obtida no ano médio (EV) e com a solução espera-e-vê (WS), calculadas segundo a Seção 3.7.4.</w:t>
+        <w:t xml:space="preserve">A Tabela 4.7 compara a decisão estocástica (RP) com a decisão obtida no ano médio (EV) e com a solução espera-e-vê (WS), calculadas segundo a Seção 3.7.4.</w:t>
       </w:r>
     </w:p>
     <w:p>
@@ -3641,7 +4023,7 @@
         <w:pStyle w:val="Legenda"/>
       </w:pPr>
       <w:r>
-        <w:t xml:space="preserve">Tabela 4.6 – Decisões e lucro anual por cenário para o cálculo do VSS e do EVPI</w:t>
+        <w:t xml:space="preserve">Tabela 4.7 – Decisões e lucro anual por cenário para o cálculo do VSS e do EVPI</w:t>
       </w:r>
     </w:p>
     <w:tbl>
@@ -4072,8 +4454,8 @@
         <w:t xml:space="preserve">Dois aspectos merecem destaque. Primeiro, embora o ano médio conduza à decisão correta, ele superestima o lucro: o valor ótimo do problema EV foi de R$ 68,89 milhões, contra R$ 68,12 milhões do EEV. A diferença, de cerca de R$ 0,8 milhão por ano, resulta da suavização dos picos e vales de preço e de irradiância pela média hora a hora, e confirma que o ano médio não deve ser usado para estimar a receita do empreendimento. Segundo, os baixos valores de VSS e de EVPI indicam que a incerteza modelada — a variação de preço e de geração entre anos — tem pouco efeito sobre a decisão de contratação. As subseções seguintes mostram que outras hipóteses, não representadas nos cenários, têm efeito muito maior.</w:t>
       </w:r>
     </w:p>
-    <w:bookmarkEnd w:id="27"/>
-    <w:bookmarkStart w:id="31" w:name="curva-de-oferta"/>
+    <w:bookmarkEnd w:id="28"/>
+    <w:bookmarkStart w:id="32" w:name="curva-de-oferta"/>
     <w:p>
       <w:pPr>
         <w:pStyle w:val="Heading3"/>
@@ -4107,18 +4489,18 @@
           <wp:inline>
             <wp:extent cx="5334000" cy="1635760"/>
             <wp:effectExtent b="0" l="0" r="0" t="0"/>
-            <wp:docPr descr="" title="" id="29" name="Picture"/>
+            <wp:docPr descr="" title="" id="30" name="Picture"/>
             <a:graphic>
               <a:graphicData uri="http://schemas.openxmlformats.org/drawingml/2006/picture">
                 <pic:pic>
                   <pic:nvPicPr>
-                    <pic:cNvPr descr="figuras/curva_oferta.png" id="30" name="Picture"/>
+                    <pic:cNvPr descr="figuras/curva_oferta.png" id="31" name="Picture"/>
                     <pic:cNvPicPr>
                       <a:picLocks noChangeArrowheads="1" noChangeAspect="1"/>
                     </pic:cNvPicPr>
                   </pic:nvPicPr>
                   <pic:blipFill>
-                    <a:blip r:embed="rId28"/>
+                    <a:blip r:embed="rId29"/>
                     <a:stretch>
                       <a:fillRect/>
                     </a:stretch>
@@ -4198,8 +4580,8 @@
         <w:t xml:space="preserve">Esse resultado tem duas implicações para o proponente. A decisão de participar do leilão é robusta, pois o limiar de entrada é baixo em todos os casos avaliados (R$ 76 mil a R$ 96 mil/(MW·ano)), muito inferior a qualquer receita fixa plausível para sistemas de armazenamento. Por outro lado, a quantidade a ofertar acima de cerca de 40 MW é sensível tanto ao preço quanto às hipóteses sobre o hidrogênio, como mostra a subseção seguinte.</w:t>
       </w:r>
     </w:p>
-    <w:bookmarkEnd w:id="31"/>
-    <w:bookmarkStart w:id="32" w:name="Xecdbf8e9b0c8cf7cf478028b36aa5fe92ae5811"/>
+    <w:bookmarkEnd w:id="32"/>
+    <w:bookmarkStart w:id="33" w:name="Xecdbf8e9b0c8cf7cf478028b36aa5fe92ae5811"/>
     <w:p>
       <w:pPr>
         <w:pStyle w:val="Heading3"/>
@@ -4213,7 +4595,7 @@
         <w:pStyle w:val="FirstParagraph"/>
       </w:pPr>
       <w:r>
-        <w:t xml:space="preserve">A Tabela 4.7 resume, para a receita fixa de referência, a potência ótima, o lucro e a operação média de cada caso.</w:t>
+        <w:t xml:space="preserve">A Tabela 4.8 resume, para a receita fixa de referência, a potência ótima, o lucro e a operação média de cada caso.</w:t>
       </w:r>
     </w:p>
     <w:p>
@@ -4221,7 +4603,7 @@
         <w:pStyle w:val="Legenda"/>
       </w:pPr>
       <w:r>
-        <w:t xml:space="preserve">Tabela 4.7 – Potência ótima, lucro e operação média nos casos de contrato de hidrogênio e de importação (receita fixa de R$ 600 mil/(MW·ano))</w:t>
+        <w:t xml:space="preserve">Tabela 4.8 – Potência ótima, lucro e operação média nos casos de contrato de hidrogênio e de importação (receita fixa de R$ 600 mil/(MW·ano))</w:t>
       </w:r>
     </w:p>
     <w:tbl>
@@ -5215,8 +5597,8 @@
         <w:t xml:space="preserve">Esses resultados indicam que a troca entre o LRCAP e o MCP só se manifesta plenamente quando a demanda de hidrogênio é limitada. Sem limite de volume, a troca relevante é entre o LRCAP e a produção de hidrogênio, mediada pelo módulo mercantil do BESS; a regra de suprimento do eletrolisador é, entre as hipóteses avaliadas, a de maior efeito sobre o lucro.</w:t>
       </w:r>
     </w:p>
-    <w:bookmarkEnd w:id="32"/>
-    <w:bookmarkStart w:id="36" w:name="frequência-do-despacho-do-ons"/>
+    <w:bookmarkEnd w:id="33"/>
+    <w:bookmarkStart w:id="37" w:name="frequência-do-despacho-do-ons"/>
     <w:p>
       <w:pPr>
         <w:pStyle w:val="Heading3"/>
@@ -5230,7 +5612,7 @@
         <w:pStyle w:val="FirstParagraph"/>
       </w:pPr>
       <w:r>
-        <w:t xml:space="preserve">A Figura 4.6 e a Tabela 4.8 apresentam a curva de oferta do caso de referência para 50, 150 e 365 despachos por ano.</w:t>
+        <w:t xml:space="preserve">A Figura 4.6 e a Tabela 4.9 apresentam a curva de oferta do caso de referência para 50, 150 e 365 despachos por ano.</w:t>
       </w:r>
     </w:p>
     <w:p>
@@ -5250,18 +5632,18 @@
           <wp:inline>
             <wp:extent cx="5334000" cy="1635760"/>
             <wp:effectExtent b="0" l="0" r="0" t="0"/>
-            <wp:docPr descr="" title="" id="34" name="Picture"/>
+            <wp:docPr descr="" title="" id="35" name="Picture"/>
             <a:graphic>
               <a:graphicData uri="http://schemas.openxmlformats.org/drawingml/2006/picture">
                 <pic:pic>
                   <pic:nvPicPr>
-                    <pic:cNvPr descr="figuras/curva_oferta_ciclos.png" id="35" name="Picture"/>
+                    <pic:cNvPr descr="figuras/curva_oferta_ciclos.png" id="36" name="Picture"/>
                     <pic:cNvPicPr>
                       <a:picLocks noChangeArrowheads="1" noChangeAspect="1"/>
                     </pic:cNvPicPr>
                   </pic:nvPicPr>
                   <pic:blipFill>
-                    <a:blip r:embed="rId33"/>
+                    <a:blip r:embed="rId34"/>
                     <a:stretch>
                       <a:fillRect/>
                     </a:stretch>
@@ -5301,7 +5683,7 @@
         <w:pStyle w:val="Legenda"/>
       </w:pPr>
       <w:r>
-        <w:t xml:space="preserve">Tabela 4.8 – Efeito da frequência do despacho do ONS (receita fixa de R$ 600 mil/(MW·ano))</w:t>
+        <w:t xml:space="preserve">Tabela 4.9 – Efeito da frequência do despacho do ONS (receita fixa de R$ 600 mil/(MW·ano))</w:t>
       </w:r>
     </w:p>
     <w:tbl>
@@ -5642,8 +6024,8 @@
         <w:t xml:space="preserve">Em consequência, a frequência do despacho, embora desconhecida, não altera a potência ótima para a receita de referência e afeta apenas o limiar de entrada e o lucro. Como seu efeito é linear e pode ser calculado diretamente, sem simulação, essa incerteza pode ser incorporada à análise como um custo por MW contratado — por exemplo, como componente do lance mínimo —, sem a necessidade de cenários adicionais no modelo de operação.</w:t>
       </w:r>
     </w:p>
-    <w:bookmarkEnd w:id="36"/>
-    <w:bookmarkStart w:id="43" w:name="custo-de-degradação-e-dimensionamento"/>
+    <w:bookmarkEnd w:id="37"/>
+    <w:bookmarkStart w:id="44" w:name="custo-de-degradação-e-dimensionamento"/>
     <w:p>
       <w:pPr>
         <w:pStyle w:val="Heading3"/>
@@ -5675,7 +6057,7 @@
         <w:t xml:space="preserve"> </w:t>
       </w:r>
       <w:r>
-        <w:t xml:space="preserve">A Figura 4.7 e a Tabela 4.9 apresentam a curva de oferta para custos de degradação de R$ 50, R$ 100 e R$ 200/MWh, os dois últimos próximos da faixa estimada a partir do custo de reposição dos módulos (Seção 3.5).</w:t>
+        <w:t xml:space="preserve">A Figura 4.7 e a Tabela 4.10 apresentam a curva de oferta para custos de degradação de R$ 50, R$ 100 e R$ 200/MWh, os dois últimos próximos da faixa estimada a partir do custo de reposição dos módulos (Seção 3.5).</w:t>
       </w:r>
     </w:p>
     <w:p>
@@ -5695,18 +6077,18 @@
           <wp:inline>
             <wp:extent cx="5334000" cy="1635760"/>
             <wp:effectExtent b="0" l="0" r="0" t="0"/>
-            <wp:docPr descr="" title="" id="38" name="Picture"/>
+            <wp:docPr descr="" title="" id="39" name="Picture"/>
             <a:graphic>
               <a:graphicData uri="http://schemas.openxmlformats.org/drawingml/2006/picture">
                 <pic:pic>
                   <pic:nvPicPr>
-                    <pic:cNvPr descr="figuras/curva_oferta_degradacao.png" id="39" name="Picture"/>
+                    <pic:cNvPr descr="figuras/curva_oferta_degradacao.png" id="40" name="Picture"/>
                     <pic:cNvPicPr>
                       <a:picLocks noChangeArrowheads="1" noChangeAspect="1"/>
                     </pic:cNvPicPr>
                   </pic:nvPicPr>
                   <pic:blipFill>
-                    <a:blip r:embed="rId37"/>
+                    <a:blip r:embed="rId38"/>
                     <a:stretch>
                       <a:fillRect/>
                     </a:stretch>
@@ -5746,7 +6128,7 @@
         <w:pStyle w:val="Legenda"/>
       </w:pPr>
       <w:r>
-        <w:t xml:space="preserve">Tabela 4.9 – Efeito do custo de degradação do BESS (receita fixa de R$ 600 mil/(MW·ano))</w:t>
+        <w:t xml:space="preserve">Tabela 4.10 – Efeito do custo de degradação do BESS (receita fixa de R$ 600 mil/(MW·ano))</w:t>
       </w:r>
     </w:p>
     <w:tbl>
@@ -6026,7 +6408,7 @@
         <w:t xml:space="preserve"> </w:t>
       </w:r>
       <w:r>
-        <w:t xml:space="preserve">A Figura 4.8 e a Tabela 4.10 comparam eletrolisadores de 10, 17,5 e 25 MW, mantida a usina FV de 50 MWp.</w:t>
+        <w:t xml:space="preserve">A Figura 4.8 e a Tabela 4.11 comparam eletrolisadores de 10, 17,5 e 25 MW, mantida a usina FV de 50 MWp.</w:t>
       </w:r>
     </w:p>
     <w:p>
@@ -6046,18 +6428,18 @@
           <wp:inline>
             <wp:extent cx="5334000" cy="1635760"/>
             <wp:effectExtent b="0" l="0" r="0" t="0"/>
-            <wp:docPr descr="" title="" id="41" name="Picture"/>
+            <wp:docPr descr="" title="" id="42" name="Picture"/>
             <a:graphic>
               <a:graphicData uri="http://schemas.openxmlformats.org/drawingml/2006/picture">
                 <pic:pic>
                   <pic:nvPicPr>
-                    <pic:cNvPr descr="figuras/curva_oferta_eletrolisador.png" id="42" name="Picture"/>
+                    <pic:cNvPr descr="figuras/curva_oferta_eletrolisador.png" id="43" name="Picture"/>
                     <pic:cNvPicPr>
                       <a:picLocks noChangeArrowheads="1" noChangeAspect="1"/>
                     </pic:cNvPicPr>
                   </pic:nvPicPr>
                   <pic:blipFill>
-                    <a:blip r:embed="rId40"/>
+                    <a:blip r:embed="rId41"/>
                     <a:stretch>
                       <a:fillRect/>
                     </a:stretch>
@@ -6097,7 +6479,7 @@
         <w:pStyle w:val="Legenda"/>
       </w:pPr>
       <w:r>
-        <w:t xml:space="preserve">Tabela 4.10 – Efeito da potência do eletrolisador (receita fixa de R$ 600 mil/(MW·ano))</w:t>
+        <w:t xml:space="preserve">Tabela 4.11 – Efeito da potência do eletrolisador (receita fixa de R$ 600 mil/(MW·ano))</w:t>
       </w:r>
     </w:p>
     <w:tbl>
@@ -6425,8 +6807,8 @@
         <w:t xml:space="preserve">No caso com contrato de 3 t/dia, a ampliação do tanque de hidrogênio de 2 t para 10 t reduz o déficit anual de entrega, com 55 MW contratados, de 40 t para 11 t, e eleva o lucro operacional esperado em R$ 1,6 milhão por ano. O tanque maior guarda o hidrogênio produzido nos dias de alta irradiância para os dias nublados, função que, com o tanque de 2 t, cabia ao módulo mercantil do BESS. Por isso, o custo de oportunidade marginal entre 30 e 50 MW cai de R$ 100–169 mil para R$ 85–126 mil/(MW·ano), e o lance mínimo para construir o BESS cai de R$ 1,078 milhão para R$ 1,056 milhão/(MW·ano) (Tabela 4.4). A potência ótima para a receita de referência permanece em 55 MW. Com 60 MW contratados, porém, os dois tanques produzem o mesmo resultado: sem o módulo mercantil, o eletrolisador opera apenas nas horas de sol, a entrega de 3 t/dia exige cerca de 9,4 h diárias na potência nominal, e raramente sobra hidrogênio para guardar. Esse efeito do tanque só aparece com a fronteira da relaxação linear (Subseção 4.1): com a condição cíclica semanal, o tanque era esvaziado no início de cada semana e sua ampliação não tinha efeito.</w:t>
       </w:r>
     </w:p>
-    <w:bookmarkEnd w:id="43"/>
-    <w:bookmarkStart w:id="50" w:name="X5d7116e36aa75b714ebe85263b9b5917fb83cc3"/>
+    <w:bookmarkEnd w:id="44"/>
+    <w:bookmarkStart w:id="51" w:name="X5d7116e36aa75b714ebe85263b9b5917fb83cc3"/>
     <w:p>
       <w:pPr>
         <w:pStyle w:val="Heading3"/>
@@ -6691,18 +7073,18 @@
           <wp:inline>
             <wp:extent cx="5334000" cy="2062480"/>
             <wp:effectExtent b="0" l="0" r="0" t="0"/>
-            <wp:docPr descr="" title="" id="45" name="Picture"/>
+            <wp:docPr descr="" title="" id="46" name="Picture"/>
             <a:graphic>
               <a:graphicData uri="http://schemas.openxmlformats.org/drawingml/2006/picture">
                 <pic:pic>
                   <pic:nvPicPr>
-                    <pic:cNvPr descr="figuras/mapa_sensibilidade_potencia_lucro.png" id="46" name="Picture"/>
+                    <pic:cNvPr descr="figuras/mapa_sensibilidade_potencia_lucro.png" id="47" name="Picture"/>
                     <pic:cNvPicPr>
                       <a:picLocks noChangeArrowheads="1" noChangeAspect="1"/>
                     </pic:cNvPicPr>
                   </pic:nvPicPr>
                   <pic:blipFill>
-                    <a:blip r:embed="rId44"/>
+                    <a:blip r:embed="rId45"/>
                     <a:stretch>
                       <a:fillRect/>
                     </a:stretch>
@@ -6778,18 +7160,18 @@
           <wp:inline>
             <wp:extent cx="5334000" cy="3867150"/>
             <wp:effectExtent b="0" l="0" r="0" t="0"/>
-            <wp:docPr descr="" title="" id="48" name="Picture"/>
+            <wp:docPr descr="" title="" id="49" name="Picture"/>
             <a:graphic>
               <a:graphicData uri="http://schemas.openxmlformats.org/drawingml/2006/picture">
                 <pic:pic>
                   <pic:nvPicPr>
-                    <pic:cNvPr descr="figuras/mapa_sensibilidade_arrependimento.png" id="49" name="Picture"/>
+                    <pic:cNvPr descr="figuras/mapa_sensibilidade_arrependimento.png" id="50" name="Picture"/>
                     <pic:cNvPicPr>
                       <a:picLocks noChangeArrowheads="1" noChangeAspect="1"/>
                     </pic:cNvPicPr>
                   </pic:nvPicPr>
                   <pic:blipFill>
-                    <a:blip r:embed="rId47"/>
+                    <a:blip r:embed="rId48"/>
                     <a:stretch>
                       <a:fillRect/>
                     </a:stretch>
@@ -6840,9 +7222,9 @@
         <w:t xml:space="preserve">Os resultados das Figuras 4.5 e 4.6 são coerentes com a curva de oferta da Subseção 4.3.3, obtida com o modelo estocástico: a potência ótima para R$ 600 mil e hidrogênio a R$ 35/kg (54,4 MW no caso determinístico) e a receita a partir da qual se oferta toda a potência (cerca de R$ 900 mil, contra a fronteira entre R$ 830 mil e R$ 1,0 milhão no mapa) são compatíveis entre as duas análises.</w:t>
       </w:r>
     </w:p>
-    <w:bookmarkEnd w:id="50"/>
     <w:bookmarkEnd w:id="51"/>
-    <w:bookmarkStart w:id="52" w:name="síntese"/>
+    <w:bookmarkEnd w:id="52"/>
+    <w:bookmarkStart w:id="53" w:name="síntese"/>
     <w:p>
       <w:pPr>
         <w:pStyle w:val="Heading2"/>
@@ -6883,76 +7265,64 @@
           <w:b/>
           <w:bCs/>
         </w:rPr>
-        <w:t xml:space="preserve">a oferta é do tipo</w:t>
-      </w:r>
+        <w:t xml:space="preserve">a bateria do leilão deve ser dimensionada para o contrato:</w:t>
+      </w:r>
+      <w:r>
+        <w:t xml:space="preserve"> </w:t>
+      </w:r>
+      <w:r>
+        <w:t xml:space="preserve">o módulo mercantil não se paga no lance, e, com a bateria dimensionada para o contrato, o proponente ofertaria qualquer potência entre 30 e 50 MW ao mesmo lance mínimo, que só cresce acima da potência da usina FV; com o BESS de referência, de 60 MW e 300 MWh, a oferta é do tipo</w:t>
+      </w:r>
+      <w:r>
+        <w:t xml:space="preserve"> </w:t>
+      </w:r>
+      <w:r>
+        <w:t xml:space="preserve">“tudo ou nada”</w:t>
+      </w:r>
+      <w:r>
+        <w:t xml:space="preserve">;</w:t>
+      </w:r>
+    </w:p>
+    <w:p>
+      <w:pPr>
+        <w:numPr>
+          <w:ilvl w:val="0"/>
+          <w:numId w:val="1001"/>
+        </w:numPr>
+      </w:pPr>
       <w:r>
         <w:rPr>
           <w:b/>
           <w:bCs/>
         </w:rPr>
+        <w:t xml:space="preserve">o lance mínimo é de cerca de R$ 1,06 milhão/(MW·ano) com a bateria dimensionada para o contrato</w:t>
+      </w:r>
+      <w:r>
         <w:t xml:space="preserve"> </w:t>
       </w:r>
+      <w:r>
+        <w:t xml:space="preserve">(R$ 1,12 milhão com o BESS de referência), com investimento de referência de R$ 5.500/kW para 4 h e taxa de 12,1% antes de impostos; varia de R$ 1,02 milhão a R$ 1,35 milhão/(MW·ano) com o BESS de referência, conforme a duração de referência do custo da bateria, a regra de cobrança do uso da rede, o investimento, o O&amp;M e a disponibilidade; corresponde ao custo anual equivalente do BESS por MW (Equação (3.45)) e supera o preço obtido por termelétricas existentes no LRCAP de 2026 (R$ 831 mil); com a taxa após impostos, que ignora o imposto de renda, cairia para R$ 874 mil;</w:t>
+      </w:r>
+    </w:p>
+    <w:p>
+      <w:pPr>
+        <w:numPr>
+          <w:ilvl w:val="0"/>
+          <w:numId w:val="1001"/>
+        </w:numPr>
+      </w:pPr>
       <w:r>
         <w:rPr>
           <w:b/>
           <w:bCs/>
         </w:rPr>
-        <w:t xml:space="preserve">“tudo ou nada”</w:t>
-      </w:r>
-      <w:r>
-        <w:rPr>
-          <w:b/>
-          <w:bCs/>
-        </w:rPr>
-        <w:t xml:space="preserve">:</w:t>
+        <w:t xml:space="preserve">o papel do arranjo híbrido no lance é o compartilhamento da conexão:</w:t>
       </w:r>
       <w:r>
         <w:t xml:space="preserve"> </w:t>
       </w:r>
       <w:r>
-        <w:t xml:space="preserve">abaixo do lance mínimo, o BESS não é construído; acima dele, oferta-se praticamente toda a potência da bateria (55 a 60 MW);</w:t>
-      </w:r>
-    </w:p>
-    <w:p>
-      <w:pPr>
-        <w:numPr>
-          <w:ilvl w:val="0"/>
-          <w:numId w:val="1001"/>
-        </w:numPr>
-      </w:pPr>
-      <w:r>
-        <w:rPr>
-          <w:b/>
-          <w:bCs/>
-        </w:rPr>
-        <w:t xml:space="preserve">o lance mínimo é de cerca de R$ 1,12 milhão/(MW·ano) no caso central</w:t>
-      </w:r>
-      <w:r>
-        <w:t xml:space="preserve"> </w:t>
-      </w:r>
-      <w:r>
-        <w:t xml:space="preserve">(investimento de referência de R$ 5.500/kW para 4 h e taxa de 12,1% antes de impostos) e varia de R$ 1,02 milhão a R$ 1,35 milhão/(MW·ano) conforme a duração de referência do custo da bateria, a regra de cobrança do uso da rede, o investimento, o O&amp;M e a disponibilidade; ele coincide com o custo anual equivalente do BESS por MW — capital, O&amp;M com reposição de módulos e acréscimo de uso da rede (Equação (3.45)) — e supera em 34% o preço obtido por termelétricas existentes no LRCAP de 2026; com a taxa após impostos, que ignora o imposto de renda, cairia para R$ 919 mil;</w:t>
-      </w:r>
-    </w:p>
-    <w:p>
-      <w:pPr>
-        <w:numPr>
-          <w:ilvl w:val="0"/>
-          <w:numId w:val="1001"/>
-        </w:numPr>
-      </w:pPr>
-      <w:r>
-        <w:rPr>
-          <w:b/>
-          <w:bCs/>
-        </w:rPr>
-        <w:t xml:space="preserve">as hipóteses sobre o hidrogênio alteram pouco o lance mínimo</w:t>
-      </w:r>
-      <w:r>
-        <w:t xml:space="preserve"> </w:t>
-      </w:r>
-      <w:r>
-        <w:t xml:space="preserve">(redução de até 5%, no contrato firme de 3 t/dia com tanque de 10 t, efeito que depende da multa contratual adotada), e o arranjo híbrido o reduz sobretudo pelo compartilhamento da conexão com a usina FV (R$ 109 mil/(MW·ano)); as hipóteses sobre o hidrogênio determinam, porém, a viabilidade do empreendimento como um todo: com os parâmetros adotados, nenhum caso se paga, e o preço de equilíbrio do hidrogênio no caso de referência é de cerca de R$ 103/kg;</w:t>
+        <w:t xml:space="preserve">uma bateria isolada teria lance de R$ 1,20 milhão/(MW·ano), R$ 131 mil acima do híbrido, e as hipóteses sobre o hidrogênio alteram pouco o lance (redução de até 5%, no contrato firme de 3 t/dia com tanque de 10 t, efeito que depende da multa contratual adotada); essas hipóteses determinam, porém, a viabilidade do empreendimento como um todo: com os parâmetros adotados, nenhum caso se paga, e o preço de equilíbrio do hidrogênio no caso de referência é de cerca de R$ 103/kg;</w:t>
       </w:r>
     </w:p>
     <w:p>
@@ -7111,8 +7481,8 @@
         <w:t xml:space="preserve">Em conjunto, os resultados indicam que, para um BESS novo, a arbitragem relevante não se dá entre o LRCAP e o mercado de curto prazo na operação, mas na decisão de investimento: a bateria é construída para o leilão, e o lance é determinado pelo seu custo. A produção de hidrogênio, por sua vez, define se o empreendimento híbrido como um todo é viável, e as condições de sua comercialização — preço, volume e critério de qualificação — são as informações prioritárias para essa avaliação.</w:t>
       </w:r>
     </w:p>
-    <w:bookmarkEnd w:id="52"/>
-    <w:bookmarkStart w:id="53" w:name="referências"/>
+    <w:bookmarkEnd w:id="53"/>
+    <w:bookmarkStart w:id="54" w:name="referências"/>
     <w:p>
       <w:pPr>
         <w:pStyle w:val="Heading2"/>
@@ -7205,8 +7575,8 @@
         <w:t xml:space="preserve">: 10 GWh of energy storage capacity awarded. Roma: Terna S.p.A., 1 out. 2025. Comunicado de imprensa. Disponível em: https://www.terna.it. Acesso em: 3 out. 2026.</w:t>
       </w:r>
     </w:p>
-    <w:bookmarkEnd w:id="53"/>
     <w:bookmarkEnd w:id="54"/>
+    <w:bookmarkEnd w:id="55"/>
     <w:sectPr>
       <w:pgSz w:w="11906" w:h="16838"/>
       <w:pgMar w:top="1701" w:right="1134" w:bottom="1134" w:left="1701" w:header="709" w:footer="709" w:gutter="0"/>

</xml_diff>

<commit_message>
Fronteira risco-retorno com tolerância de 0,01%: troca pequena, não degenerada
Com beta em {0; 0,5; 1; 2; 5}, a potência ótima recua de 54,4 para 52,1 MW;
o lucro esperado cai R$ 81 mil/ano e o CVaR sobe R$ 85 mil/ano. Atualiza a
Seção 4.3.1, o README, a Figura 4.4 e regenera o .docx do capítulo 4.

Co-Authored-By: Claude Opus 5.5 <noreply@anthropic.com>
Claude-Session: https://claude.ai/code/session_01YFtn9hiQUHbNLSX7rUNYuK
</commit_message>
<xml_diff>
--- a/docs/dissertacao/cap4_resultados.docx
+++ b/docs/dissertacao/cap4_resultados.docx
@@ -538,7 +538,7 @@
         <w:pStyle w:val="BodyText"/>
       </w:pPr>
       <w:r>
-        <w:t xml:space="preserve">As duas abordagens conduzem à mesma potência ótima. As diferenças de composição decorrem principalmente do preço. Embora a série ERA5 de 2025 apresente fator de capacidade FV ligeiramente inferior ao da média dos cenários SARAH-3 (16,9% contra 17,5%), o caso determinístico produz mais hidrogênio. No modelo estocástico, os picos de PLD do cenário de 2021, que superam o valor da energia no eletrolisador, tornam a exportação ao MCP mais vantajosa em parte das horas, o que eleva a receita média no mercado de curto prazo e reduz a produção de hidrogênio. A coincidência das potências ótimas antecipa o resultado da Subseção 4.3.2: a variação entre anos pouco altera a decisão de contratação.</w:t>
+        <w:t xml:space="preserve">As duas abordagens conduzem à mesma potência ótima. A comparação da composição, porém, não isola o efeito de um único fator, pois os dois casos diferem em quatro hipóteses: os anos de preço (2025 contra 2021 a 2025), a base de irradiância (ERA5 de 2023, reposicionada no calendário de 2025, contra SARAH-3), a regra de despacho do ONS (perfil fixo contra perfil baseado no PLD) e o custo de partida do eletrolisador (nulo contra R$ 500 por partida). Embora a série ERA5 apresente fator de capacidade FV ligeiramente inferior ao da média dos cenários SARAH-3 (16,9% contra 17,5%), o caso determinístico produz mais hidrogênio. Duas causas contribuem para isso: no modelo estocástico, os picos de PLD do cenário de 2021, que superam o valor da energia no eletrolisador, tornam a exportação ao MCP mais vantajosa em parte das horas, e o custo de partida desestimula ligamentos curtos do eletrolisador. A coincidência das potências ótimas, apesar dessas diferenças, antecipa o resultado da Subseção 4.3.2: a variação entre anos pouco altera a decisão de contratação.</w:t>
       </w:r>
     </w:p>
     <w:p>
@@ -775,40 +775,40 @@
               <w:pStyle w:val="Compact"/>
             </w:pPr>
             <w:r>
-              <w:t xml:space="preserve">−471 (−637 a −259)</w:t>
-            </w:r>
-          </w:p>
-        </w:tc>
-        <w:tc>
-          <w:tcPr/>
-          <w:p>
-            <w:pPr>
-              <w:pStyle w:val="Compact"/>
-            </w:pPr>
-            <w:r>
-              <w:t xml:space="preserve">−389</w:t>
-            </w:r>
-          </w:p>
-        </w:tc>
-        <w:tc>
-          <w:tcPr/>
-          <w:p>
-            <w:pPr>
-              <w:pStyle w:val="Compact"/>
-            </w:pPr>
-            <w:r>
-              <w:t xml:space="preserve">−1,6%</w:t>
-            </w:r>
-          </w:p>
-        </w:tc>
-        <w:tc>
-          <w:tcPr/>
-          <w:p>
-            <w:pPr>
-              <w:pStyle w:val="Compact"/>
-            </w:pPr>
-            <w:r>
-              <w:t xml:space="preserve">103</w:t>
+              <w:t xml:space="preserve">−489 (−655 a −277)</w:t>
+            </w:r>
+          </w:p>
+        </w:tc>
+        <w:tc>
+          <w:tcPr/>
+          <w:p>
+            <w:pPr>
+              <w:pStyle w:val="Compact"/>
+            </w:pPr>
+            <w:r>
+              <w:t xml:space="preserve">−412</w:t>
+            </w:r>
+          </w:p>
+        </w:tc>
+        <w:tc>
+          <w:tcPr/>
+          <w:p>
+            <w:pPr>
+              <w:pStyle w:val="Compact"/>
+            </w:pPr>
+            <w:r>
+              <w:t xml:space="preserve">−2,3%</w:t>
+            </w:r>
+          </w:p>
+        </w:tc>
+        <w:tc>
+          <w:tcPr/>
+          <w:p>
+            <w:pPr>
+              <w:pStyle w:val="Compact"/>
+            </w:pPr>
+            <w:r>
+              <w:t xml:space="preserve">108</w:t>
             </w:r>
           </w:p>
         </w:tc>
@@ -854,40 +854,40 @@
               <w:pStyle w:val="Compact"/>
             </w:pPr>
             <w:r>
-              <w:t xml:space="preserve">−510 (−676 a −299)</w:t>
-            </w:r>
-          </w:p>
-        </w:tc>
-        <w:tc>
-          <w:tcPr/>
-          <w:p>
-            <w:pPr>
-              <w:pStyle w:val="Compact"/>
-            </w:pPr>
-            <w:r>
-              <w:t xml:space="preserve">−439</w:t>
-            </w:r>
-          </w:p>
-        </w:tc>
-        <w:tc>
-          <w:tcPr/>
-          <w:p>
-            <w:pPr>
-              <w:pStyle w:val="Compact"/>
-            </w:pPr>
-            <w:r>
-              <w:t xml:space="preserve">−3,1%</w:t>
-            </w:r>
-          </w:p>
-        </w:tc>
-        <w:tc>
-          <w:tcPr/>
-          <w:p>
-            <w:pPr>
-              <w:pStyle w:val="Compact"/>
-            </w:pPr>
-            <w:r>
-              <w:t xml:space="preserve">139</w:t>
+              <w:t xml:space="preserve">−527 (−693 a −315)</w:t>
+            </w:r>
+          </w:p>
+        </w:tc>
+        <w:tc>
+          <w:tcPr/>
+          <w:p>
+            <w:pPr>
+              <w:pStyle w:val="Compact"/>
+            </w:pPr>
+            <w:r>
+              <w:t xml:space="preserve">−460</w:t>
+            </w:r>
+          </w:p>
+        </w:tc>
+        <w:tc>
+          <w:tcPr/>
+          <w:p>
+            <w:pPr>
+              <w:pStyle w:val="Compact"/>
+            </w:pPr>
+            <w:r>
+              <w:t xml:space="preserve">−3,8%</w:t>
+            </w:r>
+          </w:p>
+        </w:tc>
+        <w:tc>
+          <w:tcPr/>
+          <w:p>
+            <w:pPr>
+              <w:pStyle w:val="Compact"/>
+            </w:pPr>
+            <w:r>
+              <w:t xml:space="preserve">146</w:t>
             </w:r>
           </w:p>
         </w:tc>
@@ -933,40 +933,40 @@
               <w:pStyle w:val="Compact"/>
             </w:pPr>
             <w:r>
-              <w:t xml:space="preserve">−488 (−654 a −277)</w:t>
-            </w:r>
-          </w:p>
-        </w:tc>
-        <w:tc>
-          <w:tcPr/>
-          <w:p>
-            <w:pPr>
-              <w:pStyle w:val="Compact"/>
-            </w:pPr>
-            <w:r>
-              <w:t xml:space="preserve">−411</w:t>
-            </w:r>
-          </w:p>
-        </w:tc>
-        <w:tc>
-          <w:tcPr/>
-          <w:p>
-            <w:pPr>
-              <w:pStyle w:val="Compact"/>
-            </w:pPr>
-            <w:r>
-              <w:t xml:space="preserve">−2,2%</w:t>
-            </w:r>
-          </w:p>
-        </w:tc>
-        <w:tc>
-          <w:tcPr/>
-          <w:p>
-            <w:pPr>
-              <w:pStyle w:val="Compact"/>
-            </w:pPr>
-            <w:r>
-              <w:t xml:space="preserve">103</w:t>
+              <w:t xml:space="preserve">−506 (−672 a −295)</w:t>
+            </w:r>
+          </w:p>
+        </w:tc>
+        <w:tc>
+          <w:tcPr/>
+          <w:p>
+            <w:pPr>
+              <w:pStyle w:val="Compact"/>
+            </w:pPr>
+            <w:r>
+              <w:t xml:space="preserve">−434</w:t>
+            </w:r>
+          </w:p>
+        </w:tc>
+        <w:tc>
+          <w:tcPr/>
+          <w:p>
+            <w:pPr>
+              <w:pStyle w:val="Compact"/>
+            </w:pPr>
+            <w:r>
+              <w:t xml:space="preserve">−3,0%</w:t>
+            </w:r>
+          </w:p>
+        </w:tc>
+        <w:tc>
+          <w:tcPr/>
+          <w:p>
+            <w:pPr>
+              <w:pStyle w:val="Compact"/>
+            </w:pPr>
+            <w:r>
+              <w:t xml:space="preserve">108</w:t>
             </w:r>
           </w:p>
         </w:tc>
@@ -1012,40 +1012,40 @@
               <w:pStyle w:val="Compact"/>
             </w:pPr>
             <w:r>
-              <w:t xml:space="preserve">−329 (−496 a −118)</w:t>
-            </w:r>
-          </w:p>
-        </w:tc>
-        <w:tc>
-          <w:tcPr/>
-          <w:p>
-            <w:pPr>
-              <w:pStyle w:val="Compact"/>
-            </w:pPr>
-            <w:r>
-              <w:t xml:space="preserve">−210</w:t>
-            </w:r>
-          </w:p>
-        </w:tc>
-        <w:tc>
-          <w:tcPr/>
-          <w:p>
-            <w:pPr>
-              <w:pStyle w:val="Compact"/>
-            </w:pPr>
-            <w:r>
-              <w:t xml:space="preserve">3,3%</w:t>
-            </w:r>
-          </w:p>
-        </w:tc>
-        <w:tc>
-          <w:tcPr/>
-          <w:p>
-            <w:pPr>
-              <w:pStyle w:val="Compact"/>
-            </w:pPr>
-            <w:r>
-              <w:t xml:space="preserve">54</w:t>
+              <w:t xml:space="preserve">−362 (−528 a −150)</w:t>
+            </w:r>
+          </w:p>
+        </w:tc>
+        <w:tc>
+          <w:tcPr/>
+          <w:p>
+            <w:pPr>
+              <w:pStyle w:val="Compact"/>
+            </w:pPr>
+            <w:r>
+              <w:t xml:space="preserve">−251</w:t>
+            </w:r>
+          </w:p>
+        </w:tc>
+        <w:tc>
+          <w:tcPr/>
+          <w:p>
+            <w:pPr>
+              <w:pStyle w:val="Compact"/>
+            </w:pPr>
+            <w:r>
+              <w:t xml:space="preserve">2,2%</w:t>
+            </w:r>
+          </w:p>
+        </w:tc>
+        <w:tc>
+          <w:tcPr/>
+          <w:p>
+            <w:pPr>
+              <w:pStyle w:val="Compact"/>
+            </w:pPr>
+            <w:r>
+              <w:t xml:space="preserve">57</w:t>
             </w:r>
           </w:p>
         </w:tc>
@@ -1091,40 +1091,40 @@
               <w:pStyle w:val="Compact"/>
             </w:pPr>
             <w:r>
-              <w:t xml:space="preserve">−462 (−628 a −251)</w:t>
-            </w:r>
-          </w:p>
-        </w:tc>
-        <w:tc>
-          <w:tcPr/>
-          <w:p>
-            <w:pPr>
-              <w:pStyle w:val="Compact"/>
-            </w:pPr>
-            <w:r>
-              <w:t xml:space="preserve">−378</w:t>
-            </w:r>
-          </w:p>
-        </w:tc>
-        <w:tc>
-          <w:tcPr/>
-          <w:p>
-            <w:pPr>
-              <w:pStyle w:val="Compact"/>
-            </w:pPr>
-            <w:r>
-              <w:t xml:space="preserve">−1,2%</w:t>
-            </w:r>
-          </w:p>
-        </w:tc>
-        <w:tc>
-          <w:tcPr/>
-          <w:p>
-            <w:pPr>
-              <w:pStyle w:val="Compact"/>
-            </w:pPr>
-            <w:r>
-              <w:t xml:space="preserve">97</w:t>
+              <w:t xml:space="preserve">−482 (−648 a −270)</w:t>
+            </w:r>
+          </w:p>
+        </w:tc>
+        <w:tc>
+          <w:tcPr/>
+          <w:p>
+            <w:pPr>
+              <w:pStyle w:val="Compact"/>
+            </w:pPr>
+            <w:r>
+              <w:t xml:space="preserve">−403</w:t>
+            </w:r>
+          </w:p>
+        </w:tc>
+        <w:tc>
+          <w:tcPr/>
+          <w:p>
+            <w:pPr>
+              <w:pStyle w:val="Compact"/>
+            </w:pPr>
+            <w:r>
+              <w:t xml:space="preserve">−2,0%</w:t>
+            </w:r>
+          </w:p>
+        </w:tc>
+        <w:tc>
+          <w:tcPr/>
+          <w:p>
+            <w:pPr>
+              <w:pStyle w:val="Compact"/>
+            </w:pPr>
+            <w:r>
+              <w:t xml:space="preserve">102</w:t>
             </w:r>
           </w:p>
         </w:tc>
@@ -1170,40 +1170,40 @@
               <w:pStyle w:val="Compact"/>
             </w:pPr>
             <w:r>
-              <w:t xml:space="preserve">−330 (−496 a −118)</w:t>
-            </w:r>
-          </w:p>
-        </w:tc>
-        <w:tc>
-          <w:tcPr/>
-          <w:p>
-            <w:pPr>
-              <w:pStyle w:val="Compact"/>
-            </w:pPr>
-            <w:r>
-              <w:t xml:space="preserve">−210</w:t>
-            </w:r>
-          </w:p>
-        </w:tc>
-        <w:tc>
-          <w:tcPr/>
-          <w:p>
-            <w:pPr>
-              <w:pStyle w:val="Compact"/>
-            </w:pPr>
-            <w:r>
-              <w:t xml:space="preserve">3,3%</w:t>
-            </w:r>
-          </w:p>
-        </w:tc>
-        <w:tc>
-          <w:tcPr/>
-          <w:p>
-            <w:pPr>
-              <w:pStyle w:val="Compact"/>
-            </w:pPr>
-            <w:r>
-              <w:t xml:space="preserve">54</w:t>
+              <w:t xml:space="preserve">−362 (−528 a −151)</w:t>
+            </w:r>
+          </w:p>
+        </w:tc>
+        <w:tc>
+          <w:tcPr/>
+          <w:p>
+            <w:pPr>
+              <w:pStyle w:val="Compact"/>
+            </w:pPr>
+            <w:r>
+              <w:t xml:space="preserve">−251</w:t>
+            </w:r>
+          </w:p>
+        </w:tc>
+        <w:tc>
+          <w:tcPr/>
+          <w:p>
+            <w:pPr>
+              <w:pStyle w:val="Compact"/>
+            </w:pPr>
+            <w:r>
+              <w:t xml:space="preserve">2,2%</w:t>
+            </w:r>
+          </w:p>
+        </w:tc>
+        <w:tc>
+          <w:tcPr/>
+          <w:p>
+            <w:pPr>
+              <w:pStyle w:val="Compact"/>
+            </w:pPr>
+            <w:r>
+              <w:t xml:space="preserve">57</w:t>
             </w:r>
           </w:p>
         </w:tc>
@@ -1249,40 +1249,40 @@
               <w:pStyle w:val="Compact"/>
             </w:pPr>
             <w:r>
-              <w:t xml:space="preserve">−331 (−497 a −120)</w:t>
-            </w:r>
-          </w:p>
-        </w:tc>
-        <w:tc>
-          <w:tcPr/>
-          <w:p>
-            <w:pPr>
-              <w:pStyle w:val="Compact"/>
-            </w:pPr>
-            <w:r>
-              <w:t xml:space="preserve">−213</w:t>
-            </w:r>
-          </w:p>
-        </w:tc>
-        <w:tc>
-          <w:tcPr/>
-          <w:p>
-            <w:pPr>
-              <w:pStyle w:val="Compact"/>
-            </w:pPr>
-            <w:r>
-              <w:t xml:space="preserve">3,2%</w:t>
-            </w:r>
-          </w:p>
-        </w:tc>
-        <w:tc>
-          <w:tcPr/>
-          <w:p>
-            <w:pPr>
-              <w:pStyle w:val="Compact"/>
-            </w:pPr>
-            <w:r>
-              <w:t xml:space="preserve">54</w:t>
+              <w:t xml:space="preserve">−364 (−530 a −152)</w:t>
+            </w:r>
+          </w:p>
+        </w:tc>
+        <w:tc>
+          <w:tcPr/>
+          <w:p>
+            <w:pPr>
+              <w:pStyle w:val="Compact"/>
+            </w:pPr>
+            <w:r>
+              <w:t xml:space="preserve">−253</w:t>
+            </w:r>
+          </w:p>
+        </w:tc>
+        <w:tc>
+          <w:tcPr/>
+          <w:p>
+            <w:pPr>
+              <w:pStyle w:val="Compact"/>
+            </w:pPr>
+            <w:r>
+              <w:t xml:space="preserve">2,2%</w:t>
+            </w:r>
+          </w:p>
+        </w:tc>
+        <w:tc>
+          <w:tcPr/>
+          <w:p>
+            <w:pPr>
+              <w:pStyle w:val="Compact"/>
+            </w:pPr>
+            <w:r>
+              <w:t xml:space="preserve">57</w:t>
             </w:r>
           </w:p>
         </w:tc>
@@ -1328,40 +1328,40 @@
               <w:pStyle w:val="Compact"/>
             </w:pPr>
             <w:r>
-              <w:t xml:space="preserve">−434 (−600 a −222)</w:t>
-            </w:r>
-          </w:p>
-        </w:tc>
-        <w:tc>
-          <w:tcPr/>
-          <w:p>
-            <w:pPr>
-              <w:pStyle w:val="Compact"/>
-            </w:pPr>
-            <w:r>
-              <w:t xml:space="preserve">−342</w:t>
-            </w:r>
-          </w:p>
-        </w:tc>
-        <w:tc>
-          <w:tcPr/>
-          <w:p>
-            <w:pPr>
-              <w:pStyle w:val="Compact"/>
-            </w:pPr>
-            <w:r>
-              <w:t xml:space="preserve">−0,2%</w:t>
-            </w:r>
-          </w:p>
-        </w:tc>
-        <w:tc>
-          <w:tcPr/>
-          <w:p>
-            <w:pPr>
-              <w:pStyle w:val="Compact"/>
-            </w:pPr>
-            <w:r>
-              <w:t xml:space="preserve">76</w:t>
+              <w:t xml:space="preserve">−457 (−623 a −245)</w:t>
+            </w:r>
+          </w:p>
+        </w:tc>
+        <w:tc>
+          <w:tcPr/>
+          <w:p>
+            <w:pPr>
+              <w:pStyle w:val="Compact"/>
+            </w:pPr>
+            <w:r>
+              <w:t xml:space="preserve">−371</w:t>
+            </w:r>
+          </w:p>
+        </w:tc>
+        <w:tc>
+          <w:tcPr/>
+          <w:p>
+            <w:pPr>
+              <w:pStyle w:val="Compact"/>
+            </w:pPr>
+            <w:r>
+              <w:t xml:space="preserve">−1,0%</w:t>
+            </w:r>
+          </w:p>
+        </w:tc>
+        <w:tc>
+          <w:tcPr/>
+          <w:p>
+            <w:pPr>
+              <w:pStyle w:val="Compact"/>
+            </w:pPr>
+            <w:r>
+              <w:t xml:space="preserve">80</w:t>
             </w:r>
           </w:p>
         </w:tc>
@@ -1407,40 +1407,40 @@
               <w:pStyle w:val="Compact"/>
             </w:pPr>
             <w:r>
-              <w:t xml:space="preserve">−455 (−621 a −244)</w:t>
-            </w:r>
-          </w:p>
-        </w:tc>
-        <w:tc>
-          <w:tcPr/>
-          <w:p>
-            <w:pPr>
-              <w:pStyle w:val="Compact"/>
-            </w:pPr>
-            <w:r>
-              <w:t xml:space="preserve">−369</w:t>
-            </w:r>
-          </w:p>
-        </w:tc>
-        <w:tc>
-          <w:tcPr/>
-          <w:p>
-            <w:pPr>
-              <w:pStyle w:val="Compact"/>
-            </w:pPr>
-            <w:r>
-              <w:t xml:space="preserve">−1,0%</w:t>
-            </w:r>
-          </w:p>
-        </w:tc>
-        <w:tc>
-          <w:tcPr/>
-          <w:p>
-            <w:pPr>
-              <w:pStyle w:val="Compact"/>
-            </w:pPr>
-            <w:r>
-              <w:t xml:space="preserve">89</w:t>
+              <w:t xml:space="preserve">−475 (−641 a −264)</w:t>
+            </w:r>
+          </w:p>
+        </w:tc>
+        <w:tc>
+          <w:tcPr/>
+          <w:p>
+            <w:pPr>
+              <w:pStyle w:val="Compact"/>
+            </w:pPr>
+            <w:r>
+              <w:t xml:space="preserve">−395</w:t>
+            </w:r>
+          </w:p>
+        </w:tc>
+        <w:tc>
+          <w:tcPr/>
+          <w:p>
+            <w:pPr>
+              <w:pStyle w:val="Compact"/>
+            </w:pPr>
+            <w:r>
+              <w:t xml:space="preserve">−1,7%</w:t>
+            </w:r>
+          </w:p>
+        </w:tc>
+        <w:tc>
+          <w:tcPr/>
+          <w:p>
+            <w:pPr>
+              <w:pStyle w:val="Compact"/>
+            </w:pPr>
+            <w:r>
+              <w:t xml:space="preserve">93</w:t>
             </w:r>
           </w:p>
         </w:tc>
@@ -1486,40 +1486,40 @@
               <w:pStyle w:val="Compact"/>
             </w:pPr>
             <w:r>
-              <w:t xml:space="preserve">−426 (−568 a −259)</w:t>
-            </w:r>
-          </w:p>
-        </w:tc>
-        <w:tc>
-          <w:tcPr/>
-          <w:p>
-            <w:pPr>
-              <w:pStyle w:val="Compact"/>
-            </w:pPr>
-            <w:r>
-              <w:t xml:space="preserve">−354</w:t>
-            </w:r>
-          </w:p>
-        </w:tc>
-        <w:tc>
-          <w:tcPr/>
-          <w:p>
-            <w:pPr>
-              <w:pStyle w:val="Compact"/>
-            </w:pPr>
-            <w:r>
-              <w:t xml:space="preserve">−1,8%</w:t>
-            </w:r>
-          </w:p>
-        </w:tc>
-        <w:tc>
-          <w:tcPr/>
-          <w:p>
-            <w:pPr>
-              <w:pStyle w:val="Compact"/>
-            </w:pPr>
-            <w:r>
-              <w:t xml:space="preserve">109</w:t>
+              <w:t xml:space="preserve">−444 (−585 a −276)</w:t>
+            </w:r>
+          </w:p>
+        </w:tc>
+        <w:tc>
+          <w:tcPr/>
+          <w:p>
+            <w:pPr>
+              <w:pStyle w:val="Compact"/>
+            </w:pPr>
+            <w:r>
+              <w:t xml:space="preserve">−376</w:t>
+            </w:r>
+          </w:p>
+        </w:tc>
+        <w:tc>
+          <w:tcPr/>
+          <w:p>
+            <w:pPr>
+              <w:pStyle w:val="Compact"/>
+            </w:pPr>
+            <w:r>
+              <w:t xml:space="preserve">−2,5%</w:t>
+            </w:r>
+          </w:p>
+        </w:tc>
+        <w:tc>
+          <w:tcPr/>
+          <w:p>
+            <w:pPr>
+              <w:pStyle w:val="Compact"/>
+            </w:pPr>
+            <w:r>
+              <w:t xml:space="preserve">115</w:t>
             </w:r>
           </w:p>
         </w:tc>
@@ -1565,40 +1565,40 @@
               <w:pStyle w:val="Compact"/>
             </w:pPr>
             <w:r>
-              <w:t xml:space="preserve">−530 (−721 a −275)</w:t>
-            </w:r>
-          </w:p>
-        </w:tc>
-        <w:tc>
-          <w:tcPr/>
-          <w:p>
-            <w:pPr>
-              <w:pStyle w:val="Compact"/>
-            </w:pPr>
-            <w:r>
-              <w:t xml:space="preserve">−442</w:t>
-            </w:r>
-          </w:p>
-        </w:tc>
-        <w:tc>
-          <w:tcPr/>
-          <w:p>
-            <w:pPr>
-              <w:pStyle w:val="Compact"/>
-            </w:pPr>
-            <w:r>
-              <w:t xml:space="preserve">−1,9%</w:t>
-            </w:r>
-          </w:p>
-        </w:tc>
-        <w:tc>
-          <w:tcPr/>
-          <w:p>
-            <w:pPr>
-              <w:pStyle w:val="Compact"/>
-            </w:pPr>
-            <w:r>
-              <w:t xml:space="preserve">102</w:t>
+              <w:t xml:space="preserve">−550 (−740 a −294)</w:t>
+            </w:r>
+          </w:p>
+        </w:tc>
+        <w:tc>
+          <w:tcPr/>
+          <w:p>
+            <w:pPr>
+              <w:pStyle w:val="Compact"/>
+            </w:pPr>
+            <w:r>
+              <w:t xml:space="preserve">−467</w:t>
+            </w:r>
+          </w:p>
+        </w:tc>
+        <w:tc>
+          <w:tcPr/>
+          <w:p>
+            <w:pPr>
+              <w:pStyle w:val="Compact"/>
+            </w:pPr>
+            <w:r>
+              <w:t xml:space="preserve">−2,6%</w:t>
+            </w:r>
+          </w:p>
+        </w:tc>
+        <w:tc>
+          <w:tcPr/>
+          <w:p>
+            <w:pPr>
+              <w:pStyle w:val="Compact"/>
+            </w:pPr>
+            <w:r>
+              <w:t xml:space="preserve">107</w:t>
             </w:r>
           </w:p>
         </w:tc>
@@ -1609,7 +1609,7 @@
         <w:pStyle w:val="Fonte"/>
       </w:pPr>
       <w:r>
-        <w:t xml:space="preserve">Fonte: elaborado pelo autor. Investimento, TIR e preço de equilíbrio do H₂ (H₂ eq., à taxa de 12,1%) com investimento central; entre parênteses, VPL a 12,1% com investimento alto e baixo. O lucro operacional exclui a degradação do módulo LRCAP, coberta pelo O&amp;M fixo, e o fluxo desconta o O&amp;M fixo e o uso da rede (Seção 3.8.2). Limites de emissões em kgCO₂/kgH₂ (Subseção 4.3.5). Nos casos de eletrolisador de 10 MW e de limite de emissões com fator marginal, o preço de equilíbrio usa o H₂ vendido na potência ótima da curva de oferta (50 ou 52,5 MW), e não na de 55 MW do VPL, e fica levemente subestimado.</w:t>
+        <w:t xml:space="preserve">Fonte: elaborado pelo autor. Investimento, TIR e preço de equilíbrio do H₂ (H₂ eq., à taxa de 12,1%) com investimento central; entre parênteses, VPL a 12,1% com investimento alto e baixo. O lucro operacional exclui a degradação do módulo LRCAP, coberta pelo O&amp;M fixo, e o fluxo desconta o O&amp;M fixo, o uso da rede e o PIS/Cofins de 3,65% sobre a receita bruta (Seção 3.8.2). Limites de emissões em kgCO₂/kgH₂ (Subseção 4.3.5). Nos casos de eletrolisador de 10 MW e de limite de emissões com fator marginal, o preço de equilíbrio usa o H₂ vendido na potência ótima da curva de oferta (50 ou 52,5 MW), e não na de 55 MW do VPL, e fica levemente subestimado.</w:t>
       </w:r>
     </w:p>
     <w:p>
@@ -1617,7 +1617,7 @@
         <w:pStyle w:val="BodyText"/>
       </w:pPr>
       <w:r>
-        <w:t xml:space="preserve">Com os parâmetros adotados, nenhum caso é economicamente viável. No caso de referência, o investimento de R$ 781 milhões — R$ 212 milhões na usina FV, R$ 380 milhões no BESS e R$ 189 milhões no eletrolisador — gera fluxo anual de R$ 45,8 milhões, após R$ 18,3 milhões de O&amp;M fixo e R$ 7,9 milhões de uso da rede, e a TIR real é negativa (−1,6%). O preço do hidrogênio que tornaria o VPL nulo à taxa de 12,1% é de cerca de R$ 103/kg, quase o triplo do valor adotado (R$ 79/kg à taxa de 8%). Mesmo o caso de importação de energia, o de maior lucro, tem VPL negativo à taxa central em toda a faixa de investimento; apenas à taxa de 8% e com investimentos no limite inferior ele atinge o equilíbrio (VPL de R$ 9 milhões), o que antecipa a importância da regra de suprimento do eletrolisador discutida nas Subseções 4.3.4 e 4.3.5. Com o limite de emissões do marco legal, o resultado depende do fator de emissão da rede: com o fator médio do SIN, o VPL é praticamente o da importação livre; com o fator marginal, fica entre este e o do caso de referência.</w:t>
+        <w:t xml:space="preserve">Com os parâmetros adotados, nenhum caso é economicamente viável. No caso de referência, o investimento de R$ 781 milhões — R$ 212 milhões na usina FV, R$ 380 milhões no BESS e R$ 189 milhões no eletrolisador — gera fluxo anual de R$ 43,1 milhões, após R$ 18,3 milhões de O&amp;M fixo, R$ 7,9 milhões de uso da rede e R$ 2,7 milhões de PIS/Cofins, e a TIR real é negativa (−2,3%). O preço do hidrogênio que tornaria o VPL nulo à taxa de 12,1% é de cerca de R$ 108/kg, mais que o triplo do valor adotado (R$ 84/kg à taxa de 8%). Mesmo o caso de importação de energia, o de maior lucro, tem VPL negativo em toda a faixa de investimento e nas duas taxas; no cenário mais favorável, com investimento baixo e taxa de 8%, o VPL é de −R$ 32 milhões, o que antecipa a importância da regra de suprimento do eletrolisador discutida nas Subseções 4.3.4 e 4.3.5. Com o limite de emissões do marco legal, o resultado depende do fator de emissão da rede: com o fator médio do SIN, o VPL é praticamente o da importação livre; com o fator marginal, fica entre este e o do caso de referência.</w:t>
       </w:r>
     </w:p>
     <w:p>
@@ -1708,7 +1708,7 @@
         <w:t xml:space="preserve"> </w:t>
       </w:r>
       <w:r>
-        <w:t xml:space="preserve">Sem a bateria, e portanto sem o leilão, o lucro operacional esperado é de R$ 35,4 milhões por ano. Com o BESS e a contratação de 55 MW à receita de R$ 600 mil/(MW·ano), passa a R$ 72,1 milhões. O ganho de R$ 36,7 milhões por ano não cobre o custo anual equivalente do BESS, de R$ 66,8 milhões à taxa de 12,1% com investimento central — R$ 56,0 milhões de capital, R$ 9,5 milhões de O&amp;M com reposição de módulos e R$ 1,3 milhão de acréscimo de uso da rede (Figura 4.2(b)). Sem a receita do leilão, a bateria agrega apenas R$ 8,8 milhões por ano, provenientes do suprimento noturno do eletrolisador e da arbitragem no MCP, já descontado o seu consumo auxiliar; é, portanto, a receita fixa do LRCAP que pode viabilizá-la.</w:t>
+        <w:t xml:space="preserve">Sem a bateria, e portanto sem o leilão, o lucro operacional esperado é de R$ 35,4 milhões por ano. Com o BESS e a contratação de 55 MW à receita de R$ 600 mil/(MW·ano), passa a R$ 72,1 milhões. O ganho, de R$ 35,5 milhões por ano depois do PIS/Cofins sobre a receita fixa, não cobre o custo anual equivalente do BESS, de R$ 66,8 milhões à taxa de 12,1% com investimento central — R$ 56,0 milhões de capital, R$ 9,5 milhões de O&amp;M com reposição de módulos e R$ 1,3 milhão de acréscimo de uso da rede (Figura 4.2(b)). Sem a receita do leilão, a bateria agrega apenas R$ 8,8 milhões por ano, provenientes do suprimento noturno do eletrolisador e da arbitragem no MCP, já descontado o seu consumo auxiliar; é, portanto, a receita fixa do LRCAP que pode viabilizá-la.</w:t>
       </w:r>
     </w:p>
     <w:p>
@@ -1881,29 +1881,29 @@
               <w:pStyle w:val="Compact"/>
             </w:pPr>
             <w:r>
-              <w:t xml:space="preserve">1.015 (60 MW)</w:t>
-            </w:r>
-          </w:p>
-        </w:tc>
-        <w:tc>
-          <w:tcPr/>
-          <w:p>
-            <w:pPr>
-              <w:pStyle w:val="Compact"/>
-            </w:pPr>
-            <w:r>
-              <w:t xml:space="preserve">1.115 (60 MW)</w:t>
-            </w:r>
-          </w:p>
-        </w:tc>
-        <w:tc>
-          <w:tcPr/>
-          <w:p>
-            <w:pPr>
-              <w:pStyle w:val="Compact"/>
-            </w:pPr>
-            <w:r>
-              <w:t xml:space="preserve">1.214 (60 MW)</w:t>
+              <w:t xml:space="preserve">1.054 (60 MW)</w:t>
+            </w:r>
+          </w:p>
+        </w:tc>
+        <w:tc>
+          <w:tcPr/>
+          <w:p>
+            <w:pPr>
+              <w:pStyle w:val="Compact"/>
+            </w:pPr>
+            <w:r>
+              <w:t xml:space="preserve">1.157 (60 MW)</w:t>
+            </w:r>
+          </w:p>
+        </w:tc>
+        <w:tc>
+          <w:tcPr/>
+          <w:p>
+            <w:pPr>
+              <w:pStyle w:val="Compact"/>
+            </w:pPr>
+            <w:r>
+              <w:t xml:space="preserve">1.260 (60 MW)</w:t>
             </w:r>
           </w:p>
         </w:tc>
@@ -1927,29 +1927,29 @@
               <w:pStyle w:val="Compact"/>
             </w:pPr>
             <w:r>
-              <w:t xml:space="preserve">838 (60 MW)</w:t>
-            </w:r>
-          </w:p>
-        </w:tc>
-        <w:tc>
-          <w:tcPr/>
-          <w:p>
-            <w:pPr>
-              <w:pStyle w:val="Compact"/>
-            </w:pPr>
-            <w:r>
-              <w:t xml:space="preserve">919 (60 MW)</w:t>
-            </w:r>
-          </w:p>
-        </w:tc>
-        <w:tc>
-          <w:tcPr/>
-          <w:p>
-            <w:pPr>
-              <w:pStyle w:val="Compact"/>
-            </w:pPr>
-            <w:r>
-              <w:t xml:space="preserve">1.001 (60 MW)</w:t>
+              <w:t xml:space="preserve">870 (60 MW)</w:t>
+            </w:r>
+          </w:p>
+        </w:tc>
+        <w:tc>
+          <w:tcPr/>
+          <w:p>
+            <w:pPr>
+              <w:pStyle w:val="Compact"/>
+            </w:pPr>
+            <w:r>
+              <w:t xml:space="preserve">954 (60 MW)</w:t>
+            </w:r>
+          </w:p>
+        </w:tc>
+        <w:tc>
+          <w:tcPr/>
+          <w:p>
+            <w:pPr>
+              <w:pStyle w:val="Compact"/>
+            </w:pPr>
+            <w:r>
+              <w:t xml:space="preserve">1.039 (60 MW)</w:t>
             </w:r>
           </w:p>
         </w:tc>
@@ -1989,7 +1989,7 @@
         <w:t xml:space="preserve"> </w:t>
       </w:r>
       <w:r>
-        <w:t xml:space="preserve">(Subseção 4.2.4). A curva escalonada da Seção 4.3 descreve, portanto, a decisão de um proponente que já dispõe do BESS. O lance mínimo no caso central é de R$ 1,115 milhão/(MW·ano) e coincide com o custo anual equivalente do BESS por MW (Figura 4.3(b)): R$ 934 mil de capital, R$ 158 mil de O&amp;M com reposição de módulos e R$ 22 mil de acréscimo de uso da rede. O capital reflete a energia da bateria: com 300 MWh, ou 5 h, o investimento é de R$ 380 milhões, 15% acima do valor de referência de um sistema de 4 h. O uso da rede pesa pouco porque a bateria compartilha a conexão com a usina FV e eleva o montante de uso de injeção em apenas 10 MW. As demais parcelas são nulas: o consumo auxiliar de 1% da potência cabe na folga de recarga custeada pela CONCAP, e, com 60 MW contratados, o módulo mercantil se anula, de modo que o uso mercantil da bateria não reduz o lance. O lance mínimo supera em 34% o preço médio obtido por termelétricas existentes no LRCAP de março de 2026 (R$ 831 mil/(MW·ano)) — mesmo no cenário mais favorável, com investimento baixo e taxa de 8%, ele fica em R$ 838 mil — e é muito inferior ao das termelétricas e hidrelétricas do leilão anterior (R$ 2,33 milhões/(MW·ano)). Isso sugere que o armazenamento em baterias é competitivo frente à expansão térmica, mas não frente às usinas existentes. A receita de R$ 600 mil/(MW·ano) adotada no caso de referência é inferior ao lance mínimo em todas as combinações avaliadas: com ela, um proponente racional não construiria o BESS.</w:t>
+        <w:t xml:space="preserve">(Subseção 4.2.4). A curva escalonada da Seção 4.3 descreve, portanto, a decisão de um proponente que já dispõe do BESS. O lance mínimo no caso central é de R$ 1,157 milhão/(MW·ano) e corresponde ao custo anual equivalente do BESS por MW, acrescido do PIS/Cofins sobre a receita fixa (Figura 4.3(b)): R$ 934 mil de capital, R$ 158 mil de O&amp;M com reposição de módulos, R$ 22 mil de acréscimo de uso da rede e R$ 43 mil de tributos sobre a receita. O capital reflete a energia da bateria: com 300 MWh, ou 5 h, o investimento é de R$ 380 milhões, 15% acima do valor de referência de um sistema de 4 h. O uso da rede pesa pouco porque a bateria compartilha a conexão com a usina FV e eleva o montante de uso de injeção em apenas 10 MW. As demais parcelas são nulas: o consumo auxiliar de 1% da potência cabe na folga de recarga custeada pela CONCAP, e, com 60 MW contratados, o módulo mercantil se anula, de modo que o uso mercantil da bateria não reduz o lance. O lance mínimo supera em 39% o preço médio obtido por termelétricas existentes no LRCAP de março de 2026 (R$ 831 mil/(MW·ano)) — mesmo no cenário mais favorável, com investimento baixo e taxa de 8%, ele fica em R$ 870 mil — e é muito inferior ao das termelétricas e hidrelétricas do leilão anterior (R$ 2,33 milhões/(MW·ano)). Isso sugere que o armazenamento em baterias é competitivo frente à expansão térmica, mas não frente às usinas existentes. A receita de R$ 600 mil/(MW·ano) adotada no caso de referência é inferior ao lance mínimo em todas as combinações avaliadas: com ela, um proponente racional não construiria o BESS.</w:t>
       </w:r>
     </w:p>
     <w:bookmarkEnd w:id="20"/>
@@ -2015,7 +2015,7 @@
         <w:pStyle w:val="Legenda"/>
       </w:pPr>
       <w:r>
-        <w:t xml:space="preserve">Tabela 4.4 – Lance mínimo para a construção do BESS com uma hipótese alterada de cada vez em relação ao caso central (investimento de referência de R$ 5.500/kW para 4 h e taxa de 12,1%)</w:t>
+        <w:t xml:space="preserve">Tabela 4.4 – Lance mínimo para a construção do BESS com uma hipótese alterada de cada vez em relação ao caso central (investimento de referência de R$ 5.500/kW para 4 h, taxa de 12,1%, PIS/Cofins de 3,65% e receita reajustada pelo IPCA)</w:t>
       </w:r>
     </w:p>
     <w:tbl>
@@ -2140,7 +2140,7 @@
               <w:pStyle w:val="Compact"/>
             </w:pPr>
             <w:r>
-              <w:t xml:space="preserve">1.115</w:t>
+              <w:t xml:space="preserve">1.157</w:t>
             </w:r>
           </w:p>
         </w:tc>
@@ -2186,7 +2186,7 @@
               <w:pStyle w:val="Compact"/>
             </w:pPr>
             <w:r>
-              <w:t xml:space="preserve">1.015</w:t>
+              <w:t xml:space="preserve">1.054</w:t>
             </w:r>
           </w:p>
         </w:tc>
@@ -2232,7 +2232,7 @@
               <w:pStyle w:val="Compact"/>
             </w:pPr>
             <w:r>
-              <w:t xml:space="preserve">1.214</w:t>
+              <w:t xml:space="preserve">1.260</w:t>
             </w:r>
           </w:p>
         </w:tc>
@@ -2278,7 +2278,7 @@
               <w:pStyle w:val="Compact"/>
             </w:pPr>
             <w:r>
-              <w:t xml:space="preserve">1.352</w:t>
+              <w:t xml:space="preserve">1.403</w:t>
             </w:r>
           </w:p>
         </w:tc>
@@ -2324,7 +2324,7 @@
               <w:pStyle w:val="Compact"/>
             </w:pPr>
             <w:r>
-              <w:t xml:space="preserve">1.079</w:t>
+              <w:t xml:space="preserve">1.120</w:t>
             </w:r>
           </w:p>
         </w:tc>
@@ -2370,7 +2370,7 @@
               <w:pStyle w:val="Compact"/>
             </w:pPr>
             <w:r>
-              <w:t xml:space="preserve">1.150</w:t>
+              <w:t xml:space="preserve">1.194</w:t>
             </w:r>
           </w:p>
         </w:tc>
@@ -2416,7 +2416,7 @@
               <w:pStyle w:val="Compact"/>
             </w:pPr>
             <w:r>
-              <w:t xml:space="preserve">919</w:t>
+              <w:t xml:space="preserve">954</w:t>
             </w:r>
           </w:p>
         </w:tc>
@@ -2462,7 +2462,7 @@
               <w:pStyle w:val="Compact"/>
             </w:pPr>
             <w:r>
-              <w:t xml:space="preserve">1.051</w:t>
+              <w:t xml:space="preserve">1.091</w:t>
             </w:r>
           </w:p>
         </w:tc>
@@ -2508,7 +2508,7 @@
               <w:pStyle w:val="Compact"/>
             </w:pPr>
             <w:r>
-              <w:t xml:space="preserve">1.178</w:t>
+              <w:t xml:space="preserve">1.222</w:t>
             </w:r>
           </w:p>
         </w:tc>
@@ -2554,7 +2554,7 @@
               <w:pStyle w:val="Compact"/>
             </w:pPr>
             <w:r>
-              <w:t xml:space="preserve">1.104</w:t>
+              <w:t xml:space="preserve">1.146</w:t>
             </w:r>
           </w:p>
         </w:tc>
@@ -2600,7 +2600,7 @@
               <w:pStyle w:val="Compact"/>
             </w:pPr>
             <w:r>
-              <w:t xml:space="preserve">1.132</w:t>
+              <w:t xml:space="preserve">1.175</w:t>
             </w:r>
           </w:p>
         </w:tc>
@@ -2646,7 +2646,7 @@
               <w:pStyle w:val="Compact"/>
             </w:pPr>
             <w:r>
-              <w:t xml:space="preserve">1.224</w:t>
+              <w:t xml:space="preserve">1.270</w:t>
             </w:r>
           </w:p>
         </w:tc>
@@ -2692,7 +2692,7 @@
               <w:pStyle w:val="Compact"/>
             </w:pPr>
             <w:r>
-              <w:t xml:space="preserve">1.297</w:t>
+              <w:t xml:space="preserve">1.346</w:t>
             </w:r>
           </w:p>
         </w:tc>
@@ -2738,7 +2738,7 @@
               <w:pStyle w:val="Compact"/>
             </w:pPr>
             <w:r>
-              <w:t xml:space="preserve">1.115</w:t>
+              <w:t xml:space="preserve">1.157</w:t>
             </w:r>
           </w:p>
         </w:tc>
@@ -2784,7 +2784,7 @@
               <w:pStyle w:val="Compact"/>
             </w:pPr>
             <w:r>
-              <w:t xml:space="preserve">1.127</w:t>
+              <w:t xml:space="preserve">1.170</w:t>
             </w:r>
           </w:p>
         </w:tc>
@@ -2830,7 +2830,7 @@
               <w:pStyle w:val="Compact"/>
             </w:pPr>
             <w:r>
-              <w:t xml:space="preserve">1.149</w:t>
+              <w:t xml:space="preserve">1.193</w:t>
             </w:r>
           </w:p>
         </w:tc>
@@ -2853,6 +2853,144 @@
             </w:pPr>
             <w:r>
               <w:t xml:space="preserve">+3%</w:t>
+            </w:r>
+          </w:p>
+        </w:tc>
+      </w:tr>
+      <w:tr>
+        <w:tc>
+          <w:tcPr/>
+          <w:p>
+            <w:pPr>
+              <w:pStyle w:val="Compact"/>
+            </w:pPr>
+            <w:r>
+              <w:t xml:space="preserve">Sem PIS/Cofins</w:t>
+            </w:r>
+          </w:p>
+        </w:tc>
+        <w:tc>
+          <w:tcPr/>
+          <w:p>
+            <w:pPr>
+              <w:pStyle w:val="Compact"/>
+            </w:pPr>
+            <w:r>
+              <w:t xml:space="preserve">1.115</w:t>
+            </w:r>
+          </w:p>
+        </w:tc>
+        <w:tc>
+          <w:tcPr/>
+          <w:p>
+            <w:pPr>
+              <w:pStyle w:val="Compact"/>
+            </w:pPr>
+            <w:r>
+              <w:t xml:space="preserve">60</w:t>
+            </w:r>
+          </w:p>
+        </w:tc>
+        <w:tc>
+          <w:tcPr/>
+          <w:p>
+            <w:pPr>
+              <w:pStyle w:val="Compact"/>
+            </w:pPr>
+            <w:r>
+              <w:t xml:space="preserve">−4%</w:t>
+            </w:r>
+          </w:p>
+        </w:tc>
+      </w:tr>
+      <w:tr>
+        <w:tc>
+          <w:tcPr/>
+          <w:p>
+            <w:pPr>
+              <w:pStyle w:val="Compact"/>
+            </w:pPr>
+            <w:r>
+              <w:t xml:space="preserve">PIS/Cofins não cumulativo (9,25%)</w:t>
+            </w:r>
+          </w:p>
+        </w:tc>
+        <w:tc>
+          <w:tcPr/>
+          <w:p>
+            <w:pPr>
+              <w:pStyle w:val="Compact"/>
+            </w:pPr>
+            <w:r>
+              <w:t xml:space="preserve">1.228</w:t>
+            </w:r>
+          </w:p>
+        </w:tc>
+        <w:tc>
+          <w:tcPr/>
+          <w:p>
+            <w:pPr>
+              <w:pStyle w:val="Compact"/>
+            </w:pPr>
+            <w:r>
+              <w:t xml:space="preserve">60</w:t>
+            </w:r>
+          </w:p>
+        </w:tc>
+        <w:tc>
+          <w:tcPr/>
+          <w:p>
+            <w:pPr>
+              <w:pStyle w:val="Compact"/>
+            </w:pPr>
+            <w:r>
+              <w:t xml:space="preserve">+6%</w:t>
+            </w:r>
+          </w:p>
+        </w:tc>
+      </w:tr>
+      <w:tr>
+        <w:tc>
+          <w:tcPr/>
+          <w:p>
+            <w:pPr>
+              <w:pStyle w:val="Compact"/>
+            </w:pPr>
+            <w:r>
+              <w:t xml:space="preserve">Receita fixa sem reajuste pelo IPCA (4% a.a.)</w:t>
+            </w:r>
+          </w:p>
+        </w:tc>
+        <w:tc>
+          <w:tcPr/>
+          <w:p>
+            <w:pPr>
+              <w:pStyle w:val="Compact"/>
+            </w:pPr>
+            <w:r>
+              <w:t xml:space="preserve">1.444</w:t>
+            </w:r>
+          </w:p>
+        </w:tc>
+        <w:tc>
+          <w:tcPr/>
+          <w:p>
+            <w:pPr>
+              <w:pStyle w:val="Compact"/>
+            </w:pPr>
+            <w:r>
+              <w:t xml:space="preserve">60</w:t>
+            </w:r>
+          </w:p>
+        </w:tc>
+        <w:tc>
+          <w:tcPr/>
+          <w:p>
+            <w:pPr>
+              <w:pStyle w:val="Compact"/>
+            </w:pPr>
+            <w:r>
+              <w:t xml:space="preserve">+25%</w:t>
             </w:r>
           </w:p>
         </w:tc>
@@ -2917,7 +3055,7 @@
               <w:pStyle w:val="Compact"/>
             </w:pPr>
             <w:r>
-              <w:t xml:space="preserve">1.115</w:t>
+              <w:t xml:space="preserve">1.157</w:t>
             </w:r>
           </w:p>
         </w:tc>
@@ -2963,7 +3101,7 @@
               <w:pStyle w:val="Compact"/>
             </w:pPr>
             <w:r>
-              <w:t xml:space="preserve">1.078</w:t>
+              <w:t xml:space="preserve">1.119</w:t>
             </w:r>
           </w:p>
         </w:tc>
@@ -3009,7 +3147,7 @@
               <w:pStyle w:val="Compact"/>
             </w:pPr>
             <w:r>
-              <w:t xml:space="preserve">1.056</w:t>
+              <w:t xml:space="preserve">1.096</w:t>
             </w:r>
           </w:p>
         </w:tc>
@@ -3055,7 +3193,7 @@
               <w:pStyle w:val="Compact"/>
             </w:pPr>
             <w:r>
-              <w:t xml:space="preserve">1.115</w:t>
+              <w:t xml:space="preserve">1.157</w:t>
             </w:r>
           </w:p>
         </w:tc>
@@ -3101,7 +3239,7 @@
               <w:pStyle w:val="Compact"/>
             </w:pPr>
             <w:r>
-              <w:t xml:space="preserve">1.115</w:t>
+              <w:t xml:space="preserve">1.157</w:t>
             </w:r>
           </w:p>
         </w:tc>
@@ -3147,7 +3285,7 @@
               <w:pStyle w:val="Compact"/>
             </w:pPr>
             <w:r>
-              <w:t xml:space="preserve">1.115</w:t>
+              <w:t xml:space="preserve">1.157</w:t>
             </w:r>
           </w:p>
         </w:tc>
@@ -3193,7 +3331,7 @@
               <w:pStyle w:val="Compact"/>
             </w:pPr>
             <w:r>
-              <w:t xml:space="preserve">1.115</w:t>
+              <w:t xml:space="preserve">1.157</w:t>
             </w:r>
           </w:p>
         </w:tc>
@@ -3239,7 +3377,7 @@
               <w:pStyle w:val="Compact"/>
             </w:pPr>
             <w:r>
-              <w:t xml:space="preserve">1.127</w:t>
+              <w:t xml:space="preserve">1.170</w:t>
             </w:r>
           </w:p>
         </w:tc>
@@ -3285,7 +3423,7 @@
               <w:pStyle w:val="Compact"/>
             </w:pPr>
             <w:r>
-              <w:t xml:space="preserve">1.122</w:t>
+              <w:t xml:space="preserve">1.165</w:t>
             </w:r>
           </w:p>
         </w:tc>
@@ -3331,7 +3469,7 @@
               <w:pStyle w:val="Compact"/>
             </w:pPr>
             <w:r>
-              <w:t xml:space="preserve">1.115</w:t>
+              <w:t xml:space="preserve">1.157</w:t>
             </w:r>
           </w:p>
         </w:tc>
@@ -3377,7 +3515,7 @@
               <w:pStyle w:val="Compact"/>
             </w:pPr>
             <w:r>
-              <w:t xml:space="preserve">1.115</w:t>
+              <w:t xml:space="preserve">1.157</w:t>
             </w:r>
           </w:p>
         </w:tc>
@@ -3418,7 +3556,7 @@
         <w:pStyle w:val="BodyText"/>
       </w:pPr>
       <w:r>
-        <w:t xml:space="preserve">O lance mínimo é determinado pelas premissas de custo do BESS. A de maior efeito é a duração a que se refere o custo da EPE: se os R$ 5.500/kW corresponderem a um sistema de 3 h, e não de 4 h, a energia da bateria de 5 h fica mais cara e o lance sobe 21%. Seguem a taxa de desconto (−18% com a taxa após impostos, que ignora o imposto de renda), a regra de cobrança do uso da rede (+16% se o armazenamento pagar também a TUST de consumo e +10% sem compartilhar a conexão), o investimento de referência (±9%) e o O&amp;M (±6% para ±1 ponto percentual). A parcela do custo proporcional à energia (±3%), a disponibilidade de 97% (+3%), a TUST regional (de −1% a +2%) e o consumo auxiliar (+1% com 2% da potência) pesam pouco. O compartilhamento da conexão é uma vantagem do arranjo híbrido: sem ele, a bateria pagaria a TUST sobre toda a sua potência, e o lance seria R$ 109 mil/(MW·ano) maior.</w:t>
+        <w:t xml:space="preserve">O lance mínimo é determinado pelas premissas de custo do BESS. A de maior efeito é a duração a que se refere o custo da EPE: se os R$ 5.500/kW corresponderem a um sistema de 3 h, e não de 4 h, a energia da bateria de 5 h fica mais cara e o lance sobe 21%. Seguem a taxa de desconto (−18% com a taxa após impostos, que ignora o imposto de renda), a regra de cobrança do uso da rede (+16% se o armazenamento pagar também a TUST de consumo e +10% sem compartilhar a conexão), o investimento de referência (±9%) e o O&amp;M (±6% para ±1 ponto percentual). A parcela do custo proporcional à energia (±3%), a disponibilidade de 97% (+3%), a TUST regional (de −1% a +2%) e o consumo auxiliar (+1% com 2% da potência) pesam pouco. O compartilhamento da conexão é uma vantagem do arranjo híbrido: sem ele, a bateria pagaria a TUST sobre toda a sua potência, e o lance seria R$ 113 mil/(MW·ano) maior. Duas premissas de natureza tributária e contratual também pesam: o regime não cumulativo do PIS/Cofins, sem créditos, eleva o lance em 6%, e a falta de reajuste da receita fixa pelo IPCA, com inflação de 4% a.a., em 25%, pois a receita perderia valor real ao longo dos 15 anos; esta última é a premissa de maior efeito e deve ser confirmada no edital.</w:t>
       </w:r>
     </w:p>
     <w:p>
@@ -3426,7 +3564,7 @@
         <w:pStyle w:val="BodyText"/>
       </w:pPr>
       <w:r>
-        <w:t xml:space="preserve">As hipóteses de operação quase não alteram o lance. Como o desgaste do despacho está no O&amp;M fixo, o custo de degradação por MWh deixa de afetá-lo, e a frequência do despacho só o altera por meio do consumo auxiliar: com 50 despachos por ano, a folga de recarga diminui e o lance sobe 1%. Com o contrato de 2 t/dia, a importação e os dois tamanhos de eletrolisador, o proponente oferta toda a potência, o módulo mercantil se anula e o lance é igual ao do caso central. A exceção é o contrato firme de 3 t/dia sem importação: o proponente oferta 57,5 MW (55 MW com o tanque de 10 t), e a bateria mercantil restante reduz o déficit de entrega e a multa correspondente, o que reduz o lance em 3% com o tanque de 2 t e em 5% com o de 10 t. A magnitude dessa redução depende da multa contratual, que faz cada kg não entregue custar R$ 70 ao empreendedor (Seção 3.4.5). À taxa central, o lance mínimo situa-se, assim, entre R$ 1,02 milhão e R$ 1,35 milhão/(MW·ano), e sua incerteza decorre principalmente da duração de referência do custo do BESS, da regra de cobrança do uso da rede, do investimento e do O&amp;M.</w:t>
+        <w:t xml:space="preserve">As hipóteses de operação quase não alteram o lance. Como o desgaste do despacho está no O&amp;M fixo, o custo de degradação por MWh deixa de afetá-lo, e a frequência do despacho só o altera por meio do consumo auxiliar: com 50 despachos por ano, a folga de recarga diminui e o lance sobe 1%. Com o contrato de 2 t/dia, a importação e os dois tamanhos de eletrolisador, o proponente oferta toda a potência, o módulo mercantil se anula e o lance é igual ao do caso central. A exceção é o contrato firme de 3 t/dia sem importação: o proponente oferta 57,5 MW (55 MW com o tanque de 10 t), e a bateria mercantil restante reduz o déficit de entrega e a multa correspondente, o que reduz o lance em 3% com o tanque de 2 t e em 5% com o de 10 t. A magnitude dessa redução depende da multa contratual, que faz cada kg não entregue custar R$ 70 ao empreendedor (Seção 3.4.5). À taxa central e com a receita reajustada pelo IPCA, o lance mínimo situa-se, assim, entre R$ 1,05 milhão e R$ 1,40 milhão/(MW·ano), e sua incerteza decorre principalmente da duração de referência do custo do BESS, da regra de cobrança do uso da rede, do regime tributário, do investimento e do O&amp;M; sem reajuste, chegaria a R$ 1,44 milhão.</w:t>
       </w:r>
     </w:p>
     <w:bookmarkEnd w:id="21"/>
@@ -3570,18 +3708,18 @@
               <w:pStyle w:val="Compact"/>
             </w:pPr>
             <w:r>
-              <w:t xml:space="preserve">1.115</w:t>
-            </w:r>
-          </w:p>
-        </w:tc>
-        <w:tc>
-          <w:tcPr/>
-          <w:p>
-            <w:pPr>
-              <w:pStyle w:val="Compact"/>
-            </w:pPr>
-            <w:r>
-              <w:t xml:space="preserve">919</w:t>
+              <w:t xml:space="preserve">1.157</w:t>
+            </w:r>
+          </w:p>
+        </w:tc>
+        <w:tc>
+          <w:tcPr/>
+          <w:p>
+            <w:pPr>
+              <w:pStyle w:val="Compact"/>
+            </w:pPr>
+            <w:r>
+              <w:t xml:space="preserve">954</w:t>
             </w:r>
           </w:p>
         </w:tc>
@@ -3627,18 +3765,18 @@
               <w:pStyle w:val="Compact"/>
             </w:pPr>
             <w:r>
-              <w:t xml:space="preserve">1.086</w:t>
-            </w:r>
-          </w:p>
-        </w:tc>
-        <w:tc>
-          <w:tcPr/>
-          <w:p>
-            <w:pPr>
-              <w:pStyle w:val="Compact"/>
-            </w:pPr>
-            <w:r>
-              <w:t xml:space="preserve">896</w:t>
+              <w:t xml:space="preserve">1.127</w:t>
+            </w:r>
+          </w:p>
+        </w:tc>
+        <w:tc>
+          <w:tcPr/>
+          <w:p>
+            <w:pPr>
+              <w:pStyle w:val="Compact"/>
+            </w:pPr>
+            <w:r>
+              <w:t xml:space="preserve">929</w:t>
             </w:r>
           </w:p>
         </w:tc>
@@ -3684,18 +3822,18 @@
               <w:pStyle w:val="Compact"/>
             </w:pPr>
             <w:r>
-              <w:t xml:space="preserve">1.064</w:t>
-            </w:r>
-          </w:p>
-        </w:tc>
-        <w:tc>
-          <w:tcPr/>
-          <w:p>
-            <w:pPr>
-              <w:pStyle w:val="Compact"/>
-            </w:pPr>
-            <w:r>
-              <w:t xml:space="preserve">874</w:t>
+              <w:t xml:space="preserve">1.104</w:t>
+            </w:r>
+          </w:p>
+        </w:tc>
+        <w:tc>
+          <w:tcPr/>
+          <w:p>
+            <w:pPr>
+              <w:pStyle w:val="Compact"/>
+            </w:pPr>
+            <w:r>
+              <w:t xml:space="preserve">907</w:t>
             </w:r>
           </w:p>
         </w:tc>
@@ -3741,18 +3879,18 @@
               <w:pStyle w:val="Compact"/>
             </w:pPr>
             <w:r>
-              <w:t xml:space="preserve">1.195</w:t>
-            </w:r>
-          </w:p>
-        </w:tc>
-        <w:tc>
-          <w:tcPr/>
-          <w:p>
-            <w:pPr>
-              <w:pStyle w:val="Compact"/>
-            </w:pPr>
-            <w:r>
-              <w:t xml:space="preserve">1.005</w:t>
+              <w:t xml:space="preserve">1.240</w:t>
+            </w:r>
+          </w:p>
+        </w:tc>
+        <w:tc>
+          <w:tcPr/>
+          <w:p>
+            <w:pPr>
+              <w:pStyle w:val="Compact"/>
+            </w:pPr>
+            <w:r>
+              <w:t xml:space="preserve">1.043</w:t>
             </w:r>
           </w:p>
         </w:tc>
@@ -3779,7 +3917,7 @@
         <w:pStyle w:val="BodyText"/>
       </w:pPr>
       <w:r>
-        <w:t xml:space="preserve">Três resultados se destacam. Primeiro, a bateria do leilão deve ser dimensionada para o contrato, pois o módulo mercantil não se paga no lance. No BESS de referência, ofertar 57,5 MW e manter 2,5 MW e 24 MWh para uso mercantil acrescenta R$ 2,1 milhões por ano ao lucro, mas essa capacidade custa R$ 4,7 milhões por ano entre capital, O&amp;M e uso da rede; já os 12 MWh além do necessário para 60 MW custam R$ 29 mil/(MW·ano) no lance. Segundo, com o BESS dimensionado para o contrato, o lance por MW não depende da potência até a potência da usina FV, porque a bateria cabe no montante de uso de injeção já contratado pela usina; acima de 50 MW, cada MW adicional acrescenta TUST, e o lance cresce até R$ 1,086 milhão/(MW·ano) com 60 MW. A oferta deixa de ser</w:t>
+        <w:t xml:space="preserve">Três resultados se destacam. Primeiro, a bateria do leilão deve ser dimensionada para o contrato, pois o módulo mercantil não se paga no lance. No BESS de referência, ofertar 57,5 MW e manter 2,5 MW e 24 MWh para uso mercantil acrescenta R$ 2,1 milhões por ano ao lucro, mas essa capacidade custa R$ 4,7 milhões por ano entre capital, O&amp;M e uso da rede; já os 12 MWh além do necessário para 60 MW custam R$ 30 mil/(MW·ano) no lance. Segundo, com o BESS dimensionado para o contrato, o lance por MW não depende da potência até a potência da usina FV, porque a bateria cabe no montante de uso de injeção já contratado pela usina; acima de 50 MW, cada MW adicional acrescenta TUST, e o lance cresce até R$ 1,127 milhão/(MW·ano) com 60 MW. A oferta deixa de ser</w:t>
       </w:r>
       <w:r>
         <w:t xml:space="preserve"> </w:t>
@@ -3788,7 +3926,7 @@
         <w:t xml:space="preserve">“tudo ou nada”</w:t>
       </w:r>
       <w:r>
-        <w:t xml:space="preserve">: o proponente ofertaria qualquer quantidade entre 30 e 50 MW a partir de R$ 1,064 milhão/(MW·ano) e quantidades maiores a preços crescentes.</w:t>
+        <w:t xml:space="preserve">: o proponente ofertaria qualquer quantidade entre 30 e 50 MW a partir de R$ 1,104 milhão/(MW·ano) e quantidades maiores a preços crescentes.</w:t>
       </w:r>
     </w:p>
     <w:p>
@@ -3796,7 +3934,15 @@
         <w:pStyle w:val="BodyText"/>
       </w:pPr>
       <w:r>
-        <w:t xml:space="preserve">Terceiro, a bateria isolada, que paga a TUST sobre toda a sua potência, tem lance de R$ 1,195 milhão/(MW·ano), R$ 131 mil acima do híbrido. Como, no lance, o uso mercantil é nulo nos dois arranjos, essa diferença decorre inteiramente do compartilhamento da conexão: no lance mínimo, o papel da usina FV com produção de hidrogênio é dividir o ponto de conexão, e não fornecer receitas à bateria. O compartilhamento da infraestrutura de conexão, que também reduziria o investimento do arranjo híbrido, não foi quantificado.</w:t>
+        <w:t xml:space="preserve">Terceiro, a bateria isolada, que paga a TUST sobre toda a sua potência, tem lance de R$ 1,240 milhão/(MW·ano), R$ 136 mil acima do híbrido: a TUST de R$ 131 mil/(MW·ano), acrescida do PIS/Cofins. Como, no lance, o uso mercantil é nulo nos dois arranjos, essa diferença decorre inteiramente do compartilhamento da conexão: no lance mínimo, o papel da usina FV com produção de hidrogênio é dividir o ponto de conexão, e não fornecer receitas à bateria. O compartilhamento da infraestrutura de conexão, que também reduziria o investimento do arranjo híbrido, não foi quantificado.</w:t>
+      </w:r>
+    </w:p>
+    <w:p>
+      <w:pPr>
+        <w:pStyle w:val="BodyText"/>
+      </w:pPr>
+      <w:r>
+        <w:t xml:space="preserve">Essa vantagem, porém, pressupõe que a usina FV com o eletrolisador seja construída. Sozinha, sem o BESS, essa usina exige R$ 402 milhões de investimento e gera fluxo anual de R$ 18,6 milhões, após O&amp;M, uso da rede e PIS/Cofins, o que resulta em VPL de −R$ 276 milhões à taxa de 12,1% (−R$ 242 milhões a 8%). Com o hidrogênio a R$ 35/kg, portanto, a usina que hospeda a bateria não se justificaria por si. O lance de R$ 1,104 milhão/(MW·ano) vale para um proponente cuja usina FV exista ou se justifique por outras razões — por exemplo, uma usina já em operação ou com a energia vendida em contrato —; para um proponente que constrói só a bateria, a referência é o lance da bateria isolada, de R$ 1,240 milhão/(MW·ano).</w:t>
       </w:r>
     </w:p>
     <w:bookmarkEnd w:id="22"/>
@@ -4209,7 +4355,7 @@
         <w:pStyle w:val="BodyText"/>
       </w:pPr>
       <w:r>
-        <w:t xml:space="preserve">A fronteira entre risco e retorno, obtida com pesos</w:t>
+        <w:t xml:space="preserve">A fronteira entre risco e retorno foi obtida com pesos</w:t>
       </w:r>
       <w:r>
         <w:t xml:space="preserve"> </w:t>
@@ -4282,6 +4428,18 @@
           <m:rPr>
             <m:sty m:val="p"/>
           </m:rPr>
+          <m:t>;</m:t>
+        </m:r>
+        <m:r>
+          <m:t> </m:t>
+        </m:r>
+        <m:r>
+          <m:t>5</m:t>
+        </m:r>
+        <m:r>
+          <m:rPr>
+            <m:sty m:val="p"/>
+          </m:rPr>
           <m:t>}</m:t>
         </m:r>
       </m:oMath>
@@ -4289,7 +4447,7 @@
         <w:t xml:space="preserve"> </w:t>
       </w:r>
       <w:r>
-        <w:t xml:space="preserve">para o CVaR, degenerou em um único ponto: a mesma potência maximiza o lucro esperado e o lucro do pior ano, com</w:t>
+        <w:t xml:space="preserve">para o CVaR e tolerância de 0,01%, com</w:t>
       </w:r>
       <w:r>
         <w:t xml:space="preserve"> </w:t>
@@ -4305,7 +4463,150 @@
         <w:t xml:space="preserve"> </w:t>
       </w:r>
       <w:r>
-        <w:t xml:space="preserve">inferior a 0,07% em todos os casos. Não há, portanto, troca entre risco e retorno nesta configuração, pois a dispersão entre os cenários pouco depende da decisão de contratação, como se observa na Figura 4.4(b): as barras de cada decisão se deslocam praticamente em paralelo entre os anos.</w:t>
+        <w:t xml:space="preserve">final inferior a 0,01% em todos os casos. Com cinco cenários equiprováveis e</w:t>
+      </w:r>
+      <w:r>
+        <w:t xml:space="preserve"> </w:t>
+      </w:r>
+      <m:oMath>
+        <m:r>
+          <m:t>α</m:t>
+        </m:r>
+        <m:r>
+          <m:rPr>
+            <m:sty m:val="p"/>
+          </m:rPr>
+          <m:t>=</m:t>
+        </m:r>
+        <m:r>
+          <m:t>0</m:t>
+        </m:r>
+        <m:r>
+          <m:rPr>
+            <m:sty m:val="p"/>
+          </m:rPr>
+          <m:t>,</m:t>
+        </m:r>
+        <m:r>
+          <m:t>8</m:t>
+        </m:r>
+      </m:oMath>
+      <w:r>
+        <w:t xml:space="preserve">, o CVaR coincide com o lucro do pior ano, 2022. À medida que</w:t>
+      </w:r>
+      <w:r>
+        <w:t xml:space="preserve"> </w:t>
+      </w:r>
+      <m:oMath>
+        <m:r>
+          <m:t>β</m:t>
+        </m:r>
+      </m:oMath>
+      <w:r>
+        <w:t xml:space="preserve"> </w:t>
+      </w:r>
+      <w:r>
+        <w:t xml:space="preserve">aumenta, a potência ótima recua de 54,4 MW (</w:t>
+      </w:r>
+      <m:oMath>
+        <m:r>
+          <m:t>β</m:t>
+        </m:r>
+        <m:r>
+          <m:rPr>
+            <m:sty m:val="p"/>
+          </m:rPr>
+          <m:t>=</m:t>
+        </m:r>
+        <m:r>
+          <m:t>0</m:t>
+        </m:r>
+      </m:oMath>
+      <w:r>
+        <w:t xml:space="preserve">) para 53,4 MW (</w:t>
+      </w:r>
+      <m:oMath>
+        <m:r>
+          <m:t>β</m:t>
+        </m:r>
+        <m:r>
+          <m:rPr>
+            <m:sty m:val="p"/>
+          </m:rPr>
+          <m:t>=</m:t>
+        </m:r>
+        <m:r>
+          <m:t>0</m:t>
+        </m:r>
+        <m:r>
+          <m:rPr>
+            <m:sty m:val="p"/>
+          </m:rPr>
+          <m:t>,</m:t>
+        </m:r>
+        <m:r>
+          <m:t>5</m:t>
+        </m:r>
+      </m:oMath>
+      <w:r>
+        <w:t xml:space="preserve"> </w:t>
+      </w:r>
+      <w:r>
+        <w:t xml:space="preserve">e 1), 52,7 MW (</w:t>
+      </w:r>
+      <m:oMath>
+        <m:r>
+          <m:t>β</m:t>
+        </m:r>
+        <m:r>
+          <m:rPr>
+            <m:sty m:val="p"/>
+          </m:rPr>
+          <m:t>=</m:t>
+        </m:r>
+        <m:r>
+          <m:t>2</m:t>
+        </m:r>
+      </m:oMath>
+      <w:r>
+        <w:t xml:space="preserve">) e 52,1 MW (</w:t>
+      </w:r>
+      <m:oMath>
+        <m:r>
+          <m:t>β</m:t>
+        </m:r>
+        <m:r>
+          <m:rPr>
+            <m:sty m:val="p"/>
+          </m:rPr>
+          <m:t>=</m:t>
+        </m:r>
+        <m:r>
+          <m:t>5</m:t>
+        </m:r>
+      </m:oMath>
+      <w:r>
+        <w:t xml:space="preserve">). Entre os extremos, o lucro esperado cai R$ 81 mil por ano (0,12%) e o CVaR sobe R$ 85 mil (0,13%). Há, portanto, troca entre risco e retorno, mas ela é pequena. O CVaR desloca a decisão em direção ao ótimo do pior ano, de 51,5 MW (Tabela 4.7): com</w:t>
+      </w:r>
+      <w:r>
+        <w:t xml:space="preserve"> </w:t>
+      </w:r>
+      <m:oMath>
+        <m:r>
+          <m:t>β</m:t>
+        </m:r>
+        <m:r>
+          <m:rPr>
+            <m:sty m:val="p"/>
+          </m:rPr>
+          <m:t>=</m:t>
+        </m:r>
+        <m:r>
+          <m:t>5</m:t>
+        </m:r>
+      </m:oMath>
+      <w:r>
+        <w:t xml:space="preserve">, o lucro de 2022 fica a apenas R$ 1,4 mil do máximo possível naquele cenário. A troca é pequena porque a dispersão entre os cenários pouco depende da decisão de contratação, como se observa na Figura 4.4(b): as barras de cada decisão se deslocam praticamente em paralelo entre os anos. Com a tolerância de 0,1% usada inicialmente, a fronteira parecia degenerar em um único ponto (53,4 MW para todos os pesos), pois as diferenças entre os seus pontos, de até R$ 85 mil por ano, são da mesma ordem que essa tolerância, cerca de R$ 68 mil.</w:t>
       </w:r>
     </w:p>
     <w:p>
@@ -4785,7 +5086,7 @@
         <w:pStyle w:val="FirstParagraph"/>
       </w:pPr>
       <w:r>
-        <w:t xml:space="preserve">A Figura 4.5 apresenta o resultado do procedimento da Seção 3.8 para os cinco casos de contrato de hidrogênio e de importação do Quadro 3.2. No caso de referência (curvas em azul), o custo de oportunidade marginal cresce de forma acentuada com a potência contratada: até 37,5 MW, cada MW adicional custa menos de R$ 100 mil/(MW·ano), enquanto os últimos 5 MW custam entre R$ 760 mil e R$ 900 mil/(MW·ano) (Figura 4.5(b)). A receita mínima de entrada é de R$ 76 mil/(MW·ano) e a receita necessária para ofertar toda a potência do BESS é de R$ 895 mil/(MW·ano).</w:t>
+        <w:t xml:space="preserve">A Figura 4.5 apresenta o resultado do procedimento da Seção 3.8 para os cinco casos de contrato de hidrogênio e de importação do Quadro 3.2. No caso de referência (curvas em azul), o custo de oportunidade marginal cresce de forma acentuada com a potência contratada: até 37,5 MW, cada MW adicional custa menos de R$ 100 mil/(MW·ano), enquanto os últimos 5 MW custam entre R$ 760 mil e R$ 900 mil/(MW·ano) (Figura 4.5(b)). A receita mínima de entrada é de R$ 76 mil/(MW·ano), dos quais R$ 73 mil correspondem à degradação do módulo LRCAP (R$ 50/MWh sobre cerca de 1.461 MWh/MW injetados por ano) e apenas R$ 3 mil à perda de lucro no MCP e no hidrogênio, e a receita necessária para ofertar toda a potência do BESS é de R$ 895 mil/(MW·ano).</w:t>
       </w:r>
     </w:p>
     <w:p>
@@ -7011,7 +7312,7 @@
         <w:t xml:space="preserve"> </w:t>
       </w:r>
       <w:r>
-        <w:t xml:space="preserve">O limite de emissões não altera o lance mínimo do BESS a construir, que permanece em R$ 1,115 milhão/(MW·ano) com o BESS de referência e em R$ 1,064 milhão com o BESS dimensionado para o contrato: no primeiro, a oferta de toda a potência elimina o módulo mercantil, e, no segundo, o BESS não altera a operação do lado mercantil (Subseção 4.2.4). O critério altera, porém, a viabilidade do empreendimento como um todo (Tabela 4.2): à taxa de 12,1%, o VPL passa de −R$ 471 milhões no caso de referência para −R$ 434 milhões com o limite de 7 kgCO₂/kgH₂ e fator marginal e para −R$ 330 milhões com fator médio, e o preço de equilíbrio do hidrogênio cai de R$ 103/kg para R$ 76/kg e R$ 54/kg, respectivamente.</w:t>
+        <w:t xml:space="preserve">O limite de emissões não altera o lance mínimo do BESS a construir, que permanece em R$ 1,157 milhão/(MW·ano) com o BESS de referência e em R$ 1,104 milhão com o BESS dimensionado para o contrato: no primeiro, a oferta de toda a potência elimina o módulo mercantil, e, no segundo, o BESS não altera a operação do lado mercantil (Subseção 4.2.4). O critério altera, porém, a viabilidade do empreendimento como um todo (Tabela 4.2): à taxa de 12,1%, o VPL passa de −R$ 489 milhões no caso de referência para −R$ 457 milhões com o limite de 7 kgCO₂/kgH₂ e fator marginal e para −R$ 362 milhões com fator médio, e o preço de equilíbrio do hidrogênio cai de R$ 108/kg para R$ 80/kg e R$ 57/kg, respectivamente.</w:t>
       </w:r>
     </w:p>
     <w:p>
@@ -8408,7 +8709,7 @@
               <w:pStyle w:val="Compact"/>
             </w:pPr>
             <w:r>
-              <w:t xml:space="preserve">A anualização do CAPEX a 10% a.a. em 15 anos resulta em R$ 657 mil a R$ 789 mil/(MW·ano); os valores da grade acrescentam O&amp;M, encargos, tributos e reposição de módulos para manter a disponibilidade</w:t>
+              <w:t xml:space="preserve">A anualização do CAPEX à taxa central de 12,1% a.a. em 15 anos resulta em R$ 738 mil a R$ 886 mil/(MW·ano); os valores da grade acrescentam O&amp;M, encargos, tributos e reposição de módulos para manter a disponibilidade</w:t>
             </w:r>
           </w:p>
         </w:tc>
@@ -8720,13 +9021,13 @@
           <w:b/>
           <w:bCs/>
         </w:rPr>
-        <w:t xml:space="preserve">o lance mínimo é de cerca de R$ 1,06 milhão/(MW·ano) com a bateria dimensionada para o contrato</w:t>
+        <w:t xml:space="preserve">o lance mínimo é de cerca de R$ 1,10 milhão/(MW·ano) com a bateria dimensionada para o contrato</w:t>
       </w:r>
       <w:r>
         <w:t xml:space="preserve"> </w:t>
       </w:r>
       <w:r>
-        <w:t xml:space="preserve">(R$ 1,12 milhão com o BESS de referência), com investimento de referência de R$ 5.500/kW para 4 h e taxa de 12,1% antes de impostos; varia de R$ 1,02 milhão a R$ 1,35 milhão/(MW·ano) com o BESS de referência, conforme a duração de referência do custo da bateria, a regra de cobrança do uso da rede, o investimento, o O&amp;M e a disponibilidade; corresponde ao custo anual equivalente do BESS por MW (Equação (3.47)) e supera o preço obtido por termelétricas existentes no LRCAP de 2026 (R$ 831 mil); com a taxa após impostos, que ignora o imposto de renda, cairia para R$ 874 mil;</w:t>
+        <w:t xml:space="preserve">(R$ 1,16 milhão com o BESS de referência), com investimento de referência de R$ 5.500/kW para 4 h, taxa de 12,1% antes de impostos, PIS/Cofins de 3,65% e receita fixa reajustada pelo IPCA; varia de R$ 1,05 milhão a R$ 1,40 milhão/(MW·ano) com o BESS de referência, conforme a duração de referência do custo da bateria, a regra de cobrança do uso da rede, o regime tributário, o investimento, o O&amp;M e a disponibilidade, e chegaria a R$ 1,44 milhão se a receita fixa não fosse reajustada; corresponde ao custo anual equivalente do BESS por MW acrescido dos tributos sobre a receita (Equação (3.47)) e supera o preço obtido por termelétricas existentes no LRCAP de 2026 (R$ 831 mil); com a taxa após impostos, que ignora o imposto de renda, cairia para R$ 907 mil;</w:t>
       </w:r>
     </w:p>
     <w:p>
@@ -8741,13 +9042,13 @@
           <w:b/>
           <w:bCs/>
         </w:rPr>
-        <w:t xml:space="preserve">o papel do arranjo híbrido no lance é o compartilhamento da conexão:</w:t>
+        <w:t xml:space="preserve">o papel do arranjo híbrido no lance é o compartilhamento da conexão, condicionado à existência da usina:</w:t>
       </w:r>
       <w:r>
         <w:t xml:space="preserve"> </w:t>
       </w:r>
       <w:r>
-        <w:t xml:space="preserve">uma bateria isolada teria lance de R$ 1,20 milhão/(MW·ano), R$ 131 mil acima do híbrido, e as hipóteses sobre o hidrogênio alteram pouco o lance (redução de até 5%, no contrato firme de 3 t/dia com tanque de 10 t, efeito que depende da multa contratual adotada); essas hipóteses determinam, porém, a viabilidade do empreendimento como um todo: com os parâmetros adotados, nenhum caso se paga, e o preço de equilíbrio do hidrogênio no caso de referência é de cerca de R$ 103/kg;</w:t>
+        <w:t xml:space="preserve">uma bateria isolada teria lance de R$ 1,24 milhão/(MW·ano), R$ 136 mil acima do híbrido, mas a usina FV com o eletrolisador que hospeda a bateria tem, sozinha, VPL de −R$ 276 milhões; o lance do híbrido vale, portanto, para uma usina que exista ou se justifique por outras razões. As hipóteses sobre o hidrogênio alteram pouco o lance (redução de até 5%, no contrato firme de 3 t/dia com tanque de 10 t, efeito que depende da multa contratual adotada e que ignora o custo do tanque); essas hipóteses determinam, porém, a viabilidade do empreendimento como um todo: com os parâmetros adotados, nenhum caso se paga, e o preço de equilíbrio do hidrogênio no caso de referência é de cerca de R$ 108/kg;</w:t>
       </w:r>
     </w:p>
     <w:p>

</xml_diff>

<commit_message>
Itens 9 a 17: números novos (tanque, pilhas, juros na construção, fronteira LP, c_imp)
Co-Authored-By: Claude Opus 5.5 <noreply@anthropic.com>
Claude-Session: https://claude.ai/code/session_01YFtn9hiQUHbNLSX7rUNYuK
</commit_message>
<xml_diff>
--- a/docs/dissertacao/cap4_resultados.docx
+++ b/docs/dissertacao/cap4_resultados.docx
@@ -590,7 +590,7 @@
         <w:pStyle w:val="BodyText"/>
       </w:pPr>
       <w:r>
-        <w:t xml:space="preserve">O mesmo não vale quando há contrato de fornecimento de hidrogênio. Com entrega diária firme, guardar energia e hidrogênio de dias ensolarados para dias nublados tem valor, e a condição cíclica semanal — que obriga cada semana a começar com o módulo mercantil em 50% da carga e o tanque vazio — passa a restringir a operação. No contrato de 3 t/dia, o lucro operacional esperado com blocos cíclicos ficou entre 2,3% e 3,8% abaixo do obtido com os estados de fronteira da relaxação linear do ano (Seção 3.6.2), para potências de até 55 MW, e o déficit anual de entrega com 55 MW contratados caiu de 61 t para 40 t. Com o tanque de 10 t, a diferença chegou a 9%, pois a condição cíclica esvaziava o tanque no início de cada semana. Com a fronteira da relaxação, a diferença entre os limites inferior e superior do lucro foi inferior a 0,1% em todos os pontos das curvas de oferta dos casos com contrato até 55 MW, de até 0,33% com 57,5 MW e de até 1,6% com 60 MW. Nesse último ponto, o módulo mercantil fica sem potência e a relaxação linear, que admite o eletrolisador abaixo da carga mínima, é menos justa. No caso sem contrato, os dois tratamentos diferem em 0,01% (ano de 2021, 57,5 MW). Por isso, os casos com contrato de hidrogênio, apresentados nas Subseções 4.2.3, 4.3.4 e 4.3.7, foram calculados com a fronteira da relaxação.</w:t>
+        <w:t xml:space="preserve">O mesmo não vale quando há contrato de fornecimento de hidrogênio. Com entrega diária firme, guardar energia e hidrogênio de dias ensolarados para dias nublados tem valor, e a condição cíclica semanal — que obriga cada semana a começar com o módulo mercantil em 50% da carga e o tanque vazio — passa a restringir a operação. No contrato de 3 t/dia, o lucro operacional esperado com blocos cíclicos ficou entre 2,3% e 3,8% abaixo do obtido com os estados de fronteira da relaxação linear do ano (Seção 3.6.2), para potências de até 55 MW, e o déficit anual de entrega com 55 MW contratados caiu de 61 t para 40 t. Com o tanque de 10 t, a diferença chegou a 9%, pois a condição cíclica esvaziava o tanque no início de cada semana. Com a fronteira da relaxação, a diferença entre os limites inferior e superior do lucro foi inferior a 0,1% em todos os pontos das curvas de oferta dos casos com contrato até 55 MW, de até 0,33% com 57,5 MW e de até 1,6% com 60 MW. Nesse último ponto, o módulo mercantil fica sem potência e a relaxação linear, que admite o eletrolisador abaixo da carga mínima, é menos justa. Nos casos sem contrato, os dois tratamentos diferem em no máximo 0,05% no lucro esperado. Por isso, todas as curvas de oferta e as avaliações com potência fixa deste capítulo foram calculadas com a fronteira da relaxação, de modo que os casos sejam comparáveis entre si.3, 4.3.4 e 4.3.7, foram calculados com a fronteira da relaxação.</w:t>
       </w:r>
     </w:p>
     <w:bookmarkEnd w:id="12"/>
@@ -753,62 +753,62 @@
               <w:pStyle w:val="Compact"/>
             </w:pPr>
             <w:r>
-              <w:t xml:space="preserve">781</w:t>
-            </w:r>
-          </w:p>
-        </w:tc>
-        <w:tc>
-          <w:tcPr/>
-          <w:p>
-            <w:pPr>
-              <w:pStyle w:val="Compact"/>
-            </w:pPr>
-            <w:r>
-              <w:t xml:space="preserve">72,1</w:t>
-            </w:r>
-          </w:p>
-        </w:tc>
-        <w:tc>
-          <w:tcPr/>
-          <w:p>
-            <w:pPr>
-              <w:pStyle w:val="Compact"/>
-            </w:pPr>
-            <w:r>
-              <w:t xml:space="preserve">−489 (−655 a −277)</w:t>
-            </w:r>
-          </w:p>
-        </w:tc>
-        <w:tc>
-          <w:tcPr/>
-          <w:p>
-            <w:pPr>
-              <w:pStyle w:val="Compact"/>
-            </w:pPr>
-            <w:r>
-              <w:t xml:space="preserve">−412</w:t>
-            </w:r>
-          </w:p>
-        </w:tc>
-        <w:tc>
-          <w:tcPr/>
-          <w:p>
-            <w:pPr>
-              <w:pStyle w:val="Compact"/>
-            </w:pPr>
-            <w:r>
-              <w:t xml:space="preserve">−2,3%</w:t>
-            </w:r>
-          </w:p>
-        </w:tc>
-        <w:tc>
-          <w:tcPr/>
-          <w:p>
-            <w:pPr>
-              <w:pStyle w:val="Compact"/>
-            </w:pPr>
-            <w:r>
-              <w:t xml:space="preserve">108</w:t>
+              <w:t xml:space="preserve">792</w:t>
+            </w:r>
+          </w:p>
+        </w:tc>
+        <w:tc>
+          <w:tcPr/>
+          <w:p>
+            <w:pPr>
+              <w:pStyle w:val="Compact"/>
+            </w:pPr>
+            <w:r>
+              <w:t xml:space="preserve">72,0</w:t>
+            </w:r>
+          </w:p>
+        </w:tc>
+        <w:tc>
+          <w:tcPr/>
+          <w:p>
+            <w:pPr>
+              <w:pStyle w:val="Compact"/>
+            </w:pPr>
+            <w:r>
+              <w:t xml:space="preserve">−546 (−722 a −321)</w:t>
+            </w:r>
+          </w:p>
+        </w:tc>
+        <w:tc>
+          <w:tcPr/>
+          <w:p>
+            <w:pPr>
+              <w:pStyle w:val="Compact"/>
+            </w:pPr>
+            <w:r>
+              <w:t xml:space="preserve">−454</w:t>
+            </w:r>
+          </w:p>
+        </w:tc>
+        <w:tc>
+          <w:tcPr/>
+          <w:p>
+            <w:pPr>
+              <w:pStyle w:val="Compact"/>
+            </w:pPr>
+            <w:r>
+              <w:t xml:space="preserve">−3,1%</w:t>
+            </w:r>
+          </w:p>
+        </w:tc>
+        <w:tc>
+          <w:tcPr/>
+          <w:p>
+            <w:pPr>
+              <w:pStyle w:val="Compact"/>
+            </w:pPr>
+            <w:r>
+              <w:t xml:space="preserve">116</w:t>
             </w:r>
           </w:p>
         </w:tc>
@@ -832,7 +832,7 @@
               <w:pStyle w:val="Compact"/>
             </w:pPr>
             <w:r>
-              <w:t xml:space="preserve">781</w:t>
+              <w:t xml:space="preserve">792</w:t>
             </w:r>
           </w:p>
         </w:tc>
@@ -854,40 +854,40 @@
               <w:pStyle w:val="Compact"/>
             </w:pPr>
             <w:r>
-              <w:t xml:space="preserve">−527 (−693 a −315)</w:t>
-            </w:r>
-          </w:p>
-        </w:tc>
-        <w:tc>
-          <w:tcPr/>
-          <w:p>
-            <w:pPr>
-              <w:pStyle w:val="Compact"/>
-            </w:pPr>
-            <w:r>
-              <w:t xml:space="preserve">−460</w:t>
-            </w:r>
-          </w:p>
-        </w:tc>
-        <w:tc>
-          <w:tcPr/>
-          <w:p>
-            <w:pPr>
-              <w:pStyle w:val="Compact"/>
-            </w:pPr>
-            <w:r>
-              <w:t xml:space="preserve">−3,8%</w:t>
-            </w:r>
-          </w:p>
-        </w:tc>
-        <w:tc>
-          <w:tcPr/>
-          <w:p>
-            <w:pPr>
-              <w:pStyle w:val="Compact"/>
-            </w:pPr>
-            <w:r>
-              <w:t xml:space="preserve">146</w:t>
+              <w:t xml:space="preserve">−584 (−760 a −359)</w:t>
+            </w:r>
+          </w:p>
+        </w:tc>
+        <w:tc>
+          <w:tcPr/>
+          <w:p>
+            <w:pPr>
+              <w:pStyle w:val="Compact"/>
+            </w:pPr>
+            <w:r>
+              <w:t xml:space="preserve">−502</w:t>
+            </w:r>
+          </w:p>
+        </w:tc>
+        <w:tc>
+          <w:tcPr/>
+          <w:p>
+            <w:pPr>
+              <w:pStyle w:val="Compact"/>
+            </w:pPr>
+            <w:r>
+              <w:t xml:space="preserve">−4,6%</w:t>
+            </w:r>
+          </w:p>
+        </w:tc>
+        <w:tc>
+          <w:tcPr/>
+          <w:p>
+            <w:pPr>
+              <w:pStyle w:val="Compact"/>
+            </w:pPr>
+            <w:r>
+              <w:t xml:space="preserve">158</w:t>
             </w:r>
           </w:p>
         </w:tc>
@@ -911,7 +911,7 @@
               <w:pStyle w:val="Compact"/>
             </w:pPr>
             <w:r>
-              <w:t xml:space="preserve">781</w:t>
+              <w:t xml:space="preserve">792</w:t>
             </w:r>
           </w:p>
         </w:tc>
@@ -933,40 +933,40 @@
               <w:pStyle w:val="Compact"/>
             </w:pPr>
             <w:r>
-              <w:t xml:space="preserve">−506 (−672 a −295)</w:t>
-            </w:r>
-          </w:p>
-        </w:tc>
-        <w:tc>
-          <w:tcPr/>
-          <w:p>
-            <w:pPr>
-              <w:pStyle w:val="Compact"/>
-            </w:pPr>
-            <w:r>
-              <w:t xml:space="preserve">−434</w:t>
-            </w:r>
-          </w:p>
-        </w:tc>
-        <w:tc>
-          <w:tcPr/>
-          <w:p>
-            <w:pPr>
-              <w:pStyle w:val="Compact"/>
-            </w:pPr>
-            <w:r>
-              <w:t xml:space="preserve">−3,0%</w:t>
-            </w:r>
-          </w:p>
-        </w:tc>
-        <w:tc>
-          <w:tcPr/>
-          <w:p>
-            <w:pPr>
-              <w:pStyle w:val="Compact"/>
-            </w:pPr>
-            <w:r>
-              <w:t xml:space="preserve">108</w:t>
+              <w:t xml:space="preserve">−564 (−739 a −338)</w:t>
+            </w:r>
+          </w:p>
+        </w:tc>
+        <w:tc>
+          <w:tcPr/>
+          <w:p>
+            <w:pPr>
+              <w:pStyle w:val="Compact"/>
+            </w:pPr>
+            <w:r>
+              <w:t xml:space="preserve">−475</w:t>
+            </w:r>
+          </w:p>
+        </w:tc>
+        <w:tc>
+          <w:tcPr/>
+          <w:p>
+            <w:pPr>
+              <w:pStyle w:val="Compact"/>
+            </w:pPr>
+            <w:r>
+              <w:t xml:space="preserve">−3,8%</w:t>
+            </w:r>
+          </w:p>
+        </w:tc>
+        <w:tc>
+          <w:tcPr/>
+          <w:p>
+            <w:pPr>
+              <w:pStyle w:val="Compact"/>
+            </w:pPr>
+            <w:r>
+              <w:t xml:space="preserve">117</w:t>
             </w:r>
           </w:p>
         </w:tc>
@@ -979,73 +979,73 @@
               <w:pStyle w:val="Compact"/>
             </w:pPr>
             <w:r>
-              <w:t xml:space="preserve">Importação</w:t>
-            </w:r>
-          </w:p>
-        </w:tc>
-        <w:tc>
-          <w:tcPr/>
-          <w:p>
-            <w:pPr>
-              <w:pStyle w:val="Compact"/>
-            </w:pPr>
-            <w:r>
-              <w:t xml:space="preserve">781</w:t>
-            </w:r>
-          </w:p>
-        </w:tc>
-        <w:tc>
-          <w:tcPr/>
-          <w:p>
-            <w:pPr>
-              <w:pStyle w:val="Compact"/>
-            </w:pPr>
-            <w:r>
-              <w:t xml:space="preserve">92,9</w:t>
-            </w:r>
-          </w:p>
-        </w:tc>
-        <w:tc>
-          <w:tcPr/>
-          <w:p>
-            <w:pPr>
-              <w:pStyle w:val="Compact"/>
-            </w:pPr>
-            <w:r>
-              <w:t xml:space="preserve">−362 (−528 a −150)</w:t>
-            </w:r>
-          </w:p>
-        </w:tc>
-        <w:tc>
-          <w:tcPr/>
-          <w:p>
-            <w:pPr>
-              <w:pStyle w:val="Compact"/>
-            </w:pPr>
-            <w:r>
-              <w:t xml:space="preserve">−251</w:t>
-            </w:r>
-          </w:p>
-        </w:tc>
-        <w:tc>
-          <w:tcPr/>
-          <w:p>
-            <w:pPr>
-              <w:pStyle w:val="Compact"/>
-            </w:pPr>
-            <w:r>
-              <w:t xml:space="preserve">2,2%</w:t>
-            </w:r>
-          </w:p>
-        </w:tc>
-        <w:tc>
-          <w:tcPr/>
-          <w:p>
-            <w:pPr>
-              <w:pStyle w:val="Compact"/>
-            </w:pPr>
-            <w:r>
-              <w:t xml:space="preserve">57</w:t>
+              <w:t xml:space="preserve">Contrato 3 t/dia, tanque de 10 t</w:t>
+            </w:r>
+          </w:p>
+        </w:tc>
+        <w:tc>
+          <w:tcPr/>
+          <w:p>
+            <w:pPr>
+              <w:pStyle w:val="Compact"/>
+            </w:pPr>
+            <w:r>
+              <w:t xml:space="preserve">835</w:t>
+            </w:r>
+          </w:p>
+        </w:tc>
+        <w:tc>
+          <w:tcPr/>
+          <w:p>
+            <w:pPr>
+              <w:pStyle w:val="Compact"/>
+            </w:pPr>
+            <w:r>
+              <w:t xml:space="preserve">71,1</w:t>
+            </w:r>
+          </w:p>
+        </w:tc>
+        <w:tc>
+          <w:tcPr/>
+          <w:p>
+            <w:pPr>
+              <w:pStyle w:val="Compact"/>
+            </w:pPr>
+            <w:r>
+              <w:t xml:space="preserve">−599 (−779 a −359)</w:t>
+            </w:r>
+          </w:p>
+        </w:tc>
+        <w:tc>
+          <w:tcPr/>
+          <w:p>
+            <w:pPr>
+              <w:pStyle w:val="Compact"/>
+            </w:pPr>
+            <w:r>
+              <w:t xml:space="preserve">−507</w:t>
+            </w:r>
+          </w:p>
+        </w:tc>
+        <w:tc>
+          <w:tcPr/>
+          <w:p>
+            <w:pPr>
+              <w:pStyle w:val="Compact"/>
+            </w:pPr>
+            <w:r>
+              <w:t xml:space="preserve">−3,9%</w:t>
+            </w:r>
+          </w:p>
+        </w:tc>
+        <w:tc>
+          <w:tcPr/>
+          <w:p>
+            <w:pPr>
+              <w:pStyle w:val="Compact"/>
+            </w:pPr>
+            <w:r>
+              <w:t xml:space="preserve">120</w:t>
             </w:r>
           </w:p>
         </w:tc>
@@ -1058,73 +1058,73 @@
               <w:pStyle w:val="Compact"/>
             </w:pPr>
             <w:r>
-              <w:t xml:space="preserve">Importação e contrato 3 t/dia</w:t>
-            </w:r>
-          </w:p>
-        </w:tc>
-        <w:tc>
-          <w:tcPr/>
-          <w:p>
-            <w:pPr>
-              <w:pStyle w:val="Compact"/>
-            </w:pPr>
-            <w:r>
-              <w:t xml:space="preserve">781</w:t>
-            </w:r>
-          </w:p>
-        </w:tc>
-        <w:tc>
-          <w:tcPr/>
-          <w:p>
-            <w:pPr>
-              <w:pStyle w:val="Compact"/>
-            </w:pPr>
-            <w:r>
-              <w:t xml:space="preserve">73,3</w:t>
-            </w:r>
-          </w:p>
-        </w:tc>
-        <w:tc>
-          <w:tcPr/>
-          <w:p>
-            <w:pPr>
-              <w:pStyle w:val="Compact"/>
-            </w:pPr>
-            <w:r>
-              <w:t xml:space="preserve">−482 (−648 a −270)</w:t>
-            </w:r>
-          </w:p>
-        </w:tc>
-        <w:tc>
-          <w:tcPr/>
-          <w:p>
-            <w:pPr>
-              <w:pStyle w:val="Compact"/>
-            </w:pPr>
-            <w:r>
-              <w:t xml:space="preserve">−403</w:t>
-            </w:r>
-          </w:p>
-        </w:tc>
-        <w:tc>
-          <w:tcPr/>
-          <w:p>
-            <w:pPr>
-              <w:pStyle w:val="Compact"/>
-            </w:pPr>
-            <w:r>
-              <w:t xml:space="preserve">−2,0%</w:t>
-            </w:r>
-          </w:p>
-        </w:tc>
-        <w:tc>
-          <w:tcPr/>
-          <w:p>
-            <w:pPr>
-              <w:pStyle w:val="Compact"/>
-            </w:pPr>
-            <w:r>
-              <w:t xml:space="preserve">102</w:t>
+              <w:t xml:space="preserve">Importação</w:t>
+            </w:r>
+          </w:p>
+        </w:tc>
+        <w:tc>
+          <w:tcPr/>
+          <w:p>
+            <w:pPr>
+              <w:pStyle w:val="Compact"/>
+            </w:pPr>
+            <w:r>
+              <w:t xml:space="preserve">792</w:t>
+            </w:r>
+          </w:p>
+        </w:tc>
+        <w:tc>
+          <w:tcPr/>
+          <w:p>
+            <w:pPr>
+              <w:pStyle w:val="Compact"/>
+            </w:pPr>
+            <w:r>
+              <w:t xml:space="preserve">92,9</w:t>
+            </w:r>
+          </w:p>
+        </w:tc>
+        <w:tc>
+          <w:tcPr/>
+          <w:p>
+            <w:pPr>
+              <w:pStyle w:val="Compact"/>
+            </w:pPr>
+            <w:r>
+              <w:t xml:space="preserve">−450 (−633 a −210)</w:t>
+            </w:r>
+          </w:p>
+        </w:tc>
+        <w:tc>
+          <w:tcPr/>
+          <w:p>
+            <w:pPr>
+              <w:pStyle w:val="Compact"/>
+            </w:pPr>
+            <w:r>
+              <w:t xml:space="preserve">−334</w:t>
+            </w:r>
+          </w:p>
+        </w:tc>
+        <w:tc>
+          <w:tcPr/>
+          <w:p>
+            <w:pPr>
+              <w:pStyle w:val="Compact"/>
+            </w:pPr>
+            <w:r>
+              <w:t xml:space="preserve">0,8%</w:t>
+            </w:r>
+          </w:p>
+        </w:tc>
+        <w:tc>
+          <w:tcPr/>
+          <w:p>
+            <w:pPr>
+              <w:pStyle w:val="Compact"/>
+            </w:pPr>
+            <w:r>
+              <w:t xml:space="preserve">62</w:t>
             </w:r>
           </w:p>
         </w:tc>
@@ -1137,73 +1137,102 @@
               <w:pStyle w:val="Compact"/>
             </w:pPr>
             <w:r>
-              <w:t xml:space="preserve">Limite 7, fator médio</w:t>
-            </w:r>
-          </w:p>
-        </w:tc>
-        <w:tc>
-          <w:tcPr/>
-          <w:p>
-            <w:pPr>
-              <w:pStyle w:val="Compact"/>
-            </w:pPr>
-            <w:r>
-              <w:t xml:space="preserve">781</w:t>
-            </w:r>
-          </w:p>
-        </w:tc>
-        <w:tc>
-          <w:tcPr/>
-          <w:p>
-            <w:pPr>
-              <w:pStyle w:val="Compact"/>
-            </w:pPr>
-            <w:r>
-              <w:t xml:space="preserve">92,9</w:t>
-            </w:r>
-          </w:p>
-        </w:tc>
-        <w:tc>
-          <w:tcPr/>
-          <w:p>
-            <w:pPr>
-              <w:pStyle w:val="Compact"/>
-            </w:pPr>
-            <w:r>
-              <w:t xml:space="preserve">−362 (−528 a −151)</w:t>
-            </w:r>
-          </w:p>
-        </w:tc>
-        <w:tc>
-          <w:tcPr/>
-          <w:p>
-            <w:pPr>
-              <w:pStyle w:val="Compact"/>
-            </w:pPr>
-            <w:r>
-              <w:t xml:space="preserve">−251</w:t>
-            </w:r>
-          </w:p>
-        </w:tc>
-        <w:tc>
-          <w:tcPr/>
-          <w:p>
-            <w:pPr>
-              <w:pStyle w:val="Compact"/>
-            </w:pPr>
-            <w:r>
-              <w:t xml:space="preserve">2,2%</w:t>
-            </w:r>
-          </w:p>
-        </w:tc>
-        <w:tc>
-          <w:tcPr/>
-          <w:p>
-            <w:pPr>
-              <w:pStyle w:val="Compact"/>
-            </w:pPr>
-            <w:r>
-              <w:t xml:space="preserve">57</w:t>
+              <w:t xml:space="preserve">Importação,</w:t>
+            </w:r>
+            <w:r>
+              <w:t xml:space="preserve"> </w:t>
+            </w:r>
+            <m:oMath>
+              <m:sSup>
+                <m:e>
+                  <m:r>
+                    <m:t>c</m:t>
+                  </m:r>
+                </m:e>
+                <m:sup>
+                  <m:r>
+                    <m:t>i</m:t>
+                  </m:r>
+                  <m:r>
+                    <m:t>m</m:t>
+                  </m:r>
+                  <m:r>
+                    <m:t>p</m:t>
+                  </m:r>
+                </m:sup>
+              </m:sSup>
+            </m:oMath>
+            <w:r>
+              <w:t xml:space="preserve"> </w:t>
+            </w:r>
+            <w:r>
+              <w:t xml:space="preserve">= R$ 100/MWh</w:t>
+            </w:r>
+          </w:p>
+        </w:tc>
+        <w:tc>
+          <w:tcPr/>
+          <w:p>
+            <w:pPr>
+              <w:pStyle w:val="Compact"/>
+            </w:pPr>
+            <w:r>
+              <w:t xml:space="preserve">792</w:t>
+            </w:r>
+          </w:p>
+        </w:tc>
+        <w:tc>
+          <w:tcPr/>
+          <w:p>
+            <w:pPr>
+              <w:pStyle w:val="Compact"/>
+            </w:pPr>
+            <w:r>
+              <w:t xml:space="preserve">107,0</w:t>
+            </w:r>
+          </w:p>
+        </w:tc>
+        <w:tc>
+          <w:tcPr/>
+          <w:p>
+            <w:pPr>
+              <w:pStyle w:val="Compact"/>
+            </w:pPr>
+            <w:r>
+              <w:t xml:space="preserve">−355 (−538 a −116)</w:t>
+            </w:r>
+          </w:p>
+        </w:tc>
+        <w:tc>
+          <w:tcPr/>
+          <w:p>
+            <w:pPr>
+              <w:pStyle w:val="Compact"/>
+            </w:pPr>
+            <w:r>
+              <w:t xml:space="preserve">−214</w:t>
+            </w:r>
+          </w:p>
+        </w:tc>
+        <w:tc>
+          <w:tcPr/>
+          <w:p>
+            <w:pPr>
+              <w:pStyle w:val="Compact"/>
+            </w:pPr>
+            <w:r>
+              <w:t xml:space="preserve">3,6%</w:t>
+            </w:r>
+          </w:p>
+        </w:tc>
+        <w:tc>
+          <w:tcPr/>
+          <w:p>
+            <w:pPr>
+              <w:pStyle w:val="Compact"/>
+            </w:pPr>
+            <w:r>
+              <w:t xml:space="preserve">56</w:t>
             </w:r>
           </w:p>
         </w:tc>
@@ -1216,73 +1245,102 @@
               <w:pStyle w:val="Compact"/>
             </w:pPr>
             <w:r>
-              <w:t xml:space="preserve">Limite 3,4, fator médio</w:t>
-            </w:r>
-          </w:p>
-        </w:tc>
-        <w:tc>
-          <w:tcPr/>
-          <w:p>
-            <w:pPr>
-              <w:pStyle w:val="Compact"/>
-            </w:pPr>
-            <w:r>
-              <w:t xml:space="preserve">781</w:t>
-            </w:r>
-          </w:p>
-        </w:tc>
-        <w:tc>
-          <w:tcPr/>
-          <w:p>
-            <w:pPr>
-              <w:pStyle w:val="Compact"/>
-            </w:pPr>
-            <w:r>
-              <w:t xml:space="preserve">92,6</w:t>
-            </w:r>
-          </w:p>
-        </w:tc>
-        <w:tc>
-          <w:tcPr/>
-          <w:p>
-            <w:pPr>
-              <w:pStyle w:val="Compact"/>
-            </w:pPr>
-            <w:r>
-              <w:t xml:space="preserve">−364 (−530 a −152)</w:t>
-            </w:r>
-          </w:p>
-        </w:tc>
-        <w:tc>
-          <w:tcPr/>
-          <w:p>
-            <w:pPr>
-              <w:pStyle w:val="Compact"/>
-            </w:pPr>
-            <w:r>
-              <w:t xml:space="preserve">−253</w:t>
-            </w:r>
-          </w:p>
-        </w:tc>
-        <w:tc>
-          <w:tcPr/>
-          <w:p>
-            <w:pPr>
-              <w:pStyle w:val="Compact"/>
-            </w:pPr>
-            <w:r>
-              <w:t xml:space="preserve">2,2%</w:t>
-            </w:r>
-          </w:p>
-        </w:tc>
-        <w:tc>
-          <w:tcPr/>
-          <w:p>
-            <w:pPr>
-              <w:pStyle w:val="Compact"/>
-            </w:pPr>
-            <w:r>
-              <w:t xml:space="preserve">57</w:t>
+              <w:t xml:space="preserve">Importação,</w:t>
+            </w:r>
+            <w:r>
+              <w:t xml:space="preserve"> </w:t>
+            </w:r>
+            <m:oMath>
+              <m:sSup>
+                <m:e>
+                  <m:r>
+                    <m:t>c</m:t>
+                  </m:r>
+                </m:e>
+                <m:sup>
+                  <m:r>
+                    <m:t>i</m:t>
+                  </m:r>
+                  <m:r>
+                    <m:t>m</m:t>
+                  </m:r>
+                  <m:r>
+                    <m:t>p</m:t>
+                  </m:r>
+                </m:sup>
+              </m:sSup>
+            </m:oMath>
+            <w:r>
+              <w:t xml:space="preserve"> </w:t>
+            </w:r>
+            <w:r>
+              <w:t xml:space="preserve">= R$ 400/MWh</w:t>
+            </w:r>
+          </w:p>
+        </w:tc>
+        <w:tc>
+          <w:tcPr/>
+          <w:p>
+            <w:pPr>
+              <w:pStyle w:val="Compact"/>
+            </w:pPr>
+            <w:r>
+              <w:t xml:space="preserve">792</w:t>
+            </w:r>
+          </w:p>
+        </w:tc>
+        <w:tc>
+          <w:tcPr/>
+          <w:p>
+            <w:pPr>
+              <w:pStyle w:val="Compact"/>
+            </w:pPr>
+            <w:r>
+              <w:t xml:space="preserve">80,7</w:t>
+            </w:r>
+          </w:p>
+        </w:tc>
+        <w:tc>
+          <w:tcPr/>
+          <w:p>
+            <w:pPr>
+              <w:pStyle w:val="Compact"/>
+            </w:pPr>
+            <w:r>
+              <w:t xml:space="preserve">−526 (−708 a −288)</w:t>
+            </w:r>
+          </w:p>
+        </w:tc>
+        <w:tc>
+          <w:tcPr/>
+          <w:p>
+            <w:pPr>
+              <w:pStyle w:val="Compact"/>
+            </w:pPr>
+            <w:r>
+              <w:t xml:space="preserve">−431</w:t>
+            </w:r>
+          </w:p>
+        </w:tc>
+        <w:tc>
+          <w:tcPr/>
+          <w:p>
+            <w:pPr>
+              <w:pStyle w:val="Compact"/>
+            </w:pPr>
+            <w:r>
+              <w:t xml:space="preserve">−1,7%</w:t>
+            </w:r>
+          </w:p>
+        </w:tc>
+        <w:tc>
+          <w:tcPr/>
+          <w:p>
+            <w:pPr>
+              <w:pStyle w:val="Compact"/>
+            </w:pPr>
+            <w:r>
+              <w:t xml:space="preserve">72</w:t>
             </w:r>
           </w:p>
         </w:tc>
@@ -1295,73 +1353,73 @@
               <w:pStyle w:val="Compact"/>
             </w:pPr>
             <w:r>
-              <w:t xml:space="preserve">Limite 7, fator marginal</w:t>
-            </w:r>
-          </w:p>
-        </w:tc>
-        <w:tc>
-          <w:tcPr/>
-          <w:p>
-            <w:pPr>
-              <w:pStyle w:val="Compact"/>
-            </w:pPr>
-            <w:r>
-              <w:t xml:space="preserve">781</w:t>
-            </w:r>
-          </w:p>
-        </w:tc>
-        <w:tc>
-          <w:tcPr/>
-          <w:p>
-            <w:pPr>
-              <w:pStyle w:val="Compact"/>
-            </w:pPr>
-            <w:r>
-              <w:t xml:space="preserve">77,5</w:t>
-            </w:r>
-          </w:p>
-        </w:tc>
-        <w:tc>
-          <w:tcPr/>
-          <w:p>
-            <w:pPr>
-              <w:pStyle w:val="Compact"/>
-            </w:pPr>
-            <w:r>
-              <w:t xml:space="preserve">−457 (−623 a −245)</w:t>
-            </w:r>
-          </w:p>
-        </w:tc>
-        <w:tc>
-          <w:tcPr/>
-          <w:p>
-            <w:pPr>
-              <w:pStyle w:val="Compact"/>
-            </w:pPr>
-            <w:r>
-              <w:t xml:space="preserve">−371</w:t>
-            </w:r>
-          </w:p>
-        </w:tc>
-        <w:tc>
-          <w:tcPr/>
-          <w:p>
-            <w:pPr>
-              <w:pStyle w:val="Compact"/>
-            </w:pPr>
-            <w:r>
-              <w:t xml:space="preserve">−1,0%</w:t>
-            </w:r>
-          </w:p>
-        </w:tc>
-        <w:tc>
-          <w:tcPr/>
-          <w:p>
-            <w:pPr>
-              <w:pStyle w:val="Compact"/>
-            </w:pPr>
-            <w:r>
-              <w:t xml:space="preserve">80</w:t>
+              <w:t xml:space="preserve">Importação e contrato 3 t/dia</w:t>
+            </w:r>
+          </w:p>
+        </w:tc>
+        <w:tc>
+          <w:tcPr/>
+          <w:p>
+            <w:pPr>
+              <w:pStyle w:val="Compact"/>
+            </w:pPr>
+            <w:r>
+              <w:t xml:space="preserve">792</w:t>
+            </w:r>
+          </w:p>
+        </w:tc>
+        <w:tc>
+          <w:tcPr/>
+          <w:p>
+            <w:pPr>
+              <w:pStyle w:val="Compact"/>
+            </w:pPr>
+            <w:r>
+              <w:t xml:space="preserve">73,3</w:t>
+            </w:r>
+          </w:p>
+        </w:tc>
+        <w:tc>
+          <w:tcPr/>
+          <w:p>
+            <w:pPr>
+              <w:pStyle w:val="Compact"/>
+            </w:pPr>
+            <w:r>
+              <w:t xml:space="preserve">−539 (−715 a −313)</w:t>
+            </w:r>
+          </w:p>
+        </w:tc>
+        <w:tc>
+          <w:tcPr/>
+          <w:p>
+            <w:pPr>
+              <w:pStyle w:val="Compact"/>
+            </w:pPr>
+            <w:r>
+              <w:t xml:space="preserve">−445</w:t>
+            </w:r>
+          </w:p>
+        </w:tc>
+        <w:tc>
+          <w:tcPr/>
+          <w:p>
+            <w:pPr>
+              <w:pStyle w:val="Compact"/>
+            </w:pPr>
+            <w:r>
+              <w:t xml:space="preserve">−2,8%</w:t>
+            </w:r>
+          </w:p>
+        </w:tc>
+        <w:tc>
+          <w:tcPr/>
+          <w:p>
+            <w:pPr>
+              <w:pStyle w:val="Compact"/>
+            </w:pPr>
+            <w:r>
+              <w:t xml:space="preserve">110</w:t>
             </w:r>
           </w:p>
         </w:tc>
@@ -1374,73 +1432,73 @@
               <w:pStyle w:val="Compact"/>
             </w:pPr>
             <w:r>
-              <w:t xml:space="preserve">Limite 3,4, fator marginal</w:t>
-            </w:r>
-          </w:p>
-        </w:tc>
-        <w:tc>
-          <w:tcPr/>
-          <w:p>
-            <w:pPr>
-              <w:pStyle w:val="Compact"/>
-            </w:pPr>
-            <w:r>
-              <w:t xml:space="preserve">781</w:t>
-            </w:r>
-          </w:p>
-        </w:tc>
-        <w:tc>
-          <w:tcPr/>
-          <w:p>
-            <w:pPr>
-              <w:pStyle w:val="Compact"/>
-            </w:pPr>
-            <w:r>
-              <w:t xml:space="preserve">74,4</w:t>
-            </w:r>
-          </w:p>
-        </w:tc>
-        <w:tc>
-          <w:tcPr/>
-          <w:p>
-            <w:pPr>
-              <w:pStyle w:val="Compact"/>
-            </w:pPr>
-            <w:r>
-              <w:t xml:space="preserve">−475 (−641 a −264)</w:t>
-            </w:r>
-          </w:p>
-        </w:tc>
-        <w:tc>
-          <w:tcPr/>
-          <w:p>
-            <w:pPr>
-              <w:pStyle w:val="Compact"/>
-            </w:pPr>
-            <w:r>
-              <w:t xml:space="preserve">−395</w:t>
-            </w:r>
-          </w:p>
-        </w:tc>
-        <w:tc>
-          <w:tcPr/>
-          <w:p>
-            <w:pPr>
-              <w:pStyle w:val="Compact"/>
-            </w:pPr>
-            <w:r>
-              <w:t xml:space="preserve">−1,7%</w:t>
-            </w:r>
-          </w:p>
-        </w:tc>
-        <w:tc>
-          <w:tcPr/>
-          <w:p>
-            <w:pPr>
-              <w:pStyle w:val="Compact"/>
-            </w:pPr>
-            <w:r>
-              <w:t xml:space="preserve">93</w:t>
+              <w:t xml:space="preserve">Limite 7, fator médio</w:t>
+            </w:r>
+          </w:p>
+        </w:tc>
+        <w:tc>
+          <w:tcPr/>
+          <w:p>
+            <w:pPr>
+              <w:pStyle w:val="Compact"/>
+            </w:pPr>
+            <w:r>
+              <w:t xml:space="preserve">792</w:t>
+            </w:r>
+          </w:p>
+        </w:tc>
+        <w:tc>
+          <w:tcPr/>
+          <w:p>
+            <w:pPr>
+              <w:pStyle w:val="Compact"/>
+            </w:pPr>
+            <w:r>
+              <w:t xml:space="preserve">92,9</w:t>
+            </w:r>
+          </w:p>
+        </w:tc>
+        <w:tc>
+          <w:tcPr/>
+          <w:p>
+            <w:pPr>
+              <w:pStyle w:val="Compact"/>
+            </w:pPr>
+            <w:r>
+              <w:t xml:space="preserve">−450 (−633 a −210)</w:t>
+            </w:r>
+          </w:p>
+        </w:tc>
+        <w:tc>
+          <w:tcPr/>
+          <w:p>
+            <w:pPr>
+              <w:pStyle w:val="Compact"/>
+            </w:pPr>
+            <w:r>
+              <w:t xml:space="preserve">−334</w:t>
+            </w:r>
+          </w:p>
+        </w:tc>
+        <w:tc>
+          <w:tcPr/>
+          <w:p>
+            <w:pPr>
+              <w:pStyle w:val="Compact"/>
+            </w:pPr>
+            <w:r>
+              <w:t xml:space="preserve">0,8%</w:t>
+            </w:r>
+          </w:p>
+        </w:tc>
+        <w:tc>
+          <w:tcPr/>
+          <w:p>
+            <w:pPr>
+              <w:pStyle w:val="Compact"/>
+            </w:pPr>
+            <w:r>
+              <w:t xml:space="preserve">62</w:t>
             </w:r>
           </w:p>
         </w:tc>
@@ -1453,73 +1511,73 @@
               <w:pStyle w:val="Compact"/>
             </w:pPr>
             <w:r>
-              <w:t xml:space="preserve">Eletrolisador 10 MW</w:t>
-            </w:r>
-          </w:p>
-        </w:tc>
-        <w:tc>
-          <w:tcPr/>
-          <w:p>
-            <w:pPr>
-              <w:pStyle w:val="Compact"/>
-            </w:pPr>
-            <w:r>
-              <w:t xml:space="preserve">700</w:t>
-            </w:r>
-          </w:p>
-        </w:tc>
-        <w:tc>
-          <w:tcPr/>
-          <w:p>
-            <w:pPr>
-              <w:pStyle w:val="Compact"/>
-            </w:pPr>
-            <w:r>
-              <w:t xml:space="preserve">64,2</w:t>
-            </w:r>
-          </w:p>
-        </w:tc>
-        <w:tc>
-          <w:tcPr/>
-          <w:p>
-            <w:pPr>
-              <w:pStyle w:val="Compact"/>
-            </w:pPr>
-            <w:r>
-              <w:t xml:space="preserve">−444 (−585 a −276)</w:t>
-            </w:r>
-          </w:p>
-        </w:tc>
-        <w:tc>
-          <w:tcPr/>
-          <w:p>
-            <w:pPr>
-              <w:pStyle w:val="Compact"/>
-            </w:pPr>
-            <w:r>
-              <w:t xml:space="preserve">−376</w:t>
-            </w:r>
-          </w:p>
-        </w:tc>
-        <w:tc>
-          <w:tcPr/>
-          <w:p>
-            <w:pPr>
-              <w:pStyle w:val="Compact"/>
-            </w:pPr>
-            <w:r>
-              <w:t xml:space="preserve">−2,5%</w:t>
-            </w:r>
-          </w:p>
-        </w:tc>
-        <w:tc>
-          <w:tcPr/>
-          <w:p>
-            <w:pPr>
-              <w:pStyle w:val="Compact"/>
-            </w:pPr>
-            <w:r>
-              <w:t xml:space="preserve">115</w:t>
+              <w:t xml:space="preserve">Limite 3,4, fator médio</w:t>
+            </w:r>
+          </w:p>
+        </w:tc>
+        <w:tc>
+          <w:tcPr/>
+          <w:p>
+            <w:pPr>
+              <w:pStyle w:val="Compact"/>
+            </w:pPr>
+            <w:r>
+              <w:t xml:space="preserve">792</w:t>
+            </w:r>
+          </w:p>
+        </w:tc>
+        <w:tc>
+          <w:tcPr/>
+          <w:p>
+            <w:pPr>
+              <w:pStyle w:val="Compact"/>
+            </w:pPr>
+            <w:r>
+              <w:t xml:space="preserve">92,6</w:t>
+            </w:r>
+          </w:p>
+        </w:tc>
+        <w:tc>
+          <w:tcPr/>
+          <w:p>
+            <w:pPr>
+              <w:pStyle w:val="Compact"/>
+            </w:pPr>
+            <w:r>
+              <w:t xml:space="preserve">−451 (−635 a −212)</w:t>
+            </w:r>
+          </w:p>
+        </w:tc>
+        <w:tc>
+          <w:tcPr/>
+          <w:p>
+            <w:pPr>
+              <w:pStyle w:val="Compact"/>
+            </w:pPr>
+            <w:r>
+              <w:t xml:space="preserve">−336</w:t>
+            </w:r>
+          </w:p>
+        </w:tc>
+        <w:tc>
+          <w:tcPr/>
+          <w:p>
+            <w:pPr>
+              <w:pStyle w:val="Compact"/>
+            </w:pPr>
+            <w:r>
+              <w:t xml:space="preserve">0,8%</w:t>
+            </w:r>
+          </w:p>
+        </w:tc>
+        <w:tc>
+          <w:tcPr/>
+          <w:p>
+            <w:pPr>
+              <w:pStyle w:val="Compact"/>
+            </w:pPr>
+            <w:r>
+              <w:t xml:space="preserve">62</w:t>
             </w:r>
           </w:p>
         </w:tc>
@@ -1532,6 +1590,243 @@
               <w:pStyle w:val="Compact"/>
             </w:pPr>
             <w:r>
+              <w:t xml:space="preserve">Limite 7, fator marginal</w:t>
+            </w:r>
+          </w:p>
+        </w:tc>
+        <w:tc>
+          <w:tcPr/>
+          <w:p>
+            <w:pPr>
+              <w:pStyle w:val="Compact"/>
+            </w:pPr>
+            <w:r>
+              <w:t xml:space="preserve">792</w:t>
+            </w:r>
+          </w:p>
+        </w:tc>
+        <w:tc>
+          <w:tcPr/>
+          <w:p>
+            <w:pPr>
+              <w:pStyle w:val="Compact"/>
+            </w:pPr>
+            <w:r>
+              <w:t xml:space="preserve">77,5</w:t>
+            </w:r>
+          </w:p>
+        </w:tc>
+        <w:tc>
+          <w:tcPr/>
+          <w:p>
+            <w:pPr>
+              <w:pStyle w:val="Compact"/>
+            </w:pPr>
+            <w:r>
+              <w:t xml:space="preserve">−531 (−711 a −298)</w:t>
+            </w:r>
+          </w:p>
+        </w:tc>
+        <w:tc>
+          <w:tcPr/>
+          <w:p>
+            <w:pPr>
+              <w:pStyle w:val="Compact"/>
+            </w:pPr>
+            <w:r>
+              <w:t xml:space="preserve">−441</w:t>
+            </w:r>
+          </w:p>
+        </w:tc>
+        <w:tc>
+          <w:tcPr/>
+          <w:p>
+            <w:pPr>
+              <w:pStyle w:val="Compact"/>
+            </w:pPr>
+            <w:r>
+              <w:t xml:space="preserve">−2,1%</w:t>
+            </w:r>
+          </w:p>
+        </w:tc>
+        <w:tc>
+          <w:tcPr/>
+          <w:p>
+            <w:pPr>
+              <w:pStyle w:val="Compact"/>
+            </w:pPr>
+            <w:r>
+              <w:t xml:space="preserve">87</w:t>
+            </w:r>
+          </w:p>
+        </w:tc>
+      </w:tr>
+      <w:tr>
+        <w:tc>
+          <w:tcPr/>
+          <w:p>
+            <w:pPr>
+              <w:pStyle w:val="Compact"/>
+            </w:pPr>
+            <w:r>
+              <w:t xml:space="preserve">Limite 3,4, fator marginal</w:t>
+            </w:r>
+          </w:p>
+        </w:tc>
+        <w:tc>
+          <w:tcPr/>
+          <w:p>
+            <w:pPr>
+              <w:pStyle w:val="Compact"/>
+            </w:pPr>
+            <w:r>
+              <w:t xml:space="preserve">792</w:t>
+            </w:r>
+          </w:p>
+        </w:tc>
+        <w:tc>
+          <w:tcPr/>
+          <w:p>
+            <w:pPr>
+              <w:pStyle w:val="Compact"/>
+            </w:pPr>
+            <w:r>
+              <w:t xml:space="preserve">74,4</w:t>
+            </w:r>
+          </w:p>
+        </w:tc>
+        <w:tc>
+          <w:tcPr/>
+          <w:p>
+            <w:pPr>
+              <w:pStyle w:val="Compact"/>
+            </w:pPr>
+            <w:r>
+              <w:t xml:space="preserve">−533 (−708 a −307)</w:t>
+            </w:r>
+          </w:p>
+        </w:tc>
+        <w:tc>
+          <w:tcPr/>
+          <w:p>
+            <w:pPr>
+              <w:pStyle w:val="Compact"/>
+            </w:pPr>
+            <w:r>
+              <w:t xml:space="preserve">−436</w:t>
+            </w:r>
+          </w:p>
+        </w:tc>
+        <w:tc>
+          <w:tcPr/>
+          <w:p>
+            <w:pPr>
+              <w:pStyle w:val="Compact"/>
+            </w:pPr>
+            <w:r>
+              <w:t xml:space="preserve">−2,6%</w:t>
+            </w:r>
+          </w:p>
+        </w:tc>
+        <w:tc>
+          <w:tcPr/>
+          <w:p>
+            <w:pPr>
+              <w:pStyle w:val="Compact"/>
+            </w:pPr>
+            <w:r>
+              <w:t xml:space="preserve">100</w:t>
+            </w:r>
+          </w:p>
+        </w:tc>
+      </w:tr>
+      <w:tr>
+        <w:tc>
+          <w:tcPr/>
+          <w:p>
+            <w:pPr>
+              <w:pStyle w:val="Compact"/>
+            </w:pPr>
+            <w:r>
+              <w:t xml:space="preserve">Eletrolisador 10 MW</w:t>
+            </w:r>
+          </w:p>
+        </w:tc>
+        <w:tc>
+          <w:tcPr/>
+          <w:p>
+            <w:pPr>
+              <w:pStyle w:val="Compact"/>
+            </w:pPr>
+            <w:r>
+              <w:t xml:space="preserve">711</w:t>
+            </w:r>
+          </w:p>
+        </w:tc>
+        <w:tc>
+          <w:tcPr/>
+          <w:p>
+            <w:pPr>
+              <w:pStyle w:val="Compact"/>
+            </w:pPr>
+            <w:r>
+              <w:t xml:space="preserve">64,2</w:t>
+            </w:r>
+          </w:p>
+        </w:tc>
+        <w:tc>
+          <w:tcPr/>
+          <w:p>
+            <w:pPr>
+              <w:pStyle w:val="Compact"/>
+            </w:pPr>
+            <w:r>
+              <w:t xml:space="preserve">−506 (−659 a −322)</w:t>
+            </w:r>
+          </w:p>
+        </w:tc>
+        <w:tc>
+          <w:tcPr/>
+          <w:p>
+            <w:pPr>
+              <w:pStyle w:val="Compact"/>
+            </w:pPr>
+            <w:r>
+              <w:t xml:space="preserve">−430</w:t>
+            </w:r>
+          </w:p>
+        </w:tc>
+        <w:tc>
+          <w:tcPr/>
+          <w:p>
+            <w:pPr>
+              <w:pStyle w:val="Compact"/>
+            </w:pPr>
+            <w:r>
+              <w:t xml:space="preserve">−3,5%</w:t>
+            </w:r>
+          </w:p>
+        </w:tc>
+        <w:tc>
+          <w:tcPr/>
+          <w:p>
+            <w:pPr>
+              <w:pStyle w:val="Compact"/>
+            </w:pPr>
+            <w:r>
+              <w:t xml:space="preserve">126</w:t>
+            </w:r>
+          </w:p>
+        </w:tc>
+      </w:tr>
+      <w:tr>
+        <w:tc>
+          <w:tcPr/>
+          <w:p>
+            <w:pPr>
+              <w:pStyle w:val="Compact"/>
+            </w:pPr>
+            <w:r>
               <w:t xml:space="preserve">Eletrolisador 25 MW</w:t>
             </w:r>
           </w:p>
@@ -1543,7 +1838,7 @@
               <w:pStyle w:val="Compact"/>
             </w:pPr>
             <w:r>
-              <w:t xml:space="preserve">862</w:t>
+              <w:t xml:space="preserve">873</w:t>
             </w:r>
           </w:p>
         </w:tc>
@@ -1565,40 +1860,40 @@
               <w:pStyle w:val="Compact"/>
             </w:pPr>
             <w:r>
-              <w:t xml:space="preserve">−550 (−740 a −294)</w:t>
-            </w:r>
-          </w:p>
-        </w:tc>
-        <w:tc>
-          <w:tcPr/>
-          <w:p>
-            <w:pPr>
-              <w:pStyle w:val="Compact"/>
-            </w:pPr>
-            <w:r>
-              <w:t xml:space="preserve">−467</w:t>
-            </w:r>
-          </w:p>
-        </w:tc>
-        <w:tc>
-          <w:tcPr/>
-          <w:p>
-            <w:pPr>
-              <w:pStyle w:val="Compact"/>
-            </w:pPr>
-            <w:r>
-              <w:t xml:space="preserve">−2,6%</w:t>
-            </w:r>
-          </w:p>
-        </w:tc>
-        <w:tc>
-          <w:tcPr/>
-          <w:p>
-            <w:pPr>
-              <w:pStyle w:val="Compact"/>
-            </w:pPr>
-            <w:r>
-              <w:t xml:space="preserve">107</w:t>
+              <w:t xml:space="preserve">−612 (−813 a −340)</w:t>
+            </w:r>
+          </w:p>
+        </w:tc>
+        <w:tc>
+          <w:tcPr/>
+          <w:p>
+            <w:pPr>
+              <w:pStyle w:val="Compact"/>
+            </w:pPr>
+            <w:r>
+              <w:t xml:space="preserve">−512</w:t>
+            </w:r>
+          </w:p>
+        </w:tc>
+        <w:tc>
+          <w:tcPr/>
+          <w:p>
+            <w:pPr>
+              <w:pStyle w:val="Compact"/>
+            </w:pPr>
+            <w:r>
+              <w:t xml:space="preserve">−3,4%</w:t>
+            </w:r>
+          </w:p>
+        </w:tc>
+        <w:tc>
+          <w:tcPr/>
+          <w:p>
+            <w:pPr>
+              <w:pStyle w:val="Compact"/>
+            </w:pPr>
+            <w:r>
+              <w:t xml:space="preserve">115</w:t>
             </w:r>
           </w:p>
         </w:tc>
@@ -1609,7 +1904,7 @@
         <w:pStyle w:val="Fonte"/>
       </w:pPr>
       <w:r>
-        <w:t xml:space="preserve">Fonte: elaborado pelo autor. Investimento, TIR e preço de equilíbrio do H₂ (H₂ eq., à taxa de 12,1%) com investimento central; entre parênteses, VPL a 12,1% com investimento alto e baixo. O lucro operacional exclui a degradação do módulo LRCAP, coberta pelo O&amp;M fixo, e o fluxo desconta o O&amp;M fixo, o uso da rede e o PIS/Cofins de 3,65% sobre a receita bruta (Seção 3.8.2). Limites de emissões em kgCO₂/kgH₂ (Subseção 4.3.5). Nos casos de eletrolisador de 10 MW e de limite de emissões com fator marginal, o preço de equilíbrio usa o H₂ vendido na potência ótima da curva de oferta (50 ou 52,5 MW), e não na de 55 MW do VPL, e fica levemente subestimado.</w:t>
+        <w:t xml:space="preserve">Fonte: elaborado pelo autor. Investimento (sem os juros durante a construção), TIR e preço de equilíbrio do H₂ (H₂ eq., à taxa de 12,1%) com investimento central; o VPL inclui os juros durante a construção (um ano) e as trocas de pilhas do eletrolisador; entre parênteses, VPL a 12,1% com investimento alto e baixo. O lucro operacional exclui a degradação do módulo LRCAP, coberta pelo O&amp;M fixo, e o fluxo desconta o O&amp;M fixo, o uso da rede e o PIS/Cofins de 3,65% sobre a receita bruta (Seção 3.8.2). Limites de emissões em kgCO₂/kgH₂ (Subseção 4.3.5). Nos casos de eletrolisador de 10 MW e de limite de emissões com fator marginal, o preço de equilíbrio usa o H₂ vendido na potência ótima da curva de oferta (50 ou 52,5 MW), e não na de 55 MW do VPL, e fica levemente subestimado.</w:t>
       </w:r>
     </w:p>
     <w:p>
@@ -1617,7 +1912,7 @@
         <w:pStyle w:val="BodyText"/>
       </w:pPr>
       <w:r>
-        <w:t xml:space="preserve">Com os parâmetros adotados, nenhum caso é economicamente viável. No caso de referência, o investimento de R$ 781 milhões — R$ 212 milhões na usina FV, R$ 380 milhões no BESS e R$ 189 milhões no eletrolisador — gera fluxo anual de R$ 43,1 milhões, após R$ 18,3 milhões de O&amp;M fixo, R$ 7,9 milhões de uso da rede e R$ 2,7 milhões de PIS/Cofins, e a TIR real é negativa (−2,3%). O preço do hidrogênio que tornaria o VPL nulo à taxa de 12,1% é de cerca de R$ 108/kg, mais que o triplo do valor adotado (R$ 84/kg à taxa de 8%). Mesmo o caso de importação de energia, o de maior lucro, tem VPL negativo em toda a faixa de investimento e nas duas taxas; no cenário mais favorável, com investimento baixo e taxa de 8%, o VPL é de −R$ 32 milhões, o que antecipa a importância da regra de suprimento do eletrolisador discutida nas Subseções 4.3.4 e 4.3.5. Com o limite de emissões do marco legal, o resultado depende do fator de emissão da rede: com o fator médio do SIN, o VPL é praticamente o da importação livre; com o fator marginal, fica entre este e o do caso de referência.</w:t>
+        <w:t xml:space="preserve">Com os parâmetros adotados, nenhum caso central é economicamente viável. No caso de referência, o investimento de R$ 792 milhões — R$ 212 milhões na usina FV, R$ 380 milhões no BESS, R$ 189 milhões no eletrolisador e R$ 11 milhões no tanque de hidrogênio —, acrescido de R$ 47 milhões de juros durante a construção, gera fluxo anual de R$ 43,1 milhões, após R$ 18,3 milhões de O&amp;M fixo, R$ 7,9 milhões de uso da rede e R$ 2,7 milhões de PIS/Cofins, e a TIR real é negativa (−3,1%). O preço do hidrogênio que tornaria o VPL nulo à taxa de 12,1% é de cerca de R$ 116/kg, mais que o triplo do valor adotado (R$ 89/kg à taxa de 8%). O caso de importação de energia, o de maior lucro, tem VPL negativo em toda a faixa de investimento e nas duas taxas, mesmo com a troca de pilhas que o seu fator de capacidade de 0,92 exige no oitavo ano (R$ 30 milhões em valor presente); no cenário mais favorável, com investimento baixo e taxa de 8%, o VPL é de −R$ 86 milhões. Apenas com custo adicional de importação de R$ 100/MWh, investimento baixo e taxa de 8% o VPL se torna positivo, de R$ 34 milhões, o único caso viável dentre os avaliados, o que antecipa a importância da regra de suprimento do eletrolisador discutida nas Subseções 4.3.4 e 4.3.5. Com o limite de emissões do marco legal, o resultado depende do fator de emissão da rede: com o fator médio do SIN, o VPL é praticamente o da importação livre; com o fator marginal, fica entre este e o do caso de referência.</w:t>
       </w:r>
     </w:p>
     <w:p>
@@ -1708,7 +2003,7 @@
         <w:t xml:space="preserve"> </w:t>
       </w:r>
       <w:r>
-        <w:t xml:space="preserve">Sem a bateria, e portanto sem o leilão, o lucro operacional esperado é de R$ 35,4 milhões por ano. Com o BESS e a contratação de 55 MW à receita de R$ 600 mil/(MW·ano), passa a R$ 72,1 milhões. O ganho, de R$ 35,5 milhões por ano depois do PIS/Cofins sobre a receita fixa, não cobre o custo anual equivalente do BESS, de R$ 66,8 milhões à taxa de 12,1% com investimento central — R$ 56,0 milhões de capital, R$ 9,5 milhões de O&amp;M com reposição de módulos e R$ 1,3 milhão de acréscimo de uso da rede (Figura 4.2(b)). Sem a receita do leilão, a bateria agrega apenas R$ 8,8 milhões por ano, provenientes do suprimento noturno do eletrolisador e da arbitragem no MCP, já descontado o seu consumo auxiliar; é, portanto, a receita fixa do LRCAP que pode viabilizá-la.</w:t>
+        <w:t xml:space="preserve">Sem a bateria, e portanto sem o leilão, o lucro operacional esperado é de R$ 35,4 milhões por ano. Com o BESS e a contratação de 55 MW à receita de R$ 600 mil/(MW·ano), passa a R$ 72,0 milhões. O ganho, de R$ 35,5 milhões por ano depois do PIS/Cofins sobre a receita fixa, não cobre o custo anual equivalente do BESS, de R$ 70,1 milhões à taxa de 12,1% com investimento central — R$ 59,3 milhões de capital, incluídos os juros durante a construção, R$ 9,5 milhões de O&amp;M com reposição de módulos e R$ 1,3 milhão de acréscimo de uso da rede (Figura 4.2(b)). Sem a receita do leilão, a bateria agrega apenas R$ 8,8 milhões por ano, provenientes do suprimento noturno do eletrolisador e da arbitragem no MCP, já descontado o seu consumo auxiliar; é, portanto, a receita fixa do LRCAP que pode viabilizá-la.</w:t>
       </w:r>
     </w:p>
     <w:p>
@@ -1881,29 +2176,29 @@
               <w:pStyle w:val="Compact"/>
             </w:pPr>
             <w:r>
-              <w:t xml:space="preserve">1.054 (60 MW)</w:t>
-            </w:r>
-          </w:p>
-        </w:tc>
-        <w:tc>
-          <w:tcPr/>
-          <w:p>
-            <w:pPr>
-              <w:pStyle w:val="Compact"/>
-            </w:pPr>
-            <w:r>
-              <w:t xml:space="preserve">1.157 (60 MW)</w:t>
-            </w:r>
-          </w:p>
-        </w:tc>
-        <w:tc>
-          <w:tcPr/>
-          <w:p>
-            <w:pPr>
-              <w:pStyle w:val="Compact"/>
-            </w:pPr>
-            <w:r>
-              <w:t xml:space="preserve">1.260 (60 MW)</w:t>
+              <w:t xml:space="preserve">1.106 (60 MW)</w:t>
+            </w:r>
+          </w:p>
+        </w:tc>
+        <w:tc>
+          <w:tcPr/>
+          <w:p>
+            <w:pPr>
+              <w:pStyle w:val="Compact"/>
+            </w:pPr>
+            <w:r>
+              <w:t xml:space="preserve">1.214 (60 MW)</w:t>
+            </w:r>
+          </w:p>
+        </w:tc>
+        <w:tc>
+          <w:tcPr/>
+          <w:p>
+            <w:pPr>
+              <w:pStyle w:val="Compact"/>
+            </w:pPr>
+            <w:r>
+              <w:t xml:space="preserve">1.322 (60 MW)</w:t>
             </w:r>
           </w:p>
         </w:tc>
@@ -1927,29 +2222,29 @@
               <w:pStyle w:val="Compact"/>
             </w:pPr>
             <w:r>
-              <w:t xml:space="preserve">870 (60 MW)</w:t>
-            </w:r>
-          </w:p>
-        </w:tc>
-        <w:tc>
-          <w:tcPr/>
-          <w:p>
-            <w:pPr>
-              <w:pStyle w:val="Compact"/>
-            </w:pPr>
-            <w:r>
-              <w:t xml:space="preserve">954 (60 MW)</w:t>
-            </w:r>
-          </w:p>
-        </w:tc>
-        <w:tc>
-          <w:tcPr/>
-          <w:p>
-            <w:pPr>
-              <w:pStyle w:val="Compact"/>
-            </w:pPr>
-            <w:r>
-              <w:t xml:space="preserve">1.039 (60 MW)</w:t>
+              <w:t xml:space="preserve">897 (60 MW)</w:t>
+            </w:r>
+          </w:p>
+        </w:tc>
+        <w:tc>
+          <w:tcPr/>
+          <w:p>
+            <w:pPr>
+              <w:pStyle w:val="Compact"/>
+            </w:pPr>
+            <w:r>
+              <w:t xml:space="preserve">984 (60 MW)</w:t>
+            </w:r>
+          </w:p>
+        </w:tc>
+        <w:tc>
+          <w:tcPr/>
+          <w:p>
+            <w:pPr>
+              <w:pStyle w:val="Compact"/>
+            </w:pPr>
+            <w:r>
+              <w:t xml:space="preserve">1.072 (60 MW)</w:t>
             </w:r>
           </w:p>
         </w:tc>
@@ -1989,7 +2284,7 @@
         <w:t xml:space="preserve"> </w:t>
       </w:r>
       <w:r>
-        <w:t xml:space="preserve">(Subseção 4.2.4). A curva escalonada da Seção 4.3 descreve, portanto, a decisão de um proponente que já dispõe do BESS. O lance mínimo no caso central é de R$ 1,157 milhão/(MW·ano) e corresponde ao custo anual equivalente do BESS por MW, acrescido do PIS/Cofins sobre a receita fixa (Figura 4.3(b)): R$ 934 mil de capital, R$ 158 mil de O&amp;M com reposição de módulos, R$ 22 mil de acréscimo de uso da rede e R$ 43 mil de tributos sobre a receita. O capital reflete a energia da bateria: com 300 MWh, ou 5 h, o investimento é de R$ 380 milhões, 15% acima do valor de referência de um sistema de 4 h. O uso da rede pesa pouco porque a bateria compartilha a conexão com a usina FV e eleva o montante de uso de injeção em apenas 10 MW. As demais parcelas são nulas: o consumo auxiliar de 1% da potência cabe na folga de recarga custeada pela CONCAP, e, com 60 MW contratados, o módulo mercantil se anula, de modo que o uso mercantil da bateria não reduz o lance. O lance mínimo supera em 39% o preço médio obtido por termelétricas existentes no LRCAP de março de 2026 (R$ 831 mil/(MW·ano)) — mesmo no cenário mais favorável, com investimento baixo e taxa de 8%, ele fica em R$ 870 mil — e é muito inferior ao das termelétricas e hidrelétricas do leilão anterior (R$ 2,33 milhões/(MW·ano)). Isso sugere que o armazenamento em baterias é competitivo frente à expansão térmica, mas não frente às usinas existentes. A receita de R$ 600 mil/(MW·ano) adotada no caso de referência é inferior ao lance mínimo em todas as combinações avaliadas: com ela, um proponente racional não construiria o BESS.</w:t>
+        <w:t xml:space="preserve">(Subseção 4.2.4). A curva escalonada da Seção 4.3 descreve, portanto, a decisão de um proponente que já dispõe do BESS. O lance mínimo no caso central é de R$ 1,214 milhão/(MW·ano) e corresponde ao custo anual equivalente do BESS por MW, acrescido do PIS/Cofins sobre a receita fixa (Figura 4.3(b)): R$ 989 mil de capital, dos quais R$ 55 mil de juros durante a construção, R$ 158 mil de O&amp;M com reposição de módulos, R$ 22 mil de acréscimo de uso da rede e R$ 45 mil de tributos sobre a receita. O capital reflete a energia da bateria: com 300 MWh, ou 5 h, o investimento é de R$ 380 milhões, 15% acima do valor de referência de um sistema de 4 h. O uso da rede pesa pouco porque a bateria compartilha a conexão com a usina FV e eleva o montante de uso de injeção em apenas 10 MW. As demais parcelas são nulas: o consumo auxiliar de 1% da potência cabe na folga de recarga custeada pela CONCAP, e, com 60 MW contratados, o módulo mercantil se anula, de modo que o uso mercantil da bateria não reduz o lance. O lance mínimo supera em 46% o preço médio obtido por termelétricas existentes no LRCAP de março de 2026 (R$ 831 mil/(MW·ano)) — mesmo no cenário mais favorável, com investimento baixo e taxa de 8%, ele fica em R$ 897 mil — e é muito inferior ao das termelétricas e hidrelétricas do leilão anterior (R$ 2,33 milhões/(MW·ano)). Essa comparação, porém, é apenas indicativa, pois os produtos não são equivalentes. As termelétricas do LRCAP, além da receita fixa, são ressarcidas do custo variável unitário (CVU) da energia que geram quando despachadas e podem sustentar a potência por tempo indeterminado; a bateria entrega a potência por, no máximo, 4 h a cada despacho e arca com as perdas e o consumo auxiliar além da folga de recarga custeada pela CONCAP. A receita fixa por MW·ano não mede, assim, o custo total de cada fonte para o consumidor nem sua contribuição para a confiabilidade do sistema; uma comparação rigorosa exigiria o custo por MW de capacidade equivalente, que depende da contribuição de cada tecnologia para o atendimento da ponta, e está fora do escopo deste trabalho. Com essa ressalva, o lance situa-se entre o preço das usinas existentes e o da expansão térmica e hidrelétrica. A receita de R$ 600 mil/(MW·ano) adotada no caso de referência é inferior ao lance mínimo em todas as combinações avaliadas: com ela, um proponente racional não construiria o BESS.</w:t>
       </w:r>
     </w:p>
     <w:bookmarkEnd w:id="20"/>
@@ -2015,7 +2310,7 @@
         <w:pStyle w:val="Legenda"/>
       </w:pPr>
       <w:r>
-        <w:t xml:space="preserve">Tabela 4.4 – Lance mínimo para a construção do BESS com uma hipótese alterada de cada vez em relação ao caso central (investimento de referência de R$ 5.500/kW para 4 h, taxa de 12,1%, PIS/Cofins de 3,65% e receita reajustada pelo IPCA)</w:t>
+        <w:t xml:space="preserve">Tabela 4.4 – Lance mínimo para a construção do BESS com uma hipótese alterada de cada vez em relação ao caso central (investimento de referência de R$ 5.500/kW para 4 h, taxa de 12,1%, PIS/Cofins de 3,65%, receita reajustada pelo IPCA e implantação em um ano)</w:t>
       </w:r>
     </w:p>
     <w:tbl>
@@ -2140,7 +2435,7 @@
               <w:pStyle w:val="Compact"/>
             </w:pPr>
             <w:r>
-              <w:t xml:space="preserve">1.157</w:t>
+              <w:t xml:space="preserve">1.214</w:t>
             </w:r>
           </w:p>
         </w:tc>
@@ -2186,7 +2481,7 @@
               <w:pStyle w:val="Compact"/>
             </w:pPr>
             <w:r>
-              <w:t xml:space="preserve">1.054</w:t>
+              <w:t xml:space="preserve">1.106</w:t>
             </w:r>
           </w:p>
         </w:tc>
@@ -2232,7 +2527,7 @@
               <w:pStyle w:val="Compact"/>
             </w:pPr>
             <w:r>
-              <w:t xml:space="preserve">1.260</w:t>
+              <w:t xml:space="preserve">1.322</w:t>
             </w:r>
           </w:p>
         </w:tc>
@@ -2278,7 +2573,7 @@
               <w:pStyle w:val="Compact"/>
             </w:pPr>
             <w:r>
-              <w:t xml:space="preserve">1.403</w:t>
+              <w:t xml:space="preserve">1.473</w:t>
             </w:r>
           </w:p>
         </w:tc>
@@ -2324,7 +2619,7 @@
               <w:pStyle w:val="Compact"/>
             </w:pPr>
             <w:r>
-              <w:t xml:space="preserve">1.120</w:t>
+              <w:t xml:space="preserve">1.175</w:t>
             </w:r>
           </w:p>
         </w:tc>
@@ -2370,7 +2665,7 @@
               <w:pStyle w:val="Compact"/>
             </w:pPr>
             <w:r>
-              <w:t xml:space="preserve">1.194</w:t>
+              <w:t xml:space="preserve">1.253</w:t>
             </w:r>
           </w:p>
         </w:tc>
@@ -2416,7 +2711,7 @@
               <w:pStyle w:val="Compact"/>
             </w:pPr>
             <w:r>
-              <w:t xml:space="preserve">954</w:t>
+              <w:t xml:space="preserve">984</w:t>
             </w:r>
           </w:p>
         </w:tc>
@@ -2438,7 +2733,7 @@
               <w:pStyle w:val="Compact"/>
             </w:pPr>
             <w:r>
-              <w:t xml:space="preserve">−18%</w:t>
+              <w:t xml:space="preserve">−19%</w:t>
             </w:r>
           </w:p>
         </w:tc>
@@ -2462,7 +2757,7 @@
               <w:pStyle w:val="Compact"/>
             </w:pPr>
             <w:r>
-              <w:t xml:space="preserve">1.091</w:t>
+              <w:t xml:space="preserve">1.148</w:t>
             </w:r>
           </w:p>
         </w:tc>
@@ -2484,7 +2779,7 @@
               <w:pStyle w:val="Compact"/>
             </w:pPr>
             <w:r>
-              <w:t xml:space="preserve">−6%</w:t>
+              <w:t xml:space="preserve">−5%</w:t>
             </w:r>
           </w:p>
         </w:tc>
@@ -2508,7 +2803,7 @@
               <w:pStyle w:val="Compact"/>
             </w:pPr>
             <w:r>
-              <w:t xml:space="preserve">1.222</w:t>
+              <w:t xml:space="preserve">1.279</w:t>
             </w:r>
           </w:p>
         </w:tc>
@@ -2530,7 +2825,7 @@
               <w:pStyle w:val="Compact"/>
             </w:pPr>
             <w:r>
-              <w:t xml:space="preserve">+6%</w:t>
+              <w:t xml:space="preserve">+5%</w:t>
             </w:r>
           </w:p>
         </w:tc>
@@ -2554,7 +2849,7 @@
               <w:pStyle w:val="Compact"/>
             </w:pPr>
             <w:r>
-              <w:t xml:space="preserve">1.146</w:t>
+              <w:t xml:space="preserve">1.203</w:t>
             </w:r>
           </w:p>
         </w:tc>
@@ -2600,7 +2895,7 @@
               <w:pStyle w:val="Compact"/>
             </w:pPr>
             <w:r>
-              <w:t xml:space="preserve">1.175</w:t>
+              <w:t xml:space="preserve">1.232</w:t>
             </w:r>
           </w:p>
         </w:tc>
@@ -2622,7 +2917,7 @@
               <w:pStyle w:val="Compact"/>
             </w:pPr>
             <w:r>
-              <w:t xml:space="preserve">+2%</w:t>
+              <w:t xml:space="preserve">+1%</w:t>
             </w:r>
           </w:p>
         </w:tc>
@@ -2646,7 +2941,7 @@
               <w:pStyle w:val="Compact"/>
             </w:pPr>
             <w:r>
-              <w:t xml:space="preserve">1.270</w:t>
+              <w:t xml:space="preserve">1.327</w:t>
             </w:r>
           </w:p>
         </w:tc>
@@ -2668,7 +2963,7 @@
               <w:pStyle w:val="Compact"/>
             </w:pPr>
             <w:r>
-              <w:t xml:space="preserve">+10%</w:t>
+              <w:t xml:space="preserve">+9%</w:t>
             </w:r>
           </w:p>
         </w:tc>
@@ -2692,7 +2987,7 @@
               <w:pStyle w:val="Compact"/>
             </w:pPr>
             <w:r>
-              <w:t xml:space="preserve">1.346</w:t>
+              <w:t xml:space="preserve">1.404</w:t>
             </w:r>
           </w:p>
         </w:tc>
@@ -2738,7 +3033,7 @@
               <w:pStyle w:val="Compact"/>
             </w:pPr>
             <w:r>
-              <w:t xml:space="preserve">1.157</w:t>
+              <w:t xml:space="preserve">1.214</w:t>
             </w:r>
           </w:p>
         </w:tc>
@@ -2784,7 +3079,7 @@
               <w:pStyle w:val="Compact"/>
             </w:pPr>
             <w:r>
-              <w:t xml:space="preserve">1.170</w:t>
+              <w:t xml:space="preserve">1.227</w:t>
             </w:r>
           </w:p>
         </w:tc>
@@ -2819,18 +3114,18 @@
               <w:pStyle w:val="Compact"/>
             </w:pPr>
             <w:r>
-              <w:t xml:space="preserve">Disponibilidade de 97%</w:t>
-            </w:r>
-          </w:p>
-        </w:tc>
-        <w:tc>
-          <w:tcPr/>
-          <w:p>
-            <w:pPr>
-              <w:pStyle w:val="Compact"/>
-            </w:pPr>
-            <w:r>
-              <w:t xml:space="preserve">1.193</w:t>
+              <w:t xml:space="preserve">Consumo auxiliar sem a folga de recarga da CONCAP</w:t>
+            </w:r>
+          </w:p>
+        </w:tc>
+        <w:tc>
+          <w:tcPr/>
+          <w:p>
+            <w:pPr>
+              <w:pStyle w:val="Compact"/>
+            </w:pPr>
+            <w:r>
+              <w:t xml:space="preserve">1.229</w:t>
             </w:r>
           </w:p>
         </w:tc>
@@ -2852,7 +3147,7 @@
               <w:pStyle w:val="Compact"/>
             </w:pPr>
             <w:r>
-              <w:t xml:space="preserve">+3%</w:t>
+              <w:t xml:space="preserve">+1%</w:t>
             </w:r>
           </w:p>
         </w:tc>
@@ -2865,18 +3160,18 @@
               <w:pStyle w:val="Compact"/>
             </w:pPr>
             <w:r>
-              <w:t xml:space="preserve">Sem PIS/Cofins</w:t>
-            </w:r>
-          </w:p>
-        </w:tc>
-        <w:tc>
-          <w:tcPr/>
-          <w:p>
-            <w:pPr>
-              <w:pStyle w:val="Compact"/>
-            </w:pPr>
-            <w:r>
-              <w:t xml:space="preserve">1.115</w:t>
+              <w:t xml:space="preserve">Disponibilidade de 97%</w:t>
+            </w:r>
+          </w:p>
+        </w:tc>
+        <w:tc>
+          <w:tcPr/>
+          <w:p>
+            <w:pPr>
+              <w:pStyle w:val="Compact"/>
+            </w:pPr>
+            <w:r>
+              <w:t xml:space="preserve">1.251</w:t>
             </w:r>
           </w:p>
         </w:tc>
@@ -2898,7 +3193,7 @@
               <w:pStyle w:val="Compact"/>
             </w:pPr>
             <w:r>
-              <w:t xml:space="preserve">−4%</w:t>
+              <w:t xml:space="preserve">+3%</w:t>
             </w:r>
           </w:p>
         </w:tc>
@@ -2911,18 +3206,18 @@
               <w:pStyle w:val="Compact"/>
             </w:pPr>
             <w:r>
-              <w:t xml:space="preserve">PIS/Cofins não cumulativo (9,25%)</w:t>
-            </w:r>
-          </w:p>
-        </w:tc>
-        <w:tc>
-          <w:tcPr/>
-          <w:p>
-            <w:pPr>
-              <w:pStyle w:val="Compact"/>
-            </w:pPr>
-            <w:r>
-              <w:t xml:space="preserve">1.228</w:t>
+              <w:t xml:space="preserve">Sem PIS/Cofins</w:t>
+            </w:r>
+          </w:p>
+        </w:tc>
+        <w:tc>
+          <w:tcPr/>
+          <w:p>
+            <w:pPr>
+              <w:pStyle w:val="Compact"/>
+            </w:pPr>
+            <w:r>
+              <w:t xml:space="preserve">1.170</w:t>
             </w:r>
           </w:p>
         </w:tc>
@@ -2944,7 +3239,7 @@
               <w:pStyle w:val="Compact"/>
             </w:pPr>
             <w:r>
-              <w:t xml:space="preserve">+6%</w:t>
+              <w:t xml:space="preserve">−4%</w:t>
             </w:r>
           </w:p>
         </w:tc>
@@ -2957,6 +3252,52 @@
               <w:pStyle w:val="Compact"/>
             </w:pPr>
             <w:r>
+              <w:t xml:space="preserve">PIS/Cofins não cumulativo (9,25%)</w:t>
+            </w:r>
+          </w:p>
+        </w:tc>
+        <w:tc>
+          <w:tcPr/>
+          <w:p>
+            <w:pPr>
+              <w:pStyle w:val="Compact"/>
+            </w:pPr>
+            <w:r>
+              <w:t xml:space="preserve">1.289</w:t>
+            </w:r>
+          </w:p>
+        </w:tc>
+        <w:tc>
+          <w:tcPr/>
+          <w:p>
+            <w:pPr>
+              <w:pStyle w:val="Compact"/>
+            </w:pPr>
+            <w:r>
+              <w:t xml:space="preserve">60</w:t>
+            </w:r>
+          </w:p>
+        </w:tc>
+        <w:tc>
+          <w:tcPr/>
+          <w:p>
+            <w:pPr>
+              <w:pStyle w:val="Compact"/>
+            </w:pPr>
+            <w:r>
+              <w:t xml:space="preserve">+6%</w:t>
+            </w:r>
+          </w:p>
+        </w:tc>
+      </w:tr>
+      <w:tr>
+        <w:tc>
+          <w:tcPr/>
+          <w:p>
+            <w:pPr>
+              <w:pStyle w:val="Compact"/>
+            </w:pPr>
+            <w:r>
               <w:t xml:space="preserve">Receita fixa sem reajuste pelo IPCA (4% a.a.)</w:t>
             </w:r>
           </w:p>
@@ -2968,7 +3309,7 @@
               <w:pStyle w:val="Compact"/>
             </w:pPr>
             <w:r>
-              <w:t xml:space="preserve">1.444</w:t>
+              <w:t xml:space="preserve">1.515</w:t>
             </w:r>
           </w:p>
         </w:tc>
@@ -2991,6 +3332,98 @@
             </w:pPr>
             <w:r>
               <w:t xml:space="preserve">+25%</w:t>
+            </w:r>
+          </w:p>
+        </w:tc>
+      </w:tr>
+      <w:tr>
+        <w:tc>
+          <w:tcPr/>
+          <w:p>
+            <w:pPr>
+              <w:pStyle w:val="Compact"/>
+            </w:pPr>
+            <w:r>
+              <w:t xml:space="preserve">Sem juros durante a construção</w:t>
+            </w:r>
+          </w:p>
+        </w:tc>
+        <w:tc>
+          <w:tcPr/>
+          <w:p>
+            <w:pPr>
+              <w:pStyle w:val="Compact"/>
+            </w:pPr>
+            <w:r>
+              <w:t xml:space="preserve">1.157</w:t>
+            </w:r>
+          </w:p>
+        </w:tc>
+        <w:tc>
+          <w:tcPr/>
+          <w:p>
+            <w:pPr>
+              <w:pStyle w:val="Compact"/>
+            </w:pPr>
+            <w:r>
+              <w:t xml:space="preserve">60</w:t>
+            </w:r>
+          </w:p>
+        </w:tc>
+        <w:tc>
+          <w:tcPr/>
+          <w:p>
+            <w:pPr>
+              <w:pStyle w:val="Compact"/>
+            </w:pPr>
+            <w:r>
+              <w:t xml:space="preserve">−5%</w:t>
+            </w:r>
+          </w:p>
+        </w:tc>
+      </w:tr>
+      <w:tr>
+        <w:tc>
+          <w:tcPr/>
+          <w:p>
+            <w:pPr>
+              <w:pStyle w:val="Compact"/>
+            </w:pPr>
+            <w:r>
+              <w:t xml:space="preserve">Implantação em 2 anos</w:t>
+            </w:r>
+          </w:p>
+        </w:tc>
+        <w:tc>
+          <w:tcPr/>
+          <w:p>
+            <w:pPr>
+              <w:pStyle w:val="Compact"/>
+            </w:pPr>
+            <w:r>
+              <w:t xml:space="preserve">1.276</w:t>
+            </w:r>
+          </w:p>
+        </w:tc>
+        <w:tc>
+          <w:tcPr/>
+          <w:p>
+            <w:pPr>
+              <w:pStyle w:val="Compact"/>
+            </w:pPr>
+            <w:r>
+              <w:t xml:space="preserve">60</w:t>
+            </w:r>
+          </w:p>
+        </w:tc>
+        <w:tc>
+          <w:tcPr/>
+          <w:p>
+            <w:pPr>
+              <w:pStyle w:val="Compact"/>
+            </w:pPr>
+            <w:r>
+              <w:t xml:space="preserve">+5%</w:t>
             </w:r>
           </w:p>
         </w:tc>
@@ -3055,7 +3488,7 @@
               <w:pStyle w:val="Compact"/>
             </w:pPr>
             <w:r>
-              <w:t xml:space="preserve">1.157</w:t>
+              <w:t xml:space="preserve">1.214</w:t>
             </w:r>
           </w:p>
         </w:tc>
@@ -3101,7 +3534,7 @@
               <w:pStyle w:val="Compact"/>
             </w:pPr>
             <w:r>
-              <w:t xml:space="preserve">1.119</w:t>
+              <w:t xml:space="preserve">1.179</w:t>
             </w:r>
           </w:p>
         </w:tc>
@@ -3147,7 +3580,7 @@
               <w:pStyle w:val="Compact"/>
             </w:pPr>
             <w:r>
-              <w:t xml:space="preserve">1.096</w:t>
+              <w:t xml:space="preserve">1.159</w:t>
             </w:r>
           </w:p>
         </w:tc>
@@ -3193,7 +3626,7 @@
               <w:pStyle w:val="Compact"/>
             </w:pPr>
             <w:r>
-              <w:t xml:space="preserve">1.157</w:t>
+              <w:t xml:space="preserve">1.214</w:t>
             </w:r>
           </w:p>
         </w:tc>
@@ -3228,18 +3661,47 @@
               <w:pStyle w:val="Compact"/>
             </w:pPr>
             <w:r>
-              <w:t xml:space="preserve">Importação e contrato 3 t/dia</w:t>
-            </w:r>
-          </w:p>
-        </w:tc>
-        <w:tc>
-          <w:tcPr/>
-          <w:p>
-            <w:pPr>
-              <w:pStyle w:val="Compact"/>
-            </w:pPr>
-            <w:r>
-              <w:t xml:space="preserve">1.157</w:t>
+              <w:t xml:space="preserve">Importação,</w:t>
+            </w:r>
+            <w:r>
+              <w:t xml:space="preserve"> </w:t>
+            </w:r>
+            <m:oMath>
+              <m:sSup>
+                <m:e>
+                  <m:r>
+                    <m:t>c</m:t>
+                  </m:r>
+                </m:e>
+                <m:sup>
+                  <m:r>
+                    <m:t>i</m:t>
+                  </m:r>
+                  <m:r>
+                    <m:t>m</m:t>
+                  </m:r>
+                  <m:r>
+                    <m:t>p</m:t>
+                  </m:r>
+                </m:sup>
+              </m:sSup>
+            </m:oMath>
+            <w:r>
+              <w:t xml:space="preserve"> </w:t>
+            </w:r>
+            <w:r>
+              <w:t xml:space="preserve">= R$ 100/MWh</w:t>
+            </w:r>
+          </w:p>
+        </w:tc>
+        <w:tc>
+          <w:tcPr/>
+          <w:p>
+            <w:pPr>
+              <w:pStyle w:val="Compact"/>
+            </w:pPr>
+            <w:r>
+              <w:t xml:space="preserve">1.214</w:t>
             </w:r>
           </w:p>
         </w:tc>
@@ -3274,18 +3736,47 @@
               <w:pStyle w:val="Compact"/>
             </w:pPr>
             <w:r>
-              <w:t xml:space="preserve">Eletrolisador 10 MW</w:t>
-            </w:r>
-          </w:p>
-        </w:tc>
-        <w:tc>
-          <w:tcPr/>
-          <w:p>
-            <w:pPr>
-              <w:pStyle w:val="Compact"/>
-            </w:pPr>
-            <w:r>
-              <w:t xml:space="preserve">1.157</w:t>
+              <w:t xml:space="preserve">Importação,</w:t>
+            </w:r>
+            <w:r>
+              <w:t xml:space="preserve"> </w:t>
+            </w:r>
+            <m:oMath>
+              <m:sSup>
+                <m:e>
+                  <m:r>
+                    <m:t>c</m:t>
+                  </m:r>
+                </m:e>
+                <m:sup>
+                  <m:r>
+                    <m:t>i</m:t>
+                  </m:r>
+                  <m:r>
+                    <m:t>m</m:t>
+                  </m:r>
+                  <m:r>
+                    <m:t>p</m:t>
+                  </m:r>
+                </m:sup>
+              </m:sSup>
+            </m:oMath>
+            <w:r>
+              <w:t xml:space="preserve"> </w:t>
+            </w:r>
+            <w:r>
+              <w:t xml:space="preserve">= R$ 400/MWh</w:t>
+            </w:r>
+          </w:p>
+        </w:tc>
+        <w:tc>
+          <w:tcPr/>
+          <w:p>
+            <w:pPr>
+              <w:pStyle w:val="Compact"/>
+            </w:pPr>
+            <w:r>
+              <w:t xml:space="preserve">1.214</w:t>
             </w:r>
           </w:p>
         </w:tc>
@@ -3320,18 +3811,18 @@
               <w:pStyle w:val="Compact"/>
             </w:pPr>
             <w:r>
-              <w:t xml:space="preserve">Eletrolisador 25 MW</w:t>
-            </w:r>
-          </w:p>
-        </w:tc>
-        <w:tc>
-          <w:tcPr/>
-          <w:p>
-            <w:pPr>
-              <w:pStyle w:val="Compact"/>
-            </w:pPr>
-            <w:r>
-              <w:t xml:space="preserve">1.157</w:t>
+              <w:t xml:space="preserve">Importação e contrato 3 t/dia</w:t>
+            </w:r>
+          </w:p>
+        </w:tc>
+        <w:tc>
+          <w:tcPr/>
+          <w:p>
+            <w:pPr>
+              <w:pStyle w:val="Compact"/>
+            </w:pPr>
+            <w:r>
+              <w:t xml:space="preserve">1.214</w:t>
             </w:r>
           </w:p>
         </w:tc>
@@ -3366,18 +3857,18 @@
               <w:pStyle w:val="Compact"/>
             </w:pPr>
             <w:r>
-              <w:t xml:space="preserve">50 despachos/ano</w:t>
-            </w:r>
-          </w:p>
-        </w:tc>
-        <w:tc>
-          <w:tcPr/>
-          <w:p>
-            <w:pPr>
-              <w:pStyle w:val="Compact"/>
-            </w:pPr>
-            <w:r>
-              <w:t xml:space="preserve">1.170</w:t>
+              <w:t xml:space="preserve">Eletrolisador 10 MW</w:t>
+            </w:r>
+          </w:p>
+        </w:tc>
+        <w:tc>
+          <w:tcPr/>
+          <w:p>
+            <w:pPr>
+              <w:pStyle w:val="Compact"/>
+            </w:pPr>
+            <w:r>
+              <w:t xml:space="preserve">1.214</w:t>
             </w:r>
           </w:p>
         </w:tc>
@@ -3399,7 +3890,7 @@
               <w:pStyle w:val="Compact"/>
             </w:pPr>
             <w:r>
-              <w:t xml:space="preserve">+1%</w:t>
+              <w:t xml:space="preserve">0%</w:t>
             </w:r>
           </w:p>
         </w:tc>
@@ -3412,18 +3903,18 @@
               <w:pStyle w:val="Compact"/>
             </w:pPr>
             <w:r>
-              <w:t xml:space="preserve">150 despachos/ano</w:t>
-            </w:r>
-          </w:p>
-        </w:tc>
-        <w:tc>
-          <w:tcPr/>
-          <w:p>
-            <w:pPr>
-              <w:pStyle w:val="Compact"/>
-            </w:pPr>
-            <w:r>
-              <w:t xml:space="preserve">1.165</w:t>
+              <w:t xml:space="preserve">Eletrolisador 25 MW</w:t>
+            </w:r>
+          </w:p>
+        </w:tc>
+        <w:tc>
+          <w:tcPr/>
+          <w:p>
+            <w:pPr>
+              <w:pStyle w:val="Compact"/>
+            </w:pPr>
+            <w:r>
+              <w:t xml:space="preserve">1.214</w:t>
             </w:r>
           </w:p>
         </w:tc>
@@ -3445,7 +3936,7 @@
               <w:pStyle w:val="Compact"/>
             </w:pPr>
             <w:r>
-              <w:t xml:space="preserve">+1%</w:t>
+              <w:t xml:space="preserve">0%</w:t>
             </w:r>
           </w:p>
         </w:tc>
@@ -3458,18 +3949,18 @@
               <w:pStyle w:val="Compact"/>
             </w:pPr>
             <w:r>
-              <w:t xml:space="preserve">Degradação R$ 100/MWh</w:t>
-            </w:r>
-          </w:p>
-        </w:tc>
-        <w:tc>
-          <w:tcPr/>
-          <w:p>
-            <w:pPr>
-              <w:pStyle w:val="Compact"/>
-            </w:pPr>
-            <w:r>
-              <w:t xml:space="preserve">1.157</w:t>
+              <w:t xml:space="preserve">50 despachos/ano</w:t>
+            </w:r>
+          </w:p>
+        </w:tc>
+        <w:tc>
+          <w:tcPr/>
+          <w:p>
+            <w:pPr>
+              <w:pStyle w:val="Compact"/>
+            </w:pPr>
+            <w:r>
+              <w:t xml:space="preserve">1.230</w:t>
             </w:r>
           </w:p>
         </w:tc>
@@ -3491,7 +3982,7 @@
               <w:pStyle w:val="Compact"/>
             </w:pPr>
             <w:r>
-              <w:t xml:space="preserve">0%</w:t>
+              <w:t xml:space="preserve">+1%</w:t>
             </w:r>
           </w:p>
         </w:tc>
@@ -3504,6 +3995,98 @@
               <w:pStyle w:val="Compact"/>
             </w:pPr>
             <w:r>
+              <w:t xml:space="preserve">150 despachos/ano</w:t>
+            </w:r>
+          </w:p>
+        </w:tc>
+        <w:tc>
+          <w:tcPr/>
+          <w:p>
+            <w:pPr>
+              <w:pStyle w:val="Compact"/>
+            </w:pPr>
+            <w:r>
+              <w:t xml:space="preserve">1.226</w:t>
+            </w:r>
+          </w:p>
+        </w:tc>
+        <w:tc>
+          <w:tcPr/>
+          <w:p>
+            <w:pPr>
+              <w:pStyle w:val="Compact"/>
+            </w:pPr>
+            <w:r>
+              <w:t xml:space="preserve">60</w:t>
+            </w:r>
+          </w:p>
+        </w:tc>
+        <w:tc>
+          <w:tcPr/>
+          <w:p>
+            <w:pPr>
+              <w:pStyle w:val="Compact"/>
+            </w:pPr>
+            <w:r>
+              <w:t xml:space="preserve">+1%</w:t>
+            </w:r>
+          </w:p>
+        </w:tc>
+      </w:tr>
+      <w:tr>
+        <w:tc>
+          <w:tcPr/>
+          <w:p>
+            <w:pPr>
+              <w:pStyle w:val="Compact"/>
+            </w:pPr>
+            <w:r>
+              <w:t xml:space="preserve">Degradação R$ 100/MWh</w:t>
+            </w:r>
+          </w:p>
+        </w:tc>
+        <w:tc>
+          <w:tcPr/>
+          <w:p>
+            <w:pPr>
+              <w:pStyle w:val="Compact"/>
+            </w:pPr>
+            <w:r>
+              <w:t xml:space="preserve">1.214</w:t>
+            </w:r>
+          </w:p>
+        </w:tc>
+        <w:tc>
+          <w:tcPr/>
+          <w:p>
+            <w:pPr>
+              <w:pStyle w:val="Compact"/>
+            </w:pPr>
+            <w:r>
+              <w:t xml:space="preserve">60</w:t>
+            </w:r>
+          </w:p>
+        </w:tc>
+        <w:tc>
+          <w:tcPr/>
+          <w:p>
+            <w:pPr>
+              <w:pStyle w:val="Compact"/>
+            </w:pPr>
+            <w:r>
+              <w:t xml:space="preserve">0%</w:t>
+            </w:r>
+          </w:p>
+        </w:tc>
+      </w:tr>
+      <w:tr>
+        <w:tc>
+          <w:tcPr/>
+          <w:p>
+            <w:pPr>
+              <w:pStyle w:val="Compact"/>
+            </w:pPr>
+            <w:r>
               <w:t xml:space="preserve">Degradação R$ 200/MWh</w:t>
             </w:r>
           </w:p>
@@ -3515,7 +4098,7 @@
               <w:pStyle w:val="Compact"/>
             </w:pPr>
             <w:r>
-              <w:t xml:space="preserve">1.157</w:t>
+              <w:t xml:space="preserve">1.214</w:t>
             </w:r>
           </w:p>
         </w:tc>
@@ -3556,7 +4139,7 @@
         <w:pStyle w:val="BodyText"/>
       </w:pPr>
       <w:r>
-        <w:t xml:space="preserve">O lance mínimo é determinado pelas premissas de custo do BESS. A de maior efeito é a duração a que se refere o custo da EPE: se os R$ 5.500/kW corresponderem a um sistema de 3 h, e não de 4 h, a energia da bateria de 5 h fica mais cara e o lance sobe 21%. Seguem a taxa de desconto (−18% com a taxa após impostos, que ignora o imposto de renda), a regra de cobrança do uso da rede (+16% se o armazenamento pagar também a TUST de consumo e +10% sem compartilhar a conexão), o investimento de referência (±9%) e o O&amp;M (±6% para ±1 ponto percentual). A parcela do custo proporcional à energia (±3%), a disponibilidade de 97% (+3%), a TUST regional (de −1% a +2%) e o consumo auxiliar (+1% com 2% da potência) pesam pouco. O compartilhamento da conexão é uma vantagem do arranjo híbrido: sem ele, a bateria pagaria a TUST sobre toda a sua potência, e o lance seria R$ 113 mil/(MW·ano) maior. Duas premissas de natureza tributária e contratual também pesam: o regime não cumulativo do PIS/Cofins, sem créditos, eleva o lance em 6%, e a falta de reajuste da receita fixa pelo IPCA, com inflação de 4% a.a., em 25%, pois a receita perderia valor real ao longo dos 15 anos; esta última é a premissa de maior efeito e deve ser confirmada no edital.</w:t>
+        <w:t xml:space="preserve">O lance mínimo é determinado pelas premissas de custo do BESS. A de maior efeito é a duração a que se refere o custo da EPE: se os R$ 5.500/kW corresponderem a um sistema de 3 h, e não de 4 h, a energia da bateria de 5 h fica mais cara e o lance sobe 21%. Seguem a taxa de desconto (−19% com a taxa após impostos, que ignora o imposto de renda), a regra de cobrança do uso da rede (+16% se o armazenamento pagar também a TUST de consumo e +9% sem compartilhar a conexão), o investimento de referência (±9%), o O&amp;M (±5% para ±1 ponto percentual) e o prazo de implantação (−5% sem juros durante a construção e +5% com dois anos de implantação). A parcela do custo proporcional à energia (±3%), a disponibilidade de 97% (+3%), a TUST regional (±1%) e o consumo auxiliar pesam pouco: com 2% da potência, ou sem a folga de recarga custeada pela CONCAP, o lance sobe 1%, de modo que a interpretação adotada para o consumo auxiliar (Seção 3.8.2) não é determinante. O compartilhamento da conexão é uma vantagem do arranjo híbrido: sem ele, a bateria pagaria a TUST sobre toda a sua potência, e o lance seria R$ 113 mil/(MW·ano) maior. Duas premissas de natureza tributária e contratual também pesam: o regime não cumulativo do PIS/Cofins, sem créditos, eleva o lance em 6%, e a falta de reajuste da receita fixa pelo IPCA, com inflação de 4% a.a., em 25%, pois a receita perderia valor real ao longo dos 15 anos; esta última é a premissa de maior efeito e deve ser confirmada no edital.</w:t>
       </w:r>
     </w:p>
     <w:p>
@@ -3564,7 +4147,36 @@
         <w:pStyle w:val="BodyText"/>
       </w:pPr>
       <w:r>
-        <w:t xml:space="preserve">As hipóteses de operação quase não alteram o lance. Como o desgaste do despacho está no O&amp;M fixo, o custo de degradação por MWh deixa de afetá-lo, e a frequência do despacho só o altera por meio do consumo auxiliar: com 50 despachos por ano, a folga de recarga diminui e o lance sobe 1%. Com o contrato de 2 t/dia, a importação e os dois tamanhos de eletrolisador, o proponente oferta toda a potência, o módulo mercantil se anula e o lance é igual ao do caso central. A exceção é o contrato firme de 3 t/dia sem importação: o proponente oferta 57,5 MW (55 MW com o tanque de 10 t), e a bateria mercantil restante reduz o déficit de entrega e a multa correspondente, o que reduz o lance em 3% com o tanque de 2 t e em 5% com o de 10 t. A magnitude dessa redução depende da multa contratual, que faz cada kg não entregue custar R$ 70 ao empreendedor (Seção 3.4.5). À taxa central e com a receita reajustada pelo IPCA, o lance mínimo situa-se, assim, entre R$ 1,05 milhão e R$ 1,40 milhão/(MW·ano), e sua incerteza decorre principalmente da duração de referência do custo do BESS, da regra de cobrança do uso da rede, do regime tributário, do investimento e do O&amp;M; sem reajuste, chegaria a R$ 1,44 milhão.</w:t>
+        <w:t xml:space="preserve">As hipóteses de operação quase não alteram o lance. Como o desgaste do despacho está no O&amp;M fixo, o custo de degradação por MWh deixa de afetá-lo, e a frequência do despacho só o altera por meio do consumo auxiliar: com 50 despachos por ano, a folga de recarga diminui e o lance sobe 1%. Com o contrato de 2 t/dia, a importação e os dois tamanhos de eletrolisador, o proponente oferta toda a potência, o módulo mercantil se anula e o lance é igual ao do caso central. A exceção é o contrato firme de 3 t/dia sem importação: o proponente oferta 57,5 MW (55 MW com o tanque de 10 t), e a bateria mercantil restante reduz o déficit de entrega e a multa correspondente, o que reduz o lance em 3% com o tanque de 2 t e em 5% com o de 10 t. A magnitude dessa redução depende da multa contratual, que faz cada kg não entregue custar R$ 70 ao empreendedor (Seção 3.4.5). À taxa central e com a receita reajustada pelo IPCA, o lance mínimo situa-se, assim, entre R$ 1,11 milhão e R$ 1,47 milhão/(MW·ano), e sua incerteza decorre principalmente da duração de referência do custo do BESS, da regra de cobrança do uso da rede, do investimento, do regime tributário, do O&amp;M e do prazo de implantação; sem reajuste, chegaria a R$ 1,52 milhão. Com a importação de energia, o lance não depende do custo adicional</w:t>
+      </w:r>
+      <w:r>
+        <w:t xml:space="preserve"> </w:t>
+      </w:r>
+      <m:oMath>
+        <m:sSup>
+          <m:e>
+            <m:r>
+              <m:t>c</m:t>
+            </m:r>
+          </m:e>
+          <m:sup>
+            <m:r>
+              <m:t>i</m:t>
+            </m:r>
+            <m:r>
+              <m:t>m</m:t>
+            </m:r>
+            <m:r>
+              <m:t>p</m:t>
+            </m:r>
+          </m:sup>
+        </m:sSup>
+      </m:oMath>
+      <w:r>
+        <w:t xml:space="preserve"> </w:t>
+      </w:r>
+      <w:r>
+        <w:t xml:space="preserve">na faixa avaliada, pois o proponente oferta toda a potência e a rede supre o eletrolisador com ou sem o BESS.</w:t>
       </w:r>
     </w:p>
     <w:bookmarkEnd w:id="21"/>
@@ -3708,18 +4320,18 @@
               <w:pStyle w:val="Compact"/>
             </w:pPr>
             <w:r>
-              <w:t xml:space="preserve">1.157</w:t>
-            </w:r>
-          </w:p>
-        </w:tc>
-        <w:tc>
-          <w:tcPr/>
-          <w:p>
-            <w:pPr>
-              <w:pStyle w:val="Compact"/>
-            </w:pPr>
-            <w:r>
-              <w:t xml:space="preserve">954</w:t>
+              <w:t xml:space="preserve">1.214</w:t>
+            </w:r>
+          </w:p>
+        </w:tc>
+        <w:tc>
+          <w:tcPr/>
+          <w:p>
+            <w:pPr>
+              <w:pStyle w:val="Compact"/>
+            </w:pPr>
+            <w:r>
+              <w:t xml:space="preserve">984</w:t>
             </w:r>
           </w:p>
         </w:tc>
@@ -3765,18 +4377,18 @@
               <w:pStyle w:val="Compact"/>
             </w:pPr>
             <w:r>
-              <w:t xml:space="preserve">1.127</w:t>
-            </w:r>
-          </w:p>
-        </w:tc>
-        <w:tc>
-          <w:tcPr/>
-          <w:p>
-            <w:pPr>
-              <w:pStyle w:val="Compact"/>
-            </w:pPr>
-            <w:r>
-              <w:t xml:space="preserve">929</w:t>
+              <w:t xml:space="preserve">1.182</w:t>
+            </w:r>
+          </w:p>
+        </w:tc>
+        <w:tc>
+          <w:tcPr/>
+          <w:p>
+            <w:pPr>
+              <w:pStyle w:val="Compact"/>
+            </w:pPr>
+            <w:r>
+              <w:t xml:space="preserve">959</w:t>
             </w:r>
           </w:p>
         </w:tc>
@@ -3822,18 +4434,18 @@
               <w:pStyle w:val="Compact"/>
             </w:pPr>
             <w:r>
-              <w:t xml:space="preserve">1.104</w:t>
-            </w:r>
-          </w:p>
-        </w:tc>
-        <w:tc>
-          <w:tcPr/>
-          <w:p>
-            <w:pPr>
-              <w:pStyle w:val="Compact"/>
-            </w:pPr>
-            <w:r>
-              <w:t xml:space="preserve">907</w:t>
+              <w:t xml:space="preserve">1.160</w:t>
+            </w:r>
+          </w:p>
+        </w:tc>
+        <w:tc>
+          <w:tcPr/>
+          <w:p>
+            <w:pPr>
+              <w:pStyle w:val="Compact"/>
+            </w:pPr>
+            <w:r>
+              <w:t xml:space="preserve">936</w:t>
             </w:r>
           </w:p>
         </w:tc>
@@ -3879,18 +4491,18 @@
               <w:pStyle w:val="Compact"/>
             </w:pPr>
             <w:r>
-              <w:t xml:space="preserve">1.240</w:t>
-            </w:r>
-          </w:p>
-        </w:tc>
-        <w:tc>
-          <w:tcPr/>
-          <w:p>
-            <w:pPr>
-              <w:pStyle w:val="Compact"/>
-            </w:pPr>
-            <w:r>
-              <w:t xml:space="preserve">1.043</w:t>
+              <w:t xml:space="preserve">1.296</w:t>
+            </w:r>
+          </w:p>
+        </w:tc>
+        <w:tc>
+          <w:tcPr/>
+          <w:p>
+            <w:pPr>
+              <w:pStyle w:val="Compact"/>
+            </w:pPr>
+            <w:r>
+              <w:t xml:space="preserve">1.072</w:t>
             </w:r>
           </w:p>
         </w:tc>
@@ -3917,7 +4529,7 @@
         <w:pStyle w:val="BodyText"/>
       </w:pPr>
       <w:r>
-        <w:t xml:space="preserve">Três resultados se destacam. Primeiro, a bateria do leilão deve ser dimensionada para o contrato, pois o módulo mercantil não se paga no lance. No BESS de referência, ofertar 57,5 MW e manter 2,5 MW e 24 MWh para uso mercantil acrescenta R$ 2,1 milhões por ano ao lucro, mas essa capacidade custa R$ 4,7 milhões por ano entre capital, O&amp;M e uso da rede; já os 12 MWh além do necessário para 60 MW custam R$ 30 mil/(MW·ano) no lance. Segundo, com o BESS dimensionado para o contrato, o lance por MW não depende da potência até a potência da usina FV, porque a bateria cabe no montante de uso de injeção já contratado pela usina; acima de 50 MW, cada MW adicional acrescenta TUST, e o lance cresce até R$ 1,127 milhão/(MW·ano) com 60 MW. A oferta deixa de ser</w:t>
+        <w:t xml:space="preserve">Três resultados se destacam. Primeiro, a bateria do leilão deve ser dimensionada para o contrato, pois o módulo mercantil não se paga no lance. No BESS de referência, ofertar 57,5 MW e manter 2,5 MW e 24 MWh para uso mercantil acrescenta R$ 2,0 milhões por ano ao lucro, mas essa capacidade custa R$ 4,9 milhões por ano entre capital, O&amp;M e uso da rede; já os 12 MWh além do necessário para 60 MW custam R$ 32 mil/(MW·ano) no lance. Segundo, com o BESS dimensionado para o contrato, o lance por MW não depende da potência até a potência da usina FV, porque a bateria cabe no montante de uso de injeção já contratado pela usina; acima de 50 MW, cada MW adicional acrescenta TUST, e o lance cresce até R$ 1,182 milhão/(MW·ano) com 60 MW. A oferta deixa de ser</w:t>
       </w:r>
       <w:r>
         <w:t xml:space="preserve"> </w:t>
@@ -3926,7 +4538,7 @@
         <w:t xml:space="preserve">“tudo ou nada”</w:t>
       </w:r>
       <w:r>
-        <w:t xml:space="preserve">: o proponente ofertaria qualquer quantidade entre 30 e 50 MW a partir de R$ 1,104 milhão/(MW·ano) e quantidades maiores a preços crescentes.</w:t>
+        <w:t xml:space="preserve">: o proponente ofertaria qualquer quantidade entre 30 e 50 MW a partir de R$ 1,160 milhão/(MW·ano) e quantidades maiores a preços crescentes.</w:t>
       </w:r>
     </w:p>
     <w:p>
@@ -3934,7 +4546,7 @@
         <w:pStyle w:val="BodyText"/>
       </w:pPr>
       <w:r>
-        <w:t xml:space="preserve">Terceiro, a bateria isolada, que paga a TUST sobre toda a sua potência, tem lance de R$ 1,240 milhão/(MW·ano), R$ 136 mil acima do híbrido: a TUST de R$ 131 mil/(MW·ano), acrescida do PIS/Cofins. Como, no lance, o uso mercantil é nulo nos dois arranjos, essa diferença decorre inteiramente do compartilhamento da conexão: no lance mínimo, o papel da usina FV com produção de hidrogênio é dividir o ponto de conexão, e não fornecer receitas à bateria. O compartilhamento da infraestrutura de conexão, que também reduziria o investimento do arranjo híbrido, não foi quantificado.</w:t>
+        <w:t xml:space="preserve">Terceiro, a bateria isolada, que paga a TUST sobre toda a sua potência, tem lance de R$ 1,296 milhão/(MW·ano), R$ 136 mil acima do híbrido: a TUST de R$ 131 mil/(MW·ano), acrescida do PIS/Cofins. Como, no lance, o uso mercantil é nulo nos dois arranjos, essa diferença decorre inteiramente do compartilhamento da conexão: no lance mínimo, o papel da usina FV com produção de hidrogênio é dividir o ponto de conexão, e não fornecer receitas à bateria. O compartilhamento da infraestrutura de conexão, que também reduziria o investimento do arranjo híbrido, não foi quantificado.</w:t>
       </w:r>
     </w:p>
     <w:p>
@@ -3942,7 +4554,7 @@
         <w:pStyle w:val="BodyText"/>
       </w:pPr>
       <w:r>
-        <w:t xml:space="preserve">Essa vantagem, porém, pressupõe que a usina FV com o eletrolisador seja construída. Sozinha, sem o BESS, essa usina exige R$ 402 milhões de investimento e gera fluxo anual de R$ 18,6 milhões, após O&amp;M, uso da rede e PIS/Cofins, o que resulta em VPL de −R$ 276 milhões à taxa de 12,1% (−R$ 242 milhões a 8%). Com o hidrogênio a R$ 35/kg, portanto, a usina que hospeda a bateria não se justificaria por si. O lance de R$ 1,104 milhão/(MW·ano) vale para um proponente cuja usina FV exista ou se justifique por outras razões — por exemplo, uma usina já em operação ou com a energia vendida em contrato —; para um proponente que constrói só a bateria, a referência é o lance da bateria isolada, de R$ 1,240 milhão/(MW·ano).</w:t>
+        <w:t xml:space="preserve">Essa vantagem, porém, pressupõe que a usina FV com o eletrolisador seja construída. Sozinha, sem o BESS, essa usina exige R$ 412 milhões de investimento, com o tanque de hidrogênio, mais R$ 24 milhões de juros durante a construção, e gera fluxo anual de R$ 18,6 milhões, após O&amp;M, uso da rede e PIS/Cofins, o que resulta em VPL de −R$ 311 milhões à taxa de 12,1% (−R$ 269 milhões a 8%). Com o hidrogênio a R$ 35/kg, portanto, a usina que hospeda a bateria não se justificaria por si. O lance de R$ 1,160 milhão/(MW·ano) vale para um proponente cuja usina FV exista ou se justifique por outras razões — por exemplo, uma usina já em operação ou com a energia vendida em contrato —; para um proponente que constrói só a bateria, a referência é o lance da bateria isolada, de R$ 1,296 milhão/(MW·ano).</w:t>
       </w:r>
     </w:p>
     <w:bookmarkEnd w:id="22"/>
@@ -5194,7 +5806,7 @@
         <w:pStyle w:val="BodyText"/>
       </w:pPr>
       <w:r>
-        <w:t xml:space="preserve">Esse resultado tem duas implicações para o proponente. A decisão de participar do leilão é robusta, pois o limiar de entrada é baixo em todos os casos avaliados (R$ 76 mil a R$ 96 mil/(MW·ano)), muito inferior a qualquer receita fixa plausível para sistemas de armazenamento. Por outro lado, a quantidade a ofertar acima de cerca de 40 MW é sensível tanto ao preço quanto às hipóteses sobre o hidrogênio, como mostra a subseção seguinte.</w:t>
+        <w:t xml:space="preserve">Esse resultado tem duas implicações para o proponente. A decisão de participar do leilão é robusta, pois o limiar de entrada é baixo nos cinco casos da Figura 4.5 (R$ 76 mil a R$ 97 mil/(MW·ano)) e não supera R$ 300 mil/(MW·ano) em nenhum dos casos avaliados, muito inferior a qualquer receita fixa plausível para sistemas de armazenamento. Por outro lado, a quantidade a ofertar acima de cerca de 40 MW é sensível tanto ao preço quanto às hipóteses sobre o hidrogênio, como mostra a subseção seguinte.</w:t>
       </w:r>
     </w:p>
     <w:bookmarkEnd w:id="32"/>
@@ -6041,7 +6653,7 @@
               <w:pStyle w:val="Compact"/>
             </w:pPr>
             <w:r>
-              <w:t xml:space="preserve">96</w:t>
+              <w:t xml:space="preserve">97</w:t>
             </w:r>
           </w:p>
         </w:tc>
@@ -6109,7 +6721,7 @@
               <w:pStyle w:val="Compact"/>
             </w:pPr>
             <w:r>
-              <w:t xml:space="preserve">474</w:t>
+              <w:t xml:space="preserve">475</w:t>
             </w:r>
           </w:p>
         </w:tc>
@@ -6197,6 +6809,24 @@
           <w:b/>
           <w:bCs/>
         </w:rPr>
+        <w:t xml:space="preserve">Custo adicional da energia importada.</w:t>
+      </w:r>
+      <w:r>
+        <w:t xml:space="preserve"> </w:t>
+      </w:r>
+      <w:r>
+        <w:t xml:space="preserve">O custo adicional de R$ 250/MWh é uma hipótese agregada de uso da rede, encargos e tributos (Seção 3.8.4). Com R$ 100/MWh, o lucro esperado na receita de referência sobe para R$ 102,6 milhões por ano, 51% acima do caso sem importação, com 95 GWh importados e fator de capacidade de 0,93; com R$ 400/MWh, cai para R$ 76,6 milhões, ainda 12% acima, com 68 GWh importados, fator de capacidade de 0,79 e ótimo em 57,5 MW. A conclusão de que a importação eleva o lucro e reduz o papel do BESS no suprimento do eletrolisador é, portanto, robusta nessa faixa, mas a magnitude do ganho depende fortemente do custo da energia importada, que deve ser apurado para o ponto de conexão e o enquadramento tarifário do empreendimento. Só com R$ 100/MWh, investimento baixo e taxa de 8% o empreendimento teria VPL positivo (Tabela 4.2).</w:t>
+      </w:r>
+    </w:p>
+    <w:p>
+      <w:pPr>
+        <w:pStyle w:val="BodyText"/>
+      </w:pPr>
+      <w:r>
+        <w:rPr>
+          <w:b/>
+          <w:bCs/>
+        </w:rPr>
         <w:t xml:space="preserve">Importação com contrato de 3 t/dia.</w:t>
       </w:r>
       <w:r>
@@ -6240,7 +6870,7 @@
         </m:r>
       </m:oMath>
       <w:r>
-        <w:t xml:space="preserve">: 7 kgCO₂/kgH₂, valor inicial do marco legal (BRASIL, 2024), ou 3,4 kgCO₂/kgH₂, próximo do critério europeu. Para cada limite, consideram-se o fator de emissão horário médio do SIN e o fator marginal de uma termelétrica a gás natural (Seção 3.5). A Figura 4.6 e a Tabela 4.9 comparam esses casos com o caso de referência, em que a importação é vedada, e com o de importação livre.</w:t>
+        <w:t xml:space="preserve">: 7 kgCO₂/kgH₂, valor inicial do marco legal (BRASIL, 2024), ou 3,4 kgCO₂/kgH₂, próximo do limiar de emissões europeu, sem as exigências de adicionalidade e de correlação temporal e geográfica do Regulamento Delegado (UE) 2023/1184 (Seção 3.4.5). Para cada limite, consideram-se o fator de emissão horário médio do SIN e o fator marginal de uma termelétrica a gás natural (Seção 3.5). A Figura 4.6 e a Tabela 4.9 comparam esses casos com o caso de referência, em que a importação é vedada, e com o de importação livre.</w:t>
       </w:r>
     </w:p>
     <w:p>
@@ -7229,7 +7859,7 @@
               <w:pStyle w:val="Compact"/>
             </w:pPr>
             <w:r>
-              <w:t xml:space="preserve">474</w:t>
+              <w:t xml:space="preserve">475</w:t>
             </w:r>
           </w:p>
         </w:tc>
@@ -7312,7 +7942,7 @@
         <w:t xml:space="preserve"> </w:t>
       </w:r>
       <w:r>
-        <w:t xml:space="preserve">O limite de emissões não altera o lance mínimo do BESS a construir, que permanece em R$ 1,157 milhão/(MW·ano) com o BESS de referência e em R$ 1,104 milhão com o BESS dimensionado para o contrato: no primeiro, a oferta de toda a potência elimina o módulo mercantil, e, no segundo, o BESS não altera a operação do lado mercantil (Subseção 4.2.4). O critério altera, porém, a viabilidade do empreendimento como um todo (Tabela 4.2): à taxa de 12,1%, o VPL passa de −R$ 489 milhões no caso de referência para −R$ 457 milhões com o limite de 7 kgCO₂/kgH₂ e fator marginal e para −R$ 362 milhões com fator médio, e o preço de equilíbrio do hidrogênio cai de R$ 108/kg para R$ 80/kg e R$ 57/kg, respectivamente.</w:t>
+        <w:t xml:space="preserve">O limite de emissões não altera o lance mínimo do BESS a construir, que permanece em R$ 1,214 milhão/(MW·ano) com o BESS de referência e em R$ 1,160 milhão com o BESS dimensionado para o contrato: no primeiro, a oferta de toda a potência elimina o módulo mercantil, e, no segundo, o BESS não altera a operação do lado mercantil (Subseção 4.2.4). O critério altera, porém, a viabilidade do empreendimento como um todo (Tabela 4.2): à taxa de 12,1%, o VPL passa de −R$ 546 milhões no caso de referência para −R$ 531 milhões com o limite de 7 kgCO₂/kgH₂ e fator marginal e para −R$ 450 milhões com fator médio, e o preço de equilíbrio do hidrogênio cai de R$ 116/kg para R$ 87/kg e R$ 62/kg, respectivamente. Com o fator marginal, o ganho de lucro é parcialmente consumido pela troca de pilhas, que o fator de capacidade mais alto do eletrolisador antecipa para o 12º ano.</w:t>
       </w:r>
     </w:p>
     <w:p>
@@ -8530,7 +9160,7 @@
         <w:t xml:space="preserve"> </w:t>
       </w:r>
       <w:r>
-        <w:t xml:space="preserve">No caso com contrato de 3 t/dia, a ampliação do tanque de hidrogênio de 2 t para 10 t reduz o déficit anual de entrega, com 55 MW contratados, de 40 t para 11 t, e eleva o lucro operacional esperado em R$ 1,6 milhão por ano. O tanque maior guarda o hidrogênio produzido nos dias de alta irradiância para os dias nublados, função que, com o tanque de 2 t, cabia ao módulo mercantil do BESS. Por isso, o custo de oportunidade marginal entre 30 e 50 MW cai de R$ 100–169 mil para R$ 85–126 mil/(MW·ano), e o lance mínimo para construir o BESS cai de R$ 1,078 milhão para R$ 1,056 milhão/(MW·ano) (Tabela 4.4). A potência ótima para a receita de referência permanece em 55 MW. Com 60 MW contratados, porém, os dois tanques produzem o mesmo resultado: sem o módulo mercantil, o eletrolisador opera apenas nas horas de sol, a entrega de 3 t/dia exige cerca de 9,4 h diárias na potência nominal, e raramente sobra hidrogênio para guardar. Esse efeito do tanque só aparece com a fronteira da relaxação linear (Subseção 4.1): com a condição cíclica semanal, o tanque era esvaziado no início de cada semana e sua ampliação não tinha efeito.</w:t>
+        <w:t xml:space="preserve">No caso com contrato de 3 t/dia, a ampliação do tanque de hidrogênio de 2 t para 10 t reduz o déficit anual de entrega, com 55 MW contratados, de 40 t para 11 t, e eleva o lucro operacional esperado em R$ 1,6 milhão por ano. O tanque maior guarda o hidrogênio produzido nos dias de alta irradiância para os dias nublados, função que, com o tanque de 2 t, cabia ao módulo mercantil do BESS. Por isso, o custo de oportunidade marginal entre 30 e 50 MW cai de R$ 100–169 mil para R$ 85–126 mil/(MW·ano), e o lance mínimo para construir o BESS cai de R$ 1,179 milhão para R$ 1,159 milhão/(MW·ano) (Tabela 4.4). A potência ótima para a receita de referência permanece em 55 MW. O tanque maior, porém, não se paga: os 8 t adicionais custam R$ 43 milhões, ou R$ 6,8 milhões por ano à taxa de 12,1% com os juros durante a construção, contra o acréscimo de R$ 1,6 milhão no lucro, e o VPL do empreendimento piora de −R$ 564 milhões para −R$ 599 milhões (Tabela 4.2). A redução do lance com o tanque de 10 t só se aplica, assim, a um proponente que já disponha do tanque. Com 60 MW contratados, porém, os dois tanques produzem o mesmo resultado: sem o módulo mercantil, o eletrolisador opera apenas nas horas de sol, a entrega de 3 t/dia exige cerca de 9,4 h diárias na potência nominal, e raramente sobra hidrogênio para guardar. Esse efeito do tanque só aparece com a fronteira da relaxação linear (Subseção 4.1): com a condição cíclica semanal, o tanque era esvaziado no início de cada semana e sua ampliação não tinha efeito.</w:t>
       </w:r>
     </w:p>
     <w:bookmarkEnd w:id="48"/>
@@ -9021,13 +9651,13 @@
           <w:b/>
           <w:bCs/>
         </w:rPr>
-        <w:t xml:space="preserve">o lance mínimo é de cerca de R$ 1,10 milhão/(MW·ano) com a bateria dimensionada para o contrato</w:t>
+        <w:t xml:space="preserve">o lance mínimo é de cerca de R$ 1,16 milhão/(MW·ano) com a bateria dimensionada para o contrato</w:t>
       </w:r>
       <w:r>
         <w:t xml:space="preserve"> </w:t>
       </w:r>
       <w:r>
-        <w:t xml:space="preserve">(R$ 1,16 milhão com o BESS de referência), com investimento de referência de R$ 5.500/kW para 4 h, taxa de 12,1% antes de impostos, PIS/Cofins de 3,65% e receita fixa reajustada pelo IPCA; varia de R$ 1,05 milhão a R$ 1,40 milhão/(MW·ano) com o BESS de referência, conforme a duração de referência do custo da bateria, a regra de cobrança do uso da rede, o regime tributário, o investimento, o O&amp;M e a disponibilidade, e chegaria a R$ 1,44 milhão se a receita fixa não fosse reajustada; corresponde ao custo anual equivalente do BESS por MW acrescido dos tributos sobre a receita (Equação (3.47)) e supera o preço obtido por termelétricas existentes no LRCAP de 2026 (R$ 831 mil); com a taxa após impostos, que ignora o imposto de renda, cairia para R$ 907 mil;</w:t>
+        <w:t xml:space="preserve">(R$ 1,21 milhão com o BESS de referência), com investimento de referência de R$ 5.500/kW para 4 h, taxa de 12,1% antes de impostos, um ano de implantação com juros durante a construção, PIS/Cofins de 3,65% e receita fixa reajustada pelo IPCA; varia de R$ 1,11 milhão a R$ 1,47 milhão/(MW·ano) com o BESS de referência, conforme a duração de referência do custo da bateria, a regra de cobrança do uso da rede, o investimento, o regime tributário, o O&amp;M, o prazo de implantação e a disponibilidade, e chegaria a R$ 1,52 milhão se a receita fixa não fosse reajustada; corresponde ao custo anual equivalente do BESS por MW acrescido dos tributos sobre a receita (Equação (3.47)) e supera o preço obtido por termelétricas existentes no LRCAP de 2026 (R$ 831 mil); com a taxa após impostos, que ignora o imposto de renda, cairia para R$ 936 mil;</w:t>
       </w:r>
     </w:p>
     <w:p>
@@ -9048,7 +9678,7 @@
         <w:t xml:space="preserve"> </w:t>
       </w:r>
       <w:r>
-        <w:t xml:space="preserve">uma bateria isolada teria lance de R$ 1,24 milhão/(MW·ano), R$ 136 mil acima do híbrido, mas a usina FV com o eletrolisador que hospeda a bateria tem, sozinha, VPL de −R$ 276 milhões; o lance do híbrido vale, portanto, para uma usina que exista ou se justifique por outras razões. As hipóteses sobre o hidrogênio alteram pouco o lance (redução de até 5%, no contrato firme de 3 t/dia com tanque de 10 t, efeito que depende da multa contratual adotada e que ignora o custo do tanque); essas hipóteses determinam, porém, a viabilidade do empreendimento como um todo: com os parâmetros adotados, nenhum caso se paga, e o preço de equilíbrio do hidrogênio no caso de referência é de cerca de R$ 108/kg;</w:t>
+        <w:t xml:space="preserve">uma bateria isolada teria lance de R$ 1,30 milhão/(MW·ano), R$ 136 mil acima do híbrido, mas a usina FV com o eletrolisador que hospeda a bateria tem, sozinha, VPL de −R$ 311 milhões; o lance do híbrido vale, portanto, para uma usina que exista ou se justifique por outras razões. As hipóteses sobre o hidrogênio alteram pouco o lance (redução de até 5%, no contrato firme de 3 t/dia com tanque de 10 t, efeito que depende da multa contratual adotada; o tanque maior, porém, custa mais do que acrescenta ao lucro); essas hipóteses determinam, porém, a viabilidade do empreendimento como um todo: com os parâmetros centrais, nenhum caso se paga, e o preço de equilíbrio do hidrogênio no caso de referência é de cerca de R$ 116/kg;</w:t>
       </w:r>
     </w:p>
     <w:p>
@@ -9069,7 +9699,7 @@
         <w:t xml:space="preserve"> </w:t>
       </w:r>
       <w:r>
-        <w:t xml:space="preserve">(R$ 8,8 milhões por ano, contra custo anual equivalente de R$ 66,8 milhões): é o LRCAP que pode viabilizar a bateria, e a receita de referência de R$ 600 mil/(MW·ano) é insuficiente para isso.</w:t>
+        <w:t xml:space="preserve">(R$ 8,8 milhões por ano, contra custo anual equivalente de R$ 70,1 milhões): é o LRCAP que pode viabilizar a bateria, e a receita de referência de R$ 600 mil/(MW·ano) é insuficiente para isso.</w:t>
       </w:r>
     </w:p>
     <w:p>
@@ -9144,7 +9774,7 @@
         <w:t xml:space="preserve"> </w:t>
       </w:r>
       <w:r>
-        <w:t xml:space="preserve">permitir a importação de energia eleva o lucro em cerca de 30% e torna o BESS desnecessário para a produção de hidrogênio. Com o limite de intensidade de emissões do marco legal (7 kgCO₂/kgH₂), o resultado depende do fator de emissão da rede: com o fator médio do SIN, o limite não restringe a importação, e o resultado é o da importação livre; com o fator marginal, a rede supre no máximo 28% da energia do eletrolisador, o BESS passa a valer mais fora do leilão e a potência ótima cai para 50 MW;</w:t>
+        <w:t xml:space="preserve">permitir a importação de energia eleva o lucro em cerca de 30% e torna o BESS desnecessário para a produção de hidrogênio, resultado robusto ao custo adicional da energia importada entre R$ 100 e R$ 400/MWh (ganho de 51% a 12%). Com o limite de intensidade de emissões do marco legal (7 kgCO₂/kgH₂), o resultado depende do fator de emissão da rede: com o fator médio do SIN, o limite não restringe a importação, e o resultado é o da importação livre; com o fator marginal, a rede supre no máximo 28% da energia do eletrolisador, o BESS passa a valer mais fora do leilão e a potência ótima cai para 50 MW;</w:t>
       </w:r>
     </w:p>
     <w:p>

</xml_diff>

<commit_message>
Item 10: curvas com o maior limite entre as fronteiras e recarga excedente apurada no ano
A recarga excedente do módulo LRCAP era apurada por bloco semanal: com 50 ou 150 despachos, a
recarga de um despacho no fim de um bloco caía no seguinte e era cobrada (R$ 3-4 mil/MW·ano).
Com a apuração anual, as curvas de despacho voltam ao deslocamento exato da Eq. 3.46 e o gap fica
abaixo de 0,1% até 55 MW nos casos sem contrato. Figuras e tabelas finais do capítulo 4.

Co-Authored-By: Claude Opus 5.5 <noreply@anthropic.com>
Claude-Session: https://claude.ai/code/session_01YFtn9hiQUHbNLSX7rUNYuK
</commit_message>
<xml_diff>
--- a/docs/dissertacao/cap4_resultados.docx
+++ b/docs/dissertacao/cap4_resultados.docx
@@ -590,7 +590,7 @@
         <w:pStyle w:val="BodyText"/>
       </w:pPr>
       <w:r>
-        <w:t xml:space="preserve">O mesmo não vale quando há contrato de fornecimento de hidrogênio. Com entrega diária firme, guardar energia e hidrogênio de dias ensolarados para dias nublados tem valor, e a condição cíclica semanal — que obriga cada semana a começar com o módulo mercantil em 50% da carga e o tanque vazio — passa a restringir a operação. No contrato de 3 t/dia, o lucro operacional esperado com blocos cíclicos ficou entre 2,3% e 3,8% abaixo do obtido com os estados de fronteira da relaxação linear do ano (Seção 3.6.2), para potências de até 55 MW, e o déficit anual de entrega com 55 MW contratados caiu de 61 t para 40 t. Com o tanque de 10 t, a diferença chegou a 9%, pois a condição cíclica esvaziava o tanque no início de cada semana. Com a fronteira da relaxação, a diferença entre os limites inferior e superior do lucro foi inferior a 0,1% em todos os pontos das curvas de oferta dos casos com contrato até 55 MW, de até 0,33% com 57,5 MW e de até 1,6% com 60 MW. Nesse último ponto, o módulo mercantil fica sem potência e a relaxação linear, que admite o eletrolisador abaixo da carga mínima, é menos justa. Nos casos sem contrato, os dois tratamentos diferem em no máximo 0,05% no lucro esperado. Por isso, todas as curvas de oferta e as avaliações com potência fixa deste capítulo foram calculadas com a fronteira da relaxação, de modo que os casos sejam comparáveis entre si.3, 4.3.4 e 4.3.7, foram calculados com a fronteira da relaxação.</w:t>
+        <w:t xml:space="preserve">O mesmo não vale quando há contrato de fornecimento de hidrogênio. Com entrega diária firme, guardar energia e hidrogênio de dias ensolarados para dias nublados tem valor, e a condição cíclica semanal — que obriga cada semana a começar com o módulo mercantil em 50% da carga e o tanque vazio — passa a restringir a operação. No contrato de 3 t/dia, o lucro operacional esperado com blocos cíclicos ficou entre 2,3% e 3,8% abaixo do obtido com os estados de fronteira da relaxação linear do ano (Seção 3.6.2), para potências de até 55 MW, e o déficit anual de entrega com 55 MW contratados caiu de 61 t para 40 t. Com o tanque de 10 t, a diferença chegou a 9%, pois a condição cíclica esvaziava o tanque no início de cada semana. Com a fronteira da relaxação, a diferença entre os limites inferior e superior do lucro foi inferior a 0,1% em todos os pontos das curvas de oferta dos casos com contrato até 55 MW, de até 0,33% com 57,5 MW e de até 1,6% com 60 MW. Nesse último ponto, o módulo mercantil fica sem potência e a relaxação linear, que admite o eletrolisador abaixo da carga mínima, é menos justa. Nos casos sem contrato, os dois tratamentos diferem em no máximo 0,05% no lucro esperado. Por isso, as curvas de oferta e as avaliações com potência fixa deste capítulo adotam, para cada caso, potência e cenário, o maior dos dois limites inferiores — com os estados de fronteira da relaxação ou com a condição cíclica semanal —, pois ambos correspondem a operações viáveis do ano; o limite superior é o da relaxação. Nos casos sem contrato, a condição cíclica fica até 0,05% acima; nos casos com contrato, a relaxação fica de 2% a 4% acima. Nessas avaliações, a recarga do módulo LRCAP acima da custeada pela CONCAP é apurada no ano inteiro, e não por bloco: com 50 ou 150 despachos por ano, a apuração por bloco cobraria como excedente a recarga de um despacho realizado no fim de uma semana, que cai no bloco seguinte, sem a injeção correspondente, o que reduziria o lucro em R$ 3 mil a R$ 4 mil/(MW·ano). Com essas duas regras, a diferença entre os limites inferior e superior fica abaixo de 0,1% até 55 MW nos casos sem contrato, exceto com o eletrolisador de 25 MW (0,19%).3, 4.3.4 e 4.3.7, foram calculados com a fronteira da relaxação.</w:t>
       </w:r>
     </w:p>
     <w:bookmarkEnd w:id="12"/>
@@ -764,7 +764,7 @@
               <w:pStyle w:val="Compact"/>
             </w:pPr>
             <w:r>
-              <w:t xml:space="preserve">72,0</w:t>
+              <w:t xml:space="preserve">72,1</w:t>
             </w:r>
           </w:p>
         </w:tc>
@@ -2003,7 +2003,7 @@
         <w:t xml:space="preserve"> </w:t>
       </w:r>
       <w:r>
-        <w:t xml:space="preserve">Sem a bateria, e portanto sem o leilão, o lucro operacional esperado é de R$ 35,4 milhões por ano. Com o BESS e a contratação de 55 MW à receita de R$ 600 mil/(MW·ano), passa a R$ 72,0 milhões. O ganho, de R$ 35,5 milhões por ano depois do PIS/Cofins sobre a receita fixa, não cobre o custo anual equivalente do BESS, de R$ 70,1 milhões à taxa de 12,1% com investimento central — R$ 59,3 milhões de capital, incluídos os juros durante a construção, R$ 9,5 milhões de O&amp;M com reposição de módulos e R$ 1,3 milhão de acréscimo de uso da rede (Figura 4.2(b)). Sem a receita do leilão, a bateria agrega apenas R$ 8,8 milhões por ano, provenientes do suprimento noturno do eletrolisador e da arbitragem no MCP, já descontado o seu consumo auxiliar; é, portanto, a receita fixa do LRCAP que pode viabilizá-la.</w:t>
+        <w:t xml:space="preserve">Sem a bateria, e portanto sem o leilão, o lucro operacional esperado é de R$ 35,4 milhões por ano. Com o BESS e a contratação de 55 MW à receita de R$ 600 mil/(MW·ano), passa a R$ 72,1 milhões. O ganho, de R$ 35,5 milhões por ano depois do PIS/Cofins sobre a receita fixa, não cobre o custo anual equivalente do BESS, de R$ 70,1 milhões à taxa de 12,1% com investimento central — R$ 59,3 milhões de capital, incluídos os juros durante a construção, R$ 9,5 milhões de O&amp;M com reposição de módulos e R$ 1,3 milhão de acréscimo de uso da rede (Figura 4.2(b)). Sem a receita do leilão, a bateria agrega apenas R$ 8,8 milhões por ano, provenientes do suprimento noturno do eletrolisador e da arbitragem no MCP, já descontado o seu consumo auxiliar; é, portanto, a receita fixa do LRCAP que pode viabilizá-la.</w:t>
       </w:r>
     </w:p>
     <w:p>
@@ -3960,7 +3960,7 @@
               <w:pStyle w:val="Compact"/>
             </w:pPr>
             <w:r>
-              <w:t xml:space="preserve">1.230</w:t>
+              <w:t xml:space="preserve">1.227</w:t>
             </w:r>
           </w:p>
         </w:tc>
@@ -4006,7 +4006,7 @@
               <w:pStyle w:val="Compact"/>
             </w:pPr>
             <w:r>
-              <w:t xml:space="preserve">1.226</w:t>
+              <w:t xml:space="preserve">1.222</w:t>
             </w:r>
           </w:p>
         </w:tc>
@@ -6721,7 +6721,7 @@
               <w:pStyle w:val="Compact"/>
             </w:pPr>
             <w:r>
-              <w:t xml:space="preserve">475</w:t>
+              <w:t xml:space="preserve">474</w:t>
             </w:r>
           </w:p>
         </w:tc>
@@ -7859,7 +7859,7 @@
               <w:pStyle w:val="Compact"/>
             </w:pPr>
             <w:r>
-              <w:t xml:space="preserve">475</w:t>
+              <w:t xml:space="preserve">474</w:t>
             </w:r>
           </w:p>
         </w:tc>
@@ -8727,7 +8727,7 @@
               <w:pStyle w:val="Compact"/>
             </w:pPr>
             <w:r>
-              <w:t xml:space="preserve">854</w:t>
+              <w:t xml:space="preserve">855</w:t>
             </w:r>
           </w:p>
         </w:tc>

</xml_diff>

<commit_message>
Avaliação fora da amostra (um ano retirado de cada vez): perda média de 0,38%
Co-Authored-By: Claude Opus 5.5 <noreply@anthropic.com>
Claude-Session: https://claude.ai/code/session_01YFtn9hiQUHbNLSX7rUNYuK
</commit_message>
<xml_diff>
--- a/docs/dissertacao/cap4_resultados.docx
+++ b/docs/dissertacao/cap4_resultados.docx
@@ -5681,6 +5681,24 @@
       </w:pPr>
       <w:r>
         <w:t xml:space="preserve">Dois aspectos merecem destaque. Primeiro, embora o ano médio conduza à decisão correta, ele superestima o lucro: o valor ótimo do problema EV foi de R$ 68,89 milhões, contra R$ 68,12 milhões do EEV. A diferença, de cerca de R$ 0,8 milhão por ano, resulta da suavização dos picos e vales de preço e de irradiância pela média hora a hora, e confirma que o ano médio não deve ser usado para estimar a receita do empreendimento. Segundo, os baixos valores de VSS e de EVPI indicam que a incerteza modelada — a variação de preço e de geração entre anos — tem pouco efeito sobre a decisão de contratação. As subseções seguintes mostram que outras hipóteses, não representadas nos cenários, têm efeito muito maior.</w:t>
+      </w:r>
+    </w:p>
+    <w:p>
+      <w:pPr>
+        <w:pStyle w:val="BodyText"/>
+      </w:pPr>
+      <w:r>
+        <w:rPr>
+          <w:b/>
+          <w:bCs/>
+        </w:rPr>
+        <w:t xml:space="preserve">Avaliação fora da amostra.</w:t>
+      </w:r>
+      <w:r>
+        <w:t xml:space="preserve"> </w:t>
+      </w:r>
+      <w:r>
+        <w:t xml:space="preserve">Como os cinco anos são uma amostra pequena e o VSS e o EVPI são medidos dentro dela, a decisão foi avaliada também fora da amostra: para cada ano, a potência foi escolhida, na grade de 2,5 MW da curva de oferta, com os outros quatro anos, e avaliada no ano deixado de fora. Com a receita de referência, a decisão só muda quando 2021 é retirado da amostra, caindo de 55 para 52,5 MW; nesse caso, contratar 52,5 MW em 2021 custaria R$ 572 mil a menos do que a decisão com os cinco anos, pois, na crise hídrica, o ótimo daquele ano é contratar toda a potência. Nos demais anos, a decisão com quatro anos coincide com a de cinco. A perda média fora da amostra, em relação à decisão ótima de cada ano, é de R$ 259 mil por ano (0,38% do lucro esperado), da mesma ordem do EVPI. Com receitas de R$ 330 mil, R$ 830 mil e R$ 1,0 milhão/(MW·ano), a perda média fica entre R$ 36 mil e R$ 342 mil por ano, e a decisão varia no máximo um passo da grade. A decisão é, portanto, robusta à composição da amostra; o ano que mais a influencia é 2021, o de preços mais altos.</w:t>
       </w:r>
     </w:p>
     <w:p>

</xml_diff>

<commit_message>
Tabela 4.6: operação com a receita de referência (55 MW) e com a do lance mínimo (60 MW)
Co-Authored-By: Claude Opus 5.5 <noreply@anthropic.com>
Claude-Session: https://claude.ai/code/session_01YFtn9hiQUHbNLSX7rUNYuK
</commit_message>
<xml_diff>
--- a/docs/dissertacao/cap4_resultados.docx
+++ b/docs/dissertacao/cap4_resultados.docx
@@ -4576,6 +4576,474 @@
         <w:t xml:space="preserve">Esta seção supõe que o BESS está disponível — porque já existe ou porque foi construído com receita fixa acima do lance mínimo — e analisa quanto de sua potência contratar no leilão e como o sistema opera. Os resultados utilizam a receita fixa de referência de R$ 600 mil/(MW·ano), inferior ao lance mínimo da Seção 4.2, mas a curva de oferta fornece a decisão para qualquer receita; acima do lance mínimo, ela indica a oferta de 57,5 a 60 MW. A análise identifica os mecanismos que determinam o custo de oportunidade da contratação e a sensibilidade da decisão às hipóteses de operação e de mercado.</w:t>
       </w:r>
     </w:p>
+    <w:p>
+      <w:pPr>
+        <w:pStyle w:val="BodyText"/>
+      </w:pPr>
+      <w:r>
+        <w:t xml:space="preserve">A receita de referência, de R$ 600 mil/(MW·ano), é inferior ao lance mínimo de R$ 1,214 milhão calculado na Seção 4.2: com ela, um proponente não construiria o BESS. Os resultados desta seção valem, portanto, para quem já dispõe da bateria, e a curva de oferta da Subseção 4.3.3 fornece a decisão para qualquer receita. Para um BESS construído com receita igual ao lance mínimo, o proponente oferta toda a potência, e a operação é a da Tabela 4.6.</w:t>
+      </w:r>
+    </w:p>
+    <w:p>
+      <w:pPr>
+        <w:pStyle w:val="Legenda"/>
+      </w:pPr>
+      <w:r>
+        <w:t xml:space="preserve">Tabela 4.6 – Operação média nos cenários com a receita de referência e com a receita igual ao lance mínimo</w:t>
+      </w:r>
+    </w:p>
+    <w:tbl>
+      <w:tblPr>
+        <w:tblStyle w:val="Table"/>
+        <w:tblW w:type="pct" w:w="5000"/>
+        <w:tblLayout w:type="fixed"/>
+        <w:tblLook w:firstRow="1" w:lastRow="0" w:firstColumn="0" w:lastColumn="0" w:noHBand="0" w:noVBand="0" w:val="0020"/>
+      </w:tblPr>
+      <w:tblGrid>
+        <w:gridCol w:w="3394"/>
+        <w:gridCol w:w="2262"/>
+        <w:gridCol w:w="2262"/>
+      </w:tblGrid>
+      <w:tr>
+        <w:trPr>
+          <w:tblHeader w:val="on"/>
+        </w:trPr>
+        <w:tc>
+          <w:tcPr/>
+          <w:p>
+            <w:pPr>
+              <w:pStyle w:val="Compact"/>
+            </w:pPr>
+            <w:r>
+              <w:t xml:space="preserve">Indicador</w:t>
+            </w:r>
+          </w:p>
+        </w:tc>
+        <w:tc>
+          <w:tcPr/>
+          <w:p>
+            <w:pPr>
+              <w:pStyle w:val="Compact"/>
+            </w:pPr>
+            <w:r>
+              <w:t xml:space="preserve">R$ 600 mil/(MW·ano): 55 MW</w:t>
+            </w:r>
+          </w:p>
+        </w:tc>
+        <w:tc>
+          <w:tcPr/>
+          <w:p>
+            <w:pPr>
+              <w:pStyle w:val="Compact"/>
+            </w:pPr>
+            <w:r>
+              <w:t xml:space="preserve">R$ 1,214 mi/(MW·ano): 60 MW</w:t>
+            </w:r>
+          </w:p>
+        </w:tc>
+      </w:tr>
+      <w:tr>
+        <w:tc>
+          <w:tcPr/>
+          <w:p>
+            <w:pPr>
+              <w:pStyle w:val="Compact"/>
+            </w:pPr>
+            <w:r>
+              <w:t xml:space="preserve">Receita fixa (R$ mi/ano)</w:t>
+            </w:r>
+          </w:p>
+        </w:tc>
+        <w:tc>
+          <w:tcPr/>
+          <w:p>
+            <w:pPr>
+              <w:pStyle w:val="Compact"/>
+            </w:pPr>
+            <w:r>
+              <w:t xml:space="preserve">33,0</w:t>
+            </w:r>
+          </w:p>
+        </w:tc>
+        <w:tc>
+          <w:tcPr/>
+          <w:p>
+            <w:pPr>
+              <w:pStyle w:val="Compact"/>
+            </w:pPr>
+            <w:r>
+              <w:t xml:space="preserve">72,8</w:t>
+            </w:r>
+          </w:p>
+        </w:tc>
+      </w:tr>
+      <w:tr>
+        <w:tc>
+          <w:tcPr/>
+          <w:p>
+            <w:pPr>
+              <w:pStyle w:val="Compact"/>
+            </w:pPr>
+            <w:r>
+              <w:t xml:space="preserve">Lucro operacional sem a receita fixa (R$ mi/ano)</w:t>
+            </w:r>
+          </w:p>
+        </w:tc>
+        <w:tc>
+          <w:tcPr/>
+          <w:p>
+            <w:pPr>
+              <w:pStyle w:val="Compact"/>
+            </w:pPr>
+            <w:r>
+              <w:t xml:space="preserve">35,1</w:t>
+            </w:r>
+          </w:p>
+        </w:tc>
+        <w:tc>
+          <w:tcPr/>
+          <w:p>
+            <w:pPr>
+              <w:pStyle w:val="Compact"/>
+            </w:pPr>
+            <w:r>
+              <w:t xml:space="preserve">31,0</w:t>
+            </w:r>
+          </w:p>
+        </w:tc>
+      </w:tr>
+      <w:tr>
+        <w:tc>
+          <w:tcPr/>
+          <w:p>
+            <w:pPr>
+              <w:pStyle w:val="Compact"/>
+            </w:pPr>
+            <w:r>
+              <w:t xml:space="preserve">Lucro total (R$ mi/ano)</w:t>
+            </w:r>
+          </w:p>
+        </w:tc>
+        <w:tc>
+          <w:tcPr/>
+          <w:p>
+            <w:pPr>
+              <w:pStyle w:val="Compact"/>
+            </w:pPr>
+            <w:r>
+              <w:t xml:space="preserve">68,1</w:t>
+            </w:r>
+          </w:p>
+        </w:tc>
+        <w:tc>
+          <w:tcPr/>
+          <w:p>
+            <w:pPr>
+              <w:pStyle w:val="Compact"/>
+            </w:pPr>
+            <w:r>
+              <w:t xml:space="preserve">103,8</w:t>
+            </w:r>
+          </w:p>
+        </w:tc>
+      </w:tr>
+      <w:tr>
+        <w:tc>
+          <w:tcPr/>
+          <w:p>
+            <w:pPr>
+              <w:pStyle w:val="Compact"/>
+            </w:pPr>
+            <w:r>
+              <w:t xml:space="preserve">Receita de H₂ (R$ mi/ano)</w:t>
+            </w:r>
+          </w:p>
+        </w:tc>
+        <w:tc>
+          <w:tcPr/>
+          <w:p>
+            <w:pPr>
+              <w:pStyle w:val="Compact"/>
+            </w:pPr>
+            <w:r>
+              <w:t xml:space="preserve">36,0</w:t>
+            </w:r>
+          </w:p>
+        </w:tc>
+        <w:tc>
+          <w:tcPr/>
+          <w:p>
+            <w:pPr>
+              <w:pStyle w:val="Compact"/>
+            </w:pPr>
+            <w:r>
+              <w:t xml:space="preserve">30,7</w:t>
+            </w:r>
+          </w:p>
+        </w:tc>
+      </w:tr>
+      <w:tr>
+        <w:tc>
+          <w:tcPr/>
+          <w:p>
+            <w:pPr>
+              <w:pStyle w:val="Compact"/>
+            </w:pPr>
+            <w:r>
+              <w:t xml:space="preserve">Receita no MCP (R$ mi/ano)</w:t>
+            </w:r>
+          </w:p>
+        </w:tc>
+        <w:tc>
+          <w:tcPr/>
+          <w:p>
+            <w:pPr>
+              <w:pStyle w:val="Compact"/>
+            </w:pPr>
+            <w:r>
+              <w:t xml:space="preserve">5,1</w:t>
+            </w:r>
+          </w:p>
+        </w:tc>
+        <w:tc>
+          <w:tcPr/>
+          <w:p>
+            <w:pPr>
+              <w:pStyle w:val="Compact"/>
+            </w:pPr>
+            <w:r>
+              <w:t xml:space="preserve">6,1</w:t>
+            </w:r>
+          </w:p>
+        </w:tc>
+      </w:tr>
+      <w:tr>
+        <w:tc>
+          <w:tcPr/>
+          <w:p>
+            <w:pPr>
+              <w:pStyle w:val="Compact"/>
+            </w:pPr>
+            <w:r>
+              <w:t xml:space="preserve">H₂ vendido (t/ano)</w:t>
+            </w:r>
+          </w:p>
+        </w:tc>
+        <w:tc>
+          <w:tcPr/>
+          <w:p>
+            <w:pPr>
+              <w:pStyle w:val="Compact"/>
+            </w:pPr>
+            <w:r>
+              <w:t xml:space="preserve">1.029</w:t>
+            </w:r>
+          </w:p>
+        </w:tc>
+        <w:tc>
+          <w:tcPr/>
+          <w:p>
+            <w:pPr>
+              <w:pStyle w:val="Compact"/>
+            </w:pPr>
+            <w:r>
+              <w:t xml:space="preserve">878</w:t>
+            </w:r>
+          </w:p>
+        </w:tc>
+      </w:tr>
+      <w:tr>
+        <w:tc>
+          <w:tcPr/>
+          <w:p>
+            <w:pPr>
+              <w:pStyle w:val="Compact"/>
+            </w:pPr>
+            <w:r>
+              <w:t xml:space="preserve">Fator de capacidade do eletrolisador</w:t>
+            </w:r>
+          </w:p>
+        </w:tc>
+        <w:tc>
+          <w:tcPr/>
+          <w:p>
+            <w:pPr>
+              <w:pStyle w:val="Compact"/>
+            </w:pPr>
+            <w:r>
+              <w:t xml:space="preserve">0,37</w:t>
+            </w:r>
+          </w:p>
+        </w:tc>
+        <w:tc>
+          <w:tcPr/>
+          <w:p>
+            <w:pPr>
+              <w:pStyle w:val="Compact"/>
+            </w:pPr>
+            <w:r>
+              <w:t xml:space="preserve">0,32</w:t>
+            </w:r>
+          </w:p>
+        </w:tc>
+      </w:tr>
+      <w:tr>
+        <w:tc>
+          <w:tcPr/>
+          <w:p>
+            <w:pPr>
+              <w:pStyle w:val="Compact"/>
+            </w:pPr>
+            <w:r>
+              <w:t xml:space="preserve">Horas com o eletrolisador ligado</w:t>
+            </w:r>
+          </w:p>
+        </w:tc>
+        <w:tc>
+          <w:tcPr/>
+          <w:p>
+            <w:pPr>
+              <w:pStyle w:val="Compact"/>
+            </w:pPr>
+            <w:r>
+              <w:t xml:space="preserve">7.459</w:t>
+            </w:r>
+          </w:p>
+        </w:tc>
+        <w:tc>
+          <w:tcPr/>
+          <w:p>
+            <w:pPr>
+              <w:pStyle w:val="Compact"/>
+            </w:pPr>
+            <w:r>
+              <w:t xml:space="preserve">3.458</w:t>
+            </w:r>
+          </w:p>
+        </w:tc>
+      </w:tr>
+      <w:tr>
+        <w:tc>
+          <w:tcPr/>
+          <w:p>
+            <w:pPr>
+              <w:pStyle w:val="Compact"/>
+            </w:pPr>
+            <w:r>
+              <w:t xml:space="preserve">Partidas do eletrolisador por ano</w:t>
+            </w:r>
+          </w:p>
+        </w:tc>
+        <w:tc>
+          <w:tcPr/>
+          <w:p>
+            <w:pPr>
+              <w:pStyle w:val="Compact"/>
+            </w:pPr>
+            <w:r>
+              <w:t xml:space="preserve">78</w:t>
+            </w:r>
+          </w:p>
+        </w:tc>
+        <w:tc>
+          <w:tcPr/>
+          <w:p>
+            <w:pPr>
+              <w:pStyle w:val="Compact"/>
+            </w:pPr>
+            <w:r>
+              <w:t xml:space="preserve">358</w:t>
+            </w:r>
+          </w:p>
+        </w:tc>
+      </w:tr>
+      <w:tr>
+        <w:tc>
+          <w:tcPr/>
+          <w:p>
+            <w:pPr>
+              <w:pStyle w:val="Compact"/>
+            </w:pPr>
+            <w:r>
+              <w:t xml:space="preserve">Energia exportada (GWh/ano)</w:t>
+            </w:r>
+          </w:p>
+        </w:tc>
+        <w:tc>
+          <w:tcPr/>
+          <w:p>
+            <w:pPr>
+              <w:pStyle w:val="Compact"/>
+            </w:pPr>
+            <w:r>
+              <w:t xml:space="preserve">19,4</w:t>
+            </w:r>
+          </w:p>
+        </w:tc>
+        <w:tc>
+          <w:tcPr/>
+          <w:p>
+            <w:pPr>
+              <w:pStyle w:val="Compact"/>
+            </w:pPr>
+            <w:r>
+              <w:t xml:space="preserve">28,6</w:t>
+            </w:r>
+          </w:p>
+        </w:tc>
+      </w:tr>
+      <w:tr>
+        <w:tc>
+          <w:tcPr/>
+          <w:p>
+            <w:pPr>
+              <w:pStyle w:val="Compact"/>
+            </w:pPr>
+            <w:r>
+              <w:t xml:space="preserve">Descarga do módulo mercantil (GWh/ano)</w:t>
+            </w:r>
+          </w:p>
+        </w:tc>
+        <w:tc>
+          <w:tcPr/>
+          <w:p>
+            <w:pPr>
+              <w:pStyle w:val="Compact"/>
+            </w:pPr>
+            <w:r>
+              <w:t xml:space="preserve">8,1</w:t>
+            </w:r>
+          </w:p>
+        </w:tc>
+        <w:tc>
+          <w:tcPr/>
+          <w:p>
+            <w:pPr>
+              <w:pStyle w:val="Compact"/>
+            </w:pPr>
+            <w:r>
+              <w:t xml:space="preserve">0</w:t>
+            </w:r>
+          </w:p>
+        </w:tc>
+      </w:tr>
+    </w:tbl>
+    <w:p>
+      <w:pPr>
+        <w:pStyle w:val="Fonte"/>
+      </w:pPr>
+      <w:r>
+        <w:t xml:space="preserve">Fonte: elaborado pelo autor. Média dos cinco cenários; lucros sem O&amp;M fixo, uso da rede e tributos.</w:t>
+      </w:r>
+    </w:p>
+    <w:p>
+      <w:pPr>
+        <w:pStyle w:val="BodyText"/>
+      </w:pPr>
+      <w:r>
+        <w:t xml:space="preserve">Com a oferta de toda a potência, o módulo mercantil desaparece e, com ele, o suprimento noturno do eletrolisador: a produção de hidrogênio cai 15%, o eletrolisador passa a operar só nas horas de sol, com metade das horas de operação e uma partida por dia, e a energia que antes ia para o eletrolisador à noite passa a ser exportada ao MCP. O lucro operacional cai R$ 4,1 milhões por ano, mais do que compensado pelos R$ 39,8 milhões de receita fixa adicional. As conclusões sobre a operação desta seção referem-se, assim, ao BESS disponível; para o BESS a construir, a operação de referência é a de 60 MW.</w:t>
+      </w:r>
+    </w:p>
     <w:bookmarkStart w:id="27" w:name="X56b8d8d6087674c35fe11f865ddd535a2471b8b"/>
     <w:p>
       <w:pPr>
@@ -4716,7 +5184,7 @@
         <w:pStyle w:val="BodyText"/>
       </w:pPr>
       <w:r>
-        <w:t xml:space="preserve">O lucro por cenário na potência ótima é apresentado na Tabela 4.6. O pior cenário é 2022, ano em que o PLD permaneceu próximo do piso regulatório, e o melhor, 2021, ano da crise hídrica. A diferença entre eles, de cerca de R$ 8 milhões por ano, é pequena diante do ganho proporcionado pela participação no leilão.</w:t>
+        <w:t xml:space="preserve">O lucro por cenário na potência ótima é apresentado na Tabela 4.7. O pior cenário é 2022, ano em que o PLD permaneceu próximo do piso regulatório, e o melhor, 2021, ano da crise hídrica. A diferença entre eles, de cerca de R$ 8 milhões por ano, é pequena diante do ganho proporcionado pela participação no leilão.</w:t>
       </w:r>
     </w:p>
     <w:p>
@@ -4724,7 +5192,7 @@
         <w:pStyle w:val="Legenda"/>
       </w:pPr>
       <w:r>
-        <w:t xml:space="preserve">Tabela 4.6 – Lucro anual por cenário na potência ótima (54,4 MW)</w:t>
+        <w:t xml:space="preserve">Tabela 4.7 – Lucro anual por cenário na potência ótima (54,4 MW)</w:t>
       </w:r>
     </w:p>
     <w:tbl>
@@ -5198,7 +5666,7 @@
         </m:r>
       </m:oMath>
       <w:r>
-        <w:t xml:space="preserve">). Entre os extremos, o lucro esperado cai R$ 81 mil por ano (0,12%) e o CVaR sobe R$ 85 mil (0,13%). Há, portanto, troca entre risco e retorno, mas ela é pequena. O CVaR desloca a decisão em direção ao ótimo do pior ano, de 51,5 MW (Tabela 4.7): com</w:t>
+        <w:t xml:space="preserve">). Entre os extremos, o lucro esperado cai R$ 81 mil por ano (0,12%) e o CVaR sobe R$ 85 mil (0,13%). Há, portanto, troca entre risco e retorno, mas ela é pequena. O CVaR desloca a decisão em direção ao ótimo do pior ano, de 51,5 MW (Tabela 4.8): com</w:t>
       </w:r>
       <w:r>
         <w:t xml:space="preserve"> </w:t>
@@ -5244,7 +5712,7 @@
         <w:pStyle w:val="FirstParagraph"/>
       </w:pPr>
       <w:r>
-        <w:t xml:space="preserve">A Tabela 4.7 compara a decisão estocástica (RP) com a decisão obtida no ano médio (EV) e com a solução espera-e-vê (WS), calculadas segundo a Seção 3.7.4.</w:t>
+        <w:t xml:space="preserve">A Tabela 4.8 compara a decisão estocástica (RP) com a decisão obtida no ano médio (EV) e com a solução espera-e-vê (WS), calculadas segundo a Seção 3.7.4.</w:t>
       </w:r>
     </w:p>
     <w:p>
@@ -5252,7 +5720,7 @@
         <w:pStyle w:val="Legenda"/>
       </w:pPr>
       <w:r>
-        <w:t xml:space="preserve">Tabela 4.7 – Decisões e lucro anual por cenário para o cálculo do VSS e do EVPI</w:t>
+        <w:t xml:space="preserve">Tabela 4.8 – Decisões e lucro anual por cenário para o cálculo do VSS e do EVPI</w:t>
       </w:r>
     </w:p>
     <w:tbl>
@@ -5884,7 +6352,7 @@
         <w:pStyle w:val="FirstParagraph"/>
       </w:pPr>
       <w:r>
-        <w:t xml:space="preserve">A Tabela 4.8 resume, para a receita fixa de referência, a potência ótima, o lucro e a operação média de cada caso.</w:t>
+        <w:t xml:space="preserve">A Tabela 4.9 resume, para a receita fixa de referência, a potência ótima, o lucro e a operação média de cada caso.</w:t>
       </w:r>
     </w:p>
     <w:p>
@@ -5892,7 +6360,7 @@
         <w:pStyle w:val="Legenda"/>
       </w:pPr>
       <w:r>
-        <w:t xml:space="preserve">Tabela 4.8 – Potência ótima, lucro e operação média nos casos de contrato de hidrogênio e de importação (receita fixa de R$ 600 mil/(MW·ano))</w:t>
+        <w:t xml:space="preserve">Tabela 4.9 – Potência ótima, lucro e operação média nos casos de contrato de hidrogênio e de importação (receita fixa de R$ 600 mil/(MW·ano))</w:t>
       </w:r>
     </w:p>
     <w:tbl>
@@ -6930,7 +7398,7 @@
         </m:r>
       </m:oMath>
       <w:r>
-        <w:t xml:space="preserve">: 7 kgCO₂/kgH₂, valor inicial do marco legal (BRASIL, 2024), ou 3,4 kgCO₂/kgH₂, próximo do limiar de emissões europeu, sem as exigências de adicionalidade e de correlação temporal e geográfica do Regulamento Delegado (UE) 2023/1184 (Seção 3.4.5). Para cada limite, consideram-se o fator de emissão horário médio do SIN e o fator marginal de uma termelétrica a gás natural (Seção 3.5). A Figura 4.6 e a Tabela 4.9 comparam esses casos com o caso de referência, em que a importação é vedada, e com o de importação livre.</w:t>
+        <w:t xml:space="preserve">: 7 kgCO₂/kgH₂, valor inicial do marco legal (BRASIL, 2024), ou 3,4 kgCO₂/kgH₂, próximo do limiar de emissões europeu, sem as exigências de adicionalidade e de correlação temporal e geográfica do Regulamento Delegado (UE) 2023/1184 (Seção 3.4.5). Para cada limite, consideram-se o fator de emissão horário médio do SIN e o fator marginal de uma termelétrica a gás natural (Seção 3.5). A Figura 4.6 e a Tabela 4.10 comparam esses casos com o caso de referência, em que a importação é vedada, e com o de importação livre.</w:t>
       </w:r>
     </w:p>
     <w:p>
@@ -7001,7 +7469,7 @@
         <w:pStyle w:val="Legenda"/>
       </w:pPr>
       <w:r>
-        <w:t xml:space="preserve">Tabela 4.9 – Potência ótima, lucro e operação média nos casos de limite de emissões do hidrogênio (receita fixa de R$ 600 mil/(MW·ano))</w:t>
+        <w:t xml:space="preserve">Tabela 4.10 – Potência ótima, lucro e operação média nos casos de limite de emissões do hidrogênio (receita fixa de R$ 600 mil/(MW·ano))</w:t>
       </w:r>
     </w:p>
     <w:tbl>
@@ -8028,7 +8496,7 @@
         <w:pStyle w:val="FirstParagraph"/>
       </w:pPr>
       <w:r>
-        <w:t xml:space="preserve">A Figura 4.7 e a Tabela 4.10 apresentam a curva de oferta do caso de referência para 50, 150 e 365 despachos por ano.</w:t>
+        <w:t xml:space="preserve">A Figura 4.7 e a Tabela 4.11 apresentam a curva de oferta do caso de referência para 50, 150 e 365 despachos por ano.</w:t>
       </w:r>
     </w:p>
     <w:p>
@@ -8099,7 +8567,7 @@
         <w:pStyle w:val="Legenda"/>
       </w:pPr>
       <w:r>
-        <w:t xml:space="preserve">Tabela 4.10 – Efeito da frequência do despacho do ONS (receita fixa de R$ 600 mil/(MW·ano))</w:t>
+        <w:t xml:space="preserve">Tabela 4.11 – Efeito da frequência do despacho do ONS (receita fixa de R$ 600 mil/(MW·ano))</w:t>
       </w:r>
     </w:p>
     <w:tbl>
@@ -8473,7 +8941,7 @@
         <w:t xml:space="preserve"> </w:t>
       </w:r>
       <w:r>
-        <w:t xml:space="preserve">A Figura 4.8 e a Tabela 4.11 apresentam a curva de oferta para custos de degradação de R$ 50, R$ 100 e R$ 200/MWh, os dois últimos próximos da faixa estimada a partir do custo de reposição dos módulos (Seção 3.5).</w:t>
+        <w:t xml:space="preserve">A Figura 4.8 e a Tabela 4.12 apresentam a curva de oferta para custos de degradação de R$ 50, R$ 100 e R$ 200/MWh, os dois últimos próximos da faixa estimada a partir do custo de reposição dos módulos (Seção 3.5).</w:t>
       </w:r>
     </w:p>
     <w:p>
@@ -8544,7 +9012,7 @@
         <w:pStyle w:val="Legenda"/>
       </w:pPr>
       <w:r>
-        <w:t xml:space="preserve">Tabela 4.11 – Efeito do custo de degradação do BESS (receita fixa de R$ 600 mil/(MW·ano))</w:t>
+        <w:t xml:space="preserve">Tabela 4.12 – Efeito do custo de degradação do BESS (receita fixa de R$ 600 mil/(MW·ano))</w:t>
       </w:r>
     </w:p>
     <w:tbl>
@@ -8824,7 +9292,7 @@
         <w:t xml:space="preserve"> </w:t>
       </w:r>
       <w:r>
-        <w:t xml:space="preserve">A Figura 4.9 e a Tabela 4.12 comparam eletrolisadores de 10, 17,5 e 25 MW, mantida a usina FV de 50 MWp.</w:t>
+        <w:t xml:space="preserve">A Figura 4.9 e a Tabela 4.13 comparam eletrolisadores de 10, 17,5 e 25 MW, mantida a usina FV de 50 MWp.</w:t>
       </w:r>
     </w:p>
     <w:p>
@@ -8895,7 +9363,7 @@
         <w:pStyle w:val="Legenda"/>
       </w:pPr>
       <w:r>
-        <w:t xml:space="preserve">Tabela 4.12 – Efeito da potência do eletrolisador (receita fixa de R$ 600 mil/(MW·ano))</w:t>
+        <w:t xml:space="preserve">Tabela 4.13 – Efeito da potência do eletrolisador (receita fixa de R$ 600 mil/(MW·ano))</w:t>
       </w:r>
     </w:p>
     <w:tbl>

</xml_diff>

<commit_message>
Documenta a sensibilidade ao critério de despacho do ONS (carga líquida)
A curva de oferta e o lance coincidem com os do perfil por PLD: os perfis
coincidem em 83-94% das horas de descarga e o perfil só afeta o empreendedor
pela degradação e pela conexão.

Co-Authored-By: Claude Opus 5.5 <noreply@anthropic.com>
Claude-Session: https://claude.ai/code/session_01YFtn9hiQUHbNLSX7rUNYuK
</commit_message>
<xml_diff>
--- a/docs/dissertacao/cap4_resultados.docx
+++ b/docs/dissertacao/cap4_resultados.docx
@@ -4029,6 +4029,52 @@
             </w:pPr>
             <w:r>
               <w:t xml:space="preserve">+1%</w:t>
+            </w:r>
+          </w:p>
+        </w:tc>
+      </w:tr>
+      <w:tr>
+        <w:tc>
+          <w:tcPr/>
+          <w:p>
+            <w:pPr>
+              <w:pStyle w:val="Compact"/>
+            </w:pPr>
+            <w:r>
+              <w:t xml:space="preserve">Despacho na ponta da carga líquida</w:t>
+            </w:r>
+          </w:p>
+        </w:tc>
+        <w:tc>
+          <w:tcPr/>
+          <w:p>
+            <w:pPr>
+              <w:pStyle w:val="Compact"/>
+            </w:pPr>
+            <w:r>
+              <w:t xml:space="preserve">1.214</w:t>
+            </w:r>
+          </w:p>
+        </w:tc>
+        <w:tc>
+          <w:tcPr/>
+          <w:p>
+            <w:pPr>
+              <w:pStyle w:val="Compact"/>
+            </w:pPr>
+            <w:r>
+              <w:t xml:space="preserve">60</w:t>
+            </w:r>
+          </w:p>
+        </w:tc>
+        <w:tc>
+          <w:tcPr/>
+          <w:p>
+            <w:pPr>
+              <w:pStyle w:val="Compact"/>
+            </w:pPr>
+            <w:r>
+              <w:t xml:space="preserve">0%</w:t>
             </w:r>
           </w:p>
         </w:tc>
@@ -8906,6 +8952,27 @@
       </w:pPr>
       <w:r>
         <w:t xml:space="preserve">Em consequência, a frequência do despacho, embora desconhecida, não altera a potência ótima para a receita de referência e afeta apenas o limiar de entrada e o lucro. Como seu efeito é linear e pode ser calculado diretamente, sem simulação, essa incerteza pode ser incorporada à análise como um custo por MW contratado — por exemplo, como componente do lance mínimo —, sem a necessidade de cenários adicionais no modelo de operação.</w:t>
+      </w:r>
+    </w:p>
+    <w:p>
+      <w:pPr>
+        <w:pStyle w:val="BodyText"/>
+      </w:pPr>
+      <w:r>
+        <w:t xml:space="preserve">O critério de escolha das horas de descarga também é desconhecido. O perfil do caso de referência descarrega no bloco de quatro horas de maior PLD após o período solar; como alternativa, avaliou-se um perfil que descarrega na ponta da carga líquida do SIN e recarrega nas horas de menor carga líquida da janela de recarga (Seção 3.7.2). Entre 2021 e 2025, a carga líquida média foi de 56 a 59 GW, e sua ponta ocorreu sobretudo entre 18 h e 22 h, como a do PLD: os dois perfis coincidem em 83% a 94% das horas de descarga, conforme o ano, e o PLD médio nas horas de descarga difere em menos de R$ 1/MWh. O resultado é que a curva de oferta não se altera: o lucro operacional esperado difere do caso de referência em menos de R$ 60 por ano em todas as potências, valor da ordem da tolerância do</w:t>
+      </w:r>
+      <w:r>
+        <w:t xml:space="preserve"> </w:t>
+      </w:r>
+      <w:r>
+        <w:rPr>
+          <w:i/>
+          <w:iCs/>
+        </w:rPr>
+        <w:t xml:space="preserve">solver</w:t>
+      </w:r>
+      <w:r>
+        <w:t xml:space="preserve">, e a potência ótima (55 MW), a receita mínima de entrada (R$ 76 mil/(MW·ano)) e o lance mínimo (Tabela 4.4) são os mesmos. Isso decorre da separação entre os módulos: a energia do módulo LRCAP é liquidada pela CONCAP, e o perfil afeta o empreendedor apenas pela degradação, que depende do número de ciclos e não das horas em que ocorrem, e pelo limite do ponto de conexão, que não se mostrou ativo. Assim, o resultado é robusto ao critério de despacho do ONS, desde que o número de ciclos seja mantido e a recarga ocorra dentro da janela solar.</w:t>
       </w:r>
     </w:p>
     <w:bookmarkEnd w:id="41"/>

</xml_diff>

<commit_message>
Comparação com dias representativos (Tabela 4.2) e renumeração das tabelas
Blocos diários e K = 6-48 dias representativos (k-medoids) reproduzem a
decisão sem contrato, mas, com contrato de 3 t/dia, subestimam o custo de
oportunidade da potência em 30-40%. Corrige resto de edição na Seção 4.1.

Co-Authored-By: Claude Opus 5.5 <noreply@anthropic.com>
Claude-Session: https://claude.ai/code/session_01YFtn9hiQUHbNLSX7rUNYuK
</commit_message>
<xml_diff>
--- a/docs/dissertacao/cap4_resultados.docx
+++ b/docs/dissertacao/cap4_resultados.docx
@@ -590,7 +590,830 @@
         <w:pStyle w:val="BodyText"/>
       </w:pPr>
       <w:r>
-        <w:t xml:space="preserve">O mesmo não vale quando há contrato de fornecimento de hidrogênio. Com entrega diária firme, guardar energia e hidrogênio de dias ensolarados para dias nublados tem valor, e a condição cíclica semanal — que obriga cada semana a começar com o módulo mercantil em 50% da carga e o tanque vazio — passa a restringir a operação. No contrato de 3 t/dia, o lucro operacional esperado com blocos cíclicos ficou entre 2,3% e 3,8% abaixo do obtido com os estados de fronteira da relaxação linear do ano (Seção 3.6.2), para potências de até 55 MW, e o déficit anual de entrega com 55 MW contratados caiu de 61 t para 40 t. Com o tanque de 10 t, a diferença chegou a 9%, pois a condição cíclica esvaziava o tanque no início de cada semana. Com a fronteira da relaxação, a diferença entre os limites inferior e superior do lucro foi inferior a 0,1% em todos os pontos das curvas de oferta dos casos com contrato até 55 MW, de até 0,33% com 57,5 MW e de até 1,6% com 60 MW. Nesse último ponto, o módulo mercantil fica sem potência e a relaxação linear, que admite o eletrolisador abaixo da carga mínima, é menos justa. Nos casos sem contrato, os dois tratamentos diferem em no máximo 0,05% no lucro esperado. Por isso, as curvas de oferta e as avaliações com potência fixa deste capítulo adotam, para cada caso, potência e cenário, o maior dos dois limites inferiores — com os estados de fronteira da relaxação ou com a condição cíclica semanal —, pois ambos correspondem a operações viáveis do ano; o limite superior é o da relaxação. Nos casos sem contrato, a condição cíclica fica até 0,05% acima; nos casos com contrato, a relaxação fica de 2% a 4% acima. Nessas avaliações, a recarga do módulo LRCAP acima da custeada pela CONCAP é apurada no ano inteiro, e não por bloco: com 50 ou 150 despachos por ano, a apuração por bloco cobraria como excedente a recarga de um despacho realizado no fim de uma semana, que cai no bloco seguinte, sem a injeção correspondente, o que reduziria o lucro em R$ 3 mil a R$ 4 mil/(MW·ano). Com essas duas regras, a diferença entre os limites inferior e superior fica abaixo de 0,1% até 55 MW nos casos sem contrato, exceto com o eletrolisador de 25 MW (0,19%).3, 4.3.4 e 4.3.7, foram calculados com a fronteira da relaxação.</w:t>
+        <w:t xml:space="preserve">O mesmo não vale quando há contrato de fornecimento de hidrogênio. Com entrega diária firme, guardar energia e hidrogênio de dias ensolarados para dias nublados tem valor, e a condição cíclica semanal — que obriga cada semana a começar com o módulo mercantil em 50% da carga e o tanque vazio — passa a restringir a operação. No contrato de 3 t/dia, o lucro operacional esperado com blocos cíclicos ficou entre 2,3% e 3,8% abaixo do obtido com os estados de fronteira da relaxação linear do ano (Seção 3.6.2), para potências de até 55 MW, e o déficit anual de entrega com 55 MW contratados caiu de 61 t para 40 t. Com o tanque de 10 t, a diferença chegou a 9%, pois a condição cíclica esvaziava o tanque no início de cada semana. Com a fronteira da relaxação, a diferença entre os limites inferior e superior do lucro foi inferior a 0,1% em todos os pontos das curvas de oferta dos casos com contrato até 55 MW, de até 0,33% com 57,5 MW e de até 1,6% com 60 MW. Nesse último ponto, o módulo mercantil fica sem potência e a relaxação linear, que admite o eletrolisador abaixo da carga mínima, é menos justa. Nos casos sem contrato, os dois tratamentos diferem em no máximo 0,05% no lucro esperado. Por isso, as curvas de oferta e as avaliações com potência fixa deste capítulo adotam, para cada caso, potência e cenário, o maior dos dois limites inferiores — com os estados de fronteira da relaxação ou com a condição cíclica semanal —, pois ambos correspondem a operações viáveis do ano; o limite superior é o da relaxação. Nos casos sem contrato, a condição cíclica fica até 0,05% acima; nos casos com contrato, a relaxação fica de 2% a 4% acima. Nessas avaliações, a recarga do módulo LRCAP acima da custeada pela CONCAP é apurada no ano inteiro, e não por bloco: com 50 ou 150 despachos por ano, a apuração por bloco cobraria como excedente a recarga de um despacho realizado no fim de uma semana, que cai no bloco seguinte, sem a injeção correspondente, o que reduziria o lucro em R$ 3 mil a R$ 4 mil/(MW·ano). Com essas duas regras, a diferença entre os limites inferior e superior fica abaixo de 0,1% até 55 MW nos casos sem contrato, exceto com o eletrolisador de 25 MW (0,19%).</w:t>
+      </w:r>
+    </w:p>
+    <w:p>
+      <w:pPr>
+        <w:pStyle w:val="BodyText"/>
+      </w:pPr>
+      <w:r>
+        <w:rPr>
+          <w:b/>
+          <w:bCs/>
+        </w:rPr>
+        <w:t xml:space="preserve">Dias representativos.</w:t>
+      </w:r>
+      <w:r>
+        <w:t xml:space="preserve"> </w:t>
+      </w:r>
+      <w:r>
+        <w:t xml:space="preserve">Uma alternativa frequente na literatura é reduzir o ano a</w:t>
+      </w:r>
+      <w:r>
+        <w:t xml:space="preserve"> </w:t>
+      </w:r>
+      <m:oMath>
+        <m:r>
+          <m:t>K</m:t>
+        </m:r>
+      </m:oMath>
+      <w:r>
+        <w:t xml:space="preserve"> </w:t>
+      </w:r>
+      <w:r>
+        <w:t xml:space="preserve">dias representativos, obtidos por agrupamento das séries diárias, e resolver o modelo só para esses dias, ponderados pelo número de dias de cada grupo. Para medir o erro dessa abordagem, o MILP de 24 h foi resolvido para cada dia dos cinco cenários e cada potência da grade da curva de oferta, com condição cíclica diária, e os dias de cada ano foram agrupados por</w:t>
+      </w:r>
+      <w:r>
+        <w:t xml:space="preserve"> </w:t>
+      </w:r>
+      <w:r>
+        <w:rPr>
+          <w:i/>
+          <w:iCs/>
+        </w:rPr>
+        <w:t xml:space="preserve">k-medoids</w:t>
+      </w:r>
+      <w:r>
+        <w:t xml:space="preserve"> </w:t>
+      </w:r>
+      <w:r>
+        <w:t xml:space="preserve">sobre os perfis horários padronizados de PLD e de fator de capacidade FV, com</w:t>
+      </w:r>
+      <w:r>
+        <w:t xml:space="preserve"> </w:t>
+      </w:r>
+      <m:oMath>
+        <m:r>
+          <m:t>K</m:t>
+        </m:r>
+      </m:oMath>
+      <w:r>
+        <w:t xml:space="preserve"> </w:t>
+      </w:r>
+      <w:r>
+        <w:t xml:space="preserve">= 6, 12, 24 e 48. A Tabela 4.2 compara as curvas de oferta resultantes com a dos blocos semanais.</w:t>
+      </w:r>
+    </w:p>
+    <w:p>
+      <w:pPr>
+        <w:pStyle w:val="Legenda"/>
+      </w:pPr>
+      <w:r>
+        <w:t xml:space="preserve">Tabela 4.2 – Curva de oferta com blocos semanais, blocos diários e dias representativos (receita fixa de R$ 600 mil/(MW·ano))</w:t>
+      </w:r>
+    </w:p>
+    <w:tbl>
+      <w:tblPr>
+        <w:tblStyle w:val="Table"/>
+        <w:tblW w:type="pct" w:w="5000"/>
+        <w:tblLayout w:type="fixed"/>
+        <w:tblLook w:firstRow="1" w:lastRow="0" w:firstColumn="0" w:lastColumn="0" w:noHBand="0" w:noVBand="0" w:val="0020"/>
+      </w:tblPr>
+      <w:tblGrid>
+        <w:gridCol w:w="1131"/>
+        <w:gridCol w:w="1131"/>
+        <w:gridCol w:w="1131"/>
+        <w:gridCol w:w="1131"/>
+        <w:gridCol w:w="1131"/>
+        <w:gridCol w:w="1131"/>
+        <w:gridCol w:w="1131"/>
+      </w:tblGrid>
+      <w:tr>
+        <w:trPr>
+          <w:tblHeader w:val="on"/>
+        </w:trPr>
+        <w:tc>
+          <w:tcPr/>
+          <w:p>
+            <w:pPr>
+              <w:pStyle w:val="Compact"/>
+            </w:pPr>
+            <w:r>
+              <w:t xml:space="preserve">Método</w:t>
+            </w:r>
+          </w:p>
+        </w:tc>
+        <w:tc>
+          <w:tcPr/>
+          <w:p>
+            <w:pPr>
+              <w:pStyle w:val="Compact"/>
+            </w:pPr>
+            <w:r>
+              <w:t xml:space="preserve">Sem contrato:</w:t>
+            </w:r>
+            <w:r>
+              <w:t xml:space="preserve"> </w:t>
+            </w:r>
+            <m:oMath>
+              <m:r>
+                <m:t>Q</m:t>
+              </m:r>
+              <m:r>
+                <m:rPr>
+                  <m:sty m:val="p"/>
+                </m:rPr>
+                <m:t>(</m:t>
+              </m:r>
+              <m:r>
+                <m:t>0</m:t>
+              </m:r>
+              <m:r>
+                <m:rPr>
+                  <m:sty m:val="p"/>
+                </m:rPr>
+                <m:t>)</m:t>
+              </m:r>
+            </m:oMath>
+            <w:r>
+              <w:t xml:space="preserve"> </w:t>
+            </w:r>
+            <w:r>
+              <w:t xml:space="preserve">(R$ mi/ano)</w:t>
+            </w:r>
+          </w:p>
+        </w:tc>
+        <w:tc>
+          <w:tcPr/>
+          <w:p>
+            <w:pPr>
+              <w:pStyle w:val="Compact"/>
+            </w:pPr>
+            <w:r>
+              <w:t xml:space="preserve">Sem contrato:</w:t>
+            </w:r>
+            <w:r>
+              <w:t xml:space="preserve"> </w:t>
+            </w:r>
+            <m:oMath>
+              <m:r>
+                <m:t>Q</m:t>
+              </m:r>
+              <m:r>
+                <m:rPr>
+                  <m:sty m:val="p"/>
+                </m:rPr>
+                <m:t>(</m:t>
+              </m:r>
+              <m:r>
+                <m:t>0</m:t>
+              </m:r>
+              <m:r>
+                <m:rPr>
+                  <m:sty m:val="p"/>
+                </m:rPr>
+                <m:t>)</m:t>
+              </m:r>
+              <m:r>
+                <m:rPr>
+                  <m:sty m:val="p"/>
+                </m:rPr>
+                <m:t>−</m:t>
+              </m:r>
+              <m:r>
+                <m:t>Q</m:t>
+              </m:r>
+              <m:r>
+                <m:rPr>
+                  <m:sty m:val="p"/>
+                </m:rPr>
+                <m:t>(</m:t>
+              </m:r>
+              <m:r>
+                <m:t>60</m:t>
+              </m:r>
+              <m:r>
+                <m:rPr>
+                  <m:sty m:val="p"/>
+                </m:rPr>
+                <m:t>)</m:t>
+              </m:r>
+            </m:oMath>
+            <w:r>
+              <w:t xml:space="preserve"> </w:t>
+            </w:r>
+            <w:r>
+              <w:t xml:space="preserve">(R$ mi/ano)</w:t>
+            </w:r>
+          </w:p>
+        </w:tc>
+        <w:tc>
+          <w:tcPr/>
+          <w:p>
+            <w:pPr>
+              <w:pStyle w:val="Compact"/>
+            </w:pPr>
+            <w:r>
+              <w:t xml:space="preserve">Sem contrato: potência ótima (MW)</w:t>
+            </w:r>
+          </w:p>
+        </w:tc>
+        <w:tc>
+          <w:tcPr/>
+          <w:p>
+            <w:pPr>
+              <w:pStyle w:val="Compact"/>
+            </w:pPr>
+            <w:r>
+              <w:t xml:space="preserve">Contrato 3 t/dia:</w:t>
+            </w:r>
+            <w:r>
+              <w:t xml:space="preserve"> </w:t>
+            </w:r>
+            <m:oMath>
+              <m:r>
+                <m:t>Q</m:t>
+              </m:r>
+              <m:r>
+                <m:rPr>
+                  <m:sty m:val="p"/>
+                </m:rPr>
+                <m:t>(</m:t>
+              </m:r>
+              <m:r>
+                <m:t>0</m:t>
+              </m:r>
+              <m:r>
+                <m:rPr>
+                  <m:sty m:val="p"/>
+                </m:rPr>
+                <m:t>)</m:t>
+              </m:r>
+            </m:oMath>
+            <w:r>
+              <w:t xml:space="preserve"> </w:t>
+            </w:r>
+            <w:r>
+              <w:t xml:space="preserve">(R$ mi/ano)</w:t>
+            </w:r>
+          </w:p>
+        </w:tc>
+        <w:tc>
+          <w:tcPr/>
+          <w:p>
+            <w:pPr>
+              <w:pStyle w:val="Compact"/>
+            </w:pPr>
+            <w:r>
+              <w:t xml:space="preserve">Contrato 3 t/dia:</w:t>
+            </w:r>
+            <w:r>
+              <w:t xml:space="preserve"> </w:t>
+            </w:r>
+            <m:oMath>
+              <m:r>
+                <m:t>Q</m:t>
+              </m:r>
+              <m:r>
+                <m:rPr>
+                  <m:sty m:val="p"/>
+                </m:rPr>
+                <m:t>(</m:t>
+              </m:r>
+              <m:r>
+                <m:t>0</m:t>
+              </m:r>
+              <m:r>
+                <m:rPr>
+                  <m:sty m:val="p"/>
+                </m:rPr>
+                <m:t>)</m:t>
+              </m:r>
+              <m:r>
+                <m:rPr>
+                  <m:sty m:val="p"/>
+                </m:rPr>
+                <m:t>−</m:t>
+              </m:r>
+              <m:r>
+                <m:t>Q</m:t>
+              </m:r>
+              <m:r>
+                <m:rPr>
+                  <m:sty m:val="p"/>
+                </m:rPr>
+                <m:t>(</m:t>
+              </m:r>
+              <m:r>
+                <m:t>60</m:t>
+              </m:r>
+              <m:r>
+                <m:rPr>
+                  <m:sty m:val="p"/>
+                </m:rPr>
+                <m:t>)</m:t>
+              </m:r>
+            </m:oMath>
+            <w:r>
+              <w:t xml:space="preserve"> </w:t>
+            </w:r>
+            <w:r>
+              <w:t xml:space="preserve">(R$ mi/ano)</w:t>
+            </w:r>
+          </w:p>
+        </w:tc>
+        <w:tc>
+          <w:tcPr/>
+          <w:p>
+            <w:pPr>
+              <w:pStyle w:val="Compact"/>
+            </w:pPr>
+            <w:r>
+              <w:t xml:space="preserve">Contrato 3 t/dia: potência ótima (MW)</w:t>
+            </w:r>
+          </w:p>
+        </w:tc>
+      </w:tr>
+      <w:tr>
+        <w:tc>
+          <w:tcPr/>
+          <w:p>
+            <w:pPr>
+              <w:pStyle w:val="Compact"/>
+            </w:pPr>
+            <w:r>
+              <w:t xml:space="preserve">Blocos semanais (referência)</w:t>
+            </w:r>
+          </w:p>
+        </w:tc>
+        <w:tc>
+          <w:tcPr/>
+          <w:p>
+            <w:pPr>
+              <w:pStyle w:val="Compact"/>
+            </w:pPr>
+            <w:r>
+              <w:t xml:space="preserve">45,03</w:t>
+            </w:r>
+          </w:p>
+        </w:tc>
+        <w:tc>
+          <w:tcPr/>
+          <w:p>
+            <w:pPr>
+              <w:pStyle w:val="Compact"/>
+            </w:pPr>
+            <w:r>
+              <w:t xml:space="preserve">14,05</w:t>
+            </w:r>
+          </w:p>
+        </w:tc>
+        <w:tc>
+          <w:tcPr/>
+          <w:p>
+            <w:pPr>
+              <w:pStyle w:val="Compact"/>
+            </w:pPr>
+            <w:r>
+              <w:t xml:space="preserve">55</w:t>
+            </w:r>
+          </w:p>
+        </w:tc>
+        <w:tc>
+          <w:tcPr/>
+          <w:p>
+            <w:pPr>
+              <w:pStyle w:val="Compact"/>
+            </w:pPr>
+            <w:r>
+              <w:t xml:space="preserve">39,38</w:t>
+            </w:r>
+          </w:p>
+        </w:tc>
+        <w:tc>
+          <w:tcPr/>
+          <w:p>
+            <w:pPr>
+              <w:pStyle w:val="Compact"/>
+            </w:pPr>
+            <w:r>
+              <w:t xml:space="preserve">14,43</w:t>
+            </w:r>
+          </w:p>
+        </w:tc>
+        <w:tc>
+          <w:tcPr/>
+          <w:p>
+            <w:pPr>
+              <w:pStyle w:val="Compact"/>
+            </w:pPr>
+            <w:r>
+              <w:t xml:space="preserve">55</w:t>
+            </w:r>
+          </w:p>
+        </w:tc>
+      </w:tr>
+      <w:tr>
+        <w:tc>
+          <w:tcPr/>
+          <w:p>
+            <w:pPr>
+              <w:pStyle w:val="Compact"/>
+            </w:pPr>
+            <w:r>
+              <w:t xml:space="preserve">Blocos diários (todos os dias)</w:t>
+            </w:r>
+          </w:p>
+        </w:tc>
+        <w:tc>
+          <w:tcPr/>
+          <w:p>
+            <w:pPr>
+              <w:pStyle w:val="Compact"/>
+            </w:pPr>
+            <w:r>
+              <w:t xml:space="preserve">44,93</w:t>
+            </w:r>
+          </w:p>
+        </w:tc>
+        <w:tc>
+          <w:tcPr/>
+          <w:p>
+            <w:pPr>
+              <w:pStyle w:val="Compact"/>
+            </w:pPr>
+            <w:r>
+              <w:t xml:space="preserve">13,95</w:t>
+            </w:r>
+          </w:p>
+        </w:tc>
+        <w:tc>
+          <w:tcPr/>
+          <w:p>
+            <w:pPr>
+              <w:pStyle w:val="Compact"/>
+            </w:pPr>
+            <w:r>
+              <w:t xml:space="preserve">55</w:t>
+            </w:r>
+          </w:p>
+        </w:tc>
+        <w:tc>
+          <w:tcPr/>
+          <w:p>
+            <w:pPr>
+              <w:pStyle w:val="Compact"/>
+            </w:pPr>
+            <w:r>
+              <w:t xml:space="preserve">34,78</w:t>
+            </w:r>
+          </w:p>
+        </w:tc>
+        <w:tc>
+          <w:tcPr/>
+          <w:p>
+            <w:pPr>
+              <w:pStyle w:val="Compact"/>
+            </w:pPr>
+            <w:r>
+              <w:t xml:space="preserve">10,15</w:t>
+            </w:r>
+          </w:p>
+        </w:tc>
+        <w:tc>
+          <w:tcPr/>
+          <w:p>
+            <w:pPr>
+              <w:pStyle w:val="Compact"/>
+            </w:pPr>
+            <w:r>
+              <w:t xml:space="preserve">57,5</w:t>
+            </w:r>
+          </w:p>
+        </w:tc>
+      </w:tr>
+      <w:tr>
+        <w:tc>
+          <w:tcPr/>
+          <w:p>
+            <w:pPr>
+              <w:pStyle w:val="Compact"/>
+            </w:pPr>
+            <w:r>
+              <w:t xml:space="preserve">6 dias representativos</w:t>
+            </w:r>
+          </w:p>
+        </w:tc>
+        <w:tc>
+          <w:tcPr/>
+          <w:p>
+            <w:pPr>
+              <w:pStyle w:val="Compact"/>
+            </w:pPr>
+            <w:r>
+              <w:t xml:space="preserve">46,57</w:t>
+            </w:r>
+          </w:p>
+        </w:tc>
+        <w:tc>
+          <w:tcPr/>
+          <w:p>
+            <w:pPr>
+              <w:pStyle w:val="Compact"/>
+            </w:pPr>
+            <w:r>
+              <w:t xml:space="preserve">14,12</w:t>
+            </w:r>
+          </w:p>
+        </w:tc>
+        <w:tc>
+          <w:tcPr/>
+          <w:p>
+            <w:pPr>
+              <w:pStyle w:val="Compact"/>
+            </w:pPr>
+            <w:r>
+              <w:t xml:space="preserve">55</w:t>
+            </w:r>
+          </w:p>
+        </w:tc>
+        <w:tc>
+          <w:tcPr/>
+          <w:p>
+            <w:pPr>
+              <w:pStyle w:val="Compact"/>
+            </w:pPr>
+            <w:r>
+              <w:t xml:space="preserve">36,23</w:t>
+            </w:r>
+          </w:p>
+        </w:tc>
+        <w:tc>
+          <w:tcPr/>
+          <w:p>
+            <w:pPr>
+              <w:pStyle w:val="Compact"/>
+            </w:pPr>
+            <w:r>
+              <w:t xml:space="preserve">8,59</w:t>
+            </w:r>
+          </w:p>
+        </w:tc>
+        <w:tc>
+          <w:tcPr/>
+          <w:p>
+            <w:pPr>
+              <w:pStyle w:val="Compact"/>
+            </w:pPr>
+            <w:r>
+              <w:t xml:space="preserve">57,5</w:t>
+            </w:r>
+          </w:p>
+        </w:tc>
+      </w:tr>
+      <w:tr>
+        <w:tc>
+          <w:tcPr/>
+          <w:p>
+            <w:pPr>
+              <w:pStyle w:val="Compact"/>
+            </w:pPr>
+            <w:r>
+              <w:t xml:space="preserve">12 dias representativos</w:t>
+            </w:r>
+          </w:p>
+        </w:tc>
+        <w:tc>
+          <w:tcPr/>
+          <w:p>
+            <w:pPr>
+              <w:pStyle w:val="Compact"/>
+            </w:pPr>
+            <w:r>
+              <w:t xml:space="preserve">45,67</w:t>
+            </w:r>
+          </w:p>
+        </w:tc>
+        <w:tc>
+          <w:tcPr/>
+          <w:p>
+            <w:pPr>
+              <w:pStyle w:val="Compact"/>
+            </w:pPr>
+            <w:r>
+              <w:t xml:space="preserve">13,92</w:t>
+            </w:r>
+          </w:p>
+        </w:tc>
+        <w:tc>
+          <w:tcPr/>
+          <w:p>
+            <w:pPr>
+              <w:pStyle w:val="Compact"/>
+            </w:pPr>
+            <w:r>
+              <w:t xml:space="preserve">55</w:t>
+            </w:r>
+          </w:p>
+        </w:tc>
+        <w:tc>
+          <w:tcPr/>
+          <w:p>
+            <w:pPr>
+              <w:pStyle w:val="Compact"/>
+            </w:pPr>
+            <w:r>
+              <w:t xml:space="preserve">34,76</w:t>
+            </w:r>
+          </w:p>
+        </w:tc>
+        <w:tc>
+          <w:tcPr/>
+          <w:p>
+            <w:pPr>
+              <w:pStyle w:val="Compact"/>
+            </w:pPr>
+            <w:r>
+              <w:t xml:space="preserve">8,51</w:t>
+            </w:r>
+          </w:p>
+        </w:tc>
+        <w:tc>
+          <w:tcPr/>
+          <w:p>
+            <w:pPr>
+              <w:pStyle w:val="Compact"/>
+            </w:pPr>
+            <w:r>
+              <w:t xml:space="preserve">57,5</w:t>
+            </w:r>
+          </w:p>
+        </w:tc>
+      </w:tr>
+      <w:tr>
+        <w:tc>
+          <w:tcPr/>
+          <w:p>
+            <w:pPr>
+              <w:pStyle w:val="Compact"/>
+            </w:pPr>
+            <w:r>
+              <w:t xml:space="preserve">24 dias representativos</w:t>
+            </w:r>
+          </w:p>
+        </w:tc>
+        <w:tc>
+          <w:tcPr/>
+          <w:p>
+            <w:pPr>
+              <w:pStyle w:val="Compact"/>
+            </w:pPr>
+            <w:r>
+              <w:t xml:space="preserve">45,86</w:t>
+            </w:r>
+          </w:p>
+        </w:tc>
+        <w:tc>
+          <w:tcPr/>
+          <w:p>
+            <w:pPr>
+              <w:pStyle w:val="Compact"/>
+            </w:pPr>
+            <w:r>
+              <w:t xml:space="preserve">14,13</w:t>
+            </w:r>
+          </w:p>
+        </w:tc>
+        <w:tc>
+          <w:tcPr/>
+          <w:p>
+            <w:pPr>
+              <w:pStyle w:val="Compact"/>
+            </w:pPr>
+            <w:r>
+              <w:t xml:space="preserve">55</w:t>
+            </w:r>
+          </w:p>
+        </w:tc>
+        <w:tc>
+          <w:tcPr/>
+          <w:p>
+            <w:pPr>
+              <w:pStyle w:val="Compact"/>
+            </w:pPr>
+            <w:r>
+              <w:t xml:space="preserve">35,25</w:t>
+            </w:r>
+          </w:p>
+        </w:tc>
+        <w:tc>
+          <w:tcPr/>
+          <w:p>
+            <w:pPr>
+              <w:pStyle w:val="Compact"/>
+            </w:pPr>
+            <w:r>
+              <w:t xml:space="preserve">9,14</w:t>
+            </w:r>
+          </w:p>
+        </w:tc>
+        <w:tc>
+          <w:tcPr/>
+          <w:p>
+            <w:pPr>
+              <w:pStyle w:val="Compact"/>
+            </w:pPr>
+            <w:r>
+              <w:t xml:space="preserve">57,5</w:t>
+            </w:r>
+          </w:p>
+        </w:tc>
+      </w:tr>
+      <w:tr>
+        <w:tc>
+          <w:tcPr/>
+          <w:p>
+            <w:pPr>
+              <w:pStyle w:val="Compact"/>
+            </w:pPr>
+            <w:r>
+              <w:t xml:space="preserve">48 dias representativos</w:t>
+            </w:r>
+          </w:p>
+        </w:tc>
+        <w:tc>
+          <w:tcPr/>
+          <w:p>
+            <w:pPr>
+              <w:pStyle w:val="Compact"/>
+            </w:pPr>
+            <w:r>
+              <w:t xml:space="preserve">45,35</w:t>
+            </w:r>
+          </w:p>
+        </w:tc>
+        <w:tc>
+          <w:tcPr/>
+          <w:p>
+            <w:pPr>
+              <w:pStyle w:val="Compact"/>
+            </w:pPr>
+            <w:r>
+              <w:t xml:space="preserve">14,01</w:t>
+            </w:r>
+          </w:p>
+        </w:tc>
+        <w:tc>
+          <w:tcPr/>
+          <w:p>
+            <w:pPr>
+              <w:pStyle w:val="Compact"/>
+            </w:pPr>
+            <w:r>
+              <w:t xml:space="preserve">55</w:t>
+            </w:r>
+          </w:p>
+        </w:tc>
+        <w:tc>
+          <w:tcPr/>
+          <w:p>
+            <w:pPr>
+              <w:pStyle w:val="Compact"/>
+            </w:pPr>
+            <w:r>
+              <w:t xml:space="preserve">34,83</w:t>
+            </w:r>
+          </w:p>
+        </w:tc>
+        <w:tc>
+          <w:tcPr/>
+          <w:p>
+            <w:pPr>
+              <w:pStyle w:val="Compact"/>
+            </w:pPr>
+            <w:r>
+              <w:t xml:space="preserve">9,55</w:t>
+            </w:r>
+          </w:p>
+        </w:tc>
+        <w:tc>
+          <w:tcPr/>
+          <w:p>
+            <w:pPr>
+              <w:pStyle w:val="Compact"/>
+            </w:pPr>
+            <w:r>
+              <w:t xml:space="preserve">57,5</w:t>
+            </w:r>
+          </w:p>
+        </w:tc>
+      </w:tr>
+    </w:tbl>
+    <w:p>
+      <w:pPr>
+        <w:pStyle w:val="Fonte"/>
+      </w:pPr>
+      <w:r>
+        <w:t xml:space="preserve">Fonte: elaborado pelo autor.</w:t>
+      </w:r>
+    </w:p>
+    <w:p>
+      <w:pPr>
+        <w:pStyle w:val="BodyText"/>
+      </w:pPr>
+      <w:r>
+        <w:t xml:space="preserve">Sem contrato de hidrogênio, a operação se repete em ciclos diários, e os blocos diários reproduzem os semanais a menos de 0,2%. O agrupamento acrescenta um erro no nível do lucro, superestimado em 0,7% a 3,4% (R$ 0,3 milhão a R$ 1,5 milhão por ano), pois os medoides suavizam a variabilidade dos dias que representam, mas não na perda de lucro com a potência contratada, que difere em até 1,5%: a potência ótima, a receita mínima de entrada (R$ 74 mil a R$ 75 mil, contra R$ 76 mil/(MW·ano)) e o custo marginal do último MW (R$ 0,89 milhão a R$ 0,91 milhão, contra R$ 0,90 milhão/MW) praticamente não mudam. Com contrato de 3 t/dia, o resultado se inverte. Sem poder levar hidrogênio e energia de um dia para outro, o modelo diário subestima o lucro em 8% a 12% e o custo de oportunidade da potência contratada em 30% a 40% (R$ 8,5 milhões a R$ 10,2 milhões, contra R$ 14,4 milhões por ano com 60 MW), pois não enxerga que, com o módulo mercantil menor, cresce o déficit de entrega nas sequências de dias nublados; a potência ótima sobe para 57,5 MW e o custo marginal do último MW cai de R$ 2,0 milhões para R$ 1,3 milhão a R$ 1,4 milhão/MW. Mais dias representativos não corrigem o erro, porque ele vem da perda da cronologia entre dias, e não do agrupamento. Os blocos semanais, ligados pela fronteira da relaxação do ano, preservam essa cronologia e ficam a menos de 0,1% do limite superior até 55 MW; essa é a razão da escolha da decomposição em blocos cronológicos em vez de dias representativos (Seção 3.6).</w:t>
       </w:r>
     </w:p>
     <w:bookmarkEnd w:id="12"/>
@@ -625,7 +1448,7 @@
         <w:pStyle w:val="FirstParagraph"/>
       </w:pPr>
       <w:r>
-        <w:t xml:space="preserve">O modelo de operação maximiza o lucro operacional, sem os custos de investimento. Esta subseção avalia, segundo o procedimento da Seção 3.8.2, se o empreendimento se paga com a receita fixa de referência. Os resultados são apresentados na Tabela 4.2 e na Figura 4.2.</w:t>
+        <w:t xml:space="preserve">O modelo de operação maximiza o lucro operacional, sem os custos de investimento. Esta subseção avalia, segundo o procedimento da Seção 3.8.2, se o empreendimento se paga com a receita fixa de referência. Os resultados são apresentados na Tabela 4.3 e na Figura 4.2.</w:t>
       </w:r>
     </w:p>
     <w:p>
@@ -633,7 +1456,7 @@
         <w:pStyle w:val="Legenda"/>
       </w:pPr>
       <w:r>
-        <w:t xml:space="preserve">Tabela 4.2 – Viabilidade econômica em 15 anos (receita fixa de R$ 600 mil/(MW·ano))</w:t>
+        <w:t xml:space="preserve">Tabela 4.3 – Viabilidade econômica em 15 anos (receita fixa de R$ 600 mil/(MW·ano))</w:t>
       </w:r>
     </w:p>
     <w:tbl>
@@ -2021,7 +2844,7 @@
         <w:t xml:space="preserve"> </w:t>
       </w:r>
       <w:r>
-        <w:t xml:space="preserve">A Figura 4.3 compara a curva de oferta de um BESS já existente, obtida na Subseção 4.3.3, com a de um BESS a construir e decompõe o lance mínimo do caso central; a Tabela 4.3 apresenta o lance mínimo para cada faixa de investimento e taxa de desconto.</w:t>
+        <w:t xml:space="preserve">A Figura 4.3 compara a curva de oferta de um BESS já existente, obtida na Subseção 4.3.3, com a de um BESS a construir e decompõe o lance mínimo do caso central; a Tabela 4.4 apresenta o lance mínimo para cada faixa de investimento e taxa de desconto.</w:t>
       </w:r>
     </w:p>
     <w:p>
@@ -2092,7 +2915,7 @@
         <w:pStyle w:val="Legenda"/>
       </w:pPr>
       <w:r>
-        <w:t xml:space="preserve">Tabela 4.3 – Lance mínimo para a construção do BESS, em R$ mil/(MW·ano), e potência ofertada nesse lance</w:t>
+        <w:t xml:space="preserve">Tabela 4.4 – Lance mínimo para a construção do BESS, em R$ mil/(MW·ano), e potência ofertada nesse lance</w:t>
       </w:r>
     </w:p>
     <w:tbl>
@@ -2302,7 +3125,7 @@
         <w:pStyle w:val="FirstParagraph"/>
       </w:pPr>
       <w:r>
-        <w:t xml:space="preserve">O lance mínimo da Subseção 4.2.2 foi recalculado com uma premissa de custo alterada de cada vez e para cada caso de sensibilidade da Seção 3.8.4, com investimento central e taxa de 12,1%. Nos casos que alteram o contrato de hidrogênio, a importação e o tamanho do eletrolisador, o lucro sem BESS também foi recalculado. Os resultados são apresentados na Tabela 4.4.</w:t>
+        <w:t xml:space="preserve">O lance mínimo da Subseção 4.2.2 foi recalculado com uma premissa de custo alterada de cada vez e para cada caso de sensibilidade da Seção 3.8.4, com investimento central e taxa de 12,1%. Nos casos que alteram o contrato de hidrogênio, a importação e o tamanho do eletrolisador, o lucro sem BESS também foi recalculado. Os resultados são apresentados na Tabela 4.5.</w:t>
       </w:r>
     </w:p>
     <w:p>
@@ -2310,7 +3133,7 @@
         <w:pStyle w:val="Legenda"/>
       </w:pPr>
       <w:r>
-        <w:t xml:space="preserve">Tabela 4.4 – Lance mínimo para a construção do BESS com uma hipótese alterada de cada vez em relação ao caso central (investimento de referência de R$ 5.500/kW para 4 h, taxa de 12,1%, PIS/Cofins de 3,65%, receita reajustada pelo IPCA e implantação em um ano)</w:t>
+        <w:t xml:space="preserve">Tabela 4.5 – Lance mínimo para a construção do BESS com uma hipótese alterada de cada vez em relação ao caso central (investimento de referência de R$ 5.500/kW para 4 h, taxa de 12,1%, PIS/Cofins de 3,65%, receita reajustada pelo IPCA e implantação em um ano)</w:t>
       </w:r>
     </w:p>
     <w:tbl>
@@ -4240,7 +5063,7 @@
         <w:pStyle w:val="FirstParagraph"/>
       </w:pPr>
       <w:r>
-        <w:t xml:space="preserve">Os resultados anteriores consideram o BESS de 60 MW e 300 MWh do caso de referência. Para uma bateria construída para o leilão, porém, o tamanho pode ser escolhido junto com o lance (Seção 3.8.3). A Tabela 4.5 compara o lance mínimo do BESS de referência com o de baterias dimensionadas para o contrato, com potência igual à contratada e energia de 4,8 MWh por MW, no arranjo híbrido e numa bateria isolada.</w:t>
+        <w:t xml:space="preserve">Os resultados anteriores consideram o BESS de 60 MW e 300 MWh do caso de referência. Para uma bateria construída para o leilão, porém, o tamanho pode ser escolhido junto com o lance (Seção 3.8.3). A Tabela 4.6 compara o lance mínimo do BESS de referência com o de baterias dimensionadas para o contrato, com potência igual à contratada e energia de 4,8 MWh por MW, no arranjo híbrido e numa bateria isolada.</w:t>
       </w:r>
     </w:p>
     <w:p>
@@ -4248,7 +5071,7 @@
         <w:pStyle w:val="Legenda"/>
       </w:pPr>
       <w:r>
-        <w:t xml:space="preserve">Tabela 4.5 – Lance mínimo por arranjo e dimensionamento do BESS, em R$ mil/(MW·ano), com investimento de referência central</w:t>
+        <w:t xml:space="preserve">Tabela 4.6 – Lance mínimo por arranjo e dimensionamento do BESS, em R$ mil/(MW·ano), com investimento de referência central</w:t>
       </w:r>
     </w:p>
     <w:tbl>
@@ -4627,7 +5450,7 @@
         <w:pStyle w:val="BodyText"/>
       </w:pPr>
       <w:r>
-        <w:t xml:space="preserve">A receita de referência, de R$ 600 mil/(MW·ano), é inferior ao lance mínimo de R$ 1,214 milhão calculado na Seção 4.2: com ela, um proponente não construiria o BESS. Os resultados desta seção valem, portanto, para quem já dispõe da bateria, e a curva de oferta da Subseção 4.3.3 fornece a decisão para qualquer receita. Para um BESS construído com receita igual ao lance mínimo, o proponente oferta toda a potência, e a operação é a da Tabela 4.6.</w:t>
+        <w:t xml:space="preserve">A receita de referência, de R$ 600 mil/(MW·ano), é inferior ao lance mínimo de R$ 1,214 milhão calculado na Seção 4.2: com ela, um proponente não construiria o BESS. Os resultados desta seção valem, portanto, para quem já dispõe da bateria, e a curva de oferta da Subseção 4.3.3 fornece a decisão para qualquer receita. Para um BESS construído com receita igual ao lance mínimo, o proponente oferta toda a potência, e a operação é a da Tabela 4.7.</w:t>
       </w:r>
     </w:p>
     <w:p>
@@ -4635,7 +5458,7 @@
         <w:pStyle w:val="Legenda"/>
       </w:pPr>
       <w:r>
-        <w:t xml:space="preserve">Tabela 4.6 – Operação média nos cenários com a receita de referência e com a receita igual ao lance mínimo</w:t>
+        <w:t xml:space="preserve">Tabela 4.7 – Operação média nos cenários com a receita de referência e com a receita igual ao lance mínimo</w:t>
       </w:r>
     </w:p>
     <w:tbl>
@@ -5230,7 +6053,7 @@
         <w:pStyle w:val="BodyText"/>
       </w:pPr>
       <w:r>
-        <w:t xml:space="preserve">O lucro por cenário na potência ótima é apresentado na Tabela 4.7. O pior cenário é 2022, ano em que o PLD permaneceu próximo do piso regulatório, e o melhor, 2021, ano da crise hídrica. A diferença entre eles, de cerca de R$ 8 milhões por ano, é pequena diante do ganho proporcionado pela participação no leilão.</w:t>
+        <w:t xml:space="preserve">O lucro por cenário na potência ótima é apresentado na Tabela 4.8. O pior cenário é 2022, ano em que o PLD permaneceu próximo do piso regulatório, e o melhor, 2021, ano da crise hídrica. A diferença entre eles, de cerca de R$ 8 milhões por ano, é pequena diante do ganho proporcionado pela participação no leilão.</w:t>
       </w:r>
     </w:p>
     <w:p>
@@ -5238,7 +6061,7 @@
         <w:pStyle w:val="Legenda"/>
       </w:pPr>
       <w:r>
-        <w:t xml:space="preserve">Tabela 4.7 – Lucro anual por cenário na potência ótima (54,4 MW)</w:t>
+        <w:t xml:space="preserve">Tabela 4.8 – Lucro anual por cenário na potência ótima (54,4 MW)</w:t>
       </w:r>
     </w:p>
     <w:tbl>
@@ -5712,7 +6535,7 @@
         </m:r>
       </m:oMath>
       <w:r>
-        <w:t xml:space="preserve">). Entre os extremos, o lucro esperado cai R$ 81 mil por ano (0,12%) e o CVaR sobe R$ 85 mil (0,13%). Há, portanto, troca entre risco e retorno, mas ela é pequena. O CVaR desloca a decisão em direção ao ótimo do pior ano, de 51,5 MW (Tabela 4.8): com</w:t>
+        <w:t xml:space="preserve">). Entre os extremos, o lucro esperado cai R$ 81 mil por ano (0,12%) e o CVaR sobe R$ 85 mil (0,13%). Há, portanto, troca entre risco e retorno, mas ela é pequena. O CVaR desloca a decisão em direção ao ótimo do pior ano, de 51,5 MW (Tabela 4.9): com</w:t>
       </w:r>
       <w:r>
         <w:t xml:space="preserve"> </w:t>
@@ -5758,7 +6581,7 @@
         <w:pStyle w:val="FirstParagraph"/>
       </w:pPr>
       <w:r>
-        <w:t xml:space="preserve">A Tabela 4.8 compara a decisão estocástica (RP) com a decisão obtida no ano médio (EV) e com a solução espera-e-vê (WS), calculadas segundo a Seção 3.7.4.</w:t>
+        <w:t xml:space="preserve">A Tabela 4.9 compara a decisão estocástica (RP) com a decisão obtida no ano médio (EV) e com a solução espera-e-vê (WS), calculadas segundo a Seção 3.7.4.</w:t>
       </w:r>
     </w:p>
     <w:p>
@@ -5766,7 +6589,7 @@
         <w:pStyle w:val="Legenda"/>
       </w:pPr>
       <w:r>
-        <w:t xml:space="preserve">Tabela 4.8 – Decisões e lucro anual por cenário para o cálculo do VSS e do EVPI</w:t>
+        <w:t xml:space="preserve">Tabela 4.9 – Decisões e lucro anual por cenário para o cálculo do VSS e do EVPI</w:t>
       </w:r>
     </w:p>
     <w:tbl>
@@ -6398,7 +7221,7 @@
         <w:pStyle w:val="FirstParagraph"/>
       </w:pPr>
       <w:r>
-        <w:t xml:space="preserve">A Tabela 4.9 resume, para a receita fixa de referência, a potência ótima, o lucro e a operação média de cada caso.</w:t>
+        <w:t xml:space="preserve">A Tabela 4.10 resume, para a receita fixa de referência, a potência ótima, o lucro e a operação média de cada caso.</w:t>
       </w:r>
     </w:p>
     <w:p>
@@ -6406,7 +7229,7 @@
         <w:pStyle w:val="Legenda"/>
       </w:pPr>
       <w:r>
-        <w:t xml:space="preserve">Tabela 4.9 – Potência ótima, lucro e operação média nos casos de contrato de hidrogênio e de importação (receita fixa de R$ 600 mil/(MW·ano))</w:t>
+        <w:t xml:space="preserve">Tabela 4.10 – Potência ótima, lucro e operação média nos casos de contrato de hidrogênio e de importação (receita fixa de R$ 600 mil/(MW·ano))</w:t>
       </w:r>
     </w:p>
     <w:tbl>
@@ -7389,7 +8212,7 @@
         <w:t xml:space="preserve"> </w:t>
       </w:r>
       <w:r>
-        <w:t xml:space="preserve">O custo adicional de R$ 250/MWh é uma hipótese agregada de uso da rede, encargos e tributos (Seção 3.8.4). Com R$ 100/MWh, o lucro esperado na receita de referência sobe para R$ 102,6 milhões por ano, 51% acima do caso sem importação, com 95 GWh importados e fator de capacidade de 0,93; com R$ 400/MWh, cai para R$ 76,6 milhões, ainda 12% acima, com 68 GWh importados, fator de capacidade de 0,79 e ótimo em 57,5 MW. A conclusão de que a importação eleva o lucro e reduz o papel do BESS no suprimento do eletrolisador é, portanto, robusta nessa faixa, mas a magnitude do ganho depende fortemente do custo da energia importada, que deve ser apurado para o ponto de conexão e o enquadramento tarifário do empreendimento. Só com R$ 100/MWh, investimento baixo e taxa de 8% o empreendimento teria VPL positivo (Tabela 4.2).</w:t>
+        <w:t xml:space="preserve">O custo adicional de R$ 250/MWh é uma hipótese agregada de uso da rede, encargos e tributos (Seção 3.8.4). Com R$ 100/MWh, o lucro esperado na receita de referência sobe para R$ 102,6 milhões por ano, 51% acima do caso sem importação, com 95 GWh importados e fator de capacidade de 0,93; com R$ 400/MWh, cai para R$ 76,6 milhões, ainda 12% acima, com 68 GWh importados, fator de capacidade de 0,79 e ótimo em 57,5 MW. A conclusão de que a importação eleva o lucro e reduz o papel do BESS no suprimento do eletrolisador é, portanto, robusta nessa faixa, mas a magnitude do ganho depende fortemente do custo da energia importada, que deve ser apurado para o ponto de conexão e o enquadramento tarifário do empreendimento. Só com R$ 100/MWh, investimento baixo e taxa de 8% o empreendimento teria VPL positivo (Tabela 4.3).</w:t>
       </w:r>
     </w:p>
     <w:p>
@@ -7444,7 +8267,7 @@
         </m:r>
       </m:oMath>
       <w:r>
-        <w:t xml:space="preserve">: 7 kgCO₂/kgH₂, valor inicial do marco legal (BRASIL, 2024), ou 3,4 kgCO₂/kgH₂, próximo do limiar de emissões europeu, sem as exigências de adicionalidade e de correlação temporal e geográfica do Regulamento Delegado (UE) 2023/1184 (Seção 3.4.5). Para cada limite, consideram-se o fator de emissão horário médio do SIN e o fator marginal de uma termelétrica a gás natural (Seção 3.5). A Figura 4.6 e a Tabela 4.10 comparam esses casos com o caso de referência, em que a importação é vedada, e com o de importação livre.</w:t>
+        <w:t xml:space="preserve">: 7 kgCO₂/kgH₂, valor inicial do marco legal (BRASIL, 2024), ou 3,4 kgCO₂/kgH₂, próximo do limiar de emissões europeu, sem as exigências de adicionalidade e de correlação temporal e geográfica do Regulamento Delegado (UE) 2023/1184 (Seção 3.4.5). Para cada limite, consideram-se o fator de emissão horário médio do SIN e o fator marginal de uma termelétrica a gás natural (Seção 3.5). A Figura 4.6 e a Tabela 4.11 comparam esses casos com o caso de referência, em que a importação é vedada, e com o de importação livre.</w:t>
       </w:r>
     </w:p>
     <w:p>
@@ -7515,7 +8338,7 @@
         <w:pStyle w:val="Legenda"/>
       </w:pPr>
       <w:r>
-        <w:t xml:space="preserve">Tabela 4.10 – Potência ótima, lucro e operação média nos casos de limite de emissões do hidrogênio (receita fixa de R$ 600 mil/(MW·ano))</w:t>
+        <w:t xml:space="preserve">Tabela 4.11 – Potência ótima, lucro e operação média nos casos de limite de emissões do hidrogênio (receita fixa de R$ 600 mil/(MW·ano))</w:t>
       </w:r>
     </w:p>
     <w:tbl>
@@ -8516,7 +9339,7 @@
         <w:t xml:space="preserve"> </w:t>
       </w:r>
       <w:r>
-        <w:t xml:space="preserve">O limite de emissões não altera o lance mínimo do BESS a construir, que permanece em R$ 1,214 milhão/(MW·ano) com o BESS de referência e em R$ 1,160 milhão com o BESS dimensionado para o contrato: no primeiro, a oferta de toda a potência elimina o módulo mercantil, e, no segundo, o BESS não altera a operação do lado mercantil (Subseção 4.2.4). O critério altera, porém, a viabilidade do empreendimento como um todo (Tabela 4.2): à taxa de 12,1%, o VPL passa de −R$ 546 milhões no caso de referência para −R$ 531 milhões com o limite de 7 kgCO₂/kgH₂ e fator marginal e para −R$ 450 milhões com fator médio, e o preço de equilíbrio do hidrogênio cai de R$ 116/kg para R$ 87/kg e R$ 62/kg, respectivamente. Com o fator marginal, o ganho de lucro é parcialmente consumido pela troca de pilhas, que o fator de capacidade mais alto do eletrolisador antecipa para o 12º ano.</w:t>
+        <w:t xml:space="preserve">O limite de emissões não altera o lance mínimo do BESS a construir, que permanece em R$ 1,214 milhão/(MW·ano) com o BESS de referência e em R$ 1,160 milhão com o BESS dimensionado para o contrato: no primeiro, a oferta de toda a potência elimina o módulo mercantil, e, no segundo, o BESS não altera a operação do lado mercantil (Subseção 4.2.4). O critério altera, porém, a viabilidade do empreendimento como um todo (Tabela 4.3): à taxa de 12,1%, o VPL passa de −R$ 546 milhões no caso de referência para −R$ 531 milhões com o limite de 7 kgCO₂/kgH₂ e fator marginal e para −R$ 450 milhões com fator médio, e o preço de equilíbrio do hidrogênio cai de R$ 116/kg para R$ 87/kg e R$ 62/kg, respectivamente. Com o fator marginal, o ganho de lucro é parcialmente consumido pela troca de pilhas, que o fator de capacidade mais alto do eletrolisador antecipa para o 12º ano.</w:t>
       </w:r>
     </w:p>
     <w:p>
@@ -8542,7 +9365,7 @@
         <w:pStyle w:val="FirstParagraph"/>
       </w:pPr>
       <w:r>
-        <w:t xml:space="preserve">A Figura 4.7 e a Tabela 4.11 apresentam a curva de oferta do caso de referência para 50, 150 e 365 despachos por ano.</w:t>
+        <w:t xml:space="preserve">A Figura 4.7 e a Tabela 4.12 apresentam a curva de oferta do caso de referência para 50, 150 e 365 despachos por ano.</w:t>
       </w:r>
     </w:p>
     <w:p>
@@ -8613,7 +9436,7 @@
         <w:pStyle w:val="Legenda"/>
       </w:pPr>
       <w:r>
-        <w:t xml:space="preserve">Tabela 4.11 – Efeito da frequência do despacho do ONS (receita fixa de R$ 600 mil/(MW·ano))</w:t>
+        <w:t xml:space="preserve">Tabela 4.12 – Efeito da frequência do despacho do ONS (receita fixa de R$ 600 mil/(MW·ano))</w:t>
       </w:r>
     </w:p>
     <w:tbl>
@@ -8972,7 +9795,7 @@
         <w:t xml:space="preserve">solver</w:t>
       </w:r>
       <w:r>
-        <w:t xml:space="preserve">, e a potência ótima (55 MW), a receita mínima de entrada (R$ 76 mil/(MW·ano)) e o lance mínimo (Tabela 4.4) são os mesmos. Isso decorre da separação entre os módulos: a energia do módulo LRCAP é liquidada pela CONCAP, e o perfil afeta o empreendedor apenas pela degradação, que depende do número de ciclos e não das horas em que ocorrem, e pelo limite do ponto de conexão, que não se mostrou ativo. Assim, o resultado é robusto ao critério de despacho do ONS, desde que o número de ciclos seja mantido e a recarga ocorra dentro da janela solar.</w:t>
+        <w:t xml:space="preserve">, e a potência ótima (55 MW), a receita mínima de entrada (R$ 76 mil/(MW·ano)) e o lance mínimo (Tabela 4.5) são os mesmos. Isso decorre da separação entre os módulos: a energia do módulo LRCAP é liquidada pela CONCAP, e o perfil afeta o empreendedor apenas pela degradação, que depende do número de ciclos e não das horas em que ocorrem, e pelo limite do ponto de conexão, que não se mostrou ativo. Assim, o resultado é robusto ao critério de despacho do ONS, desde que o número de ciclos seja mantido e a recarga ocorra dentro da janela solar.</w:t>
       </w:r>
     </w:p>
     <w:bookmarkEnd w:id="41"/>
@@ -9008,7 +9831,7 @@
         <w:t xml:space="preserve"> </w:t>
       </w:r>
       <w:r>
-        <w:t xml:space="preserve">A Figura 4.8 e a Tabela 4.12 apresentam a curva de oferta para custos de degradação de R$ 50, R$ 100 e R$ 200/MWh, os dois últimos próximos da faixa estimada a partir do custo de reposição dos módulos (Seção 3.5).</w:t>
+        <w:t xml:space="preserve">A Figura 4.8 e a Tabela 4.13 apresentam a curva de oferta para custos de degradação de R$ 50, R$ 100 e R$ 200/MWh, os dois últimos próximos da faixa estimada a partir do custo de reposição dos módulos (Seção 3.5).</w:t>
       </w:r>
     </w:p>
     <w:p>
@@ -9079,7 +9902,7 @@
         <w:pStyle w:val="Legenda"/>
       </w:pPr>
       <w:r>
-        <w:t xml:space="preserve">Tabela 4.12 – Efeito do custo de degradação do BESS (receita fixa de R$ 600 mil/(MW·ano))</w:t>
+        <w:t xml:space="preserve">Tabela 4.13 – Efeito do custo de degradação do BESS (receita fixa de R$ 600 mil/(MW·ano))</w:t>
       </w:r>
     </w:p>
     <w:tbl>
@@ -9359,7 +10182,7 @@
         <w:t xml:space="preserve"> </w:t>
       </w:r>
       <w:r>
-        <w:t xml:space="preserve">A Figura 4.9 e a Tabela 4.13 comparam eletrolisadores de 10, 17,5 e 25 MW, mantida a usina FV de 50 MWp.</w:t>
+        <w:t xml:space="preserve">A Figura 4.9 e a Tabela 4.14 comparam eletrolisadores de 10, 17,5 e 25 MW, mantida a usina FV de 50 MWp.</w:t>
       </w:r>
     </w:p>
     <w:p>
@@ -9430,7 +10253,7 @@
         <w:pStyle w:val="Legenda"/>
       </w:pPr>
       <w:r>
-        <w:t xml:space="preserve">Tabela 4.13 – Efeito da potência do eletrolisador (receita fixa de R$ 600 mil/(MW·ano))</w:t>
+        <w:t xml:space="preserve">Tabela 4.14 – Efeito da potência do eletrolisador (receita fixa de R$ 600 mil/(MW·ano))</w:t>
       </w:r>
     </w:p>
     <w:tbl>
@@ -9755,7 +10578,7 @@
         <w:t xml:space="preserve"> </w:t>
       </w:r>
       <w:r>
-        <w:t xml:space="preserve">No caso com contrato de 3 t/dia, a ampliação do tanque de hidrogênio de 2 t para 10 t reduz o déficit anual de entrega, com 55 MW contratados, de 40 t para 11 t, e eleva o lucro operacional esperado em R$ 1,6 milhão por ano. O tanque maior guarda o hidrogênio produzido nos dias de alta irradiância para os dias nublados, função que, com o tanque de 2 t, cabia ao módulo mercantil do BESS. Por isso, o custo de oportunidade marginal entre 30 e 50 MW cai de R$ 100–169 mil para R$ 85–126 mil/(MW·ano), e o lance mínimo para construir o BESS cai de R$ 1,179 milhão para R$ 1,159 milhão/(MW·ano) (Tabela 4.4). A potência ótima para a receita de referência permanece em 55 MW. O tanque maior, porém, não se paga: os 8 t adicionais custam R$ 43 milhões, ou R$ 6,8 milhões por ano à taxa de 12,1% com os juros durante a construção, contra o acréscimo de R$ 1,6 milhão no lucro, e o VPL do empreendimento piora de −R$ 564 milhões para −R$ 599 milhões (Tabela 4.2). A redução do lance com o tanque de 10 t só se aplica, assim, a um proponente que já disponha do tanque. Com 60 MW contratados, porém, os dois tanques produzem o mesmo resultado: sem o módulo mercantil, o eletrolisador opera apenas nas horas de sol, a entrega de 3 t/dia exige cerca de 9,4 h diárias na potência nominal, e raramente sobra hidrogênio para guardar. Esse efeito do tanque só aparece com a fronteira da relaxação linear (Subseção 4.1): com a condição cíclica semanal, o tanque era esvaziado no início de cada semana e sua ampliação não tinha efeito.</w:t>
+        <w:t xml:space="preserve">No caso com contrato de 3 t/dia, a ampliação do tanque de hidrogênio de 2 t para 10 t reduz o déficit anual de entrega, com 55 MW contratados, de 40 t para 11 t, e eleva o lucro operacional esperado em R$ 1,6 milhão por ano. O tanque maior guarda o hidrogênio produzido nos dias de alta irradiância para os dias nublados, função que, com o tanque de 2 t, cabia ao módulo mercantil do BESS. Por isso, o custo de oportunidade marginal entre 30 e 50 MW cai de R$ 100–169 mil para R$ 85–126 mil/(MW·ano), e o lance mínimo para construir o BESS cai de R$ 1,179 milhão para R$ 1,159 milhão/(MW·ano) (Tabela 4.5). A potência ótima para a receita de referência permanece em 55 MW. O tanque maior, porém, não se paga: os 8 t adicionais custam R$ 43 milhões, ou R$ 6,8 milhões por ano à taxa de 12,1% com os juros durante a construção, contra o acréscimo de R$ 1,6 milhão no lucro, e o VPL do empreendimento piora de −R$ 564 milhões para −R$ 599 milhões (Tabela 4.3). A redução do lance com o tanque de 10 t só se aplica, assim, a um proponente que já disponha do tanque. Com 60 MW contratados, porém, os dois tanques produzem o mesmo resultado: sem o módulo mercantil, o eletrolisador opera apenas nas horas de sol, a entrega de 3 t/dia exige cerca de 9,4 h diárias na potência nominal, e raramente sobra hidrogênio para guardar. Esse efeito do tanque só aparece com a fronteira da relaxação linear (Subseção 4.1): com a condição cíclica semanal, o tanque era esvaziado no início de cada semana e sua ampliação não tinha efeito.</w:t>
       </w:r>
     </w:p>
     <w:bookmarkEnd w:id="48"/>

</xml_diff>

<commit_message>
Documenta a sensibilidade à compressão do spread do PLD
Com o spread diário 25% e 50% menor, P* segue em 55 MW, a entrada cai de
R$ 76 mil para R$ 74 mil/(MW.ano) e o lance não muda.

Co-Authored-By: Claude Opus 5.5 <noreply@anthropic.com>
Claude-Session: https://claude.ai/code/session_01YFtn9hiQUHbNLSX7rUNYuK
</commit_message>
<xml_diff>
--- a/docs/dissertacao/cap4_resultados.docx
+++ b/docs/dissertacao/cap4_resultados.docx
@@ -10893,6 +10893,160 @@
       </w:r>
       <w:r>
         <w:t xml:space="preserve">, e a potência ótima (55 MW), a receita mínima de entrada (R$ 76 mil/(MW·ano)) e o lance mínimo (Tabela 4.6) são os mesmos. Isso decorre da separação entre os módulos: a energia do módulo LRCAP é liquidada pela CONCAP, e o perfil afeta o empreendedor apenas pela degradação, que depende do número de ciclos e não das horas em que ocorrem, e pelo limite do ponto de conexão, que não se mostrou ativo. Assim, o resultado é robusto ao critério de despacho do ONS, desde que o número de ciclos seja mantido e a recarga ocorra dentro da janela solar.</w:t>
+      </w:r>
+    </w:p>
+    <w:p>
+      <w:pPr>
+        <w:pStyle w:val="BodyText"/>
+      </w:pPr>
+      <w:r>
+        <w:t xml:space="preserve">Os cenários supõem também que os preços de 2021 a 2025 se repetem ao longo do contrato, mas o próprio LRCAP deve contratar armazenamento que descarrega na ponta e tende a achatar o perfil diário do PLD. Para representar esse efeito, o PLD de cada hora foi aproximado da média do seu dia,</w:t>
+      </w:r>
+      <w:r>
+        <w:t xml:space="preserve"> </w:t>
+      </w:r>
+      <m:oMath>
+        <m:sSubSup>
+          <m:e>
+            <m:r>
+              <m:t>λ</m:t>
+            </m:r>
+          </m:e>
+          <m:sub>
+            <m:r>
+              <m:t>t</m:t>
+            </m:r>
+          </m:sub>
+          <m:sup>
+            <m:r>
+              <m:rPr>
+                <m:sty m:val="p"/>
+              </m:rPr>
+              <m:t>′</m:t>
+            </m:r>
+          </m:sup>
+        </m:sSubSup>
+        <m:r>
+          <m:rPr>
+            <m:sty m:val="p"/>
+          </m:rPr>
+          <m:t>=</m:t>
+        </m:r>
+        <m:sSub>
+          <m:e>
+            <m:acc>
+              <m:accPr>
+                <m:chr m:val="‾"/>
+              </m:accPr>
+              <m:e>
+                <m:r>
+                  <m:t>λ</m:t>
+                </m:r>
+              </m:e>
+            </m:acc>
+          </m:e>
+          <m:sub>
+            <m:r>
+              <m:t>d</m:t>
+            </m:r>
+          </m:sub>
+        </m:sSub>
+        <m:r>
+          <m:rPr>
+            <m:sty m:val="p"/>
+          </m:rPr>
+          <m:t>+</m:t>
+        </m:r>
+        <m:r>
+          <m:rPr>
+            <m:sty m:val="p"/>
+          </m:rPr>
+          <m:t>(</m:t>
+        </m:r>
+        <m:r>
+          <m:t>1</m:t>
+        </m:r>
+        <m:r>
+          <m:rPr>
+            <m:sty m:val="p"/>
+          </m:rPr>
+          <m:t>−</m:t>
+        </m:r>
+        <m:r>
+          <m:t>c</m:t>
+        </m:r>
+        <m:r>
+          <m:rPr>
+            <m:sty m:val="p"/>
+          </m:rPr>
+          <m:t>)</m:t>
+        </m:r>
+        <m:r>
+          <m:rPr>
+            <m:sty m:val="p"/>
+          </m:rPr>
+          <m:t>(</m:t>
+        </m:r>
+        <m:sSub>
+          <m:e>
+            <m:r>
+              <m:t>λ</m:t>
+            </m:r>
+          </m:e>
+          <m:sub>
+            <m:r>
+              <m:t>t</m:t>
+            </m:r>
+          </m:sub>
+        </m:sSub>
+        <m:r>
+          <m:rPr>
+            <m:sty m:val="p"/>
+          </m:rPr>
+          <m:t>−</m:t>
+        </m:r>
+        <m:sSub>
+          <m:e>
+            <m:acc>
+              <m:accPr>
+                <m:chr m:val="‾"/>
+              </m:accPr>
+              <m:e>
+                <m:r>
+                  <m:t>λ</m:t>
+                </m:r>
+              </m:e>
+            </m:acc>
+          </m:e>
+          <m:sub>
+            <m:r>
+              <m:t>d</m:t>
+            </m:r>
+          </m:sub>
+        </m:sSub>
+        <m:r>
+          <m:rPr>
+            <m:sty m:val="p"/>
+          </m:rPr>
+          <m:t>)</m:t>
+        </m:r>
+      </m:oMath>
+      <w:r>
+        <w:t xml:space="preserve">, com</w:t>
+      </w:r>
+      <w:r>
+        <w:t xml:space="preserve"> </w:t>
+      </w:r>
+      <m:oMath>
+        <m:r>
+          <m:t>c</m:t>
+        </m:r>
+      </m:oMath>
+      <w:r>
+        <w:t xml:space="preserve"> </w:t>
+      </w:r>
+      <w:r>
+        <w:t xml:space="preserve">= 25% e 50%, o que preserva a média diária e a ordem das horas (e, portanto, o perfil do ONS) e reduz a amplitude diária média de R$ 161/MWh para R$ 121/MWh e R$ 80/MWh no cenário de 2025. O efeito é pequeno: o lucro operacional sem o leilão cai 0,2% e 0,3% (de R$ 45,03 milhões para R$ 44,95 milhões e R$ 44,89 milhões por ano), a perda de lucro com 60 MW contratados cai 1,4% e 2,6% (de R$ 14,05 milhões para R$ 13,86 milhões e R$ 13,69 milhões), a receita mínima de entrada passa de R$ 76 mil para R$ 75 mil e R$ 74 mil/(MW·ano), o custo marginal do último MW, de R$ 895 mil para R$ 885 mil e R$ 876 mil/MW, e a potência ótima com a receita de referência permanece em 55 MW. A arbitragem do módulo mercantil responde por pouco do custo de oportunidade, dominado pela energia que deixa de ir ao eletrolisador, cuja valorização não depende do perfil horário do PLD; com o spread menor, a exportação ao MCP chega a aumentar ligeiramente, pois perde valor guardar energia para a ponta. O lance mínimo não se altera, pois, com o BESS todo contratado, a perda do uso mercantil é nula (Seção 4.2.2).</w:t>
       </w:r>
     </w:p>
     <w:bookmarkEnd w:id="44"/>

</xml_diff>

<commit_message>
Justifica o investimento no lance e a complementaridade entre curva de oferta e lance
Co-Authored-By: Claude Opus 5.5 <noreply@anthropic.com>
Claude-Session: https://claude.ai/code/session_01YFtn9hiQUHbNLSX7rUNYuK
</commit_message>
<xml_diff>
--- a/docs/dissertacao/cap4_resultados.docx
+++ b/docs/dissertacao/cap4_resultados.docx
@@ -4026,6 +4026,92 @@
       </w:r>
       <w:r>
         <w:t xml:space="preserve">(Subseção 4.2.4). A curva escalonada da Seção 4.3 descreve, portanto, a decisão de um proponente que já dispõe do BESS. O lance mínimo no caso central é de R$ 1,214 milhão/(MW·ano) e corresponde ao custo anual equivalente do BESS por MW, acrescido do PIS/Cofins sobre a receita fixa (Figura 4.3(b)): R$ 989 mil de capital, dos quais R$ 55 mil de juros durante a construção, R$ 158 mil de O&amp;M com reposição de módulos, R$ 22 mil de acréscimo de uso da rede e R$ 45 mil de tributos sobre a receita. O capital reflete a energia da bateria: com 300 MWh, ou 5 h, o investimento é de R$ 380 milhões, 15% acima do valor de referência de um sistema de 4 h. O uso da rede pesa pouco porque a bateria compartilha a conexão com a usina FV e eleva o montante de uso de injeção em apenas 10 MW. As demais parcelas são nulas: o consumo auxiliar de 1% da potência cabe na folga de recarga custeada pela CONCAP, e, com 60 MW contratados, o módulo mercantil se anula, de modo que o uso mercantil da bateria não reduz o lance. O lance mínimo supera em 46% o preço médio obtido por termelétricas existentes no LRCAP de março de 2026 (R$ 831 mil/(MW·ano)) — mesmo no cenário mais favorável, com investimento baixo e taxa de 8%, ele fica em R$ 897 mil — e é muito inferior ao das termelétricas e hidrelétricas do leilão anterior (R$ 2,33 milhões/(MW·ano)). Essa comparação, porém, é apenas indicativa, pois os produtos não são equivalentes. As termelétricas do LRCAP, além da receita fixa, são ressarcidas do custo variável unitário (CVU) da energia que geram quando despachadas e podem sustentar a potência por tempo indeterminado; a bateria entrega a potência por, no máximo, 4 h a cada despacho e arca com as perdas e o consumo auxiliar além da folga de recarga custeada pela CONCAP. A receita fixa por MW·ano não mede, assim, o custo total de cada fonte para o consumidor nem sua contribuição para a confiabilidade do sistema; uma comparação rigorosa exigiria o custo por MW de capacidade equivalente, que depende da contribuição de cada tecnologia para o atendimento da ponta, e está fora do escopo deste trabalho. Com essa ressalva, o lance situa-se entre o preço das usinas existentes e o da expansão térmica e hidrelétrica. A receita de R$ 600 mil/(MW·ano) adotada no caso de referência é inferior ao lance mínimo em todas as combinações avaliadas: com ela, um proponente racional não construiria o BESS.</w:t>
+      </w:r>
+    </w:p>
+    <w:p>
+      <w:pPr>
+        <w:pStyle w:val="BodyText"/>
+      </w:pPr>
+      <w:r>
+        <w:rPr>
+          <w:b/>
+          <w:bCs/>
+        </w:rPr>
+        <w:t xml:space="preserve">Por que o investimento entra no lance.</w:t>
+      </w:r>
+      <w:r>
+        <w:t xml:space="preserve"> </w:t>
+      </w:r>
+      <w:r>
+        <w:t xml:space="preserve">O lance mínimo inclui o investimento no BESS porque a Portaria contrata sistemas novos, que só serão construídos se a receita fixa os remunerar, e o mercado não o faz: sem o leilão, o BESS acrescenta R$ 8,8 milhões por ano ao lucro operacional da usina, contra um custo anual equivalente de R$ 70,1 milhões. Um lance abaixo do custo anual da bateria venceria o leilão com VPL negativo; o lance mínimo é, por construção, o preço de VPL nulo do BESS. Por isso, a comparação pertinente é com a remuneração de capacidade nova, e não com a de usinas existentes, cujo investimento já foi amortizado: o lance de R$ 1,16 milhão a R$ 1,21 milhão/(MW·ano) supera o preço das termelétricas existentes (R$ 831 mil), mas corresponde a cerca de metade do obtido no leilão que incluiu expansão térmica e hidrelétrica (R$ 2,33 milhões). O investimento deixaria de entrar no lance em dois casos: se a bateria fosse construída de qualquer forma, justificada pela arbitragem ou pelo hidrogênio, quando seu custo seria afundado e a oferta seguiria a curva escalonada da Seção 4.3, a partir de cerca de R$ 76 mil/(MW·ano); e na parcela de custos compartilhados com a usina, como a conexão, que já reduz o lance em R$ 136 mil/(MW·ano) (Subseção 4.2.4). Nenhum dos dois se verifica no caso de referência, em que o uso mercantil cobre 13% do custo anual da bateria. As alavancas que reduzem o lance estão, portanto, no próprio investimento e no custo de capital: com os custos internacionais de 2025, o lance seria de R$ 0,5 milhão a R$ 1,0 milhão (Subseção 4.2.3), e cada ponto percentual a menos na taxa de desconto o reduz em cerca de 5%.</w:t>
+      </w:r>
+    </w:p>
+    <w:p>
+      <w:pPr>
+        <w:pStyle w:val="BodyText"/>
+      </w:pPr>
+      <w:r>
+        <w:rPr>
+          <w:b/>
+          <w:bCs/>
+        </w:rPr>
+        <w:t xml:space="preserve">Relação entre a curva de oferta e o lance.</w:t>
+      </w:r>
+      <w:r>
+        <w:t xml:space="preserve"> </w:t>
+      </w:r>
+      <w:r>
+        <w:t xml:space="preserve">As duas análises do trabalho são complementares. A curva de oferta da Seção 4.3 mede, por meio do modelo de operação, quanto lucro operacional a usina perde por comprometer cada MW do BESS com o leilão,</w:t>
+      </w:r>
+      <w:r>
+        <w:t xml:space="preserve"> </w:t>
+      </w:r>
+      <m:oMath>
+        <m:r>
+          <m:t>Q</m:t>
+        </m:r>
+        <m:r>
+          <m:rPr>
+            <m:sty m:val="p"/>
+          </m:rPr>
+          <m:t>(</m:t>
+        </m:r>
+        <m:r>
+          <m:t>0</m:t>
+        </m:r>
+        <m:r>
+          <m:rPr>
+            <m:sty m:val="p"/>
+          </m:rPr>
+          <m:t>)</m:t>
+        </m:r>
+        <m:r>
+          <m:rPr>
+            <m:sty m:val="p"/>
+          </m:rPr>
+          <m:t>−</m:t>
+        </m:r>
+        <m:r>
+          <m:t>Q</m:t>
+        </m:r>
+        <m:r>
+          <m:rPr>
+            <m:sty m:val="p"/>
+          </m:rPr>
+          <m:t>(</m:t>
+        </m:r>
+        <m:r>
+          <m:t>P</m:t>
+        </m:r>
+        <m:r>
+          <m:rPr>
+            <m:sty m:val="p"/>
+          </m:rPr>
+          <m:t>)</m:t>
+        </m:r>
+      </m:oMath>
+      <w:r>
+        <w:t xml:space="preserve">, e define a oferta de quem já dispõe da bateria; o lance mínimo soma a essa perda o custo de construir a bateria. Antes da otimização, não se sabe qual potência ofertar no lance nem quanto vale essa perda: se o uso mercantil ou a produção de hidrogênio fossem valiosos, poderia ser ótimo reter parte do BESS, e o lance incorporaria a perda correspondente. O modelo mostra que, no caso de referência, ao preço do lance todos os MW valem mais no leilão (o custo marginal do último MW, R$ 895 mil, é inferior ao lance) e que, com o BESS todo contratado, a usina opera como se não houvesse bateria, de modo que a parcela de uso mercantil é nula e o lance se reduz ao custo anual do BESS. Esse é um resultado, e não uma hipótese: com contrato de 3 t/dia de hidrogênio, reter parte da bateria compensa, a potência ofertada no lance é de 57,5 MW e o lance cai 3% (Tabela 4.6).</w:t>
       </w:r>
     </w:p>
     <w:bookmarkEnd w:id="20"/>

</xml_diff>